<commit_message>
fix: isolate visual styles and release old plans on style changes
</commit_message>
<xml_diff>
--- a/docs/AutoPPT-安装与使用说明.docx
+++ b/docs/AutoPPT-安装与使用说明.docx
@@ -18,7 +18,7 @@
         <w:rPr>
           <w:b w:val="0"/>
         </w:rPr>
-        <w:t>适用版本：2026 年 9 月 30 日的仓库代码。</w:t>
+        <w:t>适用版本：2026 年 10 月 1 日的仓库代码。</w:t>
       </w:r>
     </w:p>
     <w:p>
@@ -1214,6 +1214,41 @@
         <w:rPr>
           <w:b w:val="0"/>
         </w:rPr>
+        <w:t>切换风格与保留满意的设计</w:t>
+      </w:r>
+    </w:p>
+    <w:p>
+      <w:r>
+        <w:rPr>
+          <w:b w:val="0"/>
+        </w:rPr>
+        <w:t>字体、配色、材质、图形与装饰由所选风格规范决定。已有风格规范与成品保留。新主题建议单独建风格，上传参考、提炼并试做。向原风格追加图片会保留原有参考和规则。</w:t>
+      </w:r>
+    </w:p>
+    <w:p>
+      <w:r>
+        <w:rPr>
+          <w:b w:val="0"/>
+        </w:rPr>
+        <w:t>选择新风格后，选中需要更新的页面并重新设计。切换风格或修改规范会解除旧方案的字体、配色、图形和构图锁定；仅切换选择不会自动替换成品，旧版本保留。</w:t>
+      </w:r>
+    </w:p>
+    <w:p>
+      <w:r>
+        <w:rPr>
+          <w:b w:val="0"/>
+        </w:rPr>
+        <w:t>风格版本一致、讲稿未改且来源明确时，可用“保留布局，只补细节”保留满意的构图。风格来源不明时重新构思。参考图先转成文字规范，最终效果需检查样张。</w:t>
+      </w:r>
+    </w:p>
+    <w:p>
+      <w:pPr>
+        <w:pStyle w:val="Heading2"/>
+      </w:pPr>
+      <w:r>
+        <w:rPr>
+          <w:b w:val="0"/>
+        </w:rPr>
         <w:t>追加讲稿并调整页面</w:t>
       </w:r>
     </w:p>

</xml_diff>

<commit_message>
feat: integrate content attachments in slide redesign and add manuscript reports
</commit_message>
<xml_diff>
--- a/docs/AutoPPT-安装与使用说明.docx
+++ b/docs/AutoPPT-安装与使用说明.docx
@@ -18,7 +18,7 @@
         <w:rPr>
           <w:b w:val="0"/>
         </w:rPr>
-        <w:t>适用版本：2026 年 9 月 30 日的仓库代码。</w:t>
+        <w:t>适用版本：2026 年 10 月 1 日的仓库代码。</w:t>
       </w:r>
     </w:p>
     <w:p>
@@ -885,7 +885,7 @@
                 <w:b w:val="0"/>
                 <w:sz w:val="21"/>
               </w:rPr>
-              <w:t>兼容 Images Generations，支持文字生成图片</w:t>
+              <w:t>兼容 Images Generations；带附件还需支持 Images Edits 多图输入</w:t>
             </w:r>
           </w:p>
         </w:tc>
@@ -915,7 +915,7 @@
                 <w:b w:val="0"/>
                 <w:sz w:val="21"/>
               </w:rPr>
-              <w:t>根据页面方案生成完整画面</w:t>
+              <w:t>根据方案与内容附件生成完整画面</w:t>
             </w:r>
           </w:p>
         </w:tc>
@@ -982,6 +982,20 @@
         <w:rPr>
           <w:b w:val="0"/>
         </w:rPr>
+        <w:t>、</w:t>
+      </w:r>
+      <w:r>
+        <w:rPr>
+          <w:rFonts w:ascii="Menlo" w:hAnsi="Menlo"/>
+          <w:b w:val="0"/>
+          <w:sz w:val="20"/>
+        </w:rPr>
+        <w:t>/images/generations</w:t>
+      </w:r>
+      <w:r>
+        <w:rPr>
+          <w:b w:val="0"/>
+        </w:rPr>
         <w:t xml:space="preserve"> 或 </w:t>
       </w:r>
       <w:r>
@@ -990,7 +1004,7 @@
           <w:b w:val="0"/>
           <w:sz w:val="20"/>
         </w:rPr>
-        <w:t>/images/generations</w:t>
+        <w:t>/images/edits</w:t>
       </w:r>
       <w:r>
         <w:rPr>
@@ -1058,7 +1072,7 @@
         <w:rPr>
           <w:b w:val="0"/>
         </w:rPr>
-        <w:t xml:space="preserve">生成时会把相关讲稿、设计内容，以及风格分析所需的参考图发送给配置的模型服务，可能消耗该服务额度。API Key 保存在本机 </w:t>
+        <w:t xml:space="preserve">生成时会把相关讲稿、设计内容，风格分析所需的参考图，以及重做页面时添加的内容附件发送给配置的模型服务，可能消耗该服务额度。API Key 保存在本机 </w:t>
       </w:r>
       <w:r>
         <w:rPr>
@@ -1078,6 +1092,7 @@
     <w:p>
       <w:pPr>
         <w:pStyle w:val="Heading2"/>
+        <w:pageBreakBefore/>
       </w:pPr>
       <w:r>
         <w:rPr>
@@ -1148,7 +1163,7 @@
         <w:rPr>
           <w:b w:val="0"/>
         </w:rPr>
-        <w:t>4. 点击项目右上角“导出 PPT”，再点击“下载 PPT”。打开文件，确认页序、图片和逐页备注正确。备注可在 PowerPoint 的备注区域或演讲者视图查看。</w:t>
+        <w:t>4. 先点击“报告”，确认原稿正文与页面备注逐字一致；再点击项目右上角“导出 PPT”，再点击“下载 PPT”。打开文件，确认页序、图片和逐页备注正确。备注可在 PowerPoint 的备注区域或演讲者视图查看。</w:t>
       </w:r>
     </w:p>
     <w:p>
@@ -1273,6 +1288,93 @@
           <w:b w:val="0"/>
         </w:rPr>
         <w:t>可以合并相邻页面，或手动插入分界拆成多页；先预览调整方案，确认后再生成。修改正文后，画面会标记为待更新，需要重新设计才能与新稿一致。已有图片和版本历史会保留。</w:t>
+      </w:r>
+    </w:p>
+    <w:p>
+      <w:pPr>
+        <w:pStyle w:val="Heading2"/>
+      </w:pPr>
+      <w:r>
+        <w:rPr>
+          <w:b w:val="0"/>
+        </w:rPr>
+        <w:t>重做时加入图表或产品截图</w:t>
+      </w:r>
+    </w:p>
+    <w:p>
+      <w:r>
+        <w:rPr>
+          <w:b w:val="0"/>
+        </w:rPr>
+        <w:t>打开要调整的页面，在“换一个思路，再设计一次”下面点击“添加图片”。可添加 1–4 张 PNG、JPG 或 WebP，每张最多 12 MB。缩略图可打开查看，也可移除后换图。</w:t>
+      </w:r>
+    </w:p>
+    <w:p>
+      <w:r>
+        <w:rPr>
+          <w:b w:val="0"/>
+        </w:rPr>
+        <w:t>这些图片是要直接放进新页面的内容材料，不是风格参考。写明希望怎样使用，例如“用第一张产品截图解释操作流程，第二张图表放在右侧，保留数据和标签”，再点击“重新设计这页”。系统会把附件交给设计模型安排用途、位置与保留细节，再连同方案一起交给图片模型。</w:t>
+      </w:r>
+    </w:p>
+    <w:p>
+      <w:r>
+        <w:rPr>
+          <w:b w:val="0"/>
+        </w:rPr>
+        <w:t>成功后，附件随这一版页面保存；恢复历史版本也会恢复对应附件。生成失败时保留旧页面、本次方案和附件，可以继续重试。添加后尚未点击重做就离开，会提示附件选择尚未提交。</w:t>
+      </w:r>
+    </w:p>
+    <w:p>
+      <w:r>
+        <w:rPr>
+          <w:b w:val="0"/>
+        </w:rPr>
+        <w:t>带附件出图要求配置的图片服务支持 Images Edits 多图输入；不支持时会明确报错，不会自动忽略附件改为纯文字出图。模型生成的图表数值、小字与产品细节仍应检查；接口传递的测试不代表真实模型能逐像素保留材料。</w:t>
+      </w:r>
+    </w:p>
+    <w:p>
+      <w:pPr>
+        <w:pStyle w:val="Heading2"/>
+        <w:pageBreakBefore/>
+      </w:pPr>
+      <w:r>
+        <w:rPr>
+          <w:b w:val="0"/>
+        </w:rPr>
+        <w:t>用报告核对内容完整性</w:t>
+      </w:r>
+    </w:p>
+    <w:p>
+      <w:r>
+        <w:rPr>
+          <w:b w:val="0"/>
+        </w:rPr>
+        <w:t>项目右上角，“导出 PPT”旁有“报告”。报告显示四项：已提交原文字数、页面总数、页面备注字数、演说稿字数，并显示已有画面与待生成的页数。</w:t>
+      </w:r>
+    </w:p>
+    <w:p>
+      <w:r>
+        <w:rPr>
+          <w:b w:val="0"/>
+        </w:rPr>
+        <w:t>统一按非空白字符计数：不计空格和换行，汉字、标点、数字及每个英文字母各算一个字符。原文包含提交时的 Markdown 标题，所以另列去标题后的正文，用正文与备注比较，避免把正常去标题误判为遗漏。</w:t>
+      </w:r>
+    </w:p>
+    <w:p>
+      <w:r>
+        <w:rPr>
+          <w:b w:val="0"/>
+        </w:rPr>
+        <w:t>报告不仅比较字数，还逐字检查正文与当前已保存备注的顺序和内容。发现差异时显示第一处差异的上下文，能定位时可直接打开对应页面。改过备注也可能产生差异，需要结合原稿判断；报告不会自动改稿。</w:t>
+      </w:r>
+    </w:p>
+    <w:p>
+      <w:r>
+        <w:rPr>
+          <w:b w:val="0"/>
+        </w:rPr>
+        <w:t>演说稿就是页面备注按顺序拼合，因此两者字数相同；完整性要以备注与原稿正文的核对结果为准。未拆页的已提交段落计入原文并提示，未提交草稿单独显示、不纳入基准。可展开逐页字数，或下载文字报告。报告不调用模型。</w:t>
       </w:r>
     </w:p>
     <w:p>
@@ -1550,7 +1652,7 @@
         <w:rPr>
           <w:b w:val="0"/>
         </w:rPr>
-        <w:t>：参考图和生成图片。</w:t>
+        <w:t>：参考图、内容附件和生成图片。</w:t>
       </w:r>
     </w:p>
     <w:p>

</xml_diff>

<commit_message>
feat: review and reduce on-screen copy before slide design
</commit_message>
<xml_diff>
--- a/docs/AutoPPT-安装与使用说明.docx
+++ b/docs/AutoPPT-安装与使用说明.docx
@@ -1328,6 +1328,50 @@
     <w:p>
       <w:pPr>
         <w:pStyle w:val="Heading2"/>
+        <w:pageBreakBefore/>
+      </w:pPr>
+      <w:r>
+        <w:rPr>
+          <w:b w:val="0"/>
+        </w:rPr>
+        <w:t>控制画面文字密度</w:t>
+      </w:r>
+    </w:p>
+    <w:p>
+      <w:r>
+        <w:rPr>
+          <w:b w:val="0"/>
+        </w:rPr>
+        <w:t>新页面会先提炼上屏文案，再单独复核，最后排版出图。系统把内容分为核心表达、必要支撑和口播展开，优先精简重复解释与长段落，同时保留关键条件、数字、单位和范围。逐字稿与导出备注保持完整。</w:t>
+      </w:r>
+    </w:p>
+    <w:p>
+      <w:r>
+        <w:rPr>
+          <w:b w:val="0"/>
+        </w:rPr>
+        <w:t>打开页面的“设计方案”，展开“文字取舍与密度”，可查看方案生成时的讲稿字数、上屏字数、文字组数、本次精简、保留的关键信息和留给口播的展开。字数含标点、不计空白；附件内部文字不计入统计，但图片会交给模型一起判断阅读负担。改稿后的旧方案会提示需要重新设计；历史方案没有这些记录时不显示。</w:t>
+      </w:r>
+    </w:p>
+    <w:p>
+      <w:r>
+        <w:rPr>
+          <w:b w:val="0"/>
+        </w:rPr>
+        <w:t>不同页面采用不同提醒值，超出时结合内容判断，并说明保留理由；不会按比例截断原稿，也不会自动增加页数。如果仍觉得字多，可在反馈中写“减少上屏文字，保留关键数据和限定条件”，重新设计这一页。只要求“保留布局，微调细节”时，原有主文案会保留。确需拆页时，按提示在逐字稿中手动选择分界。</w:t>
+      </w:r>
+    </w:p>
+    <w:p>
+      <w:r>
+        <w:rPr>
+          <w:b w:val="0"/>
+        </w:rPr>
+        <w:t>文案复核未通过时不会开始出图，旧图片仍保留。每次新设计增加两次内容模型请求，可能增加等待时间和该服务费用；图片阶段失败后，原任务重试会复用已保存方案。密度复核是模型对文案的判断，尚未用用户认可的样张校准，不代表实际成图面积或阅读时间测量，生成后仍应检查效果。</w:t>
+      </w:r>
+    </w:p>
+    <w:p>
+      <w:pPr>
+        <w:pStyle w:val="Heading2"/>
       </w:pPr>
       <w:r>
         <w:rPr>

</xml_diff>

<commit_message>
feat: decouple screen copy from verbatim style prompts
</commit_message>
<xml_diff>
--- a/docs/AutoPPT-安装与使用说明.docx
+++ b/docs/AutoPPT-安装与使用说明.docx
@@ -820,7 +820,7 @@
                 <w:b w:val="0"/>
                 <w:sz w:val="21"/>
               </w:rPr>
-              <w:t>拆分讲稿、分析参考图、设计页面</w:t>
+              <w:t>拆分讲稿、提炼和复核上屏文案、分析风格参考图</w:t>
             </w:r>
           </w:p>
         </w:tc>
@@ -1218,7 +1218,7 @@
         <w:rPr>
           <w:b w:val="0"/>
         </w:rPr>
-        <w:t>提炼后可先“风格试做”。调整规范产生的是候选版本，点击“保存这版为正式风格”后才应用于后续制作。</w:t>
+        <w:t>提炼后可先“风格试做”。设计提示词将原文用于出图，不会自动改写。需要修改时直接编辑“设计提示词原文”，试做满意后点击“保存这版为正式风格”；只有主动“重新提炼风格”才会根据参考图改写规则。</w:t>
       </w:r>
     </w:p>
     <w:p>
@@ -1245,7 +1245,7 @@
         <w:rPr>
           <w:b w:val="0"/>
         </w:rPr>
-        <w:t>选择新风格后，选中需要更新的页面并重新设计。切换风格或修改规范会解除旧方案的字体、配色、图形和构图锁定；仅切换选择不会自动替换成品，旧版本保留。</w:t>
+        <w:t>选择新风格后，选中需要更新的页面并重新设计。新图原文使用所选风格的提示词。讲稿和内容附件未变时，复用同一份已提炼文案，不因换风格重新拆稿或改写文字。仅切换选择不会自动替换成品，旧版本保留。</w:t>
       </w:r>
     </w:p>
     <w:p>
@@ -1253,7 +1253,7 @@
         <w:rPr>
           <w:b w:val="0"/>
         </w:rPr>
-        <w:t>风格版本一致、讲稿未改且来源明确时，可用“保留布局，只补细节”保留满意的构图。风格来源不明时重新构思。参考图先转成文字规范，最终效果需检查样张。</w:t>
+        <w:t>画面调整与上屏文字调整分别填写。画面反馈只影响本页视觉表达，不改写风格提示词；需要精简或重选内容时，填写“上屏文字调整”。图片模型自行完成构图，不保证逐像素保留旧布局，最终效果需检查样张。</w:t>
       </w:r>
     </w:p>
     <w:p>
@@ -1272,7 +1272,7 @@
         <w:rPr>
           <w:b w:val="0"/>
         </w:rPr>
-        <w:t xml:space="preserve">选好风格后，一段一段追加逐字稿，确认本段效果后再继续。系统保留提交原文，并在拆页和保存逐字稿时去掉 Markdown 标题，包括 </w:t>
+        <w:t xml:space="preserve">流程为“完整逐字稿 → 按讲述逻辑拆页 → 每页提炼并复核上屏文案 → 搭配原始风格提示词出图”。风格不参与拆页和文案提炼。段落是拆页依据，不机械地一段一页。选好风格后，一段一段追加逐字稿，确认本段效果后再继续。系统保留提交原文，并在拆页和保存逐字稿时去掉 Markdown 标题，包括 </w:t>
       </w:r>
       <w:r>
         <w:rPr>
@@ -1342,7 +1342,7 @@
         <w:rPr>
           <w:b w:val="0"/>
         </w:rPr>
-        <w:t>新页面会先提炼上屏文案，再单独复核，最后排版出图。系统把内容分为核心表达、必要支撑和口播展开，优先精简重复解释与长段落，同时保留关键条件、数字、单位和范围。逐字稿与导出备注保持完整。</w:t>
+        <w:t>新页面会先提炼上屏文案，再单独复核，最后把文案和原始风格提示词一起交给图片模型。系统把内容分为核心表达、必要支撑和口播展开，提炼观众需要看见的重点，不逐句缩写原稿；开场、重复解释、口语衔接和长段展开优先留给口播，同时保留关键条件、数字、单位和范围。逐字稿与导出备注保持完整。</w:t>
       </w:r>
     </w:p>
     <w:p>
@@ -1350,7 +1350,7 @@
         <w:rPr>
           <w:b w:val="0"/>
         </w:rPr>
-        <w:t>打开页面的“设计方案”，展开“文字取舍与密度”，可查看方案生成时的讲稿字数、上屏字数、文字组数、本次精简、保留的关键信息和留给口播的展开。字数含标点、不计空白；附件内部文字不计入统计，但图片会交给模型一起判断阅读负担。改稿后的旧方案会提示需要重新设计；历史方案没有这些记录时不显示。</w:t>
+        <w:t>打开页面的“上屏文案与风格”，展开“文字取舍与密度”，可查看方案生成时的讲稿字数、上屏字数、文字组数、本次精简、保留的关键信息和留给口播的展开。字数含标点、不计空白；附件内部文字不计入统计，但图片会交给模型一起判断阅读负担。改稿后的旧方案会提示需要重新设计；历史方案没有这些记录时不显示。还可展开“本次风格提示词原文”和“实际发送的出图提示词”，核对本次输入。</w:t>
       </w:r>
     </w:p>
     <w:p>
@@ -1358,7 +1358,7 @@
         <w:rPr>
           <w:b w:val="0"/>
         </w:rPr>
-        <w:t>不同页面采用不同提醒值，超出时结合内容判断，并说明保留理由；不会按比例截断原稿，也不会自动增加页数。如果仍觉得字多，可在反馈中写“减少上屏文字，保留关键数据和限定条件”，重新设计这一页。只要求“保留布局，微调细节”时，原有主文案会保留。确需拆页时，按提示在逐字稿中手动选择分界。</w:t>
+        <w:t>不同页面采用不同提醒值，超出时结合内容判断，并说明保留理由；不会按比例截断原稿，也不会自动增加页数。如果仍觉得字多，可在“上屏文字调整”中写“减少上屏文字，保留关键数据和限定条件”，重新设计这一页。只调整画面或切换风格时，已复核文案保持原样。确需拆页时，按提示在逐字稿中手动选择分界。</w:t>
       </w:r>
     </w:p>
     <w:p>
@@ -1366,7 +1366,15 @@
         <w:rPr>
           <w:b w:val="0"/>
         </w:rPr>
-        <w:t>文案复核未通过时不会开始出图，旧图片仍保留。每次新设计增加两次内容模型请求，可能增加等待时间和该服务费用；图片阶段失败后，原任务重试会复用已保存方案。密度复核是模型对文案的判断，尚未用用户认可的样张校准，不代表实际成图面积或阅读时间测量，生成后仍应检查效果。</w:t>
+        <w:t>文案复核未通过时不会开始出图，旧图片仍保留。只有首次提炼、讲稿或附件变化、主动调整文案、旧版记录升级时，才需要文案提炼和复核两次内容请求，可能增加等待时间和服务费用。换风格或重新构图复用当前版本的文案记录；图片阶段失败后，原任务重试复用已保存方案。密度复核是模型对文案的判断，尚未用用户认可的样张校准，不代表实际成图面积或阅读时间测量，生成后仍应检查效果。</w:t>
+      </w:r>
+    </w:p>
+    <w:p>
+      <w:r>
+        <w:rPr>
+          <w:b w:val="0"/>
+        </w:rPr>
+        <w:t>图片请求要求新增有语义文字只来自已复核清单，不自行补写中文、英文口号或页码。附件原有文字和字符画中的图像字符可保留。这是请求约束，生成后仍应检查文字是否准确。</w:t>
       </w:r>
     </w:p>
     <w:p>
@@ -1393,7 +1401,7 @@
         <w:rPr>
           <w:b w:val="0"/>
         </w:rPr>
-        <w:t>这些图片是要直接放进新页面的内容材料，不是风格参考。写明希望怎样使用，例如“用第一张产品截图解释操作流程，第二张图表放在右侧，保留数据和标签”，再点击“重新设计这页”。系统会把附件交给设计模型安排用途、位置与保留细节，再连同方案一起交给图片模型。</w:t>
+        <w:t>这些图片是要直接放进新页面的内容材料，不是风格参考。写明希望怎样使用，例如“用第一张产品截图解释操作流程，第二张图表放在右侧，保留数据和标签”，再点击“重新设计这页”。系统会把附件交给文案提炼与复核模型判断内容和阅读负担，再连同原始风格提示词、提炼文案和你的画面要求交给图片模型安排构图。请求要求保留附件的原始内容。</w:t>
       </w:r>
     </w:p>
     <w:p>

</xml_diff>

<commit_message>
feat: show and copy screen text in style trials
</commit_message>
<xml_diff>
--- a/docs/AutoPPT-安装与使用说明.docx
+++ b/docs/AutoPPT-安装与使用说明.docx
@@ -1358,6 +1358,14 @@
         <w:rPr>
           <w:b w:val="0"/>
         </w:rPr>
+        <w:t>风格试做在讲稿下方直接显示“本次提炼的上屏内容”。可复制文案、本次风格提示词，或复制完整出图提示词到 ChatGPT 对照。复制使用当前选中试做的实际记录，不混入尚未生成的修改；改稿后会提示。查看和复制不调用模型，缺少记录时不会补造。浏览器不允许复制时，可全选提示框中的文字手动复制。</w:t>
+      </w:r>
+    </w:p>
+    <w:p>
+      <w:r>
+        <w:rPr>
+          <w:b w:val="0"/>
+        </w:rPr>
         <w:t>不同页面采用不同提醒值，超出时结合内容判断，并说明保留理由；不会按比例截断原稿，也不会自动增加页数。如果仍觉得字多，可在“上屏文字调整”中写“减少上屏文字，保留关键数据和限定条件”，重新设计这一页。只调整画面或切换风格时，已复核文案保持原样。确需拆页时，按提示在逐字稿中手动选择分界。</w:t>
       </w:r>
     </w:p>

</xml_diff>

<commit_message>
fix: pass raw style and screen copy without conflicting image directives
</commit_message>
<xml_diff>
--- a/docs/AutoPPT-安装与使用说明.docx
+++ b/docs/AutoPPT-安装与使用说明.docx
@@ -1350,7 +1350,7 @@
         <w:rPr>
           <w:b w:val="0"/>
         </w:rPr>
-        <w:t>打开页面的“上屏文案与风格”，展开“文字取舍与密度”，可查看方案生成时的讲稿字数、上屏字数、文字组数、本次精简、保留的关键信息和留给口播的展开。字数含标点、不计空白；附件内部文字不计入统计，但图片会交给模型一起判断阅读负担。改稿后的旧方案会提示需要重新设计；历史方案没有这些记录时不显示。还可展开“本次风格提示词原文”和“实际发送的出图提示词”，核对本次输入。</w:t>
+        <w:t>在“上屏文案与风格 → 文字取舍与密度”查看讲稿字数、上屏字数、文字组数及取舍依据。字数含标点、不计空白；附件内部文字不计入，但模型会看图判断阅读负担。改稿后的旧方案提示重新设计，缺失记录不显示。可展开风格原文和实际出图提示词核对输入。</w:t>
       </w:r>
     </w:p>
     <w:p>
@@ -1358,7 +1358,7 @@
         <w:rPr>
           <w:b w:val="0"/>
         </w:rPr>
-        <w:t>风格试做在讲稿下方直接显示“本次提炼的上屏内容”。可复制文案、本次风格提示词，或复制完整出图提示词到 ChatGPT 对照。复制使用当前选中试做的实际记录，不混入尚未生成的修改；改稿后会提示。查看和复制不调用模型，缺少记录时不会补造。浏览器不允许复制时，可全选提示框中的文字手动复制。</w:t>
+        <w:t>风格试做在讲稿下方显示“本次提炼的上屏内容”，可复制文案、风格或完整出图提示词到 ChatGPT 对照。复制取自当前记录，不混入未生成的修改，改稿后会提示。查看、复制不调用模型；复制受限时可全选提示框手动复制。</w:t>
       </w:r>
     </w:p>
     <w:p>
@@ -1366,7 +1366,7 @@
         <w:rPr>
           <w:b w:val="0"/>
         </w:rPr>
-        <w:t>不同页面采用不同提醒值，超出时结合内容判断，并说明保留理由；不会按比例截断原稿，也不会自动增加页数。如果仍觉得字多，可在“上屏文字调整”中写“减少上屏文字，保留关键数据和限定条件”，重新设计这一页。只调整画面或切换风格时，已复核文案保持原样。确需拆页时，按提示在逐字稿中手动选择分界。</w:t>
+        <w:t>页面按任务设置密度提醒，超出时说明保留理由，不截断原稿或自动增加页数。字多时可填写“上屏文字调整”后重做；只调整画面或换风格时复用文案。确需拆页时，在逐字稿中手动选择分界。</w:t>
       </w:r>
     </w:p>
     <w:p>
@@ -1374,7 +1374,7 @@
         <w:rPr>
           <w:b w:val="0"/>
         </w:rPr>
-        <w:t>文案复核未通过时不会开始出图，旧图片仍保留。只有首次提炼、讲稿或附件变化、主动调整文案、旧版记录升级时，才需要文案提炼和复核两次内容请求，可能增加等待时间和服务费用。换风格或重新构图复用当前版本的文案记录；图片阶段失败后，原任务重试复用已保存方案。密度复核是模型对文案的判断，尚未用用户认可的样张校准，不代表实际成图面积或阅读时间测量，生成后仍应检查效果。</w:t>
+        <w:t>文案复核未通过时停止出图，保留旧图。首次提炼、改稿、增删附件、调整文案或旧记录升级时，需提炼和复核两次内容请求，可能增加等待和费用。换风格、重新构图复用当前文案；图片失败后重试复用方案。密度复核尚未用认可样张校准，不代表实际成图面积或阅读时间，成图仍需检查。</w:t>
       </w:r>
     </w:p>
     <w:p>
@@ -1382,7 +1382,15 @@
         <w:rPr>
           <w:b w:val="0"/>
         </w:rPr>
-        <w:t>图片请求要求新增有语义文字只来自已复核清单，不自行补写中文、英文口号或页码。附件原有文字和字符画中的图像字符可保留。这是请求约束，生成后仍应检查文字是否准确。</w:t>
+        <w:t>普通出图只拼接风格原文和上屏文案；有内容附件或画面反馈时才追加对应要求。不再统一禁止英文、页码等细节；编辑性标签遵循风格，仍需核对成图是否补写了错误内容。</w:t>
+      </w:r>
+    </w:p>
+    <w:p>
+      <w:r>
+        <w:rPr>
+          <w:b w:val="0"/>
+        </w:rPr>
+        <w:t>“实际发送的出图提示词”同时显示服务、请求模型和规格、实际尺寸及服务返回的信息。缺失信息不补造；若服务返回改写提示词也会显示。同文输入不保证构图一致，第三方接口的模型名称也不能证明后端与 ChatGPT 相同。</w:t>
       </w:r>
     </w:p>
     <w:p>

</xml_diff>

<commit_message>
Separate sourced auxiliary context from slide copy and constrain neutral labels
</commit_message>
<xml_diff>
--- a/docs/AutoPPT-安装与使用说明.docx
+++ b/docs/AutoPPT-安装与使用说明.docx
@@ -1358,7 +1358,7 @@
         <w:rPr>
           <w:b w:val="0"/>
         </w:rPr>
-        <w:t>风格试做在讲稿下方显示“本次提炼的上屏内容”，可复制文案、风格或完整出图提示词到 ChatGPT 对照。复制取自当前记录，不混入未生成的修改，改稿后会提示。查看、复制不调用模型；复制受限时可全选提示框手动复制。</w:t>
+        <w:t>风格试做显示“本次提炼的上屏内容”。对照时复制完整出图提示词，或分别复制风格和“内容部分（含辅助信息）”，可展开辅助依据。只复制主文案会漏掉语义边界，已有 ChatGPT 对话也可能带入上下文。复制取自当前记录，改稿后会提示；不调用模型，受限时可手动复制。</w:t>
       </w:r>
     </w:p>
     <w:p>
@@ -1382,7 +1382,7 @@
         <w:rPr>
           <w:b w:val="0"/>
         </w:rPr>
-        <w:t>普通出图只拼接风格原文和上屏文案；有内容附件或画面反馈时才追加对应要求。不再统一禁止英文、页码等细节；编辑性标签遵循风格，仍需核对成图是否补写了错误内容。</w:t>
+        <w:t>出图使用风格原文和内容部分。内容含主文案、经复核的原稿或附件短摘录及语义边界：有依据才补具体含义，摘录只作可选辅助，不能变成主标题。无依据时仅用已有概念、序号、准确短译等中性标签；不替未定义的层级赋义，不用文字或图形替提问作答。配色遵循风格，成图仍需核对。</w:t>
       </w:r>
     </w:p>
     <w:p>

</xml_diff>

<commit_message>
Add opt-in content-led composition and five-dimension style audit
</commit_message>
<xml_diff>
--- a/docs/AutoPPT-安装与使用说明.docx
+++ b/docs/AutoPPT-安装与使用说明.docx
@@ -1245,6 +1245,22 @@
         <w:rPr>
           <w:b w:val="0"/>
         </w:rPr>
+        <w:t>风格详情可开启“按内容构思（仅当前风格）”。每页增加一次内容模型调用：文案冻结后，依据风格原文比较三种表达，按排版、留白、视觉层次、色彩搭配、原创性检查构思，再出图。不会改写风格或上屏文案，其他风格不受影响；关闭后恢复直接出图。</w:t>
+      </w:r>
+    </w:p>
+    <w:p>
+      <w:r>
+        <w:rPr>
+          <w:b w:val="0"/>
+        </w:rPr>
+        <w:t>开启时可展开“本页构图与五维构思自检”，查看最终方案、选择理由和候选方向。批量制作会参考附近同风格页面已保存的构图描述，减少重复；旧页面没有描述时不猜测。这是出图前的构思自检，不是对实际图片的自动判重或视觉验收。图片失败后重试复用已保存方案，实际成图仍需核对。</w:t>
+      </w:r>
+    </w:p>
+    <w:p>
+      <w:r>
+        <w:rPr>
+          <w:b w:val="0"/>
+        </w:rPr>
         <w:t>选择新风格后，选中需要更新的页面并重新设计。新图原文使用所选风格的提示词。讲稿和内容附件未变时，复用同一份已提炼文案，不因换风格重新拆稿或改写文字。仅切换选择不会自动替换成品，旧版本保留。</w:t>
       </w:r>
     </w:p>
@@ -1253,7 +1269,7 @@
         <w:rPr>
           <w:b w:val="0"/>
         </w:rPr>
-        <w:t>画面调整与上屏文字调整分别填写。画面反馈只影响本页视觉表达，不改写风格提示词；需要精简或重选内容时，填写“上屏文字调整”。图片模型自行完成构图，不保证逐像素保留旧布局，最终效果需检查样张。</w:t>
+        <w:t>画面调整与上屏文字调整分别填写。画面反馈只影响本页视觉表达，不改写风格提示词；需要精简或重选内容时，填写“上屏文字调整”。图片模型执行构图，不保证逐像素保留旧布局，最终效果需检查样张。</w:t>
       </w:r>
     </w:p>
     <w:p>
@@ -1272,7 +1288,7 @@
         <w:rPr>
           <w:b w:val="0"/>
         </w:rPr>
-        <w:t xml:space="preserve">流程为“完整逐字稿 → 按讲述逻辑拆页 → 每页提炼并复核上屏文案 → 搭配原始风格提示词出图”。风格不参与拆页和文案提炼。段落是拆页依据，不机械地一段一页。选好风格后，一段一段追加逐字稿，确认本段效果后再继续。系统保留提交原文，并在拆页和保存逐字稿时去掉 Markdown 标题，包括 </w:t>
+        <w:t xml:space="preserve">流程为“完整逐字稿 → 按讲述逻辑拆页 → 每页提炼并复核上屏文案 → 按需构思 → 搭配原始风格提示词出图”。风格不参与拆页和文案提炼。段落是拆页依据，不机械地一段一页。选好风格后，一段一段追加逐字稿，确认本段效果后再继续。系统保留提交原文，并在拆页和保存逐字稿时去掉 Markdown 标题，包括 </w:t>
       </w:r>
       <w:r>
         <w:rPr>
@@ -1358,7 +1374,7 @@
         <w:rPr>
           <w:b w:val="0"/>
         </w:rPr>
-        <w:t>风格试做显示“本次提炼的上屏内容”。对照时复制完整出图提示词，或分别复制风格和“内容部分（含辅助信息）”，可展开辅助依据。只复制主文案会漏掉语义边界，已有 ChatGPT 对话也可能带入上下文。复制取自当前记录，改稿后会提示；不调用模型，受限时可手动复制。</w:t>
+        <w:t>风格试做显示“本次提炼的上屏内容”。对照时复制完整出图提示词，或分别复制风格和“内容部分（含辅助信息）”，可展开辅助依据。开启“按内容构思”时必须复制完整提示词，才能包含本页构图要求。只复制主文案会漏掉语义边界，已有 ChatGPT 对话也可能带入上下文。复制取自当前记录，改稿后会提示；不调用模型，受限时可手动复制。</w:t>
       </w:r>
     </w:p>
     <w:p>

</xml_diff>

<commit_message>
Simplify semantic guidance and preserve approved copy on prompt upgrades
</commit_message>
<xml_diff>
--- a/docs/AutoPPT-安装与使用说明.docx
+++ b/docs/AutoPPT-安装与使用说明.docx
@@ -1390,7 +1390,7 @@
         <w:rPr>
           <w:b w:val="0"/>
         </w:rPr>
-        <w:t>文案复核未通过时停止出图，保留旧图。首次提炼、改稿、增删附件、调整文案或旧记录升级时，需提炼和复核两次内容请求，可能增加等待和费用。换风格、重新构图复用当前文案；图片失败后重试复用方案。密度复核尚未用认可样张校准，不代表实际成图面积或阅读时间，成图仍需检查。</w:t>
+        <w:t>文案复核未通过时停止出图，保留旧图。首次提炼、改稿、增删附件、调整文案或旧文案规则升级时，需提炼和复核两次内容请求，可能增加等待和费用。换风格、重新构图及仅更新出图边界时复用有效文案；图片失败后重试复用有效方案。密度复核尚未用认可样张校准，不代表实际成图面积或阅读时间，成图仍需检查。</w:t>
       </w:r>
     </w:p>
     <w:p>
@@ -1398,7 +1398,7 @@
         <w:rPr>
           <w:b w:val="0"/>
         </w:rPr>
-        <w:t>出图使用风格原文和内容部分。内容含主文案、经复核的原稿或附件短摘录及语义边界：有依据才补具体含义，摘录只作可选辅助，不能变成主标题。无依据时仅用已有概念、序号、准确短译等中性标签；不替未定义的层级赋义，不用文字或图形替提问作答。配色遵循风格，成图仍需核对。</w:t>
+        <w:t>出图默认使用风格原文、上屏文案和简短的辅助表达边界。以已提炼的上屏文案为主，保持原意和表达程度。为丰富页面可增加少量、轻微、中性的辅助联想或解释，不能有指向性或引导性，不能让观众读出原文没有表达的意思、判断、倾向或结论，也不能补造事实。文字、图像和图形关系都遵守这一边界；有来源的摘录仅作次要辅助。成图仍需核对。</w:t>
       </w:r>
     </w:p>
     <w:p>

</xml_diff>

<commit_message>
Ship restrained minimal style as the default builtin
</commit_message>
<xml_diff>
--- a/docs/AutoPPT-安装与使用说明.docx
+++ b/docs/AutoPPT-安装与使用说明.docx
@@ -1109,7 +1109,7 @@
         <w:rPr>
           <w:b w:val="0"/>
         </w:rPr>
-        <w:t>1. 在“我的演讲”中新建项目，例如“首次测试”。先选择内置风格，如“极简叙事”，便于先验证主流程。</w:t>
+        <w:t>1. 在“我的演讲”中新建项目，例如“首次测试”。默认选中内置的“克制极简风格”，也可改选其他风格。</w:t>
       </w:r>
     </w:p>
     <w:p>
@@ -1237,6 +1237,14 @@
         <w:rPr>
           <w:b w:val="0"/>
         </w:rPr>
+        <w:t>“克制极简风格”已随程序内置，采用黑白基底、荧光强调和按内容构图的完整提示词，默认直接出图。新建项目预选这一风格；从某个风格详情新建时，沿用明确选择。升级只补充缺失的内置项，保留旧项目、图片、历史和已有风格修改。个人版同名风格继续保留，程序版标为“内置默认”；默认项不可用时会选取其他可用风格。</w:t>
+      </w:r>
+    </w:p>
+    <w:p>
+      <w:r>
+        <w:rPr>
+          <w:b w:val="0"/>
+        </w:rPr>
         <w:t>字体、配色、材质、图形与装饰由所选风格规范决定。已有风格规范与成品保留。新主题建议单独建风格，上传参考、提炼并试做。向原风格追加图片会保留原有参考和规则。</w:t>
       </w:r>
     </w:p>
@@ -1344,7 +1352,6 @@
     <w:p>
       <w:pPr>
         <w:pStyle w:val="Heading2"/>
-        <w:pageBreakBefore/>
       </w:pPr>
       <w:r>
         <w:rPr>
@@ -1455,7 +1462,6 @@
     <w:p>
       <w:pPr>
         <w:pStyle w:val="Heading2"/>
-        <w:pageBreakBefore/>
       </w:pPr>
       <w:r>
         <w:rPr>

</xml_diff>

<commit_message>
Repair screen copy validation and preserve content hierarchy
</commit_message>
<xml_diff>
--- a/docs/AutoPPT-安装与使用说明.docx
+++ b/docs/AutoPPT-安装与使用说明.docx
@@ -1397,7 +1397,23 @@
         <w:rPr>
           <w:b w:val="0"/>
         </w:rPr>
-        <w:t>文案复核未通过时停止出图，保留旧图。首次提炼、改稿、增删附件、调整文案或旧文案规则升级时，需提炼和复核两次内容请求，可能增加等待和费用。换风格、重新构图及仅更新出图边界时复用有效文案；图片失败后重试复用有效方案。密度复核尚未用认可样张校准，不代表实际成图面积或阅读时间，成图仍需检查。</w:t>
+        <w:t>校验保护已选上屏主张的必要条件，允许“五个/5个”等明确等值的整数数量写法。整条移至口播的非核心支撑信息不必强制上屏；仍在表达的结果不能只删限定词。来源或必保信息错误最多自动修正一次；仍失败时显示阶段、待核对文字、来源引用和候选文案，停止出图并保留旧图。</w:t>
+      </w:r>
+    </w:p>
+    <w:p>
+      <w:r>
+        <w:rPr>
+          <w:b w:val="0"/>
+        </w:rPr>
+        <w:t>正常提炼与复核共两次内容请求，自动修正最多增加一次请求及相应等待和费用。换风格、重新构图及仅更新出图格式时复用有效文案；图片失败后重试复用有效方案。语义判断仍可能出错，密度复核不代表成图面积或阅读时间，成图仍需检查。</w:t>
+      </w:r>
+    </w:p>
+    <w:p>
+      <w:r>
+        <w:rPr>
+          <w:b w:val="0"/>
+        </w:rPr>
+        <w:t>内容部分会保留各组文案的核心、支撑、限定或出处、标签角色，供图片模型建立阅读主次，角色说明本身不上屏。字号、位置和构图仍依照风格决定。旧图片保持原样，下次主动重新设计或续做时采用新格式；格式更新不代表排版质量已验收。</w:t>
       </w:r>
     </w:p>
     <w:p>

</xml_diff>

<commit_message>
feat: retain, compare and restore style prompt versions
</commit_message>
<xml_diff>
--- a/docs/AutoPPT-安装与使用说明.docx
+++ b/docs/AutoPPT-安装与使用说明.docx
@@ -1229,6 +1229,55 @@
         <w:rPr>
           <w:b w:val="0"/>
         </w:rPr>
+        <w:t>查看和恢复提示词版本</w:t>
+      </w:r>
+    </w:p>
+    <w:p>
+      <w:r>
+        <w:rPr>
+          <w:b w:val="0"/>
+        </w:rPr>
+        <w:t>在“查看风格”或“风格试做”展开“提示词版本”，选择历史记录，查看版本号、保存时间、来源及完整提示词；展开“与当前版本比较”，可查看增加、移除的文字和构思方式变化。</w:t>
+      </w:r>
+    </w:p>
+    <w:p>
+      <w:r>
+        <w:rPr>
+          <w:b w:val="0"/>
+        </w:rPr>
+        <w:t>手动保存、重新提炼、试做转正式时，提示词或构思方式有变化便留存版本；相同内容不重复保存。点击“恢复此版本”会创建一个新版本，恢复前的内容仍保留。恢复不改变参考图和已有图片，下次主动制作时使用恢复后的规则。编辑中的内容需要先保存或取消；试做中的草稿可先转为正式风格，或“从正式风格重新开始”。其他窗口更新过规则时，会提示冲突并保留你的输入，先比较最新版本再保存。</w:t>
+      </w:r>
+    </w:p>
+    <w:p>
+      <w:r>
+        <w:rPr>
+          <w:b w:val="0"/>
+        </w:rPr>
+        <w:t xml:space="preserve">版本保存在本机数据库中，备份 </w:t>
+      </w:r>
+      <w:r>
+        <w:rPr>
+          <w:rFonts w:ascii="Menlo" w:hAnsi="Menlo"/>
+          <w:b w:val="0"/>
+          <w:sz w:val="20"/>
+        </w:rPr>
+        <w:t>.local</w:t>
+      </w:r>
+      <w:r>
+        <w:rPr>
+          <w:b w:val="0"/>
+        </w:rPr>
+        <w:t xml:space="preserve"> 时一并保留。旧提炼和试做转正式记录按实际保存内容展示；未记录构思方式的旧版，恢复时沿用当前方式。过去没有留存的手动修改无法补回。</w:t>
+      </w:r>
+    </w:p>
+    <w:p>
+      <w:pPr>
+        <w:pStyle w:val="Heading2"/>
+      </w:pPr>
+      <w:r>
+        <w:rPr>
+          <w:b w:val="0"/>
+        </w:rPr>
         <w:t>切换风格与保留满意的设计</w:t>
       </w:r>
     </w:p>

</xml_diff>

<commit_message>
feat: create styles directly from handwritten prompts
</commit_message>
<xml_diff>
--- a/docs/AutoPPT-安装与使用说明.docx
+++ b/docs/AutoPPT-安装与使用说明.docx
@@ -1202,7 +1202,15 @@
         <w:rPr>
           <w:b w:val="0"/>
         </w:rPr>
-        <w:t>进入“风格库”创建风格，可以上传参考图，或选择“从网址获取”，粘贴公开作品页或图片链接。网址导入会先展示预览，勾选 1–12 张后再提炼；建议先用 3–5 张风格一致、构图不同的作品。</w:t>
+        <w:t>进入“风格库 → 创建风格”，选择“手动填写”，输入名称和完整风格提示词（最多 3 万字），点击“保存风格”即可使用。无需上传图片，也不调用模型改写提示词；可直接试做或用于演讲，后续修改进入版本记录。需要根据图片重新提炼时，再补充参考图。</w:t>
+      </w:r>
+    </w:p>
+    <w:p>
+      <w:r>
+        <w:rPr>
+          <w:b w:val="0"/>
+        </w:rPr>
+        <w:t>也可以选择“上传图片”，或选择“从网址获取”，粘贴公开作品页或图片链接。网址导入会先展示预览，勾选 1–12 张后再提炼；建议先用 3–5 张风格一致、构图不同的作品。</w:t>
       </w:r>
     </w:p>
     <w:p>

</xml_diff>

<commit_message>
feat: separate audience context and palettes from visual styles
</commit_message>
<xml_diff>
--- a/docs/AutoPPT-安装与使用说明.docx
+++ b/docs/AutoPPT-安装与使用说明.docx
@@ -18,7 +18,7 @@
         <w:rPr>
           <w:b w:val="0"/>
         </w:rPr>
-        <w:t>适用版本：2026 年 10 月 1 日的仓库代码。</w:t>
+        <w:t>适用版本：2026 年 10 月 2 日的仓库代码。</w:t>
       </w:r>
     </w:p>
     <w:p>
@@ -1302,7 +1302,7 @@
         <w:rPr>
           <w:b w:val="0"/>
         </w:rPr>
-        <w:t>字体、配色、材质、图形与装饰由所选风格规范决定。已有风格规范与成品保留。新主题建议单独建风格，上传参考、提炼并试做。向原风格追加图片会保留原有参考和规则。</w:t>
+        <w:t>字体、材质、图形与装饰由所选风格规范决定；配色默认沿用风格，也可独立选择。已有风格规范与成品保留。新主题建议单独建风格，上传参考、提炼并试做。向原风格追加图片会保留原有参考和规则。</w:t>
       </w:r>
     </w:p>
     <w:p>
@@ -1335,6 +1335,65 @@
           <w:b w:val="0"/>
         </w:rPr>
         <w:t>画面调整与上屏文字调整分别填写。画面反馈只影响本页视觉表达，不改写风格提示词；需要精简或重选内容时，填写“上屏文字调整”。图片模型执行构图，不保证逐像素保留旧布局，最终效果需检查样张。</w:t>
+      </w:r>
+    </w:p>
+    <w:p>
+      <w:pPr>
+        <w:pStyle w:val="Heading2"/>
+      </w:pPr>
+      <w:r>
+        <w:rPr>
+          <w:b w:val="0"/>
+        </w:rPr>
+        <w:t>内容倾向与配色方案</w:t>
+      </w:r>
+    </w:p>
+    <w:p>
+      <w:r>
+        <w:rPr>
+          <w:b w:val="0"/>
+        </w:rPr>
+        <w:t>新建演讲时，除视觉风格外，还可展开“内容倾向”和“配色方案”。已有项目点击工作台“内容倾向与配色”修改；两项均为可选，未启用时沿用原来行为。设置独立于共享风格，不影响其他项目。</w:t>
+      </w:r>
+    </w:p>
+    <w:p>
+      <w:r>
+        <w:rPr>
+          <w:b w:val="0"/>
+        </w:rPr>
+        <w:t>启用内容倾向后，简单描述受众与场景，再点击“生成内容倾向说明”，检查并编辑生成的说明；也可以直接手填。例如儿童摄影影楼管理者、婚纱摄影客户、自行车赛参赛者或运动会志愿者。说明帮助选择贴切的语境和可选场景，不强行加入行业符号，不补出原稿没有的判断、案例、定义或结论。修改简述后，请同步检查展开说明。</w:t>
+      </w:r>
+    </w:p>
+    <w:p>
+      <w:r>
+        <w:rPr>
+          <w:b w:val="0"/>
+        </w:rPr>
+        <w:t>配色可沿用风格原文、从风格提取、选择预设或自定义。提取会显示对应原文依据，没有明确配色时不会猜色；结果可以编辑。自定义说明中写清背景、文字、强调色的颜色与用途，也可填具体色值。独立配色只覆盖颜色冲突，字体、材质等仍按原风格；切换风格时保留独立配色，选“沿用风格原配色”恢复跟随风格。内容附件承载事实的色码、图例或产品本色要求保留。</w:t>
+      </w:r>
+    </w:p>
+    <w:p>
+      <w:r>
+        <w:rPr>
+          <w:b w:val="0"/>
+        </w:rPr>
+        <w:t>保存设置不会自动改已有图片；选页重新设计才应用。讲稿、附件未变且文案已有有效复核时，换配色会复用同一份上屏文案，不重新提炼；生成式出图仍可能改变构图，不是对旧图直接换色。要改文字，另填“上屏文字调整”。</w:t>
+      </w:r>
+    </w:p>
+    <w:p>
+      <w:r>
+        <w:rPr>
+          <w:b w:val="0"/>
+        </w:rPr>
+        <w:t>风格试做提供相同设置，从已有项目选稿时带入该项目设置；每次试做与页面历史保存实际使用的选项。保存试做为正式风格不会把这两项写入风格库。生成依据中可以核对内容倾向与配色；对照 ChatGPT 时复制完整出图提示词，避免漏掉独立设置。模型仍可能偏离要求，请检查成图。</w:t>
+      </w:r>
+    </w:p>
+    <w:p>
+      <w:r>
+        <w:rPr>
+          <w:b w:val="0"/>
+        </w:rPr>
+        <w:t>手动填写、选择预设不调用模型；“生成内容倾向说明”和“从风格提取配色”各调用一次内容分析模型，需要已配置接口，并产生相应费用。生成结果先作为草稿供检查，保存或发起试做后才用于生成。</w:t>
       </w:r>
     </w:p>
     <w:p>
@@ -1438,7 +1497,7 @@
         <w:rPr>
           <w:b w:val="0"/>
         </w:rPr>
-        <w:t>风格试做显示“本次提炼的上屏内容”。对照时复制完整出图提示词，或分别复制风格和“内容部分（含辅助信息）”，可展开辅助依据。开启“按内容构思”时必须复制完整提示词，才能包含本页构图要求。只复制主文案会漏掉语义边界，已有 ChatGPT 对话也可能带入上下文。复制取自当前记录，改稿后会提示；不调用模型，受限时可手动复制。</w:t>
+        <w:t>风格试做显示“本次提炼的上屏内容”。对照时复制完整出图提示词，或分别复制风格和“内容部分（含辅助信息）”，可展开辅助依据。开启“按内容构思”、内容倾向或独立配色时，请复制完整提示词以包含全部要求。只复制主文案会漏掉语义边界，已有 ChatGPT 对话也可能带入上下文。复制取自当前记录，改稿后会提示；不调用模型，受限时可手动复制。</w:t>
       </w:r>
     </w:p>
     <w:p>

</xml_diff>

<commit_message>
feat: add project deletion and simplify audience and palette controls
</commit_message>
<xml_diff>
--- a/docs/AutoPPT-安装与使用说明.docx
+++ b/docs/AutoPPT-安装与使用说明.docx
@@ -1353,7 +1353,7 @@
         <w:rPr>
           <w:b w:val="0"/>
         </w:rPr>
-        <w:t>新建演讲时，除视觉风格外，还可展开“内容倾向”和“配色方案”。已有项目点击工作台“内容倾向与配色”修改；两项均为可选，未启用时沿用原来行为。设置独立于共享风格，不影响其他项目。</w:t>
+        <w:t>新建项目、工作台“内容倾向与配色”和风格试做使用同一组设置。不修改时沿用默认：内容倾向留空，配色保持“默认 · 沿用风格”，不会追加语境或替换原配色。已有设置在未编辑时也会原样保留。</w:t>
       </w:r>
     </w:p>
     <w:p>
@@ -1361,7 +1361,7 @@
         <w:rPr>
           <w:b w:val="0"/>
         </w:rPr>
-        <w:t>启用内容倾向后，简单描述受众与场景，再点击“生成内容倾向说明”，检查并编辑生成的说明；也可以直接手填。例如儿童摄影影楼管理者、婚纱摄影客户、自行车赛参赛者或运动会志愿者。说明帮助选择贴切的语境和可选场景，不强行加入行业符号，不补出原稿没有的判断、案例、定义或结论。修改简述后，请同步检查展开说明。</w:t>
+        <w:t>内容倾向写一句受众或场景即可，例如“面向儿童摄影影楼老板”。无需先生成说明；需要详细要求时，在“展开说明（可选）”手填或点击“AI 完善说明”。简述修改后，以新描述为准，清除旧展开说明。语境服务内容，不补出原文没有的事实、定义、判断或结论。</w:t>
       </w:r>
     </w:p>
     <w:p>
@@ -1369,7 +1369,7 @@
         <w:rPr>
           <w:b w:val="0"/>
         </w:rPr>
-        <w:t>配色可沿用风格原文、从风格提取、选择预设或自定义。提取会显示对应原文依据，没有明确配色时不会猜色；结果可以编辑。自定义说明中写清背景、文字、强调色的颜色与用途，也可填具体色值。独立配色只覆盖颜色冲突，字体、材质等仍按原风格；切换风格时保留独立配色，选“沿用风格原配色”恢复跟随风格。内容附件承载事实的色码、图例或产品本色要求保留。</w:t>
+        <w:t>配色直接点击基础色板即可，也可点“自定义”，选择背景色、文字色和强调色。无需提取旧颜色、填写名称或编写提示词。选择新色板后，出图模型按原风格是否已有配色，替换原配色或采用新配色；字体、材质等继续按原风格。选回“默认 · 沿用风格”可取消替换；切换风格时保留已选独立配色。已有自定义说明可按需编辑，不修改则保持原样。</w:t>
       </w:r>
     </w:p>
     <w:p>
@@ -1377,7 +1377,7 @@
         <w:rPr>
           <w:b w:val="0"/>
         </w:rPr>
-        <w:t>保存设置不会自动改已有图片；选页重新设计才应用。讲稿、附件未变且文案已有有效复核时，换配色会复用同一份上屏文案，不重新提炼；生成式出图仍可能改变构图，不是对旧图直接换色。要改文字，另填“上屏文字调整”。</w:t>
+        <w:t>填写简述、选择色板和自定义颜色不调用模型；只有“AI 完善说明”调用内容分析模型并产生相应费用。保存设置不会自动修改已有图片；选页重新设计才应用。讲稿、附件未变且文案已有有效复核时，复用原上屏文案；构图仍可能变化。内容附件中承载事实的颜色要求保留，成图请自行核对。</w:t>
       </w:r>
     </w:p>
     <w:p>
@@ -1385,7 +1385,18 @@
         <w:rPr>
           <w:b w:val="0"/>
         </w:rPr>
-        <w:t>风格试做提供相同设置，从已有项目选稿时带入该项目设置；每次试做与页面历史保存实际使用的选项。保存试做为正式风格不会把这两项写入风格库。生成依据中可以核对内容倾向与配色；对照 ChatGPT 时复制完整出图提示词，避免漏掉独立设置。模型仍可能偏离要求，请检查成图。</w:t>
+        <w:t>每次试做与页面历史保存实际使用的选项；试做转正式不会把语境或配色写入共享风格。查看生成依据可核对设置，对照 ChatGPT 时复制完整出图提示词。</w:t>
+      </w:r>
+    </w:p>
+    <w:p>
+      <w:pPr>
+        <w:pStyle w:val="Heading2"/>
+      </w:pPr>
+      <w:r>
+        <w:rPr>
+          <w:b w:val="0"/>
+        </w:rPr>
+        <w:t>删除项目与风格</w:t>
       </w:r>
     </w:p>
     <w:p>
@@ -1393,7 +1404,15 @@
         <w:rPr>
           <w:b w:val="0"/>
         </w:rPr>
-        <w:t>手动填写、选择预设不调用模型；“生成内容倾向说明”和“从风格提取配色”各调用一次内容分析模型，需要已配置接口，并产生相应费用。生成结果先作为草稿供检查，保存或发起试做后才用于生成。</w:t>
+        <w:t>在“我的演讲”的项目卡片或风格库的风格卡片右上角点击“删除”，再确认。项目正在制作、风格正在提炼或试做时，需先完成或停止任务。</w:t>
+      </w:r>
+    </w:p>
+    <w:p>
+      <w:r>
+        <w:rPr>
+          <w:b w:val="0"/>
+        </w:rPr>
+        <w:t>删除项目后从列表移除，无法继续编辑、生成或导出该项目；其他项目与共享风格不受影响。删除风格保留已有页面、讲稿和历史，使用它的项目需另选风格才能继续制作。底层保留原记录及图片以免破坏历史和共享素材，删除不能用于释放磁盘空间，目前没有界面恢复入口。</w:t>
       </w:r>
     </w:p>
     <w:p>

</xml_diff>

<commit_message>
feat: request 2560x1440 images across generation paths
</commit_message>
<xml_diff>
--- a/docs/AutoPPT-安装与使用说明.docx
+++ b/docs/AutoPPT-安装与使用说明.docx
@@ -1654,6 +1654,14 @@
       </w:r>
     </w:p>
     <w:p>
+      <w:r>
+        <w:rPr>
+          <w:b w:val="0"/>
+        </w:rPr>
+        <w:t>新图、试做和附件重绘统一请求 2560 × 1440（16:9）、high 质量；旧图不变。接口可能返回不同尺寸，实际像素可在生成依据中核对，程序不拉伸放大。</w:t>
+      </w:r>
+    </w:p>
+    <w:p>
       <w:pPr>
         <w:pStyle w:val="Heading2"/>
       </w:pPr>

</xml_diff>

<commit_message>
feat: queue independent page edits with four concurrent jobs
</commit_message>
<xml_diff>
--- a/docs/AutoPPT-安装与使用说明.docx
+++ b/docs/AutoPPT-安装与使用说明.docx
@@ -18,7 +18,7 @@
         <w:rPr>
           <w:b w:val="0"/>
         </w:rPr>
-        <w:t>适用版本：2026 年 10 月 2 日的仓库代码。</w:t>
+        <w:t>适用版本：2026 年 10 月 3 日的仓库代码。</w:t>
       </w:r>
     </w:p>
     <w:p>
@@ -1485,6 +1485,14 @@
       </w:r>
     </w:p>
     <w:p>
+      <w:r>
+        <w:rPr>
+          <w:b w:val="0"/>
+        </w:rPr>
+        <w:t>逐页修改后可以立即提交后台任务，再切换到其他页面继续编辑。全应用最多同时执行 4 项任务，超出自动排队；每项任务可单独停止，失败后保留旧图并支持重试。同一页排队或制作时不能重复提交。批量任务内部仍按页顺序制作；合并、拆分和切换项目风格需等该项目的任务结束。实际提速取决于模型服务商的并发与限流额度。</w:t>
+      </w:r>
+    </w:p>
+    <w:p>
       <w:pPr>
         <w:pStyle w:val="Heading2"/>
       </w:pPr>
@@ -1664,6 +1672,7 @@
     <w:p>
       <w:pPr>
         <w:pStyle w:val="Heading2"/>
+        <w:pageBreakBefore/>
       </w:pPr>
       <w:r>
         <w:rPr>

</xml_diff>

<commit_message>
Make manual page splits immediate with independent background rendering
</commit_message>
<xml_diff>
--- a/docs/AutoPPT-安装与使用说明.docx
+++ b/docs/AutoPPT-安装与使用说明.docx
@@ -1481,7 +1481,7 @@
         <w:rPr>
           <w:b w:val="0"/>
         </w:rPr>
-        <w:t>可以合并相邻页面，或手动插入分界拆成多页；先预览调整方案，确认后再生成。修改正文后，画面会标记为待更新，需要重新设计才能与新稿一致。已有图片和版本历史会保留。</w:t>
+        <w:t>手动拆分可对照原图插入分界，立即拆成多页；默认后台生成，也可关闭生成先改稿。原文及内容附件保留，新页重新提炼文案和出图。拆分页空闲时可撤销，不影响其他页刚完成的图片。合并相邻页仍先预览、确认后出图。修改正文后，画面标记为待更新，重新设计才与新稿一致；旧图和版本历史保留。</w:t>
       </w:r>
     </w:p>
     <w:p>
@@ -1489,7 +1489,7 @@
         <w:rPr>
           <w:b w:val="0"/>
         </w:rPr>
-        <w:t>逐页修改后可提交后台任务，再编辑其他页，最多同时执行 4 项，超出自动排队。拆分或合并方案只锁定来源页，追加讲稿只锁定本段未完成页；其他页可改稿、重绘，也可提交下一段。已完成页及时解锁。同一项目的追加段落按顺序制作。正在制作的本页可先写修改草稿，完成后再提交；离开时提示未提交内容。确认结构调整、切换风格和导出仍需项目空闲。旧图保留，失败可重试；实际提速取决于服务商额度。 弹窗外部的点击或拖动不会关闭弹窗；请使用关闭、取消按钮或 Esc 键。</w:t>
+        <w:t>逐页修改后可提交后台任务，再编辑其他页，最多同时执行 4 项，超出自动排队。手动拆分立即保存新页，每张新图独立排队；制作只锁定对应页。合并方案只锁定来源页，追加讲稿只锁定未完成页，同一项目的追加段落按顺序制作。其他空闲页可改稿、重绘、拆分，也可提交下一段。正在制作的本页可先写草稿，完成后再提交；离开时提示未提交内容。确认合并方案、切换风格和导出仍需项目空闲。旧图保留，失败可重试；实际提速取决于服务商额度。弹窗外部点击或拖动不会关闭弹窗；请用关闭、取消按钮或 Esc 键。</w:t>
       </w:r>
     </w:p>
     <w:p>

</xml_diff>

<commit_message>
Set childhood editorial as default style with generated cover
</commit_message>
<xml_diff>
--- a/docs/AutoPPT-安装与使用说明.docx
+++ b/docs/AutoPPT-安装与使用说明.docx
@@ -1109,7 +1109,7 @@
         <w:rPr>
           <w:b w:val="0"/>
         </w:rPr>
-        <w:t>1. 在“我的演讲”中新建项目，例如“首次测试”。默认选中内置的“克制极简风格”，也可改选其他风格。</w:t>
+        <w:t>1. 在“我的演讲”中新建项目，例如“首次测试”。默认选中“克制儿童摄影杂志风”，也可改选其他风格。</w:t>
       </w:r>
     </w:p>
     <w:p>
@@ -1163,7 +1163,7 @@
         <w:rPr>
           <w:b w:val="0"/>
         </w:rPr>
-        <w:t>4. 先点击“报告”，确认原稿正文与页面备注逐字一致；再点击项目右上角“导出 PPT”，再点击“下载 PPT”。打开文件，确认页序、图片和逐页备注正确。备注可在 PowerPoint 的备注区域或演讲者视图查看。</w:t>
+        <w:t>4. 先点击“报告”，确认原稿正文与页面备注逐字一致；再点击项目右上角“导出 PPT”，再点击“下载 PPT 与逐字稿”。解压 ZIP 后打开 PPTX 和独立逐字稿 Markdown，确认页序、图片和逐页备注正确。备注可在 PowerPoint 的备注区域或演讲者视图查看。</w:t>
       </w:r>
     </w:p>
     <w:p>
@@ -1294,7 +1294,7 @@
         <w:rPr>
           <w:b w:val="0"/>
         </w:rPr>
-        <w:t>“克制极简风格”已随程序内置，采用黑白基底、荧光强调和按内容构图的完整提示词，默认直接出图。新建项目预选这一风格；从某个风格详情新建时，沿用明确选择。升级只补充缺失的内置项，保留旧项目、图片、历史和已有风格修改。个人版同名风格继续保留，程序版标为“内置默认”；默认项不可用时会选取其他可用风格。</w:t>
+        <w:t>“克制儿童摄影杂志风”已设为程序默认风格，保留完整原始提示词，采用黑白基底、少量荧光黄绿、杂志编辑语言和儿童摄影行业语境，默认直接出图。新建项目预选这一风格；从某个风格详情新建时，沿用明确选择。专属封面随程序提供，用于风格库、风格选择和无成图的项目预览，不作为出图参考，不限制以后页面的构图。升级复用已有同 ID 风格，不覆盖提示词、历史版本、删除状态或旧项目；新安装自动补齐内置记录。旧的“克制极简风格”继续保留；默认项不可用时会选取其他可用风格。</w:t>
       </w:r>
     </w:p>
     <w:p>
@@ -1481,6 +1481,14 @@
         <w:rPr>
           <w:b w:val="0"/>
         </w:rPr>
+        <w:t>在页面卡片或演说稿的页间点击“插入”，填写新页完整讲稿，再点“插入并生成”。固定新增一页，沿用当前风格、内容倾向和配色，后续页码顺延；不等待其他页制作完成。也可仅插入、稍后生成，或在第一页前及末尾插入。失败后新页和讲稿保留，可以改稿或重试；网络异常后重试同一次提交不会重复插页。</w:t>
+      </w:r>
+    </w:p>
+    <w:p>
+      <w:r>
+        <w:rPr>
+          <w:b w:val="0"/>
+        </w:rPr>
         <w:t>手动拆分可对照原图插入分界，立即拆成多页；默认后台生成，也可关闭生成先改稿。原文及内容附件保留，新页重新提炼文案和出图。拆分页空闲时可撤销，不影响其他页刚完成的图片。合并相邻页仍先预览、确认后出图。修改正文后，画面标记为待更新，重新设计才与新稿一致；旧图和版本历史保留。</w:t>
       </w:r>
     </w:p>
@@ -1489,7 +1497,7 @@
         <w:rPr>
           <w:b w:val="0"/>
         </w:rPr>
-        <w:t>逐页修改后可提交后台任务，再编辑其他页，最多同时执行 4 项，超出自动排队。手动拆分立即保存新页，每张新图独立排队；制作只锁定对应页。合并方案只锁定来源页，追加讲稿只锁定未完成页，同一项目的追加段落按顺序制作。其他空闲页可改稿、重绘、拆分，也可提交下一段。正在制作的本页可先写草稿，完成后再提交；离开时提示未提交内容。已有拆分或合并方案在来源页空闲时即可确认，其他页任务不影响。确认时显示提交状态，失败提示仅属于本次窗口，重新打开会清除旧提示。切换风格和导出仍需项目空闲。旧图保留，失败可重试；实际提速取决于服务商额度。弹窗外部点击或拖动不会关闭弹窗；请用关闭、取消按钮或 Esc 键。</w:t>
+        <w:t>逐页修改后可提交后台任务，再编辑其他页，最多同时执行 4 项，超出自动排队。手动拆分立即保存新页，每张新图独立排队；制作只锁定对应页。合并方案只锁定来源页，追加讲稿只锁定未完成页，同一项目的追加段落按顺序制作。其他空闲页可改稿、重绘、拆分，也可提交下一段。正在制作的本页可先写草稿，完成后再提交；离开时提示未提交内容。已有拆分或合并方案在来源页空闲时即可确认，其他页任务不影响。确认时显示提交状态，失败提示仅属于本次窗口，重新打开会清除旧提示。切换风格和 PPT 导出仍需项目空闲，单独下载已保存逐字稿无需等待出图。旧图保留，失败可重试；实际提速取决于服务商额度。弹窗外部点击或拖动不会关闭弹窗；请用关闭、取消按钮或 Esc 键。</w:t>
       </w:r>
     </w:p>
     <w:p>
@@ -1686,6 +1694,14 @@
         <w:rPr>
           <w:b w:val="0"/>
         </w:rPr>
+        <w:t>点击“下载 PPT 与逐字稿”会下载带版本号的 ZIP，其中有 PPTX 和独立逐字稿 Markdown。Markdown 按当前页序包含最新保存的完整讲稿，附页码，包含改稿、拆并页和插页结果；不使用提炼后的上屏文案，可作为新版本留存。两份文件来自同一份保存记录。</w:t>
+      </w:r>
+    </w:p>
+    <w:p>
+      <w:r>
+        <w:rPr>
+          <w:b w:val="0"/>
+        </w:rPr>
         <w:t xml:space="preserve">导出的 </w:t>
       </w:r>
       <w:r>
@@ -1760,7 +1776,23 @@
         <w:rPr>
           <w:b w:val="0"/>
         </w:rPr>
-        <w:t>导出本身不调用模型。演示和备注请以实际下载的 PPTX 再检查一遍。</w:t>
+        <w:t>在“演说稿”区域点击“导出演说稿（Markdown）”，可以单独导出全部页面的最新完整正文，每页用 Markdown 二级标题标明页码。</w:t>
+      </w:r>
+    </w:p>
+    <w:p>
+      <w:r>
+        <w:rPr>
+          <w:b w:val="0"/>
+        </w:rPr>
+        <w:t>“仅下载逐字稿”可以在图片尚未完成或正在生成时使用，但已提交段落必须先完成拆页；输入框中未保存的修改不包含在内。插页和改稿后，报告可能显示与最初提交原文的差异，最新版本以当前页面讲稿为准。</w:t>
+      </w:r>
+    </w:p>
+    <w:p>
+      <w:r>
+        <w:rPr>
+          <w:b w:val="0"/>
+        </w:rPr>
+        <w:t>导出本身不调用模型。解压后请核对 PPTX 页序、备注及独立逐字稿。</w:t>
       </w:r>
     </w:p>
     <w:p>

</xml_diff>

<commit_message>
feat: add product introduction site with reproducible UI screenshots and guides
</commit_message>
<xml_diff>
--- a/docs/AutoPPT-安装与使用说明.docx
+++ b/docs/AutoPPT-安装与使用说明.docx
@@ -1172,6 +1172,33 @@
           <w:b w:val="0"/>
         </w:rPr>
         <w:t>首次测试通过后，再导入个人风格和较长讲稿；如果失败，先处理页面中给出的具体错误。</w:t>
+      </w:r>
+    </w:p>
+    <w:p>
+      <w:pPr>
+        <w:pStyle w:val="Heading2"/>
+      </w:pPr>
+      <w:r>
+        <w:rPr>
+          <w:b w:val="0"/>
+        </w:rPr>
+        <w:t>先了解程序能做什么</w:t>
+      </w:r>
+    </w:p>
+    <w:p>
+      <w:r>
+        <w:rPr>
+          <w:b w:val="0"/>
+        </w:rPr>
+        <w:t>点击侧栏“介绍”，在新标签页打开产品介绍页，不会离开正在编辑的项目。先看制作流程，再切换“讲稿与文案、你的视觉风格、受众与配色、逐页打磨、导出与保存”五类功能；点击截图可以放大，展开“具体怎么用”查看操作步骤。“开始使用”部分提供安装命令、API 配置说明和 Markdown 快速指南下载。浏览介绍页不需要 API。</w:t>
+      </w:r>
+    </w:p>
+    <w:p>
+      <w:r>
+        <w:rPr>
+          <w:b w:val="0"/>
+        </w:rPr>
+        <w:t>截图使用隔离的演示项目自动采集，展示真实界面，不包含私人讲稿或密钥。介绍页随程序提供，本机地址为 http://127.0.0.1:4317/intro/；目前没有另外发布公网官网。</w:t>
       </w:r>
     </w:p>
     <w:p>

</xml_diff>

<commit_message>
fix: align current production with task pages and preserve job state on duplicate startup
</commit_message>
<xml_diff>
--- a/docs/AutoPPT-安装与使用说明.docx
+++ b/docs/AutoPPT-安装与使用说明.docx
@@ -1458,6 +1458,14 @@
         <w:rPr>
           <w:b w:val="0"/>
         </w:rPr>
+        <w:t>“本次制作”跟随实际制作任务：制作中显示当前及排队任务涉及的页面，没有进行中的任务时显示最近一次制作的页面，完成后仍保留在视图中。标签数字表示页数，卡片按整份演讲的当前顺序编号，插页后会随之更新。查看旧讲稿使用段落下拉框，“全部页面”查看完整演讲；尚无制作记录时显示“最近添加”。</w:t>
+      </w:r>
+    </w:p>
+    <w:p>
+      <w:r>
+        <w:rPr>
+          <w:b w:val="0"/>
+        </w:rPr>
         <w:t xml:space="preserve">流程为“完整逐字稿 → 按讲述逻辑拆页 → 每页提炼并复核上屏文案 → 按需构思 → 搭配原始风格提示词出图”。风格不参与拆页和文案提炼。段落是拆页依据，不机械地一段一页。选好风格后，一段一段追加逐字稿，确认本段效果后再继续。系统保留提交原文，并在拆页和保存逐字稿时去掉 Markdown 标题，包括 </w:t>
       </w:r>
       <w:r>

</xml_diff>

<commit_message>
feat: add isolated OSS deployment for product introduction
</commit_message>
<xml_diff>
--- a/docs/AutoPPT-安装与使用说明.docx
+++ b/docs/AutoPPT-安装与使用说明.docx
@@ -18,7 +18,7 @@
         <w:rPr>
           <w:b w:val="0"/>
         </w:rPr>
-        <w:t>适用版本：2026 年 10 月 3 日的仓库代码。</w:t>
+        <w:t>适用版本：2026 年 10 月 4 日的仓库代码。</w:t>
       </w:r>
     </w:p>
     <w:p>
@@ -1199,6 +1199,113 @@
           <w:b w:val="0"/>
         </w:rPr>
         <w:t>截图使用隔离的演示项目自动采集，展示真实界面，不包含私人讲稿或密钥。介绍页随程序提供，本机地址为 http://127.0.0.1:4317/intro/；目前没有另外发布公网官网。</w:t>
+      </w:r>
+    </w:p>
+    <w:p>
+      <w:pPr>
+        <w:pStyle w:val="Heading2"/>
+      </w:pPr>
+      <w:r>
+        <w:rPr>
+          <w:b w:val="0"/>
+        </w:rPr>
+        <w:t>给维护者的介绍页发布入口</w:t>
+      </w:r>
+    </w:p>
+    <w:p>
+      <w:r>
+        <w:rPr>
+          <w:b w:val="0"/>
+        </w:rPr>
+        <w:t xml:space="preserve">维护者配置好 </w:t>
+      </w:r>
+      <w:r>
+        <w:rPr>
+          <w:rFonts w:ascii="Menlo" w:hAnsi="Menlo"/>
+          <w:b w:val="0"/>
+          <w:sz w:val="20"/>
+        </w:rPr>
+        <w:t>ossutil</w:t>
+      </w:r>
+      <w:r>
+        <w:rPr>
+          <w:b w:val="0"/>
+        </w:rPr>
+        <w:t xml:space="preserve"> 后，可在 Codex 中说“将介绍页部署到 autoppt”。</w:t>
+      </w:r>
+      <w:r>
+        <w:rPr>
+          <w:rFonts w:ascii="Menlo" w:hAnsi="Menlo"/>
+          <w:b w:val="0"/>
+          <w:sz w:val="20"/>
+        </w:rPr>
+        <w:t>autoppt</w:t>
+      </w:r>
+      <w:r>
+        <w:rPr>
+          <w:b w:val="0"/>
+        </w:rPr>
+        <w:t xml:space="preserve"> 是网站子目录，可换成已确认的其他名称；</w:t>
+      </w:r>
+      <w:r>
+        <w:rPr>
+          <w:rFonts w:ascii="Menlo" w:hAnsi="Menlo"/>
+          <w:b w:val="0"/>
+          <w:sz w:val="20"/>
+        </w:rPr>
+        <w:t>skill-web</w:t>
+      </w:r>
+      <w:r>
+        <w:rPr>
+          <w:b w:val="0"/>
+        </w:rPr>
+        <w:t xml:space="preserve"> 只是测试示例。也可在项目根目录先预演，再发布：</w:t>
+      </w:r>
+    </w:p>
+    <w:p>
+      <w:pPr>
+        <w:keepLines/>
+        <w:spacing w:line="320" w:lineRule="exact" w:before="40" w:after="140"/>
+        <w:ind w:left="230"/>
+      </w:pPr>
+      <w:r>
+        <w:rPr>
+          <w:rFonts w:ascii="Menlo" w:hAnsi="Menlo"/>
+          <w:sz w:val="21"/>
+        </w:rPr>
+        <w:t>npm run deploy:intro -- autoppt --dry-run</w:t>
+        <w:br/>
+        <w:t>npm run deploy:intro -- autoppt</w:t>
+      </w:r>
+    </w:p>
+    <w:p>
+      <w:r>
+        <w:rPr>
+          <w:b w:val="0"/>
+        </w:rPr>
+        <w:t xml:space="preserve">对应网址为 </w:t>
+      </w:r>
+      <w:r>
+        <w:rPr>
+          <w:rFonts w:ascii="Menlo" w:hAnsi="Menlo"/>
+          <w:b w:val="0"/>
+          <w:sz w:val="20"/>
+        </w:rPr>
+        <w:t>https://show.turing.art/autoppt/</w:t>
+      </w:r>
+      <w:r>
+        <w:rPr>
+          <w:b w:val="0"/>
+        </w:rPr>
+        <w:t>。先核对目标目录，避免覆盖其他网站。脚本只上传介绍页、指南与展示图片，不上传私人资料或密钥，不重启程序；上传后核对公网入口和全部文件，验证通过才显示部署成功。预演不会上传。</w:t>
+      </w:r>
+    </w:p>
+    <w:p>
+      <w:r>
+        <w:rPr>
+          <w:b w:val="0"/>
+        </w:rPr>
+        <w:t>公网介绍页供浏览与下载安装；完整在线工作台另需后端部署。Mac ARM64 的配置、云端读取、预演及电脑和手机浏览已验证，尚未正式上线；Windows 和 Linux 发布未实机验证。授权文件保存在仓库外，其他电脑需另行配置。详细步骤见仓库的“维护与同步”文档。</w:t>
       </w:r>
     </w:p>
     <w:p>

</xml_diff>

<commit_message>
feat: add invite-only hosted workspaces and image credits
</commit_message>
<xml_diff>
--- a/docs/AutoPPT-安装与使用说明.docx
+++ b/docs/AutoPPT-安装与使用说明.docx
@@ -34,7 +34,7 @@
         <w:rPr>
           <w:b w:val="0"/>
         </w:rPr>
-        <w:t>程序运行在每个人自己的电脑上，项目也保存在本机。分享代码不会同步已有项目、参考图或模型密钥。</w:t>
+        <w:t>第 1–6 节介绍本机版：程序运行在自己的电脑上，项目也保存在本机，分享代码不会同步已有项目、参考图或模型密钥。使用管理员提供的网站地址和邀请码时，请直接阅读第 7 节，无需本机安装或填写 Key。</w:t>
       </w:r>
     </w:p>
     <w:p>
@@ -2451,7 +2451,7 @@
         <w:rPr>
           <w:b w:val="0"/>
         </w:rPr>
-        <w:t>截至本次验证，</w:t>
+        <w:t xml:space="preserve">本版已将 PPTX 依赖链中的 </w:t>
       </w:r>
       <w:r>
         <w:rPr>
@@ -2459,13 +2459,13 @@
           <w:b w:val="0"/>
           <w:sz w:val="20"/>
         </w:rPr>
-        <w:t>npm ci</w:t>
+        <w:t>image-size</w:t>
       </w:r>
       <w:r>
         <w:rPr>
           <w:b w:val="0"/>
         </w:rPr>
-        <w:t xml:space="preserve"> 会报告 2 项 high 级别依赖审计告警，涉及 PPTX 依赖链中的 </w:t>
+        <w:t xml:space="preserve"> 固定到 2.0.4，修复旧版本的解析告警，相关导出测试通过。本次 </w:t>
       </w:r>
       <w:r>
         <w:rPr>
@@ -2473,13 +2473,13 @@
           <w:b w:val="0"/>
           <w:sz w:val="20"/>
         </w:rPr>
-        <w:t>image-size</w:t>
+        <w:t>npm audit</w:t>
       </w:r>
       <w:r>
         <w:rPr>
           <w:b w:val="0"/>
         </w:rPr>
-        <w:t xml:space="preserve"> 与 </w:t>
+        <w:t xml:space="preserve"> 未报告漏洞；这不是长期安全保证。以后出现新的依赖提示时请交给维护者处理，不要直接执行 </w:t>
       </w:r>
       <w:r>
         <w:rPr>
@@ -2487,27 +2487,13 @@
           <w:b w:val="0"/>
           <w:sz w:val="20"/>
         </w:rPr>
-        <w:t>pptxgenjs</w:t>
+        <w:t>npm audit fix --force</w:t>
       </w:r>
       <w:r>
         <w:rPr>
           <w:b w:val="0"/>
         </w:rPr>
-        <w:t xml:space="preserve">。这是待维护者处理的依赖问题，安装、构建和测试可以完成。不要为了消除提示直接执行 </w:t>
-      </w:r>
-      <w:r>
-        <w:rPr>
-          <w:rFonts w:ascii="Menlo" w:hAnsi="Menlo"/>
-          <w:b w:val="0"/>
-          <w:sz w:val="20"/>
-        </w:rPr>
-        <w:t>npm audit fix --force</w:t>
-      </w:r>
-      <w:r>
-        <w:rPr>
-          <w:b w:val="0"/>
-        </w:rPr>
-        <w:t>，它可能更换当前导出依赖版本。</w:t>
+        <w:t xml:space="preserve"> 更换导出依赖版本。</w:t>
       </w:r>
     </w:p>
     <w:p>
@@ -2642,6 +2628,133 @@
           <w:b w:val="0"/>
         </w:rPr>
         <w:t>。</w:t>
+      </w:r>
+    </w:p>
+    <w:p>
+      <w:pPr>
+        <w:pStyle w:val="Heading1"/>
+        <w:pageBreakBefore/>
+      </w:pPr>
+      <w:r>
+        <w:rPr>
+          <w:b w:val="0"/>
+        </w:rPr>
+        <w:t>7 邀请制线上使用</w:t>
+      </w:r>
+    </w:p>
+    <w:p>
+      <w:r>
+        <w:rPr>
+          <w:b w:val="0"/>
+        </w:rPr>
+        <w:t>如果管理员给你的是正式网站地址和邀请码，无需进行前面的本机安装，也无需填写模型 Key。打开网站，选择“有邀请码？创建账号”，填写账号、至少 12 个字符的密码和邀请码。邀请码有效期 7 天且只能使用一次；已注册后直接用账号密码登录。</w:t>
+      </w:r>
+    </w:p>
+    <w:p>
+      <w:r>
+        <w:rPr>
+          <w:b w:val="0"/>
+        </w:rPr>
+        <w:t xml:space="preserve">每个人有独立的演讲项目、风格版本、附件与图片，默认风格已经内置。制作流程仍是选择风格、提交逐字稿、提炼上屏文案、生成图片、逐页修改和导出。内容保存在服务器的个人工作区，不能把它与本机 </w:t>
+      </w:r>
+      <w:r>
+        <w:rPr>
+          <w:rFonts w:ascii="Menlo" w:hAnsi="Menlo"/>
+          <w:b w:val="0"/>
+          <w:sz w:val="20"/>
+        </w:rPr>
+        <w:t>.local</w:t>
+      </w:r>
+      <w:r>
+        <w:rPr>
+          <w:b w:val="0"/>
+        </w:rPr>
+        <w:t xml:space="preserve"> 当作同一份数据。</w:t>
+      </w:r>
+    </w:p>
+    <w:p>
+      <w:pPr>
+        <w:pStyle w:val="Heading2"/>
+      </w:pPr>
+      <w:r>
+        <w:rPr>
+          <w:b w:val="0"/>
+        </w:rPr>
+        <w:t>图片额度</w:t>
+      </w:r>
+    </w:p>
+    <w:p>
+      <w:r>
+        <w:rPr>
+          <w:b w:val="0"/>
+        </w:rPr>
+        <w:t>新账号一次性赠送 100 张图片额度，不按月重置。成功生成一张图片使用 1 张，风格试做和重新生成同样计入；编辑文字、导出 PPT 与逐字稿、恢复旧版本不扣图片额度。侧栏显示可用和预留张数，点击账号可查看使用记录和已完成的图片。</w:t>
+      </w:r>
+    </w:p>
+    <w:p>
+      <w:r>
+        <w:rPr>
+          <w:b w:val="0"/>
+        </w:rPr>
+        <w:t>生成开始前先预留额度，明确失败会释放。网络中断且结果不明确时，记录显示待核对，由管理员确认后处理，不会自动重复扣费。额度不足请联系管理员补充；当前采用手动增加张数，尚未开通微信、支付宝或自动充值。</w:t>
+      </w:r>
+    </w:p>
+    <w:p>
+      <w:pPr>
+        <w:pStyle w:val="Heading2"/>
+      </w:pPr>
+      <w:r>
+        <w:rPr>
+          <w:b w:val="0"/>
+        </w:rPr>
+        <w:t>管理员操作</w:t>
+      </w:r>
+    </w:p>
+    <w:p>
+      <w:r>
+        <w:rPr>
+          <w:b w:val="0"/>
+        </w:rPr>
+        <w:t>使用管理员账号进入“账号与额度”，可创建和撤销邀请码、为指定用户补充额度、停用账号、重置密码，以及核对异常生成。密码重置会撤销该用户之前的登录；忘记密码的用户需联系管理员。</w:t>
+      </w:r>
+    </w:p>
+    <w:p>
+      <w:r>
+        <w:rPr>
+          <w:b w:val="0"/>
+        </w:rPr>
+        <w:t>两套模型 Key 只在服务器配置，普通用户无法查看或修改。全站默认同时处理 4 个模型请求，其余排队；另外设置每人和全站每天模型调用上限，用于控制包括内容提炼在内的成本。额度是产品使用配额，不等于供应商的实际账单。</w:t>
+      </w:r>
+    </w:p>
+    <w:p>
+      <w:r>
+        <w:rPr>
+          <w:b w:val="0"/>
+        </w:rPr>
+        <w:t xml:space="preserve">维护者请按仓库中的 </w:t>
+      </w:r>
+      <w:hyperlink r:id="rId14">
+        <w:r>
+          <w:rPr>
+            <w:color w:val="245C85"/>
+            <w:u w:val="single"/>
+          </w:rPr>
+          <w:t>线上部署说明</w:t>
+        </w:r>
+      </w:hyperlink>
+      <w:r>
+        <w:rPr>
+          <w:b w:val="0"/>
+        </w:rPr>
+        <w:t xml:space="preserve"> 配置域名、HTTPS、模型服务和持久化备份。更新线上服务前等待正在生成的任务完成；不要删除数据卷。本机运行与线上部署是两个入口，不能仅把静态介绍页发布到 OSS 就当作线上制作服务。</w:t>
+      </w:r>
+    </w:p>
+    <w:p>
+      <w:r>
+        <w:rPr>
+          <w:b w:val="0"/>
+        </w:rPr>
+        <w:t>账号、数据隔离、模拟出图与额度、浏览器注册登录已验证。正式服务器和域名、真实模型账单与并发承载尚未完成上线验收；管理员应先用少量账号进行实际试用，再扩大邀请范围。</w:t>
       </w:r>
     </w:p>
     <w:sectPr>

</xml_diff>

<commit_message>
feat: add local Mac app and standalone style demos with covers
</commit_message>
<xml_diff>
--- a/docs/AutoPPT-安装与使用说明.docx
+++ b/docs/AutoPPT-安装与使用说明.docx
@@ -34,12 +34,196 @@
         <w:rPr>
           <w:b w:val="0"/>
         </w:rPr>
-        <w:t>第 1–6 节介绍本机版：程序运行在自己的电脑上，项目也保存在本机，分享代码不会同步已有项目、参考图或模型密钥。使用管理员提供的网站地址和邀请码时，请直接阅读第 7 节，无需本机安装或填写 Key。</w:t>
+        <w:t>优先使用下方 Mac App 方式，无需登录。第 1–6 节继续介绍浏览器本机版：程序运行在自己的电脑上，项目也保存在本机，分享代码不会同步已有项目、参考图或模型密钥。使用管理员提供的网站地址和邀请码时，请直接阅读第 7 节，无需本机安装或填写 Key。</w:t>
       </w:r>
     </w:p>
     <w:p>
       <w:pPr>
         <w:pStyle w:val="Heading1"/>
+      </w:pPr>
+      <w:r>
+        <w:rPr>
+          <w:b w:val="0"/>
+        </w:rPr>
+        <w:t>Mac App 的安装与使用</w:t>
+      </w:r>
+    </w:p>
+    <w:p>
+      <w:r>
+        <w:rPr>
+          <w:b w:val="0"/>
+        </w:rPr>
+        <w:t xml:space="preserve">拿到 </w:t>
+      </w:r>
+      <w:r>
+        <w:rPr>
+          <w:rFonts w:ascii="Menlo" w:hAnsi="Menlo"/>
+          <w:b w:val="0"/>
+          <w:sz w:val="20"/>
+        </w:rPr>
+        <w:t>AutoPPT-mac-arm64.zip</w:t>
+      </w:r>
+      <w:r>
+        <w:rPr>
+          <w:b w:val="0"/>
+        </w:rPr>
+        <w:t xml:space="preserve"> 后解压，将 </w:t>
+      </w:r>
+      <w:r>
+        <w:rPr>
+          <w:rFonts w:ascii="Menlo" w:hAnsi="Menlo"/>
+          <w:b w:val="0"/>
+          <w:sz w:val="20"/>
+        </w:rPr>
+        <w:t>AutoPPT.app</w:t>
+      </w:r>
+      <w:r>
+        <w:rPr>
+          <w:b w:val="0"/>
+        </w:rPr>
+        <w:t xml:space="preserve"> 拖入“应用程序”再打开。App 无需账号、邀请码、Node 或服务器；第一次在“模型设置”配置内容理解与图片生成服务。项目保存在本机；调用模型时，相关文字和图片仍会发送到自己配置的服务商，并按服务商规则计费。</w:t>
+      </w:r>
+    </w:p>
+    <w:p>
+      <w:r>
+        <w:rPr>
+          <w:b w:val="0"/>
+        </w:rPr>
+        <w:t xml:space="preserve">当前是 Apple Silicon Mac 内部构建，尚未配置 Developer ID 签名和 Apple 公证，其他电脑可能受到 macOS 安全检查限制。Intel Mac 尚未实机验证。构建者可在 Mac 上执行 </w:t>
+      </w:r>
+      <w:r>
+        <w:rPr>
+          <w:rFonts w:ascii="Menlo" w:hAnsi="Menlo"/>
+          <w:b w:val="0"/>
+          <w:sz w:val="20"/>
+        </w:rPr>
+        <w:t>npm ci</w:t>
+      </w:r>
+      <w:r>
+        <w:rPr>
+          <w:b w:val="0"/>
+        </w:rPr>
+        <w:t>、</w:t>
+      </w:r>
+      <w:r>
+        <w:rPr>
+          <w:rFonts w:ascii="Menlo" w:hAnsi="Menlo"/>
+          <w:b w:val="0"/>
+          <w:sz w:val="20"/>
+        </w:rPr>
+        <w:t>npx install-electron</w:t>
+      </w:r>
+      <w:r>
+        <w:rPr>
+          <w:b w:val="0"/>
+        </w:rPr>
+        <w:t>、</w:t>
+      </w:r>
+      <w:r>
+        <w:rPr>
+          <w:rFonts w:ascii="Menlo" w:hAnsi="Menlo"/>
+          <w:b w:val="0"/>
+          <w:sz w:val="20"/>
+        </w:rPr>
+        <w:t>npm run build:mac</w:t>
+      </w:r>
+      <w:r>
+        <w:rPr>
+          <w:b w:val="0"/>
+        </w:rPr>
+        <w:t xml:space="preserve">，在 </w:t>
+      </w:r>
+      <w:r>
+        <w:rPr>
+          <w:rFonts w:ascii="Menlo" w:hAnsi="Menlo"/>
+          <w:b w:val="0"/>
+          <w:sz w:val="20"/>
+        </w:rPr>
+        <w:t>release</w:t>
+      </w:r>
+      <w:r>
+        <w:rPr>
+          <w:b w:val="0"/>
+        </w:rPr>
+        <w:t xml:space="preserve"> 目录取得 App 和 ZIP；普通使用者不需要执行这些命令。</w:t>
+      </w:r>
+    </w:p>
+    <w:p>
+      <w:r>
+        <w:rPr>
+          <w:b w:val="0"/>
+        </w:rPr>
+        <w:t xml:space="preserve">在菜单“AutoPPT → 打开数据文件夹”查看本机项目。数据位于 </w:t>
+      </w:r>
+      <w:r>
+        <w:rPr>
+          <w:rFonts w:ascii="Menlo" w:hAnsi="Menlo"/>
+          <w:b w:val="0"/>
+          <w:sz w:val="20"/>
+        </w:rPr>
+        <w:t>~/Library/Application Support/AutoPPT/workspace/</w:t>
+      </w:r>
+      <w:r>
+        <w:rPr>
+          <w:b w:val="0"/>
+        </w:rPr>
+        <w:t xml:space="preserve">，独立于旧浏览器版的 </w:t>
+      </w:r>
+      <w:r>
+        <w:rPr>
+          <w:rFonts w:ascii="Menlo" w:hAnsi="Menlo"/>
+          <w:b w:val="0"/>
+          <w:sz w:val="20"/>
+        </w:rPr>
+        <w:t>.local/</w:t>
+      </w:r>
+      <w:r>
+        <w:rPr>
+          <w:b w:val="0"/>
+        </w:rPr>
+        <w:t>，安装包不包含他人的项目或 Key。App 不会自动迁移旧项目，原项目继续从浏览器版打开；当前没有自动迁移工具。</w:t>
+      </w:r>
+    </w:p>
+    <w:p>
+      <w:r>
+        <w:rPr>
+          <w:b w:val="0"/>
+        </w:rPr>
+        <w:t xml:space="preserve">点击窗口关闭按钮会隐藏窗口，任务继续运行；从 Dock 可重新打开。选择菜单“退出 AutoPPT”或按 Command Q 才会退出，有未完成任务时会先提醒。退出再打开，已保存内容和试做草稿仍会保留。备份时先退出 App，再复制整个 </w:t>
+      </w:r>
+      <w:r>
+        <w:rPr>
+          <w:rFonts w:ascii="Menlo" w:hAnsi="Menlo"/>
+          <w:b w:val="0"/>
+          <w:sz w:val="20"/>
+        </w:rPr>
+        <w:t>workspace</w:t>
+      </w:r>
+      <w:r>
+        <w:rPr>
+          <w:b w:val="0"/>
+        </w:rPr>
+        <w:t xml:space="preserve"> 文件夹；不要分享包含自己模型密钥的 </w:t>
+      </w:r>
+      <w:r>
+        <w:rPr>
+          <w:rFonts w:ascii="Menlo" w:hAnsi="Menlo"/>
+          <w:b w:val="0"/>
+          <w:sz w:val="20"/>
+        </w:rPr>
+        <w:t>settings.json</w:t>
+      </w:r>
+      <w:r>
+        <w:rPr>
+          <w:b w:val="0"/>
+        </w:rPr>
+        <w:t>。</w:t>
+      </w:r>
+    </w:p>
+    <w:p>
+      <w:pPr>
+        <w:pStyle w:val="Heading1"/>
+        <w:pageBreakBefore/>
       </w:pPr>
       <w:r>
         <w:rPr>
@@ -1353,6 +1537,14 @@
           <w:b w:val="0"/>
         </w:rPr>
         <w:t>部分站酷页面需要本机 Google Chrome。遇到登录、滑动验证或图片访问限制时，可以改用图片直链或本地上传。程序不会自动完成验证码。</w:t>
+      </w:r>
+    </w:p>
+    <w:p>
+      <w:r>
+        <w:rPr>
+          <w:b w:val="0"/>
+        </w:rPr>
+        <w:t>在风格详情点击“生成一页 demo / 调试风格”，可用预填示例直接生成一页，也可切换通用表达、儿童摄影、运动与赛事示例并修改文字，不需要先创建项目。已有讲稿仍可手填或从已有页面选择。生成成功后点击“将这张图设为风格封面”，风格库和选风格时就会显示这张图；此操作只改变预览，不改提示词、不增加出图参考。生成需先配置模型，会调用所选服务。</w:t>
       </w:r>
     </w:p>
     <w:p>

</xml_diff>

<commit_message>
feat: bundle eight approved styles in Mac release 0.2.0
</commit_message>
<xml_diff>
--- a/docs/AutoPPT-安装与使用说明.docx
+++ b/docs/AutoPPT-安装与使用说明.docx
@@ -1613,6 +1613,14 @@
           <w:b w:val="0"/>
         </w:rPr>
         <w:t>切换风格与保留满意的设计</w:t>
+      </w:r>
+    </w:p>
+    <w:p>
+      <w:r>
+        <w:rPr>
+          <w:b w:val="0"/>
+        </w:rPr>
+        <w:t>0.2.0 版新增 8 套已选定的风格及统一文案封面：先锋酸性色彩编辑风、新瑞士主义战略编辑风、高质感手账、暗黑参数化数据地形风、80 年代复古编辑风、日系现代建筑提案风、当代 Neo-Swiss、高端科技战略发布会风。连同原有 5 套，共 13 套内置风格；默认首选仍为“克制儿童摄影杂志风”。新增的 8 套均保留完整提示词与已生成封面，新安装无需重新提炼或生成这些封面。升级只补齐缺失记录，保留同 ID 风格的个人修改、删除状态与已有项目选择。封面仅用于展示，不作为生成参考；模型接口仍由使用者自行配置。</w:t>
       </w:r>
     </w:p>
     <w:p>

</xml_diff>

<commit_message>
feat: analyze references before authoring complete style guidelines
Learn description structure from the three approved styles without imposing their palettes or industry. Preserve detailed observations, validate all design sections, expose progress and evidence, and keep prior rules on failure.

Verified isolated npm run check (92 pass, 8 optional skips), desktop/mobile creation and failure recovery, and 14 rendered guide pages. Real model visual quality is not yet verified.
</commit_message>
<xml_diff>
--- a/docs/AutoPPT-安装与使用说明.docx
+++ b/docs/AutoPPT-安装与使用说明.docx
@@ -18,7 +18,7 @@
         <w:rPr>
           <w:b w:val="0"/>
         </w:rPr>
-        <w:t>适用版本：2026 年 10 月 4 日的仓库代码。</w:t>
+        <w:t>适用版本：2026 年 10 月 5 日的仓库代码。</w:t>
       </w:r>
     </w:p>
     <w:p>
@@ -1529,6 +1529,30 @@
           <w:b w:val="0"/>
         </w:rPr>
         <w:t>也可以选择“上传图片”，或选择“从网址获取”，粘贴公开作品页或图片链接。网址导入会先展示预览，勾选 1–12 张后再提炼；建议先用 3–5 张风格一致、构图不同的作品。</w:t>
+      </w:r>
+    </w:p>
+    <w:p>
+      <w:r>
+        <w:rPr>
+          <w:b w:val="0"/>
+        </w:rPr>
+        <w:t>选择图片后，系统先逐张分析字体、色彩、构图、图像处理、材质、疏密和微观细节，再根据共同特征设计一套完整的新风格。描述方法参考已选定的三套范例：克制儿童摄影杂志风、先锋酸性色彩编辑风、新瑞士主义战略编辑风；只学习展开设计规范的写法，新风格的配色、字体与气质由本次图片决定，不默认使用儿童摄影语境。</w:t>
+      </w:r>
+    </w:p>
+    <w:p>
+      <w:r>
+        <w:rPr>
+          <w:b w:val="0"/>
+        </w:rPr>
+        <w:t>新规范包含视觉定位、核心原则、内容表达、字体层级、色彩比例、图像材质、图形强调、细节、构图疏密、跨页变化、偏离方向和自检标准 12 个部分。详情中显示当前步骤，完成后展开“查看参考图分析与创作依据”，可以核对每张图的观察、共同特征、图间差异、不确定项和设计取舍。分析依据记录最近一次提炼；手动调整或恢复历史版本后，出图以当前提示词为准。</w:t>
+      </w:r>
+    </w:p>
+    <w:p>
+      <w:r>
+        <w:rPr>
+          <w:b w:val="0"/>
+        </w:rPr>
+        <w:t>每次提炼顺序调用内容分析模型两次，产生对应服务费用；不会自动生成图片。分析或规范不完整时显示错误，原有规则继续保留，升级也不会自动重写已有风格。提炼成功后再主动试做，核对能否延伸到不同内容。此流程已用模拟模型验证，真实模型的分析深度与新风格成图效果尚未实测。</w:t>
       </w:r>
     </w:p>
     <w:p>

</xml_diff>

<commit_message>
feat: fill dynamic page numbers only at existing style slots
</commit_message>
<xml_diff>
--- a/docs/AutoPPT-安装与使用说明.docx
+++ b/docs/AutoPPT-安装与使用说明.docx
@@ -1626,6 +1626,111 @@
           <w:b w:val="0"/>
         </w:rPr>
         <w:t xml:space="preserve"> 时一并保留。旧提炼和试做转正式记录按实际保存内容展示；未记录构思方式的旧版，恢复时沿用当前方式。过去没有留存的手动修改无法补回。</w:t>
+      </w:r>
+    </w:p>
+    <w:p>
+      <w:pPr>
+        <w:pStyle w:val="Heading2"/>
+      </w:pPr>
+      <w:r>
+        <w:rPr>
+          <w:b w:val="0"/>
+        </w:rPr>
+        <w:t>动态角标页码</w:t>
+      </w:r>
+    </w:p>
+    <w:p>
+      <w:r>
+        <w:rPr>
+          <w:b w:val="0"/>
+        </w:rPr>
+        <w:t xml:space="preserve">图片生成时，系统只在风格原有的明确页码描述处填入整份演讲的当前页序，例如“微型页码”临时变成“微型页码（显示为 84）”。字体、位置、大小与装饰仍由原风格决定；保存的提示词、版本和封面不会被自动改写。也可在原有页码位置手动填写 </w:t>
+      </w:r>
+      <w:r>
+        <w:rPr>
+          <w:rFonts w:ascii="Menlo" w:hAnsi="Menlo"/>
+          <w:b w:val="0"/>
+          <w:sz w:val="20"/>
+        </w:rPr>
+        <w:t>{{page_number}}</w:t>
+      </w:r>
+      <w:r>
+        <w:rPr>
+          <w:b w:val="0"/>
+        </w:rPr>
+        <w:t xml:space="preserve">。单页试做和统一封面使用 </w:t>
+      </w:r>
+      <w:r>
+        <w:rPr>
+          <w:rFonts w:ascii="Menlo" w:hAnsi="Menlo"/>
+          <w:b w:val="0"/>
+          <w:sz w:val="20"/>
+        </w:rPr>
+        <w:t>01</w:t>
+      </w:r>
+      <w:r>
+        <w:rPr>
+          <w:b w:val="0"/>
+        </w:rPr>
+        <w:t xml:space="preserve">，演讲页面按真实页序使用 </w:t>
+      </w:r>
+      <w:r>
+        <w:rPr>
+          <w:rFonts w:ascii="Menlo" w:hAnsi="Menlo"/>
+          <w:b w:val="0"/>
+          <w:sz w:val="20"/>
+        </w:rPr>
+        <w:t>01</w:t>
+      </w:r>
+      <w:r>
+        <w:rPr>
+          <w:b w:val="0"/>
+        </w:rPr>
+        <w:t>、</w:t>
+      </w:r>
+      <w:r>
+        <w:rPr>
+          <w:rFonts w:ascii="Menlo" w:hAnsi="Menlo"/>
+          <w:b w:val="0"/>
+          <w:sz w:val="20"/>
+        </w:rPr>
+        <w:t>02</w:t>
+      </w:r>
+      <w:r>
+        <w:rPr>
+          <w:b w:val="0"/>
+        </w:rPr>
+        <w:t>、…、</w:t>
+      </w:r>
+      <w:r>
+        <w:rPr>
+          <w:rFonts w:ascii="Menlo" w:hAnsi="Menlo"/>
+          <w:b w:val="0"/>
+          <w:sz w:val="20"/>
+        </w:rPr>
+        <w:t>100</w:t>
+      </w:r>
+      <w:r>
+        <w:rPr>
+          <w:b w:val="0"/>
+        </w:rPr>
+        <w:t>，与本次制作的任务编号无关。</w:t>
+      </w:r>
+    </w:p>
+    <w:p>
+      <w:r>
+        <w:rPr>
+          <w:b w:val="0"/>
+        </w:rPr>
+        <w:t>系统仅识别明确的“页码 / page number(s)”描述或上述占位符。没有明确位置、带否定要求或已经指定固定数值时，不猜测修改；章节、照片与流程编号不替换。风格详情会提示是否支持动态页码。当前内置的先锋酸性色彩编辑风、新瑞士主义战略编辑风、高质感手账、日系现代建筑提案风可自动识别；其他内置风格保持原文。</w:t>
+      </w:r>
+    </w:p>
+    <w:p>
+      <w:r>
+        <w:rPr>
+          <w:b w:val="0"/>
+        </w:rPr>
+        <w:t>“实际发送的出图提示词”可核对编号。页码由图片模型画入，下载和导出不会另加数字；模型仍可能漏画或写错。插页、删页、拆分、合并或调整顺序不会自动重画旧图片，受影响页面需重新生成，重试时按请求发出前的最新顺序取号。页面详情会提示新旧页序不一致；本功能没有为既有图片识别或修复页码，也不自动增加付费调用。</w:t>
       </w:r>
     </w:p>
     <w:p>

</xml_diff>

<commit_message>
feat: add independent animated HTML presentations from generated pages
</commit_message>
<xml_diff>
--- a/docs/AutoPPT-安装与使用说明.docx
+++ b/docs/AutoPPT-安装与使用说明.docx
@@ -2268,6 +2268,81 @@
     </w:p>
     <w:p>
       <w:pPr>
+        <w:pStyle w:val="Heading2"/>
+      </w:pPr>
+      <w:r>
+        <w:rPr>
+          <w:b w:val="0"/>
+        </w:rPr>
+        <w:t>把已有页面转换为动态 HTML</w:t>
+      </w:r>
+    </w:p>
+    <w:p>
+      <w:r>
+        <w:rPr>
+          <w:b w:val="0"/>
+        </w:rPr>
+        <w:t>项目右上角点击“动态 HTML”。选择“整个项目”，或先关闭窗口、在工作台勾选多页，再选择“选中的页面”。一次支持 1–500 页，按原项目页序转换；所选范围如有未生成图片的页，会提示先补齐。已有演示可在窗口上方切换，也可新建另一份转换。</w:t>
+      </w:r>
+    </w:p>
+    <w:p>
+      <w:r>
+        <w:rPr>
+          <w:b w:val="0"/>
+        </w:rPr>
+        <w:t>系统识别图片里的中英文文字及排版，把文字还原为 HTML，并分离边界明确的照片、插图和图形。文字后的高亮底色、线条等尽可能保留；复杂交叠、内部带文字或无法可靠分离的图形保留在背景中。转换结果独立保存，原图、讲稿、历史及“导出 PPT”保持不变。转换使用当时的图片快照，后来改稿或换图不会自动更新已有演示。</w:t>
+      </w:r>
+    </w:p>
+    <w:p>
+      <w:r>
+        <w:rPr>
+          <w:b w:val="0"/>
+        </w:rPr>
+        <w:t>每页需要一次内容分析；复杂背景还可能调用一次图片编辑，服务必须支持带图片与 mask 的 Images Edits。费用由模型服务收取，线上图片修复计入图片额度。开始后可关闭窗口继续后台转换；失败可只重试这一页，或继续所有未完成页。停止保留完成的页面与已完成的识别；服务中断后也要主动点击继续，才会再调用模型。已发送的请求即使停止也可能计费。</w:t>
+      </w:r>
+    </w:p>
+    <w:p>
+      <w:r>
+        <w:rPr>
+          <w:b w:val="0"/>
+        </w:rPr>
+        <w:t>转换完成后对照原图检查，点击预览中的文字选中图层，可修改内容、黑体或宋体、颜色、坐标、宽高、字重及出场动效。“按原图字形边界拟合”会匹配实际字形宽高；手动改字号自动关闭拟合。文字来自图片识别，特殊字形和复杂背景可能有误差；可导入拥有嵌入与分享授权的 WOFF2 原稿字体，最多 8 MB，再为相应文字层选择该字体。移动图层不会重新清理底图，底图清理范围仍按最初识别位置。</w:t>
+      </w:r>
+    </w:p>
+    <w:p>
+      <w:r>
+        <w:rPr>
+          <w:b w:val="0"/>
+        </w:rPr>
+        <w:t>同一步骤的图文一起出现，步骤 0 用于开场，步骤 1、2 等用于随后论点；可调上浮、淡入、横向揭示、轻推近、线条展开或静止，以及延迟、时长。保存后标记该页已校对。校准、播放和下载不调用模型。未保存校准时会阻止切页与关闭，先保存或撤销；其他窗口已修改时会阻止覆盖并保留当前输入。</w:t>
+      </w:r>
+    </w:p>
+    <w:p>
+      <w:r>
+        <w:rPr>
+          <w:b w:val="0"/>
+        </w:rPr>
+        <w:t>点击“播放本页”或“播放全部”，也可下载单个 HTML。图片和所用字体内嵌在文件中，断网也能播放；默认不含讲稿，勾选“HTML 包含演讲备注”后才附带备注。请核对图片与备注的分享范围。</w:t>
+      </w:r>
+    </w:p>
+    <w:p>
+      <w:r>
+        <w:rPr>
+          <w:b w:val="0"/>
+        </w:rPr>
+        <w:t>播放时用方向键、空格或 Page Up/Down 翻页，Home/End 跳到首尾，手机可横向滑动。可切换整页播放与逐步讲述，也可设置 5、10、20、30 秒自动播放。F 全屏，R 重播，G 总览，N 备注，B 黑屏，P 自动播放或暂停；Esc 关闭浮层并暂停。离开浏览器标签页时自动暂停，系统设置减少动态效果时直接显示内容。</w:t>
+      </w:r>
+    </w:p>
+    <w:p>
+      <w:r>
+        <w:rPr>
+          <w:b w:val="0"/>
+        </w:rPr>
+        <w:t>三张真实生成页面已在 macOS Chrome 中完成转换和视觉检查，包含九张照片的独立分层；模拟测试覆盖失败续做、停止、离线播放与原项目隔离。特殊字体无法仅凭图片保证完全一致；复杂背景、其他服务商和超大项目仍需先做少量页面验证。Windows/Linux 未完成本功能实机验收。此入口只转换本程序已生成页面，不导入外部 PPTX。</w:t>
+      </w:r>
+    </w:p>
+    <w:p>
+      <w:pPr>
         <w:pStyle w:val="Heading1"/>
         <w:pageBreakBefore/>
       </w:pPr>
@@ -2429,7 +2504,7 @@
         <w:rPr>
           <w:b w:val="0"/>
         </w:rPr>
-        <w:t>：项目、风格、原文、页面方案、历史与任务。</w:t>
+        <w:t>：项目、风格、原文、页面方案、历史、任务及动态演示图层和导入字体。</w:t>
       </w:r>
     </w:p>
     <w:p>
@@ -2448,7 +2523,7 @@
         <w:rPr>
           <w:b w:val="0"/>
         </w:rPr>
-        <w:t>：参考图、内容附件和生成图片。</w:t>
+        <w:t>：参考图、内容附件、生成图片及动态演示背景和分离图层。</w:t>
       </w:r>
     </w:p>
     <w:p>

</xml_diff>

<commit_message>
feat: expose full-project and selected-page redesign controls
</commit_message>
<xml_diff>
--- a/docs/AutoPPT-安装与使用说明.docx
+++ b/docs/AutoPPT-安装与使用说明.docx
@@ -1969,6 +1969,33 @@
           <w:b w:val="0"/>
         </w:rPr>
         <w:t>逐页修改后可提交后台任务，再编辑其他页，最多同时执行 4 项，超出自动排队。手动拆分立即保存新页，每张新图独立排队；制作只锁定对应页。合并方案只锁定来源页，追加讲稿只锁定未完成页，同一项目的追加段落按顺序制作。其他空闲页可改稿、重绘、拆分，也可提交下一段。正在制作的本页可先写草稿，完成后再提交；离开时提示未提交内容。已有拆分或合并方案在来源页空闲时即可确认，其他页任务不影响。确认时显示提交状态，失败提示仅属于本次窗口，重新打开会清除旧提示。切换风格和 PPT 导出仍需项目空闲，单独下载已保存逐字稿无需等待出图。旧图保留，失败可重试；实际提速取决于服务商额度。弹窗外部点击或拖动不会关闭弹窗；请用关闭、取消按钮或 Esc 键。</w:t>
+      </w:r>
+    </w:p>
+    <w:p>
+      <w:pPr>
+        <w:pStyle w:val="Heading2"/>
+      </w:pPr>
+      <w:r>
+        <w:rPr>
+          <w:b w:val="0"/>
+        </w:rPr>
+        <w:t>全部或选择几页重新设计</w:t>
+      </w:r>
+    </w:p>
+    <w:p>
+      <w:r>
+        <w:rPr>
+          <w:b w:val="0"/>
+        </w:rPr>
+        <w:t>点击项目右上角“重新设计”。选择“全部页面重新设计”会包含整个项目，不受当前查看段落影响；选择“选择几页重新设计”后，直接勾选缩略图，也可“全选可重做页面”或“清空选择”。页面卡片左上角的多选框始终显示，勾选后也能从底栏“重新设计所选 N 页”进入，原有勾选会带入窗口。</w:t>
+      </w:r>
+    </w:p>
+    <w:p>
+      <w:r>
+        <w:rPr>
+          <w:b w:val="0"/>
+        </w:rPr>
+        <w:t>核对窗口里的当前风格、页码和数量，再点击“开始重新设计 N 页”。这时才会调用模型并产生费用；取消不会生成。使用已保存的讲稿、内容附件、风格和配色重新出图，成功后旧图存入历史，失败保留旧图。正在制作的页不能重复提交，可以选择其他空闲页。此操作重做 PPT 图片；动态 HTML 仍从独立入口转换。</w:t>
       </w:r>
     </w:p>
     <w:p>

</xml_diff>

<commit_message>
feat: add narrated PPT playback and speaker voice cloning
</commit_message>
<xml_diff>
--- a/docs/AutoPPT-安装与使用说明.docx
+++ b/docs/AutoPPT-安装与使用说明.docx
@@ -18,7 +18,7 @@
         <w:rPr>
           <w:b w:val="0"/>
         </w:rPr>
-        <w:t>适用版本：2026 年 10 月 5 日的仓库代码。</w:t>
+        <w:t>适用版本：2026 年 10 月 6 日的仓库代码。</w:t>
       </w:r>
     </w:p>
     <w:p>
@@ -2370,6 +2370,175 @@
     </w:p>
     <w:p>
       <w:pPr>
+        <w:pStyle w:val="Heading2"/>
+      </w:pPr>
+      <w:r>
+        <w:rPr>
+          <w:b w:val="0"/>
+        </w:rPr>
+        <w:t>播放 PPT 并自动讲述</w:t>
+      </w:r>
+    </w:p>
+    <w:p>
+      <w:r>
+        <w:rPr>
+          <w:b w:val="0"/>
+        </w:rPr>
+        <w:t>本机版打开演讲项目，点击顶部“播放演讲”。可以直接选择“仅放映 PPT”，使用前后翻页按钮或方向键播放已有页面，点击“全屏”进入正式放映，按 Esc 返回设置。播放器可以查看逐页讲稿，不需要再次生成图片。</w:t>
+      </w:r>
+    </w:p>
+    <w:p>
+      <w:r>
+        <w:rPr>
+          <w:b w:val="0"/>
+        </w:rPr>
+        <w:t xml:space="preserve">需要自动口播时，先在“模型设置”中找到“演讲语音 · MiniMax”，填写语音 API Key 并保存。默认接口为 </w:t>
+      </w:r>
+      <w:r>
+        <w:rPr>
+          <w:rFonts w:ascii="Menlo" w:hAnsi="Menlo"/>
+          <w:b w:val="0"/>
+          <w:sz w:val="20"/>
+        </w:rPr>
+        <w:t>https://api.minimax.cn/v1</w:t>
+      </w:r>
+      <w:r>
+        <w:rPr>
+          <w:b w:val="0"/>
+        </w:rPr>
+        <w:t xml:space="preserve">，模型为 </w:t>
+      </w:r>
+      <w:r>
+        <w:rPr>
+          <w:rFonts w:ascii="Menlo" w:hAnsi="Menlo"/>
+          <w:b w:val="0"/>
+          <w:sz w:val="20"/>
+        </w:rPr>
+        <w:t>speech-2.8-hd</w:t>
+      </w:r>
+      <w:r>
+        <w:rPr>
+          <w:b w:val="0"/>
+        </w:rPr>
+        <w:t>。这是独立的 MiniMax 原生语音连接，不沿用内容和图片模型的 Key；更换服务地址需要重新填写密钥。保存设置不会调用付费模型。</w:t>
+      </w:r>
+    </w:p>
+    <w:p>
+      <w:pPr>
+        <w:ind w:left="288" w:hanging="288"/>
+      </w:pPr>
+      <w:r>
+        <w:rPr>
+          <w:b w:val="0"/>
+        </w:rPr>
+        <w:t>1. 回到“播放演讲”，选择播报男声、新闻女声、电台男主播或温柔学姐，也可选择自己创建的声音。</w:t>
+      </w:r>
+    </w:p>
+    <w:p>
+      <w:pPr>
+        <w:ind w:left="288" w:hanging="288"/>
+      </w:pPr>
+      <w:r>
+        <w:rPr>
+          <w:b w:val="0"/>
+        </w:rPr>
+        <w:t>2. 设置整体情绪和语速。默认“随文表达”由语音模型根据文本决定起伏；也可以单独为当前页选择平稳讲述、热情愉悦、低沉感怀或惊喜强调。</w:t>
+      </w:r>
+    </w:p>
+    <w:p>
+      <w:pPr>
+        <w:ind w:left="288" w:hanging="288"/>
+      </w:pPr>
+      <w:r>
+        <w:rPr>
+          <w:b w:val="0"/>
+        </w:rPr>
+        <w:t>3. 点击“试听本页开头”，再点击音频播放按钮试听。试听最多使用本页开头 180 字，会调用语音服务。</w:t>
+      </w:r>
+    </w:p>
+    <w:p>
+      <w:pPr>
+        <w:ind w:left="288" w:hanging="288"/>
+      </w:pPr>
+      <w:r>
+        <w:rPr>
+          <w:b w:val="0"/>
+        </w:rPr>
+        <w:t>4. 满意后点击“生成整场口播”。1–500 页需都有画面和非空讲稿；系统逐页、逐段合成并保存。出错后停止后续请求，已完成的声音保留，可点击“继续未完成的页面”。</w:t>
+      </w:r>
+    </w:p>
+    <w:p>
+      <w:pPr>
+        <w:ind w:left="288" w:hanging="288"/>
+      </w:pPr>
+      <w:r>
+        <w:rPr>
+          <w:b w:val="0"/>
+        </w:rPr>
+        <w:t>5. 全部完成后点击“开始口播”。每页按完整讲稿讲述，长页多个片段依次播放，最后一段结束才翻到下一页。可暂停、继续、跳页或拖动当前片段进度；讲到末页自动停止，切换到其他浏览器标签页会暂停。</w:t>
+      </w:r>
+    </w:p>
+    <w:p>
+      <w:r>
+        <w:rPr>
+          <w:b w:val="0"/>
+        </w:rPr>
+        <w:t>口播使用生成时的画面与讲稿快照。之后改稿、换图或调整页序时，点击“载入当前项目”，检查后重新生成；原有口播仍可从“已保存的口播”中选择。相同服务账号、模型、文本、音色、情绪与语速的音频会复用，重复播放不计模型费用。选择新声音或修改情绪后，先重新生成，才会按新设置播放。服务中断后不会自动恢复语音请求，退出 App 时也会识别正在生成的语音任务。</w:t>
+      </w:r>
+    </w:p>
+    <w:p>
+      <w:pPr>
+        <w:pStyle w:val="Heading2"/>
+      </w:pPr>
+      <w:r>
+        <w:rPr>
+          <w:b w:val="0"/>
+        </w:rPr>
+        <w:t>采集自己的声音</w:t>
+      </w:r>
+    </w:p>
+    <w:p>
+      <w:r>
+        <w:rPr>
+          <w:b w:val="0"/>
+        </w:rPr>
+        <w:t>在播放设置中展开“采集演讲者的声音”。安静环境下自然讲述 30–60 秒；可以点击“开始录音”，也可以上传已有的 WAV、MP3 或 M4A。音频需在 10 秒至 5 分钟之间、20 MB 以内；直接录音最多 2 分钟，结束后可以先在本机试听，过短录音会提示重新录制。</w:t>
+      </w:r>
+    </w:p>
+    <w:p>
+      <w:r>
+        <w:rPr>
+          <w:b w:val="0"/>
+        </w:rPr>
+        <w:t>Mac App 首次录音需要系统麦克风授权。若拒绝过，请在系统设置的“隐私与安全性 → 麦克风”允许 AutoPPT，随后重新打开 App；也可以直接上传录音。录音只在主动点击开始时开启，结束或关闭播放器时停止。</w:t>
+      </w:r>
+    </w:p>
+    <w:p>
+      <w:r>
+        <w:rPr>
+          <w:b w:val="0"/>
+        </w:rPr>
+        <w:t>填写声音名称，勾选本人声音或已取得演讲者授权的确认项，再点击“创建我的声音”。此时录音才上传到已配置的语音供应商，原始录音不写入本机项目。创建成功后选择新声音，先试听，再生成口播。声音复刻保留说话人的音色，情绪还需结合讲稿和逐页设置试听调整，不保证一次就达到演讲者本人表现。</w:t>
+      </w:r>
+    </w:p>
+    <w:p>
+      <w:r>
+        <w:rPr>
+          <w:b w:val="0"/>
+        </w:rPr>
+        <w:t>MiniMax 声音复刻要求先完成供应商平台实名认证；复刻、首次使用及语音生成可能分别计费，请查看自己的供应商账号。创建后 7 天内至少正式调用一次，避免未使用音色被供应商清理。复刻音色保存在供应商账号中，更换 API Key 可能需要重新采集；已经生成的本机音频仍能播放。</w:t>
+      </w:r>
+    </w:p>
+    <w:p>
+      <w:r>
+        <w:rPr>
+          <w:b w:val="0"/>
+        </w:rPr>
+        <w:t>当前语音只在本机产品内播放，PPTX 与动态 HTML 导出不包含口播，也不导入外部 PPTX。自动化模拟测试覆盖播放同步、缓存、失败续做、停止和恢复；未调用收费模型验证真实中文情感、声音相似度，Mac 麦克风系统弹窗、其他电脑和 Windows/Linux 仍待实际验收。</w:t>
+      </w:r>
+    </w:p>
+    <w:p>
+      <w:pPr>
         <w:pStyle w:val="Heading1"/>
         <w:pageBreakBefore/>
       </w:pPr>
@@ -2569,7 +2738,54 @@
         <w:rPr>
           <w:b w:val="0"/>
         </w:rPr>
-        <w:t>：模型连接配置与密钥。</w:t>
+        <w:t>：内容与图片模型连接配置及密钥。</w:t>
+      </w:r>
+    </w:p>
+    <w:p>
+      <w:pPr>
+        <w:pStyle w:val="ListBullet"/>
+      </w:pPr>
+      <w:r>
+        <w:rPr>
+          <w:rFonts w:ascii="Menlo" w:hAnsi="Menlo"/>
+          <w:b w:val="0"/>
+          <w:sz w:val="20"/>
+        </w:rPr>
+        <w:t>speech-settings.json</w:t>
+      </w:r>
+      <w:r>
+        <w:rPr>
+          <w:b w:val="0"/>
+        </w:rPr>
+        <w:t>：语音服务配置与密钥；</w:t>
+      </w:r>
+      <w:r>
+        <w:rPr>
+          <w:rFonts w:ascii="Menlo" w:hAnsi="Menlo"/>
+          <w:b w:val="0"/>
+          <w:sz w:val="20"/>
+        </w:rPr>
+        <w:t>speech-audio/</w:t>
+      </w:r>
+      <w:r>
+        <w:rPr>
+          <w:b w:val="0"/>
+        </w:rPr>
+        <w:t xml:space="preserve">：已生成的口播音频，语音演示和音色标识保存在 </w:t>
+      </w:r>
+      <w:r>
+        <w:rPr>
+          <w:rFonts w:ascii="Menlo" w:hAnsi="Menlo"/>
+          <w:b w:val="0"/>
+          <w:sz w:val="20"/>
+        </w:rPr>
+        <w:t>autoppt.sqlite</w:t>
+      </w:r>
+      <w:r>
+        <w:rPr>
+          <w:b w:val="0"/>
+        </w:rPr>
+        <w:t>。</w:t>
       </w:r>
     </w:p>
     <w:p>

</xml_diff>

<commit_message>
fix: serve saved narration from hidden workspaces and retry playback
</commit_message>
<xml_diff>
--- a/docs/AutoPPT-安装与使用说明.docx
+++ b/docs/AutoPPT-安装与使用说明.docx
@@ -18,7 +18,7 @@
         <w:rPr>
           <w:b w:val="0"/>
         </w:rPr>
-        <w:t>适用版本：2026 年 10 月 6 日的仓库代码。</w:t>
+        <w:t>适用版本：2026 年 10 月 7 日的仓库代码。</w:t>
       </w:r>
     </w:p>
     <w:p>
@@ -2484,6 +2484,28 @@
           <w:b w:val="0"/>
         </w:rPr>
         <w:t>口播使用生成时的画面与讲稿快照。之后改稿、换图或调整页序时，点击“载入当前项目”，检查后重新生成；原有口播仍可从“已保存的口播”中选择。相同服务账号、模型、文本、音色、情绪与语速的音频会复用，重复播放不计模型费用。选择新声音或修改情绪后，先重新生成，才会按新设置播放。服务中断后不会自动恢复语音请求，退出 App 时也会识别正在生成的语音任务。</w:t>
+      </w:r>
+    </w:p>
+    <w:p>
+      <w:r>
+        <w:rPr>
+          <w:b w:val="0"/>
+        </w:rPr>
+        <w:t xml:space="preserve">播放器会显示“音频已生成 X/Y 页”、总时长和本页时长；“正在读取”表示音频已生成、浏览器正在加载。读取失败时先点击“重新读取音频”，只加载已保存文件，不重新合成或计费。2026-10-07 已修复 </w:t>
+      </w:r>
+      <w:r>
+        <w:rPr>
+          <w:rFonts w:ascii="Menlo" w:hAnsi="Menlo"/>
+          <w:b w:val="0"/>
+          <w:sz w:val="20"/>
+        </w:rPr>
+        <w:t>.local</w:t>
+      </w:r>
+      <w:r>
+        <w:rPr>
+          <w:b w:val="0"/>
+        </w:rPr>
+        <w:t xml:space="preserve"> 目录中音频存在却无法读取的问题；使用旧版时，等生成任务结束后更新并重启后台、刷新页面，再选择已保存的口播，不必重新生成整场。</w:t>
       </w:r>
     </w:p>
     <w:p>

</xml_diff>

<commit_message>
fix(speech): pace MiniMax requests and retry explicit rate limits
</commit_message>
<xml_diff>
--- a/docs/AutoPPT-安装与使用说明.docx
+++ b/docs/AutoPPT-安装与使用说明.docx
@@ -2464,7 +2464,7 @@
         <w:rPr>
           <w:b w:val="0"/>
         </w:rPr>
-        <w:t>4. 满意后点击“生成整场口播”。1–500 页需都有画面和非空讲稿；系统逐页、逐段合成并保存。出错后停止后续请求，已完成的声音保留，可点击“继续未完成的页面”。</w:t>
+        <w:t>4. 满意后点击“生成整场口播”。1–500 页需都有画面和非空讲稿；系统逐页、逐段合成并保存。限流时等待后有限重试，其他错误停止后续请求；已完成的声音保留，可点击“继续未完成的页面”。</w:t>
       </w:r>
     </w:p>
     <w:p>
@@ -2506,6 +2506,14 @@
           <w:b w:val="0"/>
         </w:rPr>
         <w:t xml:space="preserve"> 目录中的音频读取问题。使用旧版时，等生成任务结束后更新并重启后台，再刷新页面；新版播放器会绕过更新期间缓存的读取错误，已有口播无需重新生成。</w:t>
+      </w:r>
+    </w:p>
+    <w:p>
+      <w:r>
+        <w:rPr>
+          <w:b w:val="0"/>
+        </w:rPr>
+        <w:t>1002 表示请求频率超限，1008 表示余额不足。限流后自动等待，最多重试 3 次，可随时停止，已完成音频保留；超时或余额、权限错误不自动重试。</w:t>
       </w:r>
     </w:p>
     <w:p>

</xml_diff>

<commit_message>
feat: add spoken-text review, narrated HTML and portable projects
</commit_message>
<xml_diff>
--- a/docs/AutoPPT-安装与使用说明.docx
+++ b/docs/AutoPPT-安装与使用说明.docx
@@ -1347,7 +1347,7 @@
         <w:rPr>
           <w:b w:val="0"/>
         </w:rPr>
-        <w:t>4. 先点击“报告”，确认原稿正文与页面备注逐字一致；再点击项目右上角“导出 PPT”，再点击“下载 PPT 与逐字稿”。解压 ZIP 后打开 PPTX 和独立逐字稿 Markdown，确认页序、图片和逐页备注正确。备注可在 PowerPoint 的备注区域或演讲者视图查看。</w:t>
+        <w:t>4. 先点击“报告”，确认原稿正文与页面备注逐字一致；再点击项目右上角“导出”，再点击“下载 PPT 与逐字稿”。解压 ZIP 后打开 PPTX 和独立逐字稿 Markdown，确认页序、图片和逐页备注正确。备注可在 PowerPoint 的备注区域或演讲者视图查看。</w:t>
       </w:r>
     </w:p>
     <w:p>
@@ -2140,7 +2140,7 @@
         <w:rPr>
           <w:b w:val="0"/>
         </w:rPr>
-        <w:t>项目右上角，“导出 PPT”旁有“报告”。报告显示四项：已提交原文字数、页面总数、页面备注字数、演说稿字数，并显示已有画面与待生成的页数。</w:t>
+        <w:t>项目右上角，“导出”旁有“报告”。报告显示四项：已提交原文字数、页面总数、页面备注字数、演说稿字数，并显示已有画面与待生成的页数。</w:t>
       </w:r>
     </w:p>
     <w:p>
@@ -2317,7 +2317,7 @@
         <w:rPr>
           <w:b w:val="0"/>
         </w:rPr>
-        <w:t>系统识别图片里的中英文文字及排版，把文字还原为 HTML，并分离边界明确的照片、插图和图形。文字后的高亮底色、线条等尽可能保留；复杂交叠、内部带文字或无法可靠分离的图形保留在背景中。转换结果独立保存，原图、讲稿、历史及“导出 PPT”保持不变。转换使用当时的图片快照，后来改稿或换图不会自动更新已有演示。</w:t>
+        <w:t>系统识别图片里的中英文文字及排版，把文字还原为 HTML，并分离边界明确的照片、插图和图形。文字后的高亮底色、线条等尽可能保留；复杂交叠、内部带文字或无法可靠分离的图形保留在背景中。转换结果独立保存，原图、讲稿、历史及“导出”保持不变。转换使用当时的图片快照，后来改稿或换图不会自动更新已有演示。</w:t>
       </w:r>
     </w:p>
     <w:p>
@@ -2453,7 +2453,7 @@
         <w:rPr>
           <w:b w:val="0"/>
         </w:rPr>
-        <w:t>3. 点击“试听本页开头”，再点击音频播放按钮试听。试听最多使用本页开头 180 字，会调用语音服务。</w:t>
+        <w:t>3. 先检查“实际口播文本”。系统过滤常见章节标签、附件标记和舞台提示，可直接修改后保存；原稿不变。留空的页面不口播，放映时停留 3 秒。点击“试听本页开头”，再点击音频播放按钮试听。试听最多使用本页开头 180 字，会调用语音服务。</w:t>
       </w:r>
     </w:p>
     <w:p>
@@ -2464,7 +2464,7 @@
         <w:rPr>
           <w:b w:val="0"/>
         </w:rPr>
-        <w:t>4. 满意后点击“生成整场口播”。1–500 页需都有画面和非空讲稿；系统逐页、逐段合成并保存。限流时等待后有限重试，其他错误停止后续请求；已完成的声音保留，可点击“继续未完成的页面”。</w:t>
+        <w:t>4. 满意后点击“生成整场口播”。1–500 页需都有画面；系统逐页、逐段合成并保存。限流时等待后有限重试，其他错误停止后续请求；已完成的声音保留，可点击“继续未完成的页面”。</w:t>
       </w:r>
     </w:p>
     <w:p>
@@ -2475,7 +2475,7 @@
         <w:rPr>
           <w:b w:val="0"/>
         </w:rPr>
-        <w:t>5. 全部完成后点击“开始口播”。每页按完整讲稿讲述，长页多个片段依次播放，最后一段结束才翻到下一页。可暂停、继续、跳页或拖动当前片段进度；讲到末页自动停止，切换到其他浏览器标签页会暂停。</w:t>
+        <w:t>5. 全部完成后点击“开始口播”。每页按检查后的口播文本讲述，长页多个片段依次播放，最后一段结束才翻到下一页。可暂停、继续、跳页或拖动当前片段进度；讲到末页自动停止，切换到其他浏览器标签页会暂停。</w:t>
       </w:r>
     </w:p>
     <w:p>
@@ -2524,7 +2524,7 @@
         <w:rPr>
           <w:b w:val="0"/>
         </w:rPr>
-        <w:t>采集自己的声音</w:t>
+        <w:t>导出可离线口播的 HTML</w:t>
       </w:r>
     </w:p>
     <w:p>
@@ -2532,7 +2532,7 @@
         <w:rPr>
           <w:b w:val="0"/>
         </w:rPr>
-        <w:t>在播放设置中展开“采集演讲者的声音”。安静环境下自然讲述 30–60 秒；可以点击“开始录音”，也可以上传已有的 WAV、MP3 或 M4A。音频需在 10 秒至 5 分钟之间、20 MB 以内；直接录音最多 2 分钟，结束后可以先在本机试听，过短录音会提示重新录制。</w:t>
+        <w:t>无需动画时，在项目“导出”选择“静态 HTML · 可含口播”，再选择已完成且与当前画面、讲稿一致的口播版本。在播放设置中也可直接“导出静态 HTML · 含口播”，保留该版本的画面和声音。需要动画时，在“动态 HTML”窗口底部选择“HTML 口播版本”，再下载 HTML。</w:t>
       </w:r>
     </w:p>
     <w:p>
@@ -2540,7 +2540,7 @@
         <w:rPr>
           <w:b w:val="0"/>
         </w:rPr>
-        <w:t>Mac App 首次录音需要系统麦克风授权。若拒绝过，请在系统设置的“隐私与安全性 → 麦克风”允许 AutoPPT，随后重新打开 App；也可以直接上传录音。录音只在主动点击开始时开启，结束或关闭播放器时停止。</w:t>
+        <w:t>图片、字体和音频均内嵌，文件可带到其他电脑播放，不依赖本机地址，也不会再次生成或计费。打开后尝试自动口播；浏览器拦截声音时，点击一次“开始演讲”。长页片段依次播放，讲完翻页，末页停止；可暂停、继续和跳页。无口播页停留 3 秒，动态元素按原动效出现，暂不逐句对齐。</w:t>
       </w:r>
     </w:p>
     <w:p>
@@ -2548,15 +2548,18 @@
         <w:rPr>
           <w:b w:val="0"/>
         </w:rPr>
-        <w:t>填写声音名称，勾选本人声音或已取得演讲者授权的确认项，再点击“创建我的声音”。此时录音才上传到已配置的语音供应商，原始录音不写入本机项目。创建成功后选择新声音，先试听，再生成口播。声音复刻保留说话人的音色，情绪还需结合讲稿和逐页设置试听调整，不保证一次就达到演讲者本人表现。</w:t>
+        <w:t>旧版音频已读入的标题或提示无法靠文本过滤直接消除。在播放设置点击“重新识别整场口播”，检查后生成新版本；只有变化的文本需重新合成，旧版本保留。常见标记按规则识别，不保证识别所有语义含糊的说明，请检查实际口播文本。</w:t>
       </w:r>
     </w:p>
     <w:p>
-      <w:r>
-        <w:rPr>
-          <w:b w:val="0"/>
-        </w:rPr>
-        <w:t>MiniMax 声音复刻要求先完成供应商平台实名认证；复刻、首次使用及语音生成可能分别计费，请查看自己的供应商账号。创建后 7 天内至少正式调用一次，避免未使用音色被供应商清理。复刻音色保存在供应商账号中，更换 API Key 可能需要重新采集；已经生成的本机音频仍能播放。</w:t>
+      <w:pPr>
+        <w:pStyle w:val="Heading2"/>
+      </w:pPr>
+      <w:r>
+        <w:rPr>
+          <w:b w:val="0"/>
+        </w:rPr>
+        <w:t>采集自己的声音</w:t>
       </w:r>
     </w:p>
     <w:p>
@@ -2564,7 +2567,39 @@
         <w:rPr>
           <w:b w:val="0"/>
         </w:rPr>
-        <w:t>当前语音只在本机产品内播放，PPTX 与动态 HTML 导出不包含口播，也不导入外部 PPTX。2026-10-06 已用真实 MiniMax 服务生成四个默认音色及全部情绪选项的中文短样，并在 Chrome 验证真实音频自动翻页、暂停和缓存复用。听感与长篇表现仍需人工试听；声音复刻相似度、Mac 麦克风系统弹窗、其他电脑和 Windows/Linux 尚未验收。模拟测试另覆盖失败续做、停止和恢复。</w:t>
+        <w:t>在播放设置中展开“采集演讲者的声音”。安静环境下自然讲述 30–60 秒；可以点击“开始录音”，也可以上传已有的 WAV、MP3 或 M4A。音频需在 10 秒至 5 分钟之间、20 MB 以内；直接录音最多 2 分钟，结束后可以先在本机试听，过短录音会提示重新录制。</w:t>
+      </w:r>
+    </w:p>
+    <w:p>
+      <w:r>
+        <w:rPr>
+          <w:b w:val="0"/>
+        </w:rPr>
+        <w:t>Mac App 首次录音需要系统麦克风授权。若拒绝过，请在系统设置的“隐私与安全性 → 麦克风”允许 AutoPPT，随后重新打开 App；也可以直接上传录音。录音只在主动点击开始时开启，结束或关闭播放器时停止。</w:t>
+      </w:r>
+    </w:p>
+    <w:p>
+      <w:r>
+        <w:rPr>
+          <w:b w:val="0"/>
+        </w:rPr>
+        <w:t>填写声音名称，勾选本人声音或已取得演讲者授权的确认项，再点击“创建我的声音”。此时录音才上传到已配置的语音供应商，原始录音不写入本机项目。创建成功后选择新声音，先试听，再生成口播。声音复刻保留说话人的音色，情绪还需结合讲稿和逐页设置试听调整，不保证一次就达到演讲者本人表现。</w:t>
+      </w:r>
+    </w:p>
+    <w:p>
+      <w:r>
+        <w:rPr>
+          <w:b w:val="0"/>
+        </w:rPr>
+        <w:t>MiniMax 声音复刻要求先完成供应商平台实名认证；复刻、首次使用及语音生成可能分别计费，请查看自己的供应商账号。创建后 7 天内至少正式调用一次，避免未使用音色被供应商清理。复刻音色保存在供应商账号中，更换 API Key 可能需要重新采集；已经生成的本机音频仍能播放。</w:t>
+      </w:r>
+    </w:p>
+    <w:p>
+      <w:r>
+        <w:rPr>
+          <w:b w:val="0"/>
+        </w:rPr>
+        <w:t>静态与动态 HTML 可包含口播；PPTX 暂不包含音频，也不导入外部 PPTX。2026-10-06 已用真实 MiniMax 服务生成四个默认音色及全部情绪选项的中文短样，并在 Chrome 验证真实音频自动翻页、暂停和缓存复用。听感与长篇表现仍需人工试听；声音复刻相似度、Mac 麦克风系统弹窗、其他电脑和 Windows/Linux 尚未验收。模拟测试另覆盖失败续做、停止和恢复。</w:t>
       </w:r>
     </w:p>
     <w:p>
@@ -2690,6 +2725,44 @@
           <w:b w:val="0"/>
         </w:rPr>
         <w:t>备份与换电脑</w:t>
+      </w:r>
+    </w:p>
+    <w:p>
+      <w:r>
+        <w:rPr>
+          <w:b w:val="0"/>
+        </w:rPr>
+        <w:t xml:space="preserve">迁移单个项目时，点击项目“导出 → 项目迁移包”，下载 </w:t>
+      </w:r>
+      <w:r>
+        <w:rPr>
+          <w:rFonts w:ascii="Menlo" w:hAnsi="Menlo"/>
+          <w:b w:val="0"/>
+          <w:sz w:val="20"/>
+        </w:rPr>
+        <w:t>.autoppt.zip</w:t>
+      </w:r>
+      <w:r>
+        <w:rPr>
+          <w:b w:val="0"/>
+        </w:rPr>
+        <w:t>。另一台电脑安装新版 AutoPPT 后，在“我的演讲”点击“导入项目包”，选择这个文件。每次导入创建新项目，不覆盖已有内容。</w:t>
+      </w:r>
+    </w:p>
+    <w:p>
+      <w:r>
+        <w:rPr>
+          <w:b w:val="0"/>
+        </w:rPr>
+        <w:t>迁移包包含保存的草稿、讲稿、图片与历史、内容附件、项目使用的风格与版本、动画图层和字体、已生成语音、声音标识及口播编辑文本。模型密钥与日志不导出，生成任务不自动恢复；继续生成时需在新电脑配置模型，复刻声音需使用有权限的 MiniMax 账号。已完成的图片与音频不需要重新生成。</w:t>
+      </w:r>
+    </w:p>
+    <w:p>
+      <w:r>
+        <w:rPr>
+          <w:b w:val="0"/>
+        </w:rPr>
+        <w:t>先等项目任务结束再导出，并确认草稿已保存。最多 500 页、960 MB 素材、32 MB 记录，单个素材最多 64 MB，导入 ZIP 最多 1 GB。包损坏、素材缺失或版本不支持时会提示，失败不会覆盖已有项目。本机隔离工作区往返迁移已验证，其他电脑及 Windows/Linux 尚未实测。</w:t>
       </w:r>
     </w:p>
     <w:p>

</xml_diff>

<commit_message>
feat(ia): integrate four project areas with portable and narrated exports
Apply aaff27c onto 4b1a1bf while preserving project import, speech-script
editing, narrated HTML, revision checks, and export safety restrictions.
Expose source packages and static HTML in delivery; share narrated motion
export options and handlers with the editor. Keep import on project home.
Update README and the synchronized Word guide for the four-area workflow.

Validation: npm run check (123 passed, 10 skipped; skip count unchanged);
node --test tests/project-ia-browser.test.mjs tests/portable-project.test.mjs
(6 passed, 0 skipped); guide --check; 18 rendered Word pages inspected.

(cherry picked from commit aaff27cad24dda3867b6124d54991e9e1e1e3d23)
</commit_message>
<xml_diff>
--- a/docs/AutoPPT-安装与使用说明.docx
+++ b/docs/AutoPPT-安装与使用说明.docx
@@ -81,7 +81,7 @@
         <w:rPr>
           <w:b w:val="0"/>
         </w:rPr>
-        <w:t xml:space="preserve"> 拖入“应用程序”再打开。App 无需账号、邀请码、Node 或服务器；第一次在“模型设置”配置内容理解与图片生成服务。项目保存在本机；调用模型时，相关文字和图片仍会发送到自己配置的服务商，并按服务商规则计费。</w:t>
+        <w:t xml:space="preserve"> 拖入“应用程序”再打开。App 无需账号、邀请码、Node 或服务器；第一次在“模型与服务”配置内容理解与图片生成服务。项目保存在本机；调用模型时，相关文字和图片仍会发送到自己配置的服务商，并按服务商规则计费。</w:t>
       </w:r>
     </w:p>
     <w:p>
@@ -181,7 +181,7 @@
         <w:rPr>
           <w:b w:val="0"/>
         </w:rPr>
-        <w:t>，安装包不包含他人的项目或 Key。App 不会自动迁移旧项目，原项目继续从浏览器版打开；当前没有自动迁移工具。</w:t>
+        <w:t>，安装包不包含他人的项目或 Key。App 不会自动迁移旧项目；可在浏览器版的交付中心导出项目源文件，再从 App 项目首页导入新副本。</w:t>
       </w:r>
     </w:p>
     <w:p>
@@ -690,7 +690,7 @@
         <w:rPr>
           <w:b w:val="0"/>
         </w:rPr>
-        <w:t>能看到“我的演讲”“风格库”“模型设置”即表示本机程序已经启动。首次运行没有个人项目，模型密钥也需要重新配置。</w:t>
+        <w:t>能看到“项目”“风格库”“模型与服务”即表示本机程序已经启动。首次运行没有个人项目，模型密钥也需要重新配置。</w:t>
       </w:r>
     </w:p>
     <w:p>
@@ -800,7 +800,7 @@
         <w:rPr>
           <w:b w:val="0"/>
         </w:rPr>
-        <w:t>打开“模型设置”，分别填写以下两个区域。两者可以使用同一家服务，但需要确认对应接口和模型都可用。</w:t>
+        <w:t>打开“模型与服务”，分别填写以下两个区域。两者可以使用同一家服务，但需要确认对应接口和模型都可用。</w:t>
       </w:r>
     </w:p>
     <w:tbl>
@@ -1347,7 +1347,7 @@
         <w:rPr>
           <w:b w:val="0"/>
         </w:rPr>
-        <w:t>4. 先点击“报告”，确认原稿正文与页面备注逐字一致；再点击项目右上角“导出”，再点击“下载 PPT 与逐字稿”。解压 ZIP 后打开 PPTX 和独立逐字稿 Markdown，确认页序、图片和逐页备注正确。备注可在 PowerPoint 的备注区域或演讲者视图查看。</w:t>
+        <w:t>4. 在交付中心先点击“查看制作报告”，确认原稿正文与页面备注逐字一致；再点击“导出 PPT”，然后点击“下载 PPT 与逐字稿”。解压 ZIP 后打开 PPTX 和独立逐字稿 Markdown，确认页序、图片和逐页备注正确。备注可在 PowerPoint 的备注区域或演讲者视图查看。</w:t>
       </w:r>
     </w:p>
     <w:p>
@@ -1374,7 +1374,7 @@
         <w:rPr>
           <w:b w:val="0"/>
         </w:rPr>
-        <w:t>点击侧栏“介绍”，在右侧阅读新版官网，左侧导航保留。“返回刚才的页面”会回到原编辑位置，未提交的表单保持；独立打开本机介绍页时提供“返回工作台”。页面先展示用途、风格作品和实际工作台，再纵向介绍风格制作、拆稿生成、逐页打磨、导出、操作步骤及常见问题。风格展示区可切换 6 套实际封面，支持键盘左右键；全部 13 套风格在产品内选择。截图点击可放大，按 Esc 或关闭按钮退出；手机可展开顶部导航，动效遵循系统“减少动态效果”设置。“开始使用”提供安装说明、源码 ZIP、Word 说明和 Markdown 快速指南。公开下载为源码，Mac 安装包目前为内部构建。浏览无需 API，实际生成需自行配置模型。</w:t>
+        <w:t>点击侧栏“帮助与介绍”，在右侧阅读新版官网，左侧导航保留。“返回刚才的页面”会回到原编辑位置，未提交的表单保持；独立打开本机介绍页时提供“返回工作台”。页面先展示用途、风格作品和实际工作台，再纵向介绍风格制作、拆稿生成、逐页打磨、导出、操作步骤及常见问题。风格展示区可切换 6 套实际封面，支持键盘左右键；全部 13 套风格在产品内选择。截图点击可放大，按 Esc 或关闭按钮退出；手机可展开顶部导航，动效遵循系统“减少动态效果”设置。“开始使用”提供安装说明、源码 ZIP、Word 说明和 Markdown 快速指南。公开下载为源码，Mac 安装包目前为内部构建。浏览无需 API，实际生成需自行配置模型。</w:t>
       </w:r>
     </w:p>
     <w:p>
@@ -1894,7 +1894,15 @@
         <w:rPr>
           <w:b w:val="0"/>
         </w:rPr>
-        <w:t>“本次制作”跟随实际制作任务：制作中显示当前及排队任务涉及的页面，没有进行中的任务时显示最近一次制作的页面，完成后仍保留在视图中。标签数字表示页数，卡片按整份演讲的当前顺序编号，插页后会随之更新。查看旧讲稿使用段落下拉框，“全部页面”查看完整演讲；尚无制作记录时显示“最近添加”。</w:t>
+        <w:t>项目分为“概览 → 制作台 → 演练中心 → 交付中心”，对应“写 → 做 → 练 → 交”。概览按当前状态给出一个下一步动作，来源版本不同的演示会单独提示。制作台顶部固定“继续添加讲稿”，内容视图为“页面 / 演说稿”，范围为“最近制作 / 全部页面 / 历史段落”。演练中心打开播放器和动态演示，交付中心集中报告与下载。</w:t>
+      </w:r>
+    </w:p>
+    <w:p>
+      <w:r>
+        <w:rPr>
+          <w:b w:val="0"/>
+        </w:rPr>
+        <w:t>“最近制作”跟随实际制作任务：制作中显示当前及排队任务涉及的页面，没有进行中的任务时显示最近一次制作的页面，完成后仍保留在视图中。标签数字表示页数，卡片按整份演讲的当前顺序编号，插页后会随之更新。查看旧讲稿使用段落下拉框，“全部页面”查看完整演讲；尚无制作记录时回退到最近添加的段落。</w:t>
       </w:r>
     </w:p>
     <w:p>
@@ -1987,7 +1995,7 @@
         <w:rPr>
           <w:b w:val="0"/>
         </w:rPr>
-        <w:t>点击项目右上角“重新设计”。选择“全部页面重新设计”会包含整个项目，不受当前查看段落影响；选择“选择几页重新设计”后，直接勾选缩略图，也可“全选可重做页面”或“清空选择”。页面卡片左上角的多选框始终显示，勾选后也能从底栏“重新设计所选 N 页”进入，原有勾选会带入窗口。</w:t>
+        <w:t>在制作台点击“重新设计”。选择“全部页面重新设计”会包含整个项目，不受当前查看段落影响；选择“选择几页重新设计”后，直接勾选缩略图，也可“全选可重做页面”或“清空选择”。页面卡片左上角的多选框始终显示，勾选后也能从底栏“重新设计所选 N 页”进入，原有勾选会带入窗口。</w:t>
       </w:r>
     </w:p>
     <w:p>
@@ -2140,7 +2148,7 @@
         <w:rPr>
           <w:b w:val="0"/>
         </w:rPr>
-        <w:t>项目右上角，“导出”旁有“报告”。报告显示四项：已提交原文字数、页面总数、页面备注字数、演说稿字数，并显示已有画面与待生成的页数。</w:t>
+        <w:t>在交付中心点击“查看制作报告”。报告显示四项：已提交原文字数、页面总数、页面备注字数、演说稿字数，并显示已有画面与待生成的页数。</w:t>
       </w:r>
     </w:p>
     <w:p>
@@ -2192,7 +2200,7 @@
         <w:rPr>
           <w:b w:val="0"/>
         </w:rPr>
-        <w:t>点击“下载 PPT 与逐字稿”会下载带版本号的 ZIP，其中有 PPTX 和独立逐字稿 Markdown。Markdown 按当前页序包含最新保存的完整讲稿，附页码，包含改稿、拆并页和插页结果；不使用提炼后的上屏文案，可作为新版本留存。两份文件来自同一份保存记录。</w:t>
+        <w:t>在交付中心点击“导出 PPT”，再点击“下载 PPT 与逐字稿”会下载带版本号的 ZIP，其中有 PPTX 和独立逐字稿 Markdown。Markdown 按当前页序包含最新保存的完整讲稿，附页码，包含改稿、拆并页和插页结果；不使用提炼后的上屏文案，可作为新版本留存。两份文件来自同一份保存记录。</w:t>
       </w:r>
     </w:p>
     <w:p>
@@ -2274,7 +2282,7 @@
         <w:rPr>
           <w:b w:val="0"/>
         </w:rPr>
-        <w:t>在“演说稿”区域点击“导出演说稿（Markdown）”，可以单独导出全部页面的最新完整正文，每页用 Markdown 二级标题标明页码。</w:t>
+        <w:t>在交付中心点击“导出演说稿（Markdown）”，可以单独导出全部页面的最新完整正文，每页用 Markdown 二级标题标明页码。</w:t>
       </w:r>
     </w:p>
     <w:p>
@@ -2309,7 +2317,7 @@
         <w:rPr>
           <w:b w:val="0"/>
         </w:rPr>
-        <w:t>项目右上角点击“动态 HTML”。选择“整个项目”，或先关闭窗口、在工作台勾选多页，再选择“选中的页面”。一次支持 1–500 页，按原项目页序转换；所选范围如有未生成图片的页，会提示先补齐。已有演示可在窗口上方切换，也可新建另一份转换。</w:t>
+        <w:t>在演练中心点击“打开动态演示”。选择“整个项目”，或先关闭窗口、在工作台勾选多页，再选择“选中的页面”。一次支持 1–500 页，按原项目页序转换；所选范围如有未生成图片的页，会提示先补齐。已有演示可在窗口上方切换，也可新建另一份转换。</w:t>
       </w:r>
     </w:p>
     <w:p>
@@ -2384,7 +2392,7 @@
         <w:rPr>
           <w:b w:val="0"/>
         </w:rPr>
-        <w:t>本机版打开演讲项目，点击顶部“播放演讲”。可以直接选择“仅放映 PPT”，使用前后翻页按钮或方向键播放已有页面，点击“全屏”进入正式放映，按 Esc 返回设置。播放器可以查看逐页讲稿，不需要再次生成图片。</w:t>
+        <w:t>本机版打开演讲项目，在演练中心点击“打开演讲播放器”。可以直接选择“仅放映 PPT”，使用前后翻页按钮或方向键播放已有页面，点击“全屏”进入正式放映，按 Esc 返回设置。播放器可以查看逐页讲稿，不需要再次生成图片。</w:t>
       </w:r>
     </w:p>
     <w:p>
@@ -2392,7 +2400,7 @@
         <w:rPr>
           <w:b w:val="0"/>
         </w:rPr>
-        <w:t xml:space="preserve">需要自动口播时，先在“模型设置”中找到“演讲语音 · MiniMax”，填写语音 API Key 并保存。默认接口为 </w:t>
+        <w:t xml:space="preserve">需要自动口播时，先在“模型与服务”中找到“演讲语音 · MiniMax”，填写语音 API Key 并保存。默认接口为 </w:t>
       </w:r>
       <w:r>
         <w:rPr>
@@ -2431,7 +2439,7 @@
         <w:rPr>
           <w:b w:val="0"/>
         </w:rPr>
-        <w:t>1. 回到“播放演讲”，选择播报男声、新闻女声、电台男主播或温柔学姐，也可选择自己创建的声音。</w:t>
+        <w:t>1. 回到演练中心并打开演讲播放器，选择播报男声、新闻女声、电台男主播或温柔学姐，也可选择自己创建的声音。</w:t>
       </w:r>
     </w:p>
     <w:p>
@@ -2532,7 +2540,7 @@
         <w:rPr>
           <w:b w:val="0"/>
         </w:rPr>
-        <w:t>无需动画时，在项目“导出”选择“静态 HTML · 可含口播”，再选择已完成且与当前画面、讲稿一致的口播版本。在播放设置中也可直接“导出静态 HTML · 含口播”，保留该版本的画面和声音。需要动画时，在“动态 HTML”窗口底部选择“HTML 口播版本”，再下载 HTML。</w:t>
+        <w:t>无需动画时，在交付中心点击“导出静态 HTML”，再选择已完成且与当前画面、讲稿一致的口播版本。在播放设置中也可直接“导出静态 HTML · 含口播”，保留该版本的画面和声音。需要动画时，在交付中心选择动态 HTML 交付版本与“HTML 口播版本”，也可在动态演示窗口底部选择口播，然后下载 HTML；两处均可选择是否包含演讲备注。</w:t>
       </w:r>
     </w:p>
     <w:p>
@@ -2732,7 +2740,7 @@
         <w:rPr>
           <w:b w:val="0"/>
         </w:rPr>
-        <w:t xml:space="preserve">迁移单个项目时，点击项目“导出 → 项目迁移包”，下载 </w:t>
+        <w:t xml:space="preserve">迁移单个项目时，在交付中心点击“导出项目源文件 → 下载项目迁移包”，下载 </w:t>
       </w:r>
       <w:r>
         <w:rPr>
@@ -2746,7 +2754,7 @@
         <w:rPr>
           <w:b w:val="0"/>
         </w:rPr>
-        <w:t>。另一台电脑安装新版 AutoPPT 后，在“我的演讲”点击“导入项目包”，选择这个文件。每次导入创建新项目，不覆盖已有内容。</w:t>
+        <w:t>。另一台电脑安装新版 AutoPPT 后，在项目首页点击“导入项目包”，选择这个文件。每次导入创建新项目，刷新列表并进入该项目的概览，不覆盖已有内容。PPTX、Markdown 和 HTML 是放映或交付文件；项目源文件才用于恢复编辑，不能相互替代。</w:t>
       </w:r>
     </w:p>
     <w:p>

</xml_diff>

<commit_message>
feat: add release identity and workspace capability diagnostics
</commit_message>
<xml_diff>
--- a/docs/AutoPPT-安装与使用说明.docx
+++ b/docs/AutoPPT-安装与使用说明.docx
@@ -638,7 +638,63 @@
         <w:rPr>
           <w:b w:val="0"/>
         </w:rPr>
-        <w:t xml:space="preserve"> 开始执行。不要直接在压缩包内运行，也不要复制其他电脑的 </w:t>
+        <w:t xml:space="preserve"> 开始执行。ZIP 不含 Git 记录，构建前需向维护者取得该源码对应的完整 40 位提交号：Mac 执行 </w:t>
+      </w:r>
+      <w:r>
+        <w:rPr>
+          <w:rFonts w:ascii="Menlo" w:hAnsi="Menlo"/>
+          <w:b w:val="0"/>
+          <w:sz w:val="20"/>
+        </w:rPr>
+        <w:t>export AUTOPPT_BUILD_GIT_SHA=完整提交号</w:t>
+      </w:r>
+      <w:r>
+        <w:rPr>
+          <w:b w:val="0"/>
+        </w:rPr>
+        <w:t xml:space="preserve">；Windows 命令提示符执行 </w:t>
+      </w:r>
+      <w:r>
+        <w:rPr>
+          <w:rFonts w:ascii="Menlo" w:hAnsi="Menlo"/>
+          <w:b w:val="0"/>
+          <w:sz w:val="20"/>
+        </w:rPr>
+        <w:t>set AUTOPPT_BUILD_GIT_SHA=完整提交号</w:t>
+      </w:r>
+      <w:r>
+        <w:rPr>
+          <w:b w:val="0"/>
+        </w:rPr>
+        <w:t xml:space="preserve">，再执行 </w:t>
+      </w:r>
+      <w:r>
+        <w:rPr>
+          <w:rFonts w:ascii="Menlo" w:hAnsi="Menlo"/>
+          <w:b w:val="0"/>
+          <w:sz w:val="20"/>
+        </w:rPr>
+        <w:t>npm run build</w:t>
+      </w:r>
+      <w:r>
+        <w:rPr>
+          <w:b w:val="0"/>
+        </w:rPr>
+        <w:t xml:space="preserve">。不能填写分支名 </w:t>
+      </w:r>
+      <w:r>
+        <w:rPr>
+          <w:rFonts w:ascii="Menlo" w:hAnsi="Menlo"/>
+          <w:b w:val="0"/>
+          <w:sz w:val="20"/>
+        </w:rPr>
+        <w:t>main</w:t>
+      </w:r>
+      <w:r>
+        <w:rPr>
+          <w:b w:val="0"/>
+        </w:rPr>
+        <w:t xml:space="preserve">。不要直接在压缩包内运行，也不要复制其他电脑的 </w:t>
       </w:r>
       <w:r>
         <w:rPr>
@@ -1383,6 +1439,49 @@
           <w:b w:val="0"/>
         </w:rPr>
         <w:t>截图使用隔离的演示项目自动采集，展示真实界面，不包含私人讲稿或密钥。介绍页随程序提供，本机地址为 http://127.0.0.1:4317/intro/；目前没有另外发布公网官网。</w:t>
+      </w:r>
+    </w:p>
+    <w:p>
+      <w:pPr>
+        <w:pStyle w:val="Heading2"/>
+      </w:pPr>
+      <w:r>
+        <w:rPr>
+          <w:b w:val="0"/>
+        </w:rPr>
+        <w:t>查看版本与工作区</w:t>
+      </w:r>
+    </w:p>
+    <w:p>
+      <w:r>
+        <w:rPr>
+          <w:b w:val="0"/>
+        </w:rPr>
+        <w:t>打开左侧“帮助与介绍”，点击“版本与工作区”。这里同时展示前端页面和后端服务的版本、短提交号、构建时间、接口版本与一致性状态，以及当前运行形态、工作区说明和能力矩阵。需要完整提交号时，将鼠标停在短提交号上。页面默认不显示内部绝对目录或密钥。</w:t>
+      </w:r>
+    </w:p>
+    <w:p>
+      <w:r>
+        <w:rPr>
+          <w:b w:val="0"/>
+        </w:rPr>
+        <w:t>本机浏览器工作区保存在本机服务中，项目不会随浏览器缓存清理而删除；Mac App 独立工作区与浏览器版分开，可从 App 菜单打开数据文件夹；hosted 账号工作区保存在托管服务中，由管理员管理，账号之间保持隔离。</w:t>
+      </w:r>
+    </w:p>
+    <w:p>
+      <w:r>
+        <w:rPr>
+          <w:b w:val="0"/>
+        </w:rPr>
+        <w:t>能力矩阵包含项目源文件导入导出、PPTX 与逐字稿、标准放映、AI 口播生成、动态演示、本机和管理员模型设置。不可用时会显示原因。未配置语音的本机版仍可手动翻页；hosted 当前未开放播放器与语音，其模型设置由管理员管理。演练中心、交付中心与模型设置页会复用相同的服务原因。</w:t>
+      </w:r>
+    </w:p>
+    <w:p>
+      <w:r>
+        <w:rPr>
+          <w:b w:val="0"/>
+        </w:rPr>
+        <w:t>如果前后端接口版本不兼容，或发布版本的已知提交号不同，程序会暂停进入工作台。先点击“刷新页面”；若仍异常，请等制作任务结束后更新 App，或请管理员重新部署同一发布的前后端。已保存项目不受影响。开发环境提交差异只提示；unknown 表示无法核对提交，不代表版本冲突。</w:t>
       </w:r>
     </w:p>
     <w:p>

</xml_diff>

<commit_message>
fix(ux): correct rehearsal capability and delivery review flows
Require confirmation for failed pages with retained artwork, label ZIP delivery honestly, restore semantic workflow locators, and make mobile controls and safe-area clearance verifiable. Sync the usage guide and add delivery screenshots to the ignored browser evidence output.
</commit_message>
<xml_diff>
--- a/docs/AutoPPT-安装与使用说明.docx
+++ b/docs/AutoPPT-安装与使用说明.docx
@@ -1403,7 +1403,7 @@
         <w:rPr>
           <w:b w:val="0"/>
         </w:rPr>
-        <w:t>4. 在交付中心先点击“查看制作报告”，确认原稿正文与页面备注逐字一致；再点击“导出 PPT”，然后点击“下载 PPT 与逐字稿”。解压 ZIP 后打开 PPTX 和独立逐字稿 Markdown，确认页序、图片和逐页备注正确。备注可在 PowerPoint 的备注区域或演讲者视图查看。</w:t>
+        <w:t>4. 在交付中心先点击“查看制作报告”，确认原稿正文与页面备注逐字一致；再完成导出检查，点击“下载 ZIP 交付包”。解压 ZIP 后打开 PPTX 和独立逐字稿 Markdown，确认页序、图片和逐页备注正确。备注可在 PowerPoint 的备注区域或演讲者视图查看。</w:t>
       </w:r>
     </w:p>
     <w:p>
@@ -2094,7 +2094,7 @@
         <w:rPr>
           <w:b w:val="0"/>
         </w:rPr>
-        <w:t>在制作台点击“重新设计”。选择“全部页面重新设计”会包含整个项目，不受当前查看段落影响；选择“选择几页重新设计”后，直接勾选缩略图，也可“全选可重做页面”或“清空选择”。页面卡片左上角的多选框始终显示，勾选后也能从底栏“重新设计所选 N 页”进入，原有勾选会带入窗口。</w:t>
+        <w:t>在制作台点击“重新设计”（手机端先展开“更多操作”，也可用键盘聚焦后按 Enter 展开）。手机首屏保留“补齐未生成页面”；首部插页和撤销也在“更多操作”中。选择“全部页面重新设计”会包含整个项目，不受当前查看段落影响；选择“选择几页重新设计”后，直接勾选缩略图，也可“全选可重做页面”或“清空选择”。页面卡片左上角的多选框始终显示，勾选后也能从底栏“重新设计所选 N 页”进入，原有勾选会带入窗口。</w:t>
       </w:r>
     </w:p>
     <w:p>
@@ -2299,7 +2299,7 @@
         <w:rPr>
           <w:b w:val="0"/>
         </w:rPr>
-        <w:t>在交付中心点击“导出 PPT”，再点击“下载 PPT 与逐字稿”会下载带版本号的 ZIP，其中有 PPTX 和独立逐字稿 Markdown。Markdown 按当前页序包含最新保存的完整讲稿，附页码，包含改稿、拆并页和插页结果；不使用提炼后的上屏文案，可作为新版本留存。两份文件来自同一份保存记录。</w:t>
+        <w:t>在交付中心完成导出检查，再点击“下载 ZIP 交付包”会下载带版本号的 ZIP，其中有 PPTX 和独立逐字稿 Markdown。Markdown 按当前页序包含最新保存的完整讲稿，附页码，包含改稿、拆并页和插页结果；不使用提炼后的上屏文案，可作为新版本留存。两份文件来自同一份保存记录。服务不支持 ZIP 交付包时，按钮为“下载 PPTX”，直接下载 PPTX 文件。</w:t>
       </w:r>
     </w:p>
     <w:p>
@@ -2373,7 +2373,18 @@
         <w:rPr>
           <w:b w:val="0"/>
         </w:rPr>
-        <w:t>如果提示画面待更新，先重做图片，或确认使用当前图片配最新备注。</w:t>
+        <w:t>如果提示画面待更新，先重做图片，或核对后下载当前图片配最新备注。</w:t>
+      </w:r>
+    </w:p>
+    <w:p>
+      <w:pPr>
+        <w:pStyle w:val="ListBullet"/>
+      </w:pPr>
+      <w:r>
+        <w:rPr>
+          <w:b w:val="0"/>
+        </w:rPr>
+        <w:t>生成失败但保留现有画面时，检查窗口会列出失败页数量和页码，必须勾选“我已核对失败页，确认使用现有画面继续导出”才能继续。失败且无图仍需先补齐，勾选确认不能绕过缺图检查。</w:t>
       </w:r>
     </w:p>
     <w:p>
@@ -2492,6 +2503,14 @@
           <w:b w:val="0"/>
         </w:rPr>
         <w:t>本机版打开演讲项目，在演练中心点击“打开演讲播放器”。可以直接选择“仅放映 PPT”，使用前后翻页按钮或方向键播放已有页面，点击“全屏”进入正式放映，按 Esc 返回设置。播放器可以查看逐页讲稿，不需要再次生成图片。</w:t>
+      </w:r>
+    </w:p>
+    <w:p>
+      <w:r>
+        <w:rPr>
+          <w:b w:val="0"/>
+        </w:rPr>
+        <w:t>若当前服务不支持标准放映但已有画面，演练中心保留禁用的“标准放映不可用”按钮，并显示服务原因；没有可演练画面才提供“返回制作台”。</w:t>
       </w:r>
     </w:p>
     <w:p>

</xml_diff>

<commit_message>
feat: add contextual first-run onboarding
</commit_message>
<xml_diff>
--- a/docs/AutoPPT-安装与使用说明.docx
+++ b/docs/AutoPPT-安装与使用说明.docx
@@ -1349,7 +1349,7 @@
         <w:rPr>
           <w:b w:val="0"/>
         </w:rPr>
-        <w:t>1. 在“我的演讲”中新建项目，例如“首次测试”。默认选中“克制儿童摄影杂志风”，也可改选其他风格。</w:t>
+        <w:t>1. 项目首页的首次工作区准备卡会显示运行形态、模型和风格状态，可跳过；模型未就绪时可选“先写草稿”，生成前才需连接。本机可点“连接并测试模型”，hosted 模型由管理员管理。新建填写主题，例如“首次测试”，默认选中“克制儿童摄影杂志风”；完整风格、受众、AI 完善说明和配色收在“个性化设置，可稍后修改”。点击“创建并写第一段”直接进入制作台。</w:t>
       </w:r>
     </w:p>
     <w:p>
@@ -1360,7 +1360,7 @@
         <w:rPr>
           <w:b w:val="0"/>
         </w:rPr>
-        <w:t>2. 粘贴下面这段短稿并提交生成，等待拆页和出图完成：</w:t>
+        <w:t>2. 粘贴约 100–500 字准备讲的话，或点“使用示例文字”后替换。系统自动拆页，完整原稿保留。草稿自动保存，但“已保存”不等于“已生成”。首次点击“提交讲稿并制作”会确认模型调用与费用：先调用内容模型拆页，再按实际拆分页调用图片模型；具体页数以结果为准。本机费用由配置服务商按实际调用收取，hosted 使用管理员图片额度。点击“开始生成”后等待完成；“返回修改”或关闭保留草稿。“以后直接生成”只适用于后续提交新讲稿。也可用下面这段短稿：</w:t>
       </w:r>
     </w:p>
     <w:p>
@@ -1392,7 +1392,7 @@
         <w:rPr>
           <w:b w:val="0"/>
         </w:rPr>
-        <w:t>3. 打开生成页面，确认图片可以显示，逐字稿只保留正文。“开场说明”这一整行标题应已去掉，正文措辞和段落应保留。</w:t>
+        <w:t>3. 打开生成页面，先看三点提示：逐字稿是演讲者说的完整内容，上屏文案是观众看到的重点，重新设计可能再次调用模型并产生费用。保存讲稿或关闭提示后不再重复。确认图片可以显示，逐字稿只保留正文。“开场说明”这一整行标题应已去掉，正文措辞和段落应保留。</w:t>
       </w:r>
     </w:p>
     <w:p>
@@ -1411,7 +1411,15 @@
         <w:rPr>
           <w:b w:val="0"/>
         </w:rPr>
-        <w:t>首次测试通过后，再导入个人风格和较长讲稿；如果失败，先处理页面中给出的具体错误。</w:t>
+        <w:t>首次测试通过后，再导入个人风格和较长讲稿；如果失败，先处理页面中给出的具体错误。没有页面时，演练中心突出“先写讲稿 / 生成至少一页”，交付中心提示“还没有可交付内容”并可返回制作台；“项目源文件”折叠区仍可备份和迁移草稿。</w:t>
+      </w:r>
+    </w:p>
+    <w:p>
+      <w:r>
+        <w:rPr>
+          <w:b w:val="0"/>
+        </w:rPr>
+        <w:t>“帮助与介绍 → 重新查看新手引导”可以重看工作区准备和页面提示，不更改生成确认的选择。三个引导偏好独立保存在当前浏览器，按运行形态和实际登录账号隔离，不随项目包迁移；清理浏览器存储后会重新显示，存储不可用时只在当前会话记住操作。模型未就绪、取消确认或请求错误均不会清空草稿。</w:t>
       </w:r>
     </w:p>
     <w:p>

</xml_diff>

<commit_message>
fix: resolve phase-two onboarding review blockers
Use hosted account readiness, persist generation request identities and deduplicate accepted batches. Save direct-generation consent only after acceptance, preserve project drafts through style repair, and fix mobile onboarding actions and redesign cost confirmation.
</commit_message>
<xml_diff>
--- a/docs/AutoPPT-安装与使用说明.docx
+++ b/docs/AutoPPT-安装与使用说明.docx
@@ -1349,7 +1349,7 @@
         <w:rPr>
           <w:b w:val="0"/>
         </w:rPr>
-        <w:t>1. 项目首页的首次工作区准备卡会显示运行形态、模型和风格状态，可跳过；模型未就绪时可选“先写草稿”，生成前才需连接。本机可点“连接并测试模型”，hosted 模型由管理员管理。新建填写主题，例如“首次测试”，默认选中“克制儿童摄影杂志风”；完整风格、受众、AI 完善说明和配色收在“个性化设置，可稍后修改”。点击“创建并写第一段”直接进入制作台。</w:t>
+        <w:t>1. 项目首页的首次工作区准备卡会显示运行形态、模型和风格状态，可跳过；模型未就绪时可选“先写草稿”，生成前才需连接。本机可点“连接并测试模型”，hosted 按账户的真实模型服务状态判断，未就绪时请联系管理员或等待配置。新建填写主题，例如“首次测试”，默认选中“克制儿童摄影杂志风”；完整风格、受众、AI 完善说明和配色收在“个性化设置，可稍后修改”。点击“创建并写第一段”直接进入制作台。没有可用风格时，前往风格库会直接打开“手动填写”；保存风格或返回新建演讲会保留已填主题与高级选项。手机展开高级设置时，底部创建按钮保持可见。</w:t>
       </w:r>
     </w:p>
     <w:p>
@@ -1360,7 +1360,7 @@
         <w:rPr>
           <w:b w:val="0"/>
         </w:rPr>
-        <w:t>2. 粘贴约 100–500 字准备讲的话，或点“使用示例文字”后替换。系统自动拆页，完整原稿保留。草稿自动保存，但“已保存”不等于“已生成”。首次点击“提交讲稿并制作”会确认模型调用与费用：先调用内容模型拆页，再按实际拆分页调用图片模型；具体页数以结果为准。本机费用由配置服务商按实际调用收取，hosted 使用管理员图片额度。点击“开始生成”后等待完成；“返回修改”或关闭保留草稿。“以后直接生成”只适用于后续提交新讲稿。也可用下面这段短稿：</w:t>
+        <w:t>2. 粘贴约 100–500 字准备讲的话，或点“使用示例文字”后替换。系统自动拆页，完整原稿保留。草稿自动保存，但“已保存”不等于“已生成”。首次点击“提交讲稿并制作”会确认模型调用与费用：先调用内容模型拆页，再按实际拆分页调用图片模型；具体页数以结果为准。本机费用由配置服务商按实际调用收取，hosted 使用管理员图片额度。点击“开始生成”后等待完成；“返回修改”或关闭保留草稿。“以后直接生成”只适用于后续提交新讲稿，并在服务端接受本次生成后记住；草稿保存或请求失败不会启用。响应丢失时重试同一讲稿会复用提交标识，避免重复建批次。也可用下面这段短稿：</w:t>
       </w:r>
     </w:p>
     <w:p>
@@ -1392,7 +1392,7 @@
         <w:rPr>
           <w:b w:val="0"/>
         </w:rPr>
-        <w:t>3. 打开生成页面，先看三点提示：逐字稿是演讲者说的完整内容，上屏文案是观众看到的重点，重新设计可能再次调用模型并产生费用。保存讲稿或关闭提示后不再重复。确认图片可以显示，逐字稿只保留正文。“开场说明”这一整行标题应已去掉，正文措辞和段落应保留。</w:t>
+        <w:t>3. 打开生成页面，先看三点提示：逐字稿是演讲者说的完整内容，上屏文案是观众看到的重点，重新设计是按当前讲稿和风格重新制作画面。保存讲稿或点击“知道了”后不再重复；再次调用模型与费用的提示保留在重新设计确认框。确认图片可以显示，逐字稿只保留正文。“开场说明”这一整行标题应已去掉，正文措辞和段落应保留。</w:t>
       </w:r>
     </w:p>
     <w:p>
@@ -2001,7 +2001,7 @@
         <w:rPr>
           <w:b w:val="0"/>
         </w:rPr>
-        <w:t>项目分为“概览 → 制作台 → 演练中心 → 交付中心”，对应“写 → 做 → 练 → 交”。概览按当前状态给出一个下一步动作，来源版本不同的演示会单独提示。制作台顶部固定“继续添加讲稿”，内容视图为“页面 / 演说稿”，范围为“最近制作 / 全部页面 / 历史段落”。演练中心打开播放器和动态演示，交付中心集中报告与下载。</w:t>
+        <w:t>项目分为“概览 → 制作台 → 演练中心 → 交付中心”，对应“写 → 做 → 练 → 交”。概览按当前状态给出一个下一步动作，来源版本不同的演示会单独提示。已有讲稿时，制作台顶部显示“继续添加讲稿”，内容视图为“页面 / 演说稿”，范围为“最近制作 / 全部页面 / 历史段落”。演练中心打开播放器和动态演示，交付中心集中报告与下载。</w:t>
       </w:r>
     </w:p>
     <w:p>

</xml_diff>

<commit_message>
fix: keep production frontend aligned with running backend release
</commit_message>
<xml_diff>
--- a/docs/AutoPPT-安装与使用说明.docx
+++ b/docs/AutoPPT-安装与使用说明.docx
@@ -2806,7 +2806,15 @@
         <w:rPr>
           <w:b w:val="0"/>
         </w:rPr>
-        <w:t>最后刷新浏览器。如果 Git 提示本地修改或分支冲突，先保留现有文件并联系维护者处理，不要强制重置。重新运行后台启动入口会复用已运行的旧服务，所以更新前必须先停止旧服务。</w:t>
+        <w:t>最后刷新浏览器。如果 Git 提示本地修改或分支冲突，先保留现有文件并联系维护者处理，不要强制重置。后台启动入口发现旧发布仍在运行时会提示先停止旧服务，不会自动中断生成任务。</w:t>
+      </w:r>
+    </w:p>
+    <w:p>
+      <w:r>
+        <w:rPr>
+          <w:b w:val="0"/>
+        </w:rPr>
+        <w:t>本机浏览器和 Mac 内置后台会固定使用启动时配套的网页。运行期间再次构建，不会把新网页混入旧后台；刷新仍可继续使用当前发布。要启用新版，需等任务结束，再重启后台并刷新页面。构建缺失或版本不一致时，后台会拒绝启动，请先完成构建。</w:t>
       </w:r>
     </w:p>
     <w:p>

</xml_diff>

<commit_message>
feat: clarify page review and redesign Mac narration workspace
</commit_message>
<xml_diff>
--- a/docs/AutoPPT-安装与使用说明.docx
+++ b/docs/AutoPPT-安装与使用说明.docx
@@ -856,7 +856,7 @@
         <w:rPr>
           <w:b w:val="0"/>
         </w:rPr>
-        <w:t>打开“模型与服务”，分别填写以下两个区域。两者可以使用同一家服务，但需要确认对应接口和模型都可用。</w:t>
+        <w:t>打开“设置”，分别填写以下两个区域。两者可以使用同一家服务，但需要确认对应接口和模型都可用。</w:t>
       </w:r>
     </w:p>
     <w:tbl>
@@ -1419,7 +1419,7 @@
         <w:rPr>
           <w:b w:val="0"/>
         </w:rPr>
-        <w:t>“帮助与介绍 → 重新查看新手引导”可以重看工作区准备和页面提示，不更改生成确认的选择。三个引导偏好独立保存在当前浏览器，按运行形态和实际登录账号隔离，不随项目包迁移；清理浏览器存储后会重新显示，存储不可用时只在当前会话记住操作。模型未就绪、取消确认或请求错误均不会清空草稿。</w:t>
+        <w:t>“使用帮助 → 重新查看新手引导”可以重看工作区准备和页面提示，不更改生成确认的选择。三个引导偏好独立保存在当前浏览器，按运行形态和实际登录账号隔离，不随项目包迁移；清理浏览器存储后会重新显示，存储不可用时只在当前会话记住操作。模型未就绪、取消确认或请求错误均不会清空草稿。</w:t>
       </w:r>
     </w:p>
     <w:p>
@@ -1438,7 +1438,7 @@
         <w:rPr>
           <w:b w:val="0"/>
         </w:rPr>
-        <w:t>点击侧栏“帮助与介绍”，在右侧阅读新版官网，左侧导航保留。“返回刚才的页面”会回到原编辑位置，未提交的表单保持；独立打开本机介绍页时提供“返回工作台”。页面先展示用途、风格作品和实际工作台，再纵向介绍风格制作、拆稿生成、逐页打磨、导出、操作步骤及常见问题。风格展示区可切换 6 套实际封面，支持键盘左右键；全部 13 套风格在产品内选择。截图点击可放大，按 Esc 或关闭按钮退出；手机可展开顶部导航，动效遵循系统“减少动态效果”设置。“开始使用”提供安装说明、源码 ZIP、Word 说明和 Markdown 快速指南。公开下载为源码，Mac 安装包目前为内部构建。浏览无需 API，实际生成需自行配置模型。</w:t>
+        <w:t>点击侧栏“产品介绍”，在右侧阅读新版官网，左侧导航保留。“返回刚才的页面”会回到原编辑位置，未提交的表单保持；独立打开本机介绍页时提供“返回工作台”。页面先展示用途、风格作品和实际工作台，再纵向介绍风格制作、拆稿生成、逐页打磨、口播、动态演示和交付迁移；常见问题另在“使用帮助”中查找。风格展示区可切换 6 套实际封面，支持键盘左右键；全部 13 套风格在产品内选择。截图点击可放大，按 Esc 或关闭按钮退出；手机可展开顶部导航，动效遵循系统“减少动态效果”设置。“开始使用”提供安装说明、源码 ZIP、Word 说明和 Markdown 快速指南。公开下载为源码，Mac 安装包目前为内部构建。浏览无需 API，实际生成需自行配置模型。</w:t>
       </w:r>
     </w:p>
     <w:p>
@@ -1465,7 +1465,7 @@
         <w:rPr>
           <w:b w:val="0"/>
         </w:rPr>
-        <w:t>打开左侧“帮助与介绍”，点击“版本与工作区”。这里同时展示前端页面和后端服务的版本、短提交号、构建时间、接口版本与一致性状态，以及当前运行形态、工作区说明和能力矩阵。需要完整提交号时，将鼠标停在短提交号上。页面默认不显示内部绝对目录或密钥。</w:t>
+        <w:t>打开左侧“使用帮助”，展开“版本与工作区”。这里同时展示前端页面和后端服务的版本、短提交号、构建时间、接口版本与一致性状态，以及当前运行形态、工作区说明和能力矩阵。需要完整提交号时，将鼠标停在短提交号上。页面默认不显示内部绝对目录或密钥。</w:t>
       </w:r>
     </w:p>
     <w:p>
@@ -2075,7 +2075,7 @@
         <w:rPr>
           <w:b w:val="0"/>
         </w:rPr>
-        <w:t>手动拆分可对照原图插入分界，立即拆成多页；默认后台生成，也可关闭生成先改稿。原文及内容附件保留，新页重新提炼文案和出图。拆分页空闲时可撤销，不影响其他页刚完成的图片。合并相邻页仍先预览、确认后出图。修改正文后，画面标记为待更新，重新设计才与新稿一致；旧图和版本历史保留。</w:t>
+        <w:t>手动拆分可对照原图插入分界，立即拆成多页；默认后台生成，也可关闭生成先改稿。原文及内容附件保留，新页重新提炼文案和出图。拆分页空闲时可撤销，不影响其他页刚完成的图片。合并相邻页仍先预览、确认后出图。修改正文后，画面标记为待核对。在概览点击“核对 N 页画面”，可查看每页原因及前后讲稿；换行、空格或加粗的变化会单独说明。需要调整时进入页面编辑；画面仍适用时点击“确认保留第 N 页”，关闭该页提醒。“稍后处理”暂不作决定。确认保留不调用模型，原图、讲稿和历史保留；以后再次改稿会重新提醒。</w:t>
       </w:r>
     </w:p>
     <w:p>
@@ -2502,7 +2502,7 @@
         <w:rPr>
           <w:b w:val="0"/>
         </w:rPr>
-        <w:t>播放 PPT 并自动讲述</w:t>
+        <w:t>产品介绍和使用帮助</w:t>
       </w:r>
     </w:p>
     <w:p>
@@ -2510,7 +2510,7 @@
         <w:rPr>
           <w:b w:val="0"/>
         </w:rPr>
-        <w:t>本机版打开演讲项目，在演练中心点击“打开演讲播放器”。可以直接选择“仅放映 PPT”，使用前后翻页按钮或方向键播放已有页面，点击“全屏”进入正式放映，按 Esc 返回设置。播放器可以查看逐页讲稿，不需要再次生成图片。</w:t>
+        <w:t>侧栏“产品介绍”按风格制作、演讲制作、口播、动态演示及交付迁移分别说明核心功能。“使用帮助”提供可搜索的常见问题，包含画面核对、口播识别、播放倍速、声音采集、HTML 导出和换电脑。新手引导和版本工作区诊断也在使用帮助中。</w:t>
       </w:r>
     </w:p>
     <w:p>
@@ -2518,15 +2518,42 @@
         <w:rPr>
           <w:b w:val="0"/>
         </w:rPr>
-        <w:t>若当前服务不支持标准放映但已有画面，演练中心保留禁用的“标准放映不可用”按钮，并显示服务原因；没有可演练画面才提供“返回制作台”。</w:t>
+        <w:t>Mac App 菜单“帮助”可打开两者；“AutoPPT → 设置…”或 ⌘, 打开设置。声音采集归在设置，不占用演播主界面。</w:t>
       </w:r>
     </w:p>
     <w:p>
-      <w:r>
-        <w:rPr>
-          <w:b w:val="0"/>
-        </w:rPr>
-        <w:t xml:space="preserve">需要自动口播时，先在“模型与服务”中找到“演讲语音 · MiniMax”，填写语音 API Key 并保存。默认接口为 </w:t>
+      <w:pPr>
+        <w:pStyle w:val="Heading2"/>
+      </w:pPr>
+      <w:r>
+        <w:rPr>
+          <w:b w:val="0"/>
+        </w:rPr>
+        <w:t>播放 PPT 并自动讲述</w:t>
+      </w:r>
+    </w:p>
+    <w:p>
+      <w:r>
+        <w:rPr>
+          <w:b w:val="0"/>
+        </w:rPr>
+        <w:t>本机版打开演讲项目，在演练中心点击“打开演讲播放器”。可以直接选择“仅放映 PPT”，使用前后翻页按钮或方向键播放已有页面，点击“全屏”进入正式放映，按 Esc 返回设置。播放器可以查看逐页讲稿，不需要再次生成图片。</w:t>
+      </w:r>
+    </w:p>
+    <w:p>
+      <w:r>
+        <w:rPr>
+          <w:b w:val="0"/>
+        </w:rPr>
+        <w:t>若当前服务不支持标准放映但已有画面，演练中心保留禁用的“标准放映不可用”按钮，并显示服务原因；没有可演练画面才提供“返回制作台”。</w:t>
+      </w:r>
+    </w:p>
+    <w:p>
+      <w:r>
+        <w:rPr>
+          <w:b w:val="0"/>
+        </w:rPr>
+        <w:t xml:space="preserve">需要自动口播时，先在“设置”中找到“语音与声音 · MiniMax”，填写语音 API Key 并保存。默认接口为 </w:t>
       </w:r>
       <w:r>
         <w:rPr>
@@ -2565,7 +2592,7 @@
         <w:rPr>
           <w:b w:val="0"/>
         </w:rPr>
-        <w:t>1. 回到演练中心并打开演讲播放器，选择播报男声、新闻女声、电台男主播或温柔学姐，也可选择自己创建的声音。</w:t>
+        <w:t>1. 回到演练中心并打开演讲播放器。默认进入“放映”，可选择已有口播或仅放映 PPT；已有音频不要求重新配置服务。</w:t>
       </w:r>
     </w:p>
     <w:p>
@@ -2576,7 +2603,7 @@
         <w:rPr>
           <w:b w:val="0"/>
         </w:rPr>
-        <w:t>2. 设置整体情绪和语速。默认“随文表达”由语音模型根据文本决定起伏；也可以单独为当前页选择平稳讲述、热情愉悦、低沉感怀或惊喜强调。</w:t>
+        <w:t>2. 进入“1 · 口播文本”。点击“重新识别整场口播”，从原稿过滤主副标题、一级菜单、章节和停顿、暂停、环顾四周等动作提示。结果即时显示；用“查看口播页”逐页核对正文和过滤说明，可编辑并保存，原稿不变。留空表示本页不口播。</w:t>
       </w:r>
     </w:p>
     <w:p>
@@ -2587,7 +2614,7 @@
         <w:rPr>
           <w:b w:val="0"/>
         </w:rPr>
-        <w:t>3. 先检查“实际口播文本”。系统过滤常见章节标签、附件标记和舞台提示，可直接修改后保存；原稿不变。留空的页面不口播，放映时停留 3 秒。点击“试听本页开头”，再点击音频播放按钮试听。试听最多使用本页开头 180 字，会调用语音服务。</w:t>
+        <w:t>3. 进入“2 · 声音制作”。选择播报男声、新闻女声、电台男主播、温柔学姐或自己创建的声音。设置整体及逐页情绪，必要时调整生成语速；试听本页开头最多 180 字，试听会调用语音服务。</w:t>
       </w:r>
     </w:p>
     <w:p>
@@ -2598,7 +2625,7 @@
         <w:rPr>
           <w:b w:val="0"/>
         </w:rPr>
-        <w:t>4. 满意后点击“生成整场口播”。1–500 页需都有画面；系统逐页、逐段合成并保存。限流时等待后有限重试，其他错误停止后续请求；已完成的声音保留，可点击“继续未完成的页面”。</w:t>
+        <w:t>4. 检查满意后点击“生成整场口播”。1–500 页需都有画面；系统逐页、逐段合成并保存。已完成声音保留，失败可继续未完成页面。生成期间仍能播放选中的旧版，新版完成后点击“使用新口播版本”。</w:t>
       </w:r>
     </w:p>
     <w:p>
@@ -2609,7 +2636,15 @@
         <w:rPr>
           <w:b w:val="0"/>
         </w:rPr>
-        <w:t>5. 全部完成后点击“开始口播”。每页按检查后的口播文本讲述，长页多个片段依次播放，最后一段结束才翻到下一页。可暂停、继续、跳页或拖动当前片段进度；讲到末页自动停止，切换到其他浏览器标签页会暂停。</w:t>
+        <w:t>5. 点击“开始口播”，长页片段依次播放，最后一个片段结束后翻页。随时暂停、继续、跳页或拖动当前片段进度；画面下方“播放倍速”可实时选择 0.75× 至 2×，换页继续保持，无需重新生成。无口播页停留 3 秒，倍速也影响这段停留；末页停止。切到其他标签页或窗口可能暂停，回到播放器可继续。</w:t>
+      </w:r>
+    </w:p>
+    <w:p>
+      <w:r>
+        <w:rPr>
+          <w:b w:val="0"/>
+        </w:rPr>
+        <w:t>识别、保存文本和调整生成设置只修改制作草稿，不会让“开始口播”消失。原有声音继续播放已保存版本；需要听到新正文或新声音时再生成新版本。“播放倍速”即时改变播放速度，“生成语速”只影响下一份合成音频。</w:t>
       </w:r>
     </w:p>
     <w:p>
@@ -2666,7 +2701,7 @@
         <w:rPr>
           <w:b w:val="0"/>
         </w:rPr>
-        <w:t>无需动画时，在交付中心点击“导出静态 HTML”，再选择已完成且与当前画面、讲稿一致的口播版本。在播放设置中也可直接“导出静态 HTML · 含口播”，保留该版本的画面和声音。需要动画时，在交付中心选择动态 HTML 交付版本与“HTML 口播版本”，也可在动态演示窗口底部选择口播，然后下载 HTML；两处均可选择是否包含演讲备注。</w:t>
+        <w:t>无需动画时，在交付中心点击“导出静态 HTML”，再选择已完成且与当前画面、讲稿一致的口播版本。在演播台“放映”中也可直接“导出此版本 HTML · 含口播”，保留该版本的画面和声音。需要动画时，在交付中心选择动态 HTML 交付版本与“HTML 口播版本”，也可在动态演示窗口底部选择口播，然后下载 HTML；两处均可选择是否包含演讲备注。</w:t>
       </w:r>
     </w:p>
     <w:p>
@@ -2682,7 +2717,7 @@
         <w:rPr>
           <w:b w:val="0"/>
         </w:rPr>
-        <w:t>旧版音频已读入的标题或提示无法靠文本过滤直接消除。在播放设置点击“重新识别整场口播”，按钮旁会显示处理页数、过滤数量与更新结果；没有变化也会明确提示。识别和保存只处理文字、不计费，保存成功或失败就在按钮旁显示。检查文本后点击“生成整场口播”更新声音；只有变化的文本需重新合成，旧版本保留。常见标记按规则识别，不保证识别所有语义含糊的说明，请检查实际口播文本。</w:t>
+        <w:t>旧版音频已读入的标题或提示无法靠文本过滤直接消除。在演播台“1 · 口播文本”点击“重新识别整场口播”，按钮旁会显示处理页数、过滤数量与更新结果；没有变化也会明确提示。识别和保存只处理文字、不计费，保存成功或失败就在按钮旁显示。检查文本后前往“2 · 声音制作”，点击“生成整场口播”更新声音；只有变化的文本需重新合成，旧版本保留。常见标记按规则识别，不保证识别所有语义含糊的说明，请检查实际口播文本。</w:t>
       </w:r>
     </w:p>
     <w:p>
@@ -2701,7 +2736,7 @@
         <w:rPr>
           <w:b w:val="0"/>
         </w:rPr>
-        <w:t>在播放设置中展开“采集演讲者的声音”。安静环境下自然讲述 30–60 秒；可以点击“开始录音”，也可以上传已有的 WAV、MP3 或 M4A。音频需在 10 秒至 5 分钟之间、20 MB 以内；直接录音最多 2 分钟，结束后可以先在本机试听，过短录音会提示重新录制。</w:t>
+        <w:t>在“设置 → 语音与声音”中展开“采集演讲者的声音”。安静环境下自然讲述 30–60 秒；可以点击“开始录音”，也可以上传已有的 WAV、MP3 或 M4A。音频需在 10 秒至 5 分钟之间、20 MB 以内；直接录音最多 2 分钟，结束后可以先在本机试听，过短录音会提示重新录制。</w:t>
       </w:r>
     </w:p>
     <w:p>
@@ -2709,7 +2744,7 @@
         <w:rPr>
           <w:b w:val="0"/>
         </w:rPr>
-        <w:t>Mac App 首次录音需要系统麦克风授权。若拒绝过，请在系统设置的“隐私与安全性 → 麦克风”允许 AutoPPT，随后重新打开 App；也可以直接上传录音。录音只在主动点击开始时开启，结束或关闭播放器时停止。</w:t>
+        <w:t>Mac App 首次录音需要系统麦克风授权。若拒绝过，请在系统设置的“隐私与安全性 → 麦克风”允许 AutoPPT，随后重新打开 App；也可以直接上传录音。录音只在主动点击开始时开启，结束录音或离开设置时停止。</w:t>
       </w:r>
     </w:p>
     <w:p>

</xml_diff>

<commit_message>
feat: add context-aware expressive speech arrangement
</commit_message>
<xml_diff>
--- a/docs/AutoPPT-安装与使用说明.docx
+++ b/docs/AutoPPT-安装与使用说明.docx
@@ -2614,7 +2614,7 @@
         <w:rPr>
           <w:b w:val="0"/>
         </w:rPr>
-        <w:t>3. 进入“2 · 声音制作”。选择播报男声、新闻女声、电台男主播、温柔学姐或自己创建的声音。设置整体及逐页情绪，必要时调整生成语速；试听本页开头最多 180 字，试听会调用语音服务。</w:t>
+        <w:t>3. 进入“2 · 声音制作”。选择播报男声、新闻女声、电台男主播、温柔学姐或自己创建的声音。设置整体及逐页情绪，必要时调整生成语速；普通口播试听本页开头最多 180 字；演绎口播试听本页第一个编排句段（最多 600 字）。试听会调用语音服务。</w:t>
       </w:r>
     </w:p>
     <w:p>
@@ -2683,6 +2683,65 @@
           <w:b w:val="0"/>
         </w:rPr>
         <w:t>1002 表示请求频率超限，1008 表示余额不足。限流后自动等待，最多重试 3 次，可随时停止，已完成音频保留；超时或余额、权限错误不自动重试。</w:t>
+      </w:r>
+    </w:p>
+    <w:p>
+      <w:pPr>
+        <w:pStyle w:val="Heading2"/>
+      </w:pPr>
+      <w:r>
+        <w:rPr>
+          <w:b w:val="0"/>
+        </w:rPr>
+        <w:t>让逐字稿具备演讲表达</w:t>
+      </w:r>
+    </w:p>
+    <w:p>
+      <w:r>
+        <w:rPr>
+          <w:b w:val="0"/>
+        </w:rPr>
+        <w:t>在“1 · 口播文本”检查正文后，点击“AI 编排整场演讲”。这与本地“重新识别”不同：它会调用设置中的内容分析模型，先过滤常见非口播标记，再结合全场目录、前后文和原稿提示，给原句安排情绪、节奏、停顿与重点表达；不允许模型增删改写口播正文。支持 1–500 页、单次最多 30 万字符。</w:t>
+      </w:r>
+    </w:p>
+    <w:p>
+      <w:r>
+        <w:rPr>
+          <w:b w:val="0"/>
+        </w:rPr>
+        <w:t>选择“自然演讲”“沉稳克制”或“生动有感染力”。“适度加入辅助表达”默认开启，模型只在适合的语境安排轻笑、笑声、轻叹或换气，每页最多一次；咳嗽、清嗓仅在原稿明确标注时采用。关闭后只编排情绪、停顿和强调。原稿中的动作提示作为理解依据，不会直接念出来。</w:t>
+      </w:r>
+    </w:p>
+    <w:p>
+      <w:r>
+        <w:rPr>
+          <w:b w:val="0"/>
+        </w:rPr>
+        <w:t>编排显示当前处理页和进度，可以停止；失败或中断保留上一份完成方案与已有音频，下次不会自动调用模型。完成后用“查看口播页”逐页检查情绪、语速、句后额外停顿及原因，也可下载带提示的演绎稿。重点句通过整句稍慢、音量略增强来表现，暂不提供精确的词级重音。</w:t>
+      </w:r>
+    </w:p>
+    <w:p>
+      <w:r>
+        <w:rPr>
+          <w:b w:val="0"/>
+        </w:rPr>
+        <w:t>勾选“使用这份演绎编排生成口播”，进入“2 · 声音制作”试听，再生成整场。此时编排接管整体和逐页情绪，生成语速仍可整体调整。正文、页序或页面数量改变后，需重新编排；也可取消勾选，继续按普通口播生成。旧音频始终保留，编排完成不会自动扣取语音生成额度。</w:t>
+      </w:r>
+    </w:p>
+    <w:p>
+      <w:r>
+        <w:rPr>
+          <w:b w:val="0"/>
+        </w:rPr>
+        <w:t>含辅助声音的编排需要 MiniMax Speech 2.8 HD 或 Turbo；旧模型会提示更换模型，或关闭辅助表达重新编排。系统将方案转成模型支持的情绪参数和声音、停顿标记，编排标签不作为中文正文朗读。音频片段间的额外停顿可暂停、继续，App 实时倍速也作用于停顿；导出静态和动态 HTML 后保留。项目包携带演绎方案，换电脑可继续使用；相同表达片段复用缓存。</w:t>
+      </w:r>
+    </w:p>
+    <w:p>
+      <w:r>
+        <w:rPr>
+          <w:b w:val="0"/>
+        </w:rPr>
+        <w:t>本次新增演绎流程通过模拟模型、浏览器交互和真实模型短稿联调：121 字示例正文成功生成 5 段音频，MiniMax Speech 2.8 HD 接受了轻笑、停顿与重点句控制。实际语气、辅助声音自然度及长篇连贯性仍需用户试听后确认。情绪安排是模型建议，不能保证每句都符合演讲者本人的习惯。</w:t>
       </w:r>
     </w:p>
     <w:p>
@@ -2931,7 +2990,7 @@
         <w:rPr>
           <w:b w:val="0"/>
         </w:rPr>
-        <w:t>迁移包包含保存的草稿、讲稿、图片与历史、内容附件、项目使用的风格与版本、动画图层和字体、已生成语音、声音标识及口播编辑文本。模型密钥与日志不导出，生成任务不自动恢复；继续生成时需在新电脑配置模型，复刻声音需使用有权限的 MiniMax 账号。已完成的图片与音频不需要重新生成。</w:t>
+        <w:t>迁移包包含保存的草稿、讲稿、图片与历史、内容附件、项目使用的风格与版本、动画图层和字体、已生成语音、声音标识、口播编辑文本及演绎编排方案。模型密钥与日志不导出，生成任务不自动恢复；继续生成时需在新电脑配置模型，复刻声音需使用有权限的 MiniMax 账号。已完成的图片与音频不需要重新生成。</w:t>
       </w:r>
     </w:p>
     <w:p>

</xml_diff>

<commit_message>
feat: add local AI usage ledger, cost estimates and budget tracking
</commit_message>
<xml_diff>
--- a/docs/AutoPPT-安装与使用说明.docx
+++ b/docs/AutoPPT-安装与使用说明.docx
@@ -2828,6 +2828,65 @@
           <w:b w:val="0"/>
         </w:rPr>
         <w:t>静态与动态 HTML 可包含口播；PPTX 暂不包含音频，也不导入外部 PPTX。2026-10-06 已用真实 MiniMax 服务生成四个默认音色及全部情绪选项的中文短样，并在 Chrome 验证真实音频自动翻页、暂停和缓存复用。听感与长篇表现仍需人工试听；声音复刻相似度、Mac 麦克风系统弹窗、其他电脑和 Windows/Linux 尚未验收。模拟测试另覆盖失败续做、停止和恢复。</w:t>
+      </w:r>
+    </w:p>
+    <w:p>
+      <w:pPr>
+        <w:pStyle w:val="Heading2"/>
+      </w:pPr>
+      <w:r>
+        <w:rPr>
+          <w:b w:val="0"/>
+        </w:rPr>
+        <w:t>用量与账单</w:t>
+      </w:r>
+    </w:p>
+    <w:p>
+      <w:r>
+        <w:rPr>
+          <w:b w:val="0"/>
+        </w:rPr>
+        <w:t>在 Mac App 左侧打开“用量与账单”，查看今天、本月或全部时间的 AI 消耗。可以按项目和调用类型筛选，查看每次调用的模型、用量、预估费用及计价依据，再导出筛选后的 CSV 账单。</w:t>
+      </w:r>
+    </w:p>
+    <w:p>
+      <w:r>
+        <w:rPr>
+          <w:b w:val="0"/>
+        </w:rPr>
+        <w:t>第一次使用先点“模型单价”，按供应商控制台或合同填写人民币单价。未知价格请留空，确认免费才填 0。内容分析按输入、输出和缓存 Token 计价，缓存已包含在输入中，不重复累计。图片可按张或统一 Token 单价估算，尺寸和质量分别设置。语音优先采用接口返回的计费字符数；未返回时按发送字符估算并明确标注。声音复刻按成功次数做预算估算，实际扣费时点以供应商规则为准。复杂多模态和阶梯价格、折扣、汇率不会自动同步。</w:t>
+      </w:r>
+    </w:p>
+    <w:p>
+      <w:r>
+        <w:rPr>
+          <w:b w:val="0"/>
+        </w:rPr>
+        <w:t>页面生成、风格分析与试做、动态页面识别与图层修复、演绎编排、口播试听、整场合成、声音复刻的实际 AI 请求都会记录；重试单独留痕。播放已有音频、实时变速、规则过滤、保存文本和普通导出不调用 AI。复用相同的已保存语音显示零费用。</w:t>
+      </w:r>
+    </w:p>
+    <w:p>
+      <w:r>
+        <w:rPr>
+          <w:b w:val="0"/>
+        </w:rPr>
+        <w:t>点击“补充预算”，填写金额与备注即可增加本机记账额度。此操作不会付款，也不会给供应商充值。可勾选以积分显示，¥1 对应 1,000 积分；积分不是 Token。全局剩余预算扣除所有项目、所有时间的已知预估费用，不受当前筛选影响。低于 20% 或用完时在账单页提醒，生成仍可继续。</w:t>
+      </w:r>
+    </w:p>
+    <w:p>
+      <w:r>
+        <w:rPr>
+          <w:b w:val="0"/>
+        </w:rPr>
+        <w:t>缺少单价或用量、失败及中断的请求可能显示“待核对”，不计入已知费用合计，不能视为免费。实际余额和结算金额以供应商账单为准。点击明细“查看”可见供应商请求编号和当时单价；后续修改单价不会重算旧记录。</w:t>
+      </w:r>
+    </w:p>
+    <w:p>
+      <w:r>
+        <w:rPr>
+          <w:b w:val="0"/>
+        </w:rPr>
+        <w:t>从新版首次启用开始记账，不补造以前的 Token 或费用。账本保存在当前工作区 SQLite，重启后保留，不保存密钥、提示词或语音正文。项目迁移包不包含工作区预算与账单，导入不会重复扣记费用。Mac App、浏览器本机版和不同电脑目前各自记账；需要留档时导出 CSV。跨机器共享余额与在线支付尚未实现，托管账号仍沿用原有图片额度。</w:t>
       </w:r>
     </w:p>
     <w:p>

</xml_diff>

<commit_message>
fix: deduplicate style headings and validate landscape image output
</commit_message>
<xml_diff>
--- a/docs/AutoPPT-安装与使用说明.docx
+++ b/docs/AutoPPT-安装与使用说明.docx
@@ -18,7 +18,7 @@
         <w:rPr>
           <w:b w:val="0"/>
         </w:rPr>
-        <w:t>适用版本：2026 年 10 月 7 日的仓库代码。</w:t>
+        <w:t>适用版本：2026 年 10 月 8 日的仓库代码。</w:t>
       </w:r>
     </w:p>
     <w:p>
@@ -1651,7 +1651,7 @@
         <w:rPr>
           <w:b w:val="0"/>
         </w:rPr>
-        <w:t>新规范包含视觉定位、核心原则、内容表达、字体层级、色彩比例、图像材质、图形强调、细节、构图疏密、跨页变化、偏离方向和自检标准 12 个部分。详情中显示当前步骤，完成后展开“查看参考图分析与创作依据”，可以核对每张图的观察、共同特征、图间差异、不确定项和设计取舍。分析依据记录最近一次提炼；手动调整或恢复历史版本后，出图以当前提示词为准。</w:t>
+        <w:t>提炼时每个章节只显示一次标题；程序去掉模型在章节开头重复的同名标题与编号，保留正文。手动保存的规则和历史版本不会自动改写。</w:t>
       </w:r>
     </w:p>
     <w:p>
@@ -1659,7 +1659,7 @@
         <w:rPr>
           <w:b w:val="0"/>
         </w:rPr>
-        <w:t>每次提炼顺序调用内容分析模型两次，产生对应服务费用；不会自动生成图片。分析或规范不完整时显示错误，原有规则继续保留，升级也不会自动重写已有风格。提炼成功后再主动试做，核对能否延伸到不同内容。此流程已用模拟模型验证，真实模型的分析深度与新风格成图效果尚未实测。</w:t>
+        <w:t>新规范包含视觉定位、核心原则、内容表达、字体层级、色彩比例、图像材质、图形强调、细节、构图疏密、跨页变化、偏离方向和自检标准 12 个部分。详情中显示当前步骤，完成后展开“查看参考图分析与创作依据”，可以核对每张图的观察、共同特征、图间差异、不确定项和设计取舍。分析依据记录最近一次提炼；手动调整或恢复历史版本后，出图以当前提示词为准。</w:t>
       </w:r>
     </w:p>
     <w:p>
@@ -1667,7 +1667,7 @@
         <w:rPr>
           <w:b w:val="0"/>
         </w:rPr>
-        <w:t>部分站酷页面需要本机 Google Chrome。遇到登录、滑动验证或图片访问限制时，可以改用图片直链或本地上传。程序不会自动完成验证码。</w:t>
+        <w:t>每次提炼顺序调用内容分析模型两次，产生对应服务费用；不会自动生成图片。分析或规范不完整时显示错误，原有规则继续保留，升级也不会自动重写已有风格。提炼成功后再主动试做，核对能否延伸到不同内容。此流程已用模拟模型验证，真实模型的分析深度与新风格成图效果尚未实测。</w:t>
       </w:r>
     </w:p>
     <w:p>
@@ -1675,7 +1675,23 @@
         <w:rPr>
           <w:b w:val="0"/>
         </w:rPr>
+        <w:t>部分站酷页面需要本机 Google Chrome。遇到登录、滑动验证或图片访问限制时，可以改用图片直链或本地上传。程序不会自动完成验证码。</w:t>
+      </w:r>
+    </w:p>
+    <w:p>
+      <w:r>
+        <w:rPr>
+          <w:b w:val="0"/>
+        </w:rPr>
         <w:t>在风格详情点击“生成一页 demo / 调试风格”，可用预填示例直接生成一页，也可切换通用表达、儿童摄影、运动与赛事示例并修改文字，不需要先创建项目。已有讲稿仍可手填或从已有页面选择。普通试做不再用作封面。点击“生成统一封面”，固定以“让想法被看见 / 把内容讲清楚，让表达有自己的风格。”两句文案，按已保存风格直接生成一张图并自动设为封面。文案不再提炼，也不带入试做讲稿、反馈或临时倾向与配色；不改提示词、不增加出图参考。失败或风格中途变化时保留旧封面。封面只需图片模型；普通试做还需内容模型，均会调用所选服务。若提示后台版本过旧，请等制作任务完成后重新打开程序，仅刷新网页不会更新后台。</w:t>
+      </w:r>
+    </w:p>
+    <w:p>
+      <w:r>
+        <w:rPr>
+          <w:b w:val="0"/>
+        </w:rPr>
+        <w:t>封面、试做和演讲页面统一为横向 16:9。模型请求中会独立注明画幅要求，保存前再检查实际图片比例。服务返回竖图、方图或其他比例时，显示真实尺寸并停止，保留旧图片和封面，不自动重试；再次生成可能收费。历史异常图在横向预览框内完整显示并标出问题，不拉伸或裁切掩盖错误。尺寸可能因服务而异，比例允许 1% 的取整差异。</w:t>
       </w:r>
     </w:p>
     <w:p>

</xml_diff>

<commit_message>
fix: accept formatting-only differences in manuscript evidence
</commit_message>
<xml_diff>
--- a/docs/AutoPPT-安装与使用说明.docx
+++ b/docs/AutoPPT-安装与使用说明.docx
@@ -2146,6 +2146,14 @@
           <w:b w:val="0"/>
         </w:rPr>
         <w:t>新页面会先提炼上屏文案，再单独复核，最后把文案和原始风格提示词一起交给图片模型。系统把内容分为核心表达、必要支撑和口播展开，提炼观众需要看见的重点，不逐句缩写原稿；开场、重复解释、口语衔接和长段展开优先留给口播，同时保留关键条件、数字、单位和范围。逐字稿与导出备注保持完整。</w:t>
+      </w:r>
+    </w:p>
+    <w:p>
+      <w:r>
+        <w:rPr>
+          <w:b w:val="0"/>
+        </w:rPr>
+        <w:t>原稿引用校验允许空行、换行、中文间距和 Markdown 加粗、斜体差异；例如两句之间少一个空行，不再报“缺少原文依据”。原稿和引用记录保持原样，英文单词与数字之间有意义的分隔仍保留。实质文字、数字、标点、否定或条件变化，以及跳过正文拼接引用，仍会被拦截。完整语义由文案复核继续检查，已选主张的必保条件也继续保留。</w:t>
       </w:r>
     </w:p>
     <w:p>

</xml_diff>

<commit_message>
fix: recover transient model TLS failures and checkpoint content analysis
</commit_message>
<xml_diff>
--- a/docs/AutoPPT-安装与使用说明.docx
+++ b/docs/AutoPPT-安装与使用说明.docx
@@ -3627,6 +3627,22 @@
         </w:rPr>
         <w:t>Mac：</w:t>
       </w:r>
+      <w:r>
+        <w:rPr>
+          <w:rFonts w:ascii="Menlo" w:hAnsi="Menlo"/>
+          <w:b w:val="0"/>
+          <w:sz w:val="20"/>
+        </w:rPr>
+        <w:t>PORT=4318 npm start</w:t>
+      </w:r>
+    </w:p>
+    <w:p>
+      <w:r>
+        <w:rPr>
+          <w:b w:val="0"/>
+        </w:rPr>
+        <w:t>Windows 命令提示符：</w:t>
+      </w:r>
     </w:p>
     <w:p>
       <w:pPr>
@@ -3639,28 +3655,6 @@
           <w:rFonts w:ascii="Menlo" w:hAnsi="Menlo"/>
           <w:sz w:val="21"/>
         </w:rPr>
-        <w:t>PORT=4318 npm start</w:t>
-      </w:r>
-    </w:p>
-    <w:p>
-      <w:r>
-        <w:rPr>
-          <w:b w:val="0"/>
-        </w:rPr>
-        <w:t>Windows 命令提示符：</w:t>
-      </w:r>
-    </w:p>
-    <w:p>
-      <w:pPr>
-        <w:keepLines/>
-        <w:spacing w:line="320" w:lineRule="exact" w:before="40" w:after="140"/>
-        <w:ind w:left="230"/>
-      </w:pPr>
-      <w:r>
-        <w:rPr>
-          <w:rFonts w:ascii="Menlo" w:hAnsi="Menlo"/>
-          <w:sz w:val="21"/>
-        </w:rPr>
         <w:t>set PORT=4318</w:t>
         <w:br/>
         <w:t>npm start</w:t>
@@ -3682,21 +3676,23 @@
         <w:rPr>
           <w:b w:val="0"/>
         </w:rPr>
-        <w:t xml:space="preserve">核对两类连接是否都配置了密钥、基础地址和模型名。401/403 通常需要核查密钥或权限；404 需要核查接口与模型；429 需要核查额度或限流。连接测试通过但生成失败时，以生成任务的错误为准，向服务方确认相关接口支持情况。修复后使用页面上的重试或继续入口，不要删除 </w:t>
-      </w:r>
-      <w:r>
-        <w:rPr>
-          <w:rFonts w:ascii="Menlo" w:hAnsi="Menlo"/>
-          <w:b w:val="0"/>
-          <w:sz w:val="20"/>
-        </w:rPr>
-        <w:t>.local</w:t>
-      </w:r>
-      <w:r>
-        <w:rPr>
-          <w:b w:val="0"/>
-        </w:rPr>
-        <w:t>。</w:t>
+        <w:t>先核对两类模型的密钥、地址和名称。401/403 查密钥与权限，404 查接口与模型，429 查额度与限流。连接测试通过不代表生成稳定，以任务错误为准；修复后点重试或继续，不要删除数据目录。</w:t>
+      </w:r>
+    </w:p>
+    <w:p>
+      <w:r>
+        <w:rPr>
+          <w:b w:val="0"/>
+        </w:rPr>
+        <w:t>若服务明确返回上游 TLS 握手中断，内容请求会等待 2、5、10 秒，最多重试 3 次；后台显示进度，停止可取消。持续失败需检查模型服务。普通 5xx、超时、结果不确定及图片请求不自动重发；各次用量单独记录，未知费用不记零。</w:t>
+      </w:r>
+    </w:p>
+    <w:p>
+      <w:r>
+        <w:rPr>
+          <w:b w:val="0"/>
+        </w:rPr>
+        <w:t>内容分析每批最多 8 页，校验通过即保存。失败或重启后点“继续未完成任务”，复用原稿未变且版本有效的分析；旧版未保存的结果无法补回。分析进度不等于出图进度。</w:t>
       </w:r>
     </w:p>
     <w:p>

</xml_diff>

<commit_message>
Improve generation recovery feedback and guide narration preparation
</commit_message>
<xml_diff>
--- a/docs/AutoPPT-安装与使用说明.docx
+++ b/docs/AutoPPT-安装与使用说明.docx
@@ -2110,7 +2110,7 @@
         <w:rPr>
           <w:b w:val="0"/>
         </w:rPr>
-        <w:t>全部或选择几页重新设计</w:t>
+        <w:t>看懂本次制作进度</w:t>
       </w:r>
     </w:p>
     <w:p>
@@ -2118,7 +2118,7 @@
         <w:rPr>
           <w:b w:val="0"/>
         </w:rPr>
-        <w:t>在制作台点击“重新设计”（手机端先展开“更多操作”，也可用键盘聚焦后按 Enter 展开）。手机首屏保留“补齐未生成页面”；首部插页和撤销也在“更多操作”中。选择“全部页面重新设计”会包含整个项目，不受当前查看段落影响；选择“选择几页重新设计”后，直接勾选缩略图，也可“全选可重做页面”或“清空选择”。页面卡片左上角的多选框始终显示，勾选后也能从底栏“重新设计所选 N 页”进入，原有勾选会带入窗口。</w:t>
+        <w:t>顶部按本次实际需要制作的页面显示“已生成、失败、待处理”，另列已保存并跳过的页数。例如 133 页中还有 24 页未完成，继续后分母为 24，另外 109 页明确显示已保存、本次跳过；当前页仍标注原项目页码。“已处理”包括成功和失败，不代表全部成图；内容分析保存进度也不代表图片已经生成。</w:t>
       </w:r>
     </w:p>
     <w:p>
@@ -2126,7 +2126,7 @@
         <w:rPr>
           <w:b w:val="0"/>
         </w:rPr>
-        <w:t>核对窗口里的当前风格、页码和数量，再点击“开始重新设计 N 页”。这时才会调用模型并产生费用；取消不会生成。使用已保存的讲稿、内容附件、风格和配色重新出图，成功后旧图存入历史，失败保留旧图。正在制作的页不能重复提交，可以选择其他空闲页。此操作重做 PPT 图片；动态 HTML 仍从独立入口转换。</w:t>
+        <w:t>有页面失败时，顶部立即显示失败数量。展开“查看原因与处理方式”可查看原页码、原因分类、建议操作，再展开具体错误。失败页本轮先跳过，其他页继续，已完成内容立即保存。只在符合自动重试条件的连接中断时显示等待与重试次数，无需再次点击；进入失败明细的页不会自动无限重试。任务结束后处理原因，再点击“继续未完成任务”，仅补做未完成部分。</w:t>
       </w:r>
     </w:p>
     <w:p>
@@ -2137,7 +2137,7 @@
         <w:rPr>
           <w:b w:val="0"/>
         </w:rPr>
-        <w:t>控制画面文字密度</w:t>
+        <w:t>全部或选择几页重新设计</w:t>
       </w:r>
     </w:p>
     <w:p>
@@ -2145,7 +2145,7 @@
         <w:rPr>
           <w:b w:val="0"/>
         </w:rPr>
-        <w:t>新页面会先提炼上屏文案，再单独复核，最后把文案和原始风格提示词一起交给图片模型。系统把内容分为核心表达、必要支撑和口播展开，提炼观众需要看见的重点，不逐句缩写原稿；开场、重复解释、口语衔接和长段展开优先留给口播，同时保留关键条件、数字、单位和范围。逐字稿与导出备注保持完整。</w:t>
+        <w:t>在制作台点击“重新设计”（手机端先展开“更多操作”，也可用键盘聚焦后按 Enter 展开）。手机首屏保留“补齐未生成页面”；首部插页和撤销也在“更多操作”中。选择“全部页面重新设计”会包含整个项目，不受当前查看段落影响；选择“选择几页重新设计”后，直接勾选缩略图，也可“全选可重做页面”或“清空选择”。页面卡片左上角的多选框始终显示，勾选后也能从底栏“重新设计所选 N 页”进入，原有勾选会带入窗口。</w:t>
       </w:r>
     </w:p>
     <w:p>
@@ -2153,71 +2153,7 @@
         <w:rPr>
           <w:b w:val="0"/>
         </w:rPr>
-        <w:t>原稿引用校验允许空行、换行、中文间距和 Markdown 加粗、斜体差异；例如两句之间少一个空行，不再报“缺少原文依据”。原稿和引用记录保持原样，英文单词与数字之间有意义的分隔仍保留。实质文字、数字、标点、否定或条件变化，以及跳过正文拼接引用，仍会被拦截。完整语义由文案复核继续检查，已选主张的必保条件也继续保留。</w:t>
-      </w:r>
-    </w:p>
-    <w:p>
-      <w:r>
-        <w:rPr>
-          <w:b w:val="0"/>
-        </w:rPr>
-        <w:t>在“上屏文案与风格 → 文字取舍与密度”查看讲稿字数、上屏字数、文字组数及取舍依据。字数含标点、不计空白；附件内部文字不计入，但模型会看图判断阅读负担。改稿后的旧方案提示重新设计，缺失记录不显示。可展开风格原文和实际出图提示词核对输入。</w:t>
-      </w:r>
-    </w:p>
-    <w:p>
-      <w:r>
-        <w:rPr>
-          <w:b w:val="0"/>
-        </w:rPr>
-        <w:t>风格试做显示“本次提炼的上屏内容”。对照时复制完整出图提示词，或分别复制风格和“内容部分（含辅助信息）”，可展开辅助依据。开启“按内容构思”、内容倾向或独立配色时，请复制完整提示词以包含全部要求。只复制主文案会漏掉语义边界，已有 ChatGPT 对话也可能带入上下文。复制取自当前记录，改稿后会提示；不调用模型，受限时可手动复制。</w:t>
-      </w:r>
-    </w:p>
-    <w:p>
-      <w:r>
-        <w:rPr>
-          <w:b w:val="0"/>
-        </w:rPr>
-        <w:t>页面按任务设置密度提醒，超出时说明保留理由，不截断原稿或自动增加页数。字多时可填写“上屏文字调整”后重做；只调整画面或换风格时复用文案。确需拆页时，在逐字稿中手动选择分界。</w:t>
-      </w:r>
-    </w:p>
-    <w:p>
-      <w:r>
-        <w:rPr>
-          <w:b w:val="0"/>
-        </w:rPr>
-        <w:t>校验保护已选上屏主张的必要条件，允许“五个/5个”等明确等值的整数数量写法。整条移至口播的非核心支撑信息不必强制上屏；仍在表达的结果不能只删限定词。来源或必保信息错误最多自动修正一次；字面匹配仍失败时，自动恢复有来源依据的对应原句再校验，不增加模型请求；来源、原意或其他校验仍不通过才停止出图、保留旧图并显示具体原因。恢复记录可在文字取舍中查看。</w:t>
-      </w:r>
-    </w:p>
-    <w:p>
-      <w:r>
-        <w:rPr>
-          <w:b w:val="0"/>
-        </w:rPr>
-        <w:t>正常提炼与复核共两次内容请求，自动修正最多增加一次请求及相应等待和费用。换风格、重新构图及仅更新出图格式时复用有效文案；图片失败后重试复用有效方案。语义判断仍可能出错，密度复核不代表成图面积或阅读时间，成图仍需检查。</w:t>
-      </w:r>
-    </w:p>
-    <w:p>
-      <w:r>
-        <w:rPr>
-          <w:b w:val="0"/>
-        </w:rPr>
-        <w:t>内容部分会保留各组文案的核心、支撑、限定或出处、标签角色，供图片模型建立阅读主次，角色说明本身不上屏。字号、位置和构图仍依照风格决定。旧图片保持原样，下次主动重新设计或续做时采用新格式；格式更新不代表排版质量已验收。</w:t>
-      </w:r>
-    </w:p>
-    <w:p>
-      <w:r>
-        <w:rPr>
-          <w:b w:val="0"/>
-        </w:rPr>
-        <w:t>出图默认使用风格原文、上屏文案和简短的辅助表达边界。以已提炼的上屏文案为主，保持原意和表达程度。为丰富页面可增加少量、轻微、中性的辅助联想或解释，不能有指向性或引导性，不能让观众读出原文没有表达的意思、判断、倾向或结论，也不能补造事实。文字、图像和图形关系都遵守这一边界；有来源的摘录仅作次要辅助。成图仍需核对。</w:t>
-      </w:r>
-    </w:p>
-    <w:p>
-      <w:r>
-        <w:rPr>
-          <w:b w:val="0"/>
-        </w:rPr>
-        <w:t>“实际发送的出图提示词”同时显示服务、请求模型和规格、实际尺寸及服务返回的信息。缺失信息不补造；若服务返回改写提示词也会显示。同文输入不保证构图一致，第三方接口的模型名称也不能证明后端与 ChatGPT 相同。</w:t>
+        <w:t>核对窗口里的当前风格、页码和数量，再点击“开始重新设计 N 页”。这时才会调用模型并产生费用；取消不会生成。使用已保存的讲稿、内容附件、风格和配色重新出图，成功后旧图存入历史，失败保留旧图。正在制作的页不能重复提交，可以选择其他空闲页。此操作重做 PPT 图片；动态 HTML 仍从独立入口转换。</w:t>
       </w:r>
     </w:p>
     <w:p>
@@ -2228,7 +2164,7 @@
         <w:rPr>
           <w:b w:val="0"/>
         </w:rPr>
-        <w:t>重做时加入图表或产品截图</w:t>
+        <w:t>控制画面文字密度</w:t>
       </w:r>
     </w:p>
     <w:p>
@@ -2236,7 +2172,7 @@
         <w:rPr>
           <w:b w:val="0"/>
         </w:rPr>
-        <w:t>打开要调整的页面，在“换一个思路，再设计一次”下面点击“添加图片”。可添加 1–4 张 PNG、JPG 或 WebP，每张最多 12 MB。缩略图可打开查看，也可移除后换图。</w:t>
+        <w:t>新页面会先提炼上屏文案，再单独复核，最后把文案和原始风格提示词一起交给图片模型。系统把内容分为核心表达、必要支撑和口播展开，提炼观众需要看见的重点，不逐句缩写原稿；开场、重复解释、口语衔接和长段展开优先留给口播，同时保留关键条件、数字、单位和范围。逐字稿与导出备注保持完整。</w:t>
       </w:r>
     </w:p>
     <w:p>
@@ -2244,7 +2180,7 @@
         <w:rPr>
           <w:b w:val="0"/>
         </w:rPr>
-        <w:t>这些图片是内容材料，不是风格参考。可写明用途，如“第一张是操作界面，第二张是测试结果”，再点击“重新设计这页”。附件会交给文案提炼、复核和图片模型，结合风格原文参与整页构图，不默认贴缩略图、套卡片或固定放在一侧。照片可裁切无关外围、自然衔接背景；图表与界面用周围排版融合。保留主体身份、数据、文字和必要上下文，避免扭曲、遮挡或缩得过小。</w:t>
+        <w:t>原稿引用校验允许空行、换行、中文间距和 Markdown 加粗、斜体差异；例如两句之间少一个空行，不再报“缺少原文依据”。原稿和引用记录保持原样，英文单词与数字之间有意义的分隔仍保留。实质文字、数字、标点、否定或条件变化，以及跳过正文拼接引用，仍会被拦截。完整语义由文案复核继续检查，已选主张的必保条件也继续保留。</w:t>
       </w:r>
     </w:p>
     <w:p>
@@ -2252,7 +2188,7 @@
         <w:rPr>
           <w:b w:val="0"/>
         </w:rPr>
-        <w:t>成功后，附件随这一版页面保存；恢复历史版本也会恢复对应附件。生成失败时保留旧页面、本次方案和附件，可以继续重试。添加后尚未点击重做就离开，会提示附件选择尚未提交。</w:t>
+        <w:t>在“上屏文案与风格 → 文字取舍与密度”查看讲稿字数、上屏字数、文字组数及取舍依据。字数含标点、不计空白；附件内部文字不计入，但模型会看图判断阅读负担。改稿后的旧方案提示重新设计，缺失记录不显示。可展开风格原文和实际出图提示词核对输入。</w:t>
       </w:r>
     </w:p>
     <w:p>
@@ -2260,7 +2196,55 @@
         <w:rPr>
           <w:b w:val="0"/>
         </w:rPr>
-        <w:t>带附件出图要求配置的图片服务支持 Images Edits 多图输入；不支持时会明确报错，不会自动忽略附件改为纯文字出图。模型生成的图表数值、小字与产品细节仍应检查；接口传递的测试不代表真实模型能逐像素保留材料。</w:t>
+        <w:t>风格试做显示“本次提炼的上屏内容”。对照时复制完整出图提示词，或分别复制风格和“内容部分（含辅助信息）”，可展开辅助依据。开启“按内容构思”、内容倾向或独立配色时，请复制完整提示词以包含全部要求。只复制主文案会漏掉语义边界，已有 ChatGPT 对话也可能带入上下文。复制取自当前记录，改稿后会提示；不调用模型，受限时可手动复制。</w:t>
+      </w:r>
+    </w:p>
+    <w:p>
+      <w:r>
+        <w:rPr>
+          <w:b w:val="0"/>
+        </w:rPr>
+        <w:t>页面按任务设置密度提醒，超出时说明保留理由，不截断原稿或自动增加页数。字多时可填写“上屏文字调整”后重做；只调整画面或换风格时复用文案。确需拆页时，在逐字稿中手动选择分界。</w:t>
+      </w:r>
+    </w:p>
+    <w:p>
+      <w:r>
+        <w:rPr>
+          <w:b w:val="0"/>
+        </w:rPr>
+        <w:t>校验保护已选上屏主张的必要条件，允许“五个/5个”等明确等值的整数数量写法。整条移至口播的非核心支撑信息不必强制上屏；仍在表达的结果不能只删限定词。来源或必保信息错误最多自动修正一次；字面匹配仍失败时，自动恢复有来源依据的对应原句再校验，不增加模型请求；来源、原意或其他校验仍不通过才停止出图、保留旧图并显示具体原因。恢复记录可在文字取舍中查看。</w:t>
+      </w:r>
+    </w:p>
+    <w:p>
+      <w:r>
+        <w:rPr>
+          <w:b w:val="0"/>
+        </w:rPr>
+        <w:t>正常提炼与复核共两次内容请求，自动修正最多增加一次请求及相应等待和费用。换风格、重新构图及仅更新出图格式时复用有效文案；图片失败后重试复用有效方案。语义判断仍可能出错，密度复核不代表成图面积或阅读时间，成图仍需检查。</w:t>
+      </w:r>
+    </w:p>
+    <w:p>
+      <w:r>
+        <w:rPr>
+          <w:b w:val="0"/>
+        </w:rPr>
+        <w:t>内容部分会保留各组文案的核心、支撑、限定或出处、标签角色，供图片模型建立阅读主次，角色说明本身不上屏。字号、位置和构图仍依照风格决定。旧图片保持原样，下次主动重新设计或续做时采用新格式；格式更新不代表排版质量已验收。</w:t>
+      </w:r>
+    </w:p>
+    <w:p>
+      <w:r>
+        <w:rPr>
+          <w:b w:val="0"/>
+        </w:rPr>
+        <w:t>出图默认使用风格原文、上屏文案和简短的辅助表达边界。以已提炼的上屏文案为主，保持原意和表达程度。为丰富页面可增加少量、轻微、中性的辅助联想或解释，不能有指向性或引导性，不能让观众读出原文没有表达的意思、判断、倾向或结论，也不能补造事实。文字、图像和图形关系都遵守这一边界；有来源的摘录仅作次要辅助。成图仍需核对。</w:t>
+      </w:r>
+    </w:p>
+    <w:p>
+      <w:r>
+        <w:rPr>
+          <w:b w:val="0"/>
+        </w:rPr>
+        <w:t>“实际发送的出图提示词”同时显示服务、请求模型和规格、实际尺寸及服务返回的信息。缺失信息不补造；若服务返回改写提示词也会显示。同文输入不保证构图一致，第三方接口的模型名称也不能证明后端与 ChatGPT 相同。</w:t>
       </w:r>
     </w:p>
     <w:p>
@@ -2271,7 +2255,7 @@
         <w:rPr>
           <w:b w:val="0"/>
         </w:rPr>
-        <w:t>用报告核对内容完整性</w:t>
+        <w:t>重做时加入图表或产品截图</w:t>
       </w:r>
     </w:p>
     <w:p>
@@ -2279,7 +2263,7 @@
         <w:rPr>
           <w:b w:val="0"/>
         </w:rPr>
-        <w:t>在交付中心点击“查看制作报告”。报告显示四项：已提交原文字数、页面总数、页面备注字数、演说稿字数，并显示已有画面与待生成的页数。</w:t>
+        <w:t>打开要调整的页面，在“换一个思路，再设计一次”下面点击“添加图片”。可添加 1–4 张 PNG、JPG 或 WebP，每张最多 12 MB。缩略图可打开查看，也可移除后换图。</w:t>
       </w:r>
     </w:p>
     <w:p>
@@ -2287,7 +2271,7 @@
         <w:rPr>
           <w:b w:val="0"/>
         </w:rPr>
-        <w:t>统一按非空白字符计数：不计空格和换行，汉字、标点、数字及每个英文字母各算一个字符。原文包含提交时的 Markdown 标题，所以另列去标题后的正文，用正文与备注比较，避免把正常去标题误判为遗漏。</w:t>
+        <w:t>这些图片是内容材料，不是风格参考。可写明用途，如“第一张是操作界面，第二张是测试结果”，再点击“重新设计这页”。附件会交给文案提炼、复核和图片模型，结合风格原文参与整页构图，不默认贴缩略图、套卡片或固定放在一侧。照片可裁切无关外围、自然衔接背景；图表与界面用周围排版融合。保留主体身份、数据、文字和必要上下文，避免扭曲、遮挡或缩得过小。</w:t>
       </w:r>
     </w:p>
     <w:p>
@@ -2295,7 +2279,7 @@
         <w:rPr>
           <w:b w:val="0"/>
         </w:rPr>
-        <w:t>报告不仅比较字数，还逐字检查正文与当前已保存备注的顺序和内容。发现差异时显示第一处差异的上下文，能定位时可直接打开对应页面。改过备注也可能产生差异，需要结合原稿判断；报告不会自动改稿。</w:t>
+        <w:t>成功后，附件随这一版页面保存；恢复历史版本也会恢复对应附件。生成失败时保留旧页面、本次方案和附件，可以继续重试。添加后尚未点击重做就离开，会提示附件选择尚未提交。</w:t>
       </w:r>
     </w:p>
     <w:p>
@@ -2303,21 +2287,63 @@
         <w:rPr>
           <w:b w:val="0"/>
         </w:rPr>
-        <w:t>演说稿就是页面备注按顺序拼合，因此两者字数相同；完整性要以备注与原稿正文的核对结果为准。未拆页的已提交段落计入原文并提示，未提交草稿单独显示、不纳入基准。可展开逐页字数，或下载文字报告。报告不调用模型。</w:t>
-      </w:r>
-    </w:p>
-    <w:p>
-      <w:r>
-        <w:rPr>
-          <w:b w:val="0"/>
-        </w:rPr>
-        <w:t>新图、试做和附件重绘统一请求 2560 × 1440（16:9）、high 质量；旧图不变。接口可能返回不同尺寸，实际像素可在生成依据中核对，程序不拉伸放大。</w:t>
+        <w:t>带附件出图要求配置的图片服务支持 Images Edits 多图输入；不支持时会明确报错，不会自动忽略附件改为纯文字出图。模型生成的图表数值、小字与产品细节仍应检查；接口传递的测试不代表真实模型能逐像素保留材料。</w:t>
       </w:r>
     </w:p>
     <w:p>
       <w:pPr>
         <w:pStyle w:val="Heading2"/>
-        <w:pageBreakBefore/>
+      </w:pPr>
+      <w:r>
+        <w:rPr>
+          <w:b w:val="0"/>
+        </w:rPr>
+        <w:t>用报告核对内容完整性</w:t>
+      </w:r>
+    </w:p>
+    <w:p>
+      <w:r>
+        <w:rPr>
+          <w:b w:val="0"/>
+        </w:rPr>
+        <w:t>在交付中心点击“查看制作报告”。报告显示四项：已提交原文字数、页面总数、页面备注字数、演说稿字数，并显示已有画面与待生成的页数。</w:t>
+      </w:r>
+    </w:p>
+    <w:p>
+      <w:r>
+        <w:rPr>
+          <w:b w:val="0"/>
+        </w:rPr>
+        <w:t>统一按非空白字符计数：不计空格和换行，汉字、标点、数字及每个英文字母各算一个字符。原文包含提交时的 Markdown 标题，所以另列去标题后的正文，用正文与备注比较，避免把正常去标题误判为遗漏。</w:t>
+      </w:r>
+    </w:p>
+    <w:p>
+      <w:r>
+        <w:rPr>
+          <w:b w:val="0"/>
+        </w:rPr>
+        <w:t>报告不仅比较字数，还逐字检查正文与当前已保存备注的顺序和内容。发现差异时显示第一处差异的上下文，能定位时可直接打开对应页面。改过备注也可能产生差异，需要结合原稿判断；报告不会自动改稿。</w:t>
+      </w:r>
+    </w:p>
+    <w:p>
+      <w:r>
+        <w:rPr>
+          <w:b w:val="0"/>
+        </w:rPr>
+        <w:t>演说稿就是页面备注按顺序拼合，因此两者字数相同；完整性要以备注与原稿正文的核对结果为准。未拆页的已提交段落计入原文并提示，未提交草稿单独显示、不纳入基准。可展开逐页字数，或下载文字报告。报告不调用模型。</w:t>
+      </w:r>
+    </w:p>
+    <w:p>
+      <w:r>
+        <w:rPr>
+          <w:b w:val="0"/>
+        </w:rPr>
+        <w:t>新图、试做和附件重绘统一请求 2560 × 1440（16:9）、high 质量；旧图不变。接口可能返回不同尺寸，实际像素可在生成依据中核对，程序不拉伸放大。</w:t>
+      </w:r>
+    </w:p>
+    <w:p>
+      <w:pPr>
+        <w:pStyle w:val="Heading2"/>
       </w:pPr>
       <w:r>
         <w:rPr>
@@ -2616,7 +2642,7 @@
         <w:rPr>
           <w:b w:val="0"/>
         </w:rPr>
-        <w:t>1. 回到演练中心并打开演讲播放器。默认进入“放映”，可选择已有口播或仅放映 PPT；已有音频不要求重新配置服务。</w:t>
+        <w:t>1. 在演练中心点击“制作 AI 口播”，直接进入文本检查。若只想手动放映或播放已有口播，点击“打开演讲播放器”，默认进入“放映”；已有音频不要求重新配置服务。</w:t>
       </w:r>
     </w:p>
     <w:p>
@@ -2627,7 +2653,7 @@
         <w:rPr>
           <w:b w:val="0"/>
         </w:rPr>
-        <w:t>2. 进入“1 · 口播文本”。点击“重新识别整场口播”，从原稿过滤主副标题、一级菜单、章节和停顿、暂停、环顾四周等动作提示。结果即时显示；用“查看口播页”逐页核对正文和过滤说明，可编辑并保存，原稿不变。留空表示本页不口播。</w:t>
+        <w:t>2. 进入“1 · 口播文本”。点击“重新识别整场口播”，从原稿过滤主副标题、一级菜单、章节和停顿、暂停、环顾四周等动作提示。结果即时显示；用“查看口播页”逐页核对正文和过滤说明，可编辑，原稿不变。留空表示本页不口播。检查后点击“保存并继续 · 选择演讲表达”，成功保存后才进入下一步。</w:t>
       </w:r>
     </w:p>
     <w:p>
@@ -2638,7 +2664,7 @@
         <w:rPr>
           <w:b w:val="0"/>
         </w:rPr>
-        <w:t>3. 进入“2 · 声音制作”。选择播报男声、新闻女声、电台男主播、温柔学姐或自己创建的声音。设置整体及逐页情绪，必要时调整生成语速；普通口播试听本页开头最多 180 字；演绎口播试听本页第一个编排句段（最多 600 字）。试听会调用语音服务。点击后，按钮旁显示生成状态和等待秒数，完成后自动尝试播放。若自动播放受限，点击“播放已生成试听”；可在原位置暂停、继续和重播，这些播放操作不再调用语音模型。生成或读取失败会在按钮旁说明原因，读取重试使用已保存音频。等待过久可点击“停止等待”；切换工作区也会停止等待，不会在离开后突然播放。</w:t>
+        <w:t>3. 在“2 · 演讲表达”选择 AI 编排或普通口播。AI 编排成功后检查方案，点击“使用方案 · 选择声音”；若不需要编排，点击“跳过 AI 编排 · 使用普通口播”，不额外调用内容分析模型。失败会说明已停止，可重新编排或选择普通口播，旧音频仍可播放。</w:t>
       </w:r>
     </w:p>
     <w:p>
@@ -2649,7 +2675,7 @@
         <w:rPr>
           <w:b w:val="0"/>
         </w:rPr>
-        <w:t>4. 检查满意后点击“生成整场口播”。1–500 页需都有画面；系统逐页、逐段合成并保存。已完成声音保留，失败可继续未完成页面。生成期间仍能播放选中的旧版，新版完成后点击“使用新口播版本”。</w:t>
+        <w:t>4. 进入“3 · 声音制作”。选择播报男声、新闻女声、电台男主播、温柔学姐或自己创建的声音。设置整体及逐页情绪，必要时调整生成语速；普通口播试听本页开头最多 180 字；演绎口播试听本页第一个编排句段（最多 600 字）。试听会调用语音服务。点击后，按钮旁显示生成状态和等待秒数，完成后自动尝试播放。若自动播放受限，点击“播放已生成试听”；可在原位置暂停、继续和重播，这些播放操作不再调用语音模型。生成或读取失败会在按钮旁说明原因，读取重试使用已保存音频。等待过久可点击“停止等待”；切换工作区也会停止等待，不会在离开后突然播放。</w:t>
       </w:r>
     </w:p>
     <w:p>
@@ -2660,7 +2686,18 @@
         <w:rPr>
           <w:b w:val="0"/>
         </w:rPr>
-        <w:t>5. 点击“开始口播”，长页片段依次播放，最后一个片段结束后翻页。随时暂停、继续、跳页或拖动当前片段进度；画面下方“播放倍速”可实时选择 0.75× 至 2×，换页继续保持，无需重新生成。无口播页停留 3 秒，倍速也影响这段停留；末页停止。切到其他标签页或窗口可能暂停，回到播放器可继续。</w:t>
+        <w:t>5. 检查满意后点击“生成整场口播”。1–500 页需都有画面；系统逐页、逐段合成并保存。已完成声音保留，失败可继续未完成页面。生成期间仍能播放选中的旧版，新版完成后点击“使用新口播版本”。</w:t>
+      </w:r>
+    </w:p>
+    <w:p>
+      <w:pPr>
+        <w:ind w:left="288" w:hanging="288"/>
+      </w:pPr>
+      <w:r>
+        <w:rPr>
+          <w:b w:val="0"/>
+        </w:rPr>
+        <w:t>6. 切换到“放映”，点击“开始口播”，长页片段依次播放，最后一个片段结束后翻页。随时暂停、继续、跳页或拖动当前片段进度；画面下方“播放倍速”可实时选择 0.75× 至 2×，换页继续保持，无需重新生成。无口播页停留 3 秒，倍速也影响这段停留；末页停止。切到其他标签页或窗口可能暂停，回到播放器可继续。</w:t>
       </w:r>
     </w:p>
     <w:p>
@@ -2725,7 +2762,7 @@
         <w:rPr>
           <w:b w:val="0"/>
         </w:rPr>
-        <w:t>在“1 · 口播文本”检查正文后，点击“AI 编排整场演讲”。这与本地“重新识别”不同：它会调用设置中的内容分析模型，先过滤常见非口播标记，再结合全场目录、前后文和原稿提示，给原句安排情绪、节奏、停顿与重点表达；不允许模型增删改写口播正文。支持 1–500 页、单次最多 30 万字符。</w:t>
+        <w:t>在“1 · 口播文本”检查并保存正文后，进入“2 · 演讲表达”，点击“AI 编排整场演讲”。这与本地“重新识别”不同：它会调用设置中的内容分析模型，先过滤常见非口播标记，再结合全场目录、前后文和原稿提示，给原句安排情绪、节奏、停顿与重点表达；不允许模型增删改写口播正文。支持 1–500 页、单次最多 30 万字符。</w:t>
       </w:r>
     </w:p>
     <w:p>
@@ -2741,7 +2778,7 @@
         <w:rPr>
           <w:b w:val="0"/>
         </w:rPr>
-        <w:t>编排显示当前处理页和进度，可以停止；失败或中断保留上一份完成方案与已有音频，下次不会自动调用模型。完成后用“查看口播页”逐页检查情绪、语速、句后额外停顿及原因，也可下载带提示的演绎稿。重点句通过整句稍慢、音量略增强来表现，暂不提供精确的词级重音。</w:t>
+        <w:t>编排显示当前处理页和进度，可以停止；失败或中断保留上一份完成方案与已有音频，下次不会自动调用模型。完成后在“2 · 演讲表达”用“查看演绎页”逐页检查情绪、语速、句后额外停顿及原因，也可下载带提示的演绎稿。重点句通过整句稍慢、音量略增强来表现，暂不提供精确的词级重音。</w:t>
       </w:r>
     </w:p>
     <w:p>
@@ -2749,7 +2786,7 @@
         <w:rPr>
           <w:b w:val="0"/>
         </w:rPr>
-        <w:t>勾选“使用这份演绎编排生成口播”，进入“2 · 声音制作”试听，再生成整场。此时编排接管整体和逐页情绪，生成语速仍可整体调整。正文、页序或页面数量改变后，需重新编排；也可取消勾选，继续按普通口播生成。旧音频始终保留，编排完成不会自动扣取语音生成额度。</w:t>
+        <w:t>点击“使用方案 · 选择声音”，进入“3 · 声音制作”试听，再生成整场。此时编排接管整体和逐页情绪，生成语速仍可整体调整。正文、页序或页面数量改变后，需重新编排；也可选择“跳过 AI 编排 · 使用普通口播”，继续按普通口播生成。旧音频始终保留，编排完成不会自动扣取语音生成额度。</w:t>
       </w:r>
     </w:p>
     <w:p>
@@ -2800,7 +2837,7 @@
         <w:rPr>
           <w:b w:val="0"/>
         </w:rPr>
-        <w:t>旧版音频已读入的标题或提示无法靠文本过滤直接消除。在演播台“1 · 口播文本”点击“重新识别整场口播”，按钮旁会显示处理页数、过滤数量与更新结果；没有变化也会明确提示。识别和保存只处理文字、不计费，保存成功或失败就在按钮旁显示。检查文本后前往“2 · 声音制作”，点击“生成整场口播”更新声音；只有变化的文本需重新合成，旧版本保留。常见标记按规则识别，不保证识别所有语义含糊的说明，请检查实际口播文本。</w:t>
+        <w:t>旧版音频已读入的标题或提示无法靠文本过滤直接消除。在演播台“1 · 口播文本”点击“重新识别整场口播”，按钮旁会显示处理页数、过滤数量与更新结果；没有变化也会明确提示。识别和保存只处理文字、不计费，保存成功或失败就在按钮旁显示。检查文本后前往“3 · 声音制作”，点击“生成整场口播”更新声音；只有变化的文本需重新合成，旧版本保留。常见标记按规则识别，不保证识别所有语义含糊的说明，请检查实际口播文本。</w:t>
       </w:r>
     </w:p>
     <w:p>

</xml_diff>

<commit_message>
Recover explicit temporary model rejections before surfacing failures
</commit_message>
<xml_diff>
--- a/docs/AutoPPT-安装与使用说明.docx
+++ b/docs/AutoPPT-安装与使用说明.docx
@@ -2126,7 +2126,7 @@
         <w:rPr>
           <w:b w:val="0"/>
         </w:rPr>
-        <w:t>有页面失败时，顶部立即显示失败数量。展开“查看原因与处理方式”可查看原页码、原因分类、建议操作，再展开具体错误。失败页本轮先跳过，其他页继续，已完成内容立即保存。只在符合自动重试条件的连接中断时显示等待与重试次数，无需再次点击；进入失败明细的页不会自动无限重试。任务结束后处理原因，再点击“继续未完成任务”，仅补做未完成部分。</w:t>
+        <w:t>可恢复的服务拥堵、暂无可用通道或限流拒绝会先自动等待并重试，显示原因、等待时间与次数，无需再次点击，恢复期间不标为失败。恢复成功后继续制作；重试耗尽或需人工处理时，才显示失败数量。展开“查看原因与处理方式”可查看原页码、原因分类、建议操作和具体错误。失败页先跳过，其他页继续，已完成内容立即保存。任务结束后点击“继续未完成任务”，仅补做未完成部分。</w:t>
       </w:r>
     </w:p>
     <w:p>
@@ -2713,7 +2713,7 @@
         <w:rPr>
           <w:b w:val="0"/>
         </w:rPr>
-        <w:t>口播使用生成时的画面与讲稿快照。之后改稿、换图或调整页序时，点击“载入当前项目”，检查后重新生成；原有口播仍可从“已保存的口播”中选择。相同服务账号、模型、文本、音色、情绪与语速的音频会复用，重复播放不计模型费用。选择新声音或修改情绪后，先重新生成，才会按新设置播放。服务中断后不会自动恢复语音请求，退出 App 时也会识别正在生成的语音任务。</w:t>
+        <w:t>口播使用生成时的画面与讲稿快照。之后改稿、换图或调整页序时，点击“载入当前项目”，检查后重新生成；原有口播仍可从“已保存的口播”中选择。相同服务账号、模型、文本、音色、情绪与语速的音频会复用，重复播放不计模型费用。选择新声音或修改情绪后，先重新生成，才会按新设置播放。明确的临时服务拒绝先自动重试；超时或响应中断需核对结果后继续。退出 App 时会识别正在生成的语音任务。</w:t>
       </w:r>
     </w:p>
     <w:p>
@@ -2743,7 +2743,7 @@
         <w:rPr>
           <w:b w:val="0"/>
         </w:rPr>
-        <w:t>1002 表示请求频率超限，1008 表示余额不足。限流后自动等待，最多重试 3 次，可随时停止，已完成音频保留；超时或余额、权限错误不自动重试。</w:t>
+        <w:t>1002 表示请求频率超限，1008 表示余额不足。限流后等待 60、120、180 秒，明确的 HTTP 服务拥堵拒绝等待约 5、15、30 秒，均最多重试 3 次，并遵守更长的 Retry-After；超过 10 分钟则稍后手动继续。可随时停止，已完成音频保留；超时、余额、权限错误或已含音频/用量的返回不自动重试。</w:t>
       </w:r>
     </w:p>
     <w:p>
@@ -3713,7 +3713,7 @@
         <w:rPr>
           <w:b w:val="0"/>
         </w:rPr>
-        <w:t>先核对两类模型的密钥、地址和名称。401/403 查密钥与权限，404 查接口与模型，429 查额度与限流。连接测试通过不代表生成稳定，以任务错误为准；修复后点重试或继续，不要删除数据目录。</w:t>
+        <w:t>401/403 查密钥与权限，404 查模型与接口，429 查额度或限流。修复后继续，无需删除数据目录。</w:t>
       </w:r>
     </w:p>
     <w:p>
@@ -3721,7 +3721,7 @@
         <w:rPr>
           <w:b w:val="0"/>
         </w:rPr>
-        <w:t>若服务明确返回上游 TLS 握手中断，内容请求会等待 2、5、10 秒，最多重试 3 次；后台显示进度，停止可取消。持续失败需检查模型服务。普通 5xx、超时、结果不确定及图片请求不自动重发；各次用量单独记录，未知费用不记零。</w:t>
+        <w:t>本机内容和图片请求遇到明确拥堵、503 无可用通道或限流拒绝，自动等待约 5、15、30 秒再试；TLS 握手中断仅内容请求重试，等待 2、5、10 秒。最多重试 3 次，可停止；遵守 Retry-After，超过 10 分钟则稍后继续。需修正配置或结果不明（普通 5xx、超时、中断、已有结果/用量）时不盲目重发。各次用量分别记录，未知费用不记零。</w:t>
       </w:r>
     </w:p>
     <w:p>

</xml_diff>

<commit_message>
Preserve speech arrangement checkpoints and resume interrupted work
</commit_message>
<xml_diff>
--- a/docs/AutoPPT-安装与使用说明.docx
+++ b/docs/AutoPPT-安装与使用说明.docx
@@ -145,7 +145,21 @@
         <w:rPr>
           <w:b w:val="0"/>
         </w:rPr>
-        <w:t xml:space="preserve"> 目录取得 App 和 ZIP；普通使用者不需要执行这些命令。</w:t>
+        <w:t xml:space="preserve"> 目录取得 App 和 ZIP；旧发布包仍在运行时，构建者可设置 </w:t>
+      </w:r>
+      <w:r>
+        <w:rPr>
+          <w:rFonts w:ascii="Menlo" w:hAnsi="Menlo"/>
+          <w:b w:val="0"/>
+          <w:sz w:val="20"/>
+        </w:rPr>
+        <w:t>AUTOPPT_MAC_OUTPUT_DIR=release/next</w:t>
+      </w:r>
+      <w:r>
+        <w:rPr>
+          <w:b w:val="0"/>
+        </w:rPr>
+        <w:t>，将新包输出到独立目录，避免覆盖正在使用的 App。普通使用者不需要执行这些命令。</w:t>
       </w:r>
     </w:p>
     <w:p>
@@ -2664,7 +2678,7 @@
         <w:rPr>
           <w:b w:val="0"/>
         </w:rPr>
-        <w:t>3. 在“2 · 演讲表达”选择 AI 编排或普通口播。AI 编排成功后检查方案，点击“使用方案 · 选择声音”；若不需要编排，点击“跳过 AI 编排 · 使用普通口播”，不额外调用内容分析模型。失败会说明已停止，可重新编排或选择普通口播，旧音频仍可播放。</w:t>
+        <w:t>3. 在“2 · 演讲表达”选择 AI 编排或普通口播。AI 编排成功后检查方案，点击“使用方案 · 选择声音”；若不需要编排，点击“跳过 AI 编排 · 使用普通口播”，不额外调用内容分析模型。失败会说明已停止；有保存进度时可从中断处继续，也可选择普通口播，旧音频仍可播放。</w:t>
       </w:r>
     </w:p>
     <w:p>
@@ -2779,6 +2793,14 @@
           <w:b w:val="0"/>
         </w:rPr>
         <w:t>编排显示当前处理页和进度，可以停止；失败或中断保留上一份完成方案与已有音频，下次不会自动调用模型。完成后在“2 · 演讲表达”用“查看演绎页”逐页检查情绪、语速、句后额外停顿及原因，也可下载带提示的演绎稿。重点句通过整句稍慢、音量略增强来表现，暂不提供精确的词级重音。</w:t>
+      </w:r>
+    </w:p>
+    <w:p>
+      <w:r>
+        <w:rPr>
+          <w:b w:val="0"/>
+        </w:rPr>
+        <w:t>表达编排会在每次模型结果通过检查后保存进度，包括长页面中已经编排的句子。遇到明确拥堵、暂无通道或限流时有限重试；最终失败、手动停止或重开 App 后，点击“继续编排 · 从中断处继续”，只请求剩余内容，已保存部分不会重复分析。界面显示已完成页数和已保存句数。续编要求整场口播正文、原稿提示、标题、页序、表达设置、内容分析模型及接口一致；发生变化时需从头编排。“从头重新编排”会替换未完成进度并重新请求整场，已有完整方案和音频保留。重开 App 不自动发起付费请求；旧版失败时未保存的结果无法补回，迁移后的项目需重新编排。</w:t>
       </w:r>
     </w:p>
     <w:p>

</xml_diff>

<commit_message>
Plan whole-talk delivery and arrange speech in resumable multi-page batches
</commit_message>
<xml_diff>
--- a/docs/AutoPPT-安装与使用说明.docx
+++ b/docs/AutoPPT-安装与使用说明.docx
@@ -2776,7 +2776,7 @@
         <w:rPr>
           <w:b w:val="0"/>
         </w:rPr>
-        <w:t>在“1 · 口播文本”检查并保存正文后，进入“2 · 演讲表达”，点击“AI 编排整场演讲”。这与本地“重新识别”不同：它会调用设置中的内容分析模型，先过滤常见非口播标记，再结合全场目录、前后文和原稿提示，给原句安排情绪、节奏、停顿与重点表达；不允许模型增删改写口播正文。支持 1–500 页、单次最多 30 万字符。</w:t>
+        <w:t>在“1 · 口播文本”检查并保存正文后，进入“2 · 演讲表达”，点击“AI 编排整场演讲”。这与本地“重新识别”不同：它会调用设置中的内容分析模型，先过滤常见非口播标记，先通读全文形成统一的表达思路，再按连续多页分批安排情绪、节奏、停顿与重点表达；不允许模型增删改写口播正文。支持 1–500 页、单次最多 30 万字符。</w:t>
       </w:r>
     </w:p>
     <w:p>
@@ -2792,7 +2792,7 @@
         <w:rPr>
           <w:b w:val="0"/>
         </w:rPr>
-        <w:t>编排显示当前处理页和进度，可以停止；失败或中断保留上一份完成方案与已有音频，下次不会自动调用模型。完成后在“2 · 演讲表达”用“查看演绎页”逐页检查情绪、语速、句后额外停顿及原因，也可下载带提示的演绎稿。重点句通过整句稍慢、音量略增强来表现，暂不提供精确的词级重音。</w:t>
+        <w:t>批次按句数、正文长度与页数自动划分，每批最多 64 句、8000 正文字符、12 页，尽量保持单页完整，超长页再拆分。长稿超出一次阅读范围时分段通读后汇总，正文不会被截掉。编排显示全文规划阶段、当前批次、覆盖页码和已保存页数，可以停止；失败或中断保留上一份完成方案与已有音频，下次不会自动调用模型。完成后可展开“全场表达思路”，在“2 · 演讲表达”用“查看演绎页”逐页检查情绪、语速、句后额外停顿及原因，也可下载带提示的演绎稿。重点句通过整句稍慢、音量略增强来表现，暂不提供精确的词级重音。</w:t>
       </w:r>
     </w:p>
     <w:p>
@@ -2800,7 +2800,7 @@
         <w:rPr>
           <w:b w:val="0"/>
         </w:rPr>
-        <w:t>表达编排会在每次模型结果通过检查后保存进度，包括长页面中已经编排的句子。遇到明确拥堵、暂无通道或限流时有限重试；最终失败、手动停止或重开 App 后，点击“继续编排 · 从中断处继续”，只请求剩余内容，已保存部分不会重复分析。界面显示已完成页数和已保存句数。续编要求整场口播正文、原稿提示、标题、页序、表达设置、内容分析模型及接口一致；发生变化时需从头编排。“从头重新编排”会替换未完成进度并重新请求整场，已有完整方案和音频保留。重开 App 不自动发起付费请求；旧版失败时未保存的结果无法补回，迁移后的项目需重新编排。</w:t>
+        <w:t>表达编排会在每次模型结果通过检查后保存进度，包括长页面中已经编排的句子。遇到明确拥堵、暂无通道或限流时有限重试；最终失败、手动停止或重开 App 后，点击“继续编排 · 从中断处继续”，只请求剩余内容，已保存句子不会重新编排，已完成的全文规划也会复用；旧版逐页断点可继续使用，先补充全文规划再批量处理剩余句子。界面显示已完成页数和已保存句数。续编要求整场口播正文、原稿提示、标题、页序、表达设置、内容分析模型及接口一致；发生变化时需从头编排。“从头重新编排”会替换未完成进度并重新请求整场，已有完整方案和音频保留。重开 App 不自动发起付费请求；旧版失败时未保存的结果无法补回，迁移后的项目需重新编排。</w:t>
       </w:r>
     </w:p>
     <w:p>
@@ -2824,7 +2824,7 @@
         <w:rPr>
           <w:b w:val="0"/>
         </w:rPr>
-        <w:t>本次新增演绎流程通过模拟模型、浏览器交互和真实模型短稿联调：121 字示例正文成功生成 5 段音频，MiniMax Speech 2.8 HD 接受了轻笑、停顿与重点句控制。实际语气、辅助声音自然度及长篇连贯性仍需用户试听后确认。情绪安排是模型建议，不能保证每句都符合演讲者本人的习惯。</w:t>
+        <w:t>批量编排已通过模拟模型与浏览器验证，尚未实测真实模型下的长篇速度和听感。原有演绎流程通过模拟模型、浏览器交互和真实模型短稿联调：121 字示例正文成功生成 5 段音频，MiniMax Speech 2.8 HD 接受了轻笑、停顿与重点句控制。实际语气、辅助声音自然度及长篇连贯性仍需用户试听后确认。情绪安排是模型建议，不能保证每句都符合演讲者本人的习惯。</w:t>
       </w:r>
     </w:p>
     <w:p>

</xml_diff>

<commit_message>
Stream large offline HTML exports and load embedded media on demand
</commit_message>
<xml_diff>
--- a/docs/AutoPPT-安装与使用说明.docx
+++ b/docs/AutoPPT-安装与使用说明.docx
@@ -2852,6 +2852,28 @@
           <w:b w:val="0"/>
         </w:rPr>
         <w:t>图片、字体和音频均内嵌，文件可带到其他电脑播放，不依赖本机地址，也不会再次生成或计费。打开后尝试自动口播；浏览器拦截声音时，点击一次“开始演讲”。长页片段依次播放，讲完翻页，末页停止；可暂停、继续和跳页。无口播页停留 3 秒，动态元素按原动效出现，暂不逐句对齐。</w:t>
+      </w:r>
+    </w:p>
+    <w:p>
+      <w:r>
+        <w:rPr>
+          <w:b w:val="0"/>
+        </w:rPr>
+        <w:t xml:space="preserve">长篇演示分块写出，完成后才开始下载；不会把整场图片和声音拼成一条超长字符串。2026-10-08 修复大文件导出时的 </w:t>
+      </w:r>
+      <w:r>
+        <w:rPr>
+          <w:rFonts w:ascii="Menlo" w:hAnsi="Menlo"/>
+          <w:b w:val="0"/>
+          <w:sz w:val="20"/>
+        </w:rPr>
+        <w:t>Invalid string length</w:t>
+      </w:r>
+      <w:r>
+        <w:rPr>
+          <w:b w:val="0"/>
+        </w:rPr>
+        <w:t>，已在 macOS Chrome 断网验证 133 页、约 789 MB 的口播文件，首尾页画面和声音可用。保留原图清晰度，复用已有音频；文件较大时请等待导出完成，并为临时文件和下载文件预留磁盘空间。下载完成、失败或中断后自动清理临时文件。使用旧版 App 时，等生成任务结束后再退出并打开新版，无需重新生成口播。其他浏览器和跨电脑的大文件播放尚未实机验收。</w:t>
       </w:r>
     </w:p>
     <w:p>

</xml_diff>

<commit_message>
Use high-quality JPEGs for screen images and portable exports
Apply a QHD JPEG quality-92 profile across new images and static exports, retain transparent assets, and remap project package snapshots without changing audio or local originals. Validate 133-page offline HTML and package migration; update synchronized usage guides.
</commit_message>
<xml_diff>
--- a/docs/AutoPPT-安装与使用说明.docx
+++ b/docs/AutoPPT-安装与使用说明.docx
@@ -2352,7 +2352,15 @@
         <w:rPr>
           <w:b w:val="0"/>
         </w:rPr>
-        <w:t>新图、试做和附件重绘统一请求 2560 × 1440（16:9）、high 质量；旧图不变。接口可能返回不同尺寸，实际像素可在生成依据中核对，程序不拉伸放大。</w:t>
+        <w:t>新图、试做和附件重绘统一请求 2560 × 1440（16:9）、high 质量。保存时使用高质量 JPG，质量参数 92，保留完整色彩采样以照顾小字和线条。图片等比限制在 2560×1440 内，不裁切，较小图片不放大；实际像素可在生成依据中核对。JPG 属于有损压缩，适用于屏幕演示，不等于无损原图。</w:t>
+      </w:r>
+    </w:p>
+    <w:p>
+      <w:r>
+        <w:rPr>
+          <w:b w:val="0"/>
+        </w:rPr>
+        <w:t>新页面、试做和封面采用同一规则。风格参考图沿用 1600×1600 上限，内容附件保留实际尺寸；透明图片、抠图和蒙版仍保存为 PNG。已有本机原图与历史不批量改写，旧项目在导出 PPT、HTML 或保存单图时自动转换。已符合要求的 JPG 不重复压缩。</w:t>
       </w:r>
     </w:p>
     <w:p>
@@ -2393,7 +2401,7 @@
         <w:rPr>
           <w:b w:val="0"/>
         </w:rPr>
-        <w:t xml:space="preserve"> 为 16:9，每页包含一张完整图片和该页最新已保存的逐字稿备注。图片中的文字和图形不会拆成可编辑元素。图片保持比例、居中显示，不裁切；原图比例不同时会有留白。</w:t>
+        <w:t xml:space="preserve"> 为 16:9，每页包含一张完整图片和该页最新已保存的逐字稿备注。图片中的文字和图形不会拆成可编辑元素。图片使用适合屏幕播放的高质量 JPG，保持比例、居中显示，不裁切；原图比例不同时会有留白。</w:t>
       </w:r>
     </w:p>
     <w:p>
@@ -2873,7 +2881,7 @@
         <w:rPr>
           <w:b w:val="0"/>
         </w:rPr>
-        <w:t>，已在 macOS Chrome 断网验证 133 页、约 789 MB 的口播文件，首尾页画面和声音可用。保留原图清晰度，复用已有音频；文件较大时请等待导出完成，并为临时文件和下载文件预留磁盘空间。下载完成、失败或中断后自动清理临时文件。使用旧版 App 时，等生成任务结束后再退出并打开新版，无需重新生成口播。其他浏览器和跨电脑的大文件播放尚未实机验收。</w:t>
+        <w:t>，并启用 JPG 压缩。同一份 133 页、759 段口播的 HTML 从约 789 MB 降至 197 MB，已在 macOS Chrome 断网验证首尾页画面、声音和往返翻页。此次页面保持原有 1672×941 像素，复用已有音频；文件较大时请等待导出完成，并为临时文件和下载文件预留磁盘空间。下载完成、失败或中断后自动清理临时文件。使用旧版 App 时，等生成任务结束后再退出并打开新版，无需重新生成口播。其他浏览器和跨电脑的大文件播放尚未实机验收。</w:t>
       </w:r>
     </w:p>
     <w:p>
@@ -3155,6 +3163,14 @@
           <w:b w:val="0"/>
         </w:rPr>
         <w:t>迁移包包含保存的草稿、讲稿、图片与历史、内容附件、项目使用的风格与版本、动画图层和字体、已生成语音、声音标识、口播编辑文本及演绎编排方案。模型密钥与日志不导出，生成任务不自动恢复；继续生成时需在新电脑配置模型，复刻声音需使用有权限的 MiniMax 账号。已完成的图片与音频不需要重新生成。</w:t>
+      </w:r>
+    </w:p>
+    <w:p>
+      <w:r>
+        <w:rPr>
+          <w:b w:val="0"/>
+        </w:rPr>
+        <w:t>项目包中的不透明图片使用高质量 JPG，透明素材保留 PNG；为保留动态图层坐标和附件细节，迁移素材保持实际尺寸。历史页面、素材与口播的对应关系一并更新，声音文件不重新压缩。本机原图不改写；如果需要无损归档原始图片，应另行保留本机工作区。重复导出已符合规则的 JPG 不会反复压缩。</w:t>
       </w:r>
     </w:p>
     <w:p>

</xml_diff>

<commit_message>
fix(mac): avoid duplicate app bundles and preserve user workspaces
</commit_message>
<xml_diff>
--- a/docs/AutoPPT-安装与使用说明.docx
+++ b/docs/AutoPPT-安装与使用说明.docx
@@ -18,7 +18,7 @@
         <w:rPr>
           <w:b w:val="0"/>
         </w:rPr>
-        <w:t>适用版本：2026 年 10 月 8 日的仓库代码。</w:t>
+        <w:t>适用版本：2026 年 10 月 9 日的仓库代码。</w:t>
       </w:r>
     </w:p>
     <w:p>
@@ -131,7 +131,7 @@
         <w:rPr>
           <w:b w:val="0"/>
         </w:rPr>
-        <w:t xml:space="preserve">，在 </w:t>
+        <w:t xml:space="preserve">；在全新临时目录验证 App 与压缩包后，只保留 </w:t>
       </w:r>
       <w:r>
         <w:rPr>
@@ -139,13 +139,13 @@
           <w:b w:val="0"/>
           <w:sz w:val="20"/>
         </w:rPr>
-        <w:t>release</w:t>
-      </w:r>
-      <w:r>
-        <w:rPr>
-          <w:b w:val="0"/>
-        </w:rPr>
-        <w:t xml:space="preserve"> 目录取得 App 和 ZIP；旧发布包仍在运行时，构建者可设置 </w:t>
+        <w:t>release/AutoPPT-mac-arm64.zip</w:t>
+      </w:r>
+      <w:r>
+        <w:rPr>
+          <w:b w:val="0"/>
+        </w:rPr>
+        <w:t>，临时 App 自动清理，避免启动列表出现多个 AutoPPT。</w:t>
       </w:r>
       <w:r>
         <w:rPr>
@@ -153,13 +153,63 @@
           <w:b w:val="0"/>
           <w:sz w:val="20"/>
         </w:rPr>
-        <w:t>AUTOPPT_MAC_OUTPUT_DIR=release/next</w:t>
-      </w:r>
-      <w:r>
-        <w:rPr>
-          <w:b w:val="0"/>
-        </w:rPr>
-        <w:t>，将新包输出到独立目录，避免覆盖正在使用的 App。普通使用者不需要执行这些命令。</w:t>
+        <w:t>AUTOPPT_MAC_OUTPUT_DIR</w:t>
+      </w:r>
+      <w:r>
+        <w:rPr>
+          <w:b w:val="0"/>
+        </w:rPr>
+        <w:t xml:space="preserve"> 可指定 ZIP 输出目录，构建不修改已安装程序。普通使用者不需要执行这些命令。</w:t>
+      </w:r>
+    </w:p>
+    <w:p>
+      <w:r>
+        <w:rPr>
+          <w:b w:val="0"/>
+        </w:rPr>
+        <w:t xml:space="preserve">日常只保留“应用程序”中的 </w:t>
+      </w:r>
+      <w:r>
+        <w:rPr>
+          <w:rFonts w:ascii="Menlo" w:hAnsi="Menlo"/>
+          <w:b w:val="0"/>
+          <w:sz w:val="20"/>
+        </w:rPr>
+        <w:t>/Applications/AutoPPT.app</w:t>
+      </w:r>
+      <w:r>
+        <w:rPr>
+          <w:b w:val="0"/>
+        </w:rPr>
+        <w:t xml:space="preserve">。升级前先等任务结束、退出旧版并备份数据，再将新 App 拖入“应用程序”替换同名程序。确认新版本能打开、项目完整后，把下载或构建目录中多余的 App 移到废纸篓；暂不清空，便于恢复。不要使用卸载工具清理关联数据，也不要删除 </w:t>
+      </w:r>
+      <w:r>
+        <w:rPr>
+          <w:rFonts w:ascii="Menlo" w:hAnsi="Menlo"/>
+          <w:b w:val="0"/>
+          <w:sz w:val="20"/>
+        </w:rPr>
+        <w:t>~/Library/Application Support/AutoPPT/</w:t>
+      </w:r>
+      <w:r>
+        <w:rPr>
+          <w:b w:val="0"/>
+        </w:rPr>
+        <w:t xml:space="preserve"> 或旧浏览器版的 </w:t>
+      </w:r>
+      <w:r>
+        <w:rPr>
+          <w:rFonts w:ascii="Menlo" w:hAnsi="Menlo"/>
+          <w:b w:val="0"/>
+          <w:sz w:val="20"/>
+        </w:rPr>
+        <w:t>.local/</w:t>
+      </w:r>
+      <w:r>
+        <w:rPr>
+          <w:b w:val="0"/>
+        </w:rPr>
+        <w:t>；这些位置保存项目、素材、声音、密钥和草稿，不属于可清理的安装副本。</w:t>
       </w:r>
     </w:p>
     <w:p>

</xml_diff>

<commit_message>
fix(mac): ship HeyGen settings in the desktop app
</commit_message>
<xml_diff>
--- a/docs/AutoPPT-安装与使用说明.docx
+++ b/docs/AutoPPT-安装与使用说明.docx
@@ -246,6 +246,28 @@
           <w:b w:val="0"/>
         </w:rPr>
         <w:t>，安装包不包含他人的项目或 Key。App 不会自动迁移旧项目；可在浏览器版的交付中心导出项目源文件，再从 App 项目首页导入新副本。</w:t>
+      </w:r>
+    </w:p>
+    <w:p>
+      <w:r>
+        <w:rPr>
+          <w:b w:val="0"/>
+        </w:rPr>
+        <w:t xml:space="preserve">App 内打开“设置”，点击顶部“数字人讲解员 · HeyGen”，填写独立的 HeyGen API Key，再依次点击“保存 HeyGen 设置”和“测试 HeyGen 连接”。密钥保存在当前工作区的私有 </w:t>
+      </w:r>
+      <w:r>
+        <w:rPr>
+          <w:rFonts w:ascii="Menlo" w:hAnsi="Menlo"/>
+          <w:b w:val="0"/>
+          <w:sz w:val="20"/>
+        </w:rPr>
+        <w:t>presenter-settings.json</w:t>
+      </w:r>
+      <w:r>
+        <w:rPr>
+          <w:b w:val="0"/>
+        </w:rPr>
+        <w:t>，界面不回显、不随项目包导出；留空保存会保留已有密钥，也可单独移除。测试只查询 HeyGen 官方账号接口，不上传头像、音频或生成视频。连接成功只表示密钥有效，数字人视频生成仍在接入中。浏览器预览与 App 的密钥不会自动同步；旧 App 没有这个入口时，需要升级“应用程序”中的 App，仅刷新浏览器预览不能更新 App。</w:t>
       </w:r>
     </w:p>
     <w:p>

</xml_diff>

<commit_message>
feat(presenter): add persistent project setup to the Mac app
</commit_message>
<xml_diff>
--- a/docs/AutoPPT-安装与使用说明.docx
+++ b/docs/AutoPPT-安装与使用说明.docx
@@ -253,21 +253,15 @@
         <w:rPr>
           <w:b w:val="0"/>
         </w:rPr>
-        <w:t xml:space="preserve">App 内打开“设置”，点击顶部“数字人讲解员 · HeyGen”，填写独立的 HeyGen API Key，再依次点击“保存 HeyGen 设置”和“测试 HeyGen 连接”。密钥保存在当前工作区的私有 </w:t>
-      </w:r>
-      <w:r>
-        <w:rPr>
-          <w:rFonts w:ascii="Menlo" w:hAnsi="Menlo"/>
-          <w:b w:val="0"/>
-          <w:sz w:val="20"/>
-        </w:rPr>
-        <w:t>presenter-settings.json</w:t>
-      </w:r>
-      <w:r>
-        <w:rPr>
-          <w:b w:val="0"/>
-        </w:rPr>
-        <w:t>，界面不回显、不随项目包导出；留空保存会保留已有密钥，也可单独移除。测试只查询 HeyGen 官方账号接口，不上传头像、音频或生成视频。连接成功只表示密钥有效，数字人视频生成仍在接入中。浏览器预览与 App 的密钥不会自动同步；旧 App 没有这个入口时，需要升级“应用程序”中的 App，仅刷新浏览器预览不能更新 App。</w:t>
+        <w:t>App 内打开“设置 → 数字人讲解员 · HeyGen”，保存独立 API Key 并测试连接。密钥保存在当前工作区，不回显、不随项目包导出；测试只查询官方账号。浏览器预览与 App 配置不同步，旧 App 需升级后才有此入口。真实视频生成仍在接入中。</w:t>
+      </w:r>
+    </w:p>
+    <w:p>
+      <w:r>
+        <w:rPr>
+          <w:b w:val="0"/>
+        </w:rPr>
+        <w:t>具体项目的头像、口播和位置在“项目 → 演练中心 → 配置数字人讲解员”设置，操作步骤见后文。目前可保存配置和查看静态位置示意，播放器暂不显示数字人。</w:t>
       </w:r>
     </w:p>
     <w:p>
@@ -2962,6 +2956,110 @@
           <w:b w:val="0"/>
         </w:rPr>
         <w:t>旧版音频已读入的标题或提示无法靠文本过滤直接消除。在演播台“1 · 口播文本”点击“重新识别整场口播”，按钮旁会显示处理页数、过滤数量与更新结果；没有变化也会明确提示。识别和保存只处理文字、不计费，保存成功或失败就在按钮旁显示。检查文本后前往“3 · 声音制作”，点击“生成整场口播”更新声音；只有变化的文本需重新合成，旧版本保留。常见标记按规则识别，不保证识别所有语义含糊的说明，请检查实际口播文本。</w:t>
+      </w:r>
+    </w:p>
+    <w:p>
+      <w:pPr>
+        <w:pStyle w:val="Heading2"/>
+      </w:pPr>
+      <w:r>
+        <w:rPr>
+          <w:b w:val="0"/>
+        </w:rPr>
+        <w:t>配置项目数字人讲解员</w:t>
+      </w:r>
+    </w:p>
+    <w:p>
+      <w:r>
+        <w:rPr>
+          <w:b w:val="0"/>
+        </w:rPr>
+        <w:t>在 App 中打开一个项目，进入“演练中心”，点击“配置数字人讲解员”。空项目也能先准备头像和位置；完成讲稿、画面和口播后再选择口播版本。</w:t>
+      </w:r>
+    </w:p>
+    <w:p>
+      <w:pPr>
+        <w:ind w:left="288" w:hanging="288"/>
+      </w:pPr>
+      <w:r>
+        <w:rPr>
+          <w:b w:val="0"/>
+        </w:rPr>
+        <w:t>1. 展开“添加头像”，填写名称，选择正面清晰的静态 JPEG、PNG 或 WebP 照片，最大 8 MB，再点击“保存头像”。图片会校验、去除元数据并以本机素材保存，不会在这一步发送到 HeyGen。已保存的头像可以在其他项目中再次选择。</w:t>
+      </w:r>
+    </w:p>
+    <w:p>
+      <w:pPr>
+        <w:ind w:left="288" w:hanging="288"/>
+      </w:pPr>
+      <w:r>
+        <w:rPr>
+          <w:b w:val="0"/>
+        </w:rPr>
+        <w:t>2. 在“数字人口播版本”中选择与本项目当前画面、讲稿和音频匹配的已完成口播。标为“需更新”的历史版本不可选；可点击“前往制作 AI 口播”先完成或更新口播。</w:t>
+      </w:r>
+    </w:p>
+    <w:p>
+      <w:pPr>
+        <w:ind w:left="288" w:hanging="288"/>
+      </w:pPr>
+      <w:r>
+        <w:rPr>
+          <w:b w:val="0"/>
+        </w:rPr>
+        <w:t>3. 选择四角位置及小、中、大尺寸，查看“位置示意（静态）”，再点击“保存本项目数字人配置”。每个项目分别保存选择，不改动页面、讲稿、项目版本或已有口播；重新打开项目后保留。</w:t>
+      </w:r>
+    </w:p>
+    <w:p>
+      <w:r>
+        <w:rPr>
+          <w:b w:val="0"/>
+        </w:rPr>
+        <w:t>当前仅能准备和保存配置。真实头像口播视频生成仍在接入中，填好 Key 后也不会自动生成视频，播放器暂不显示数字人。项目内可点击“查看 HeyGen API 设置”检查密钥。</w:t>
+      </w:r>
+    </w:p>
+    <w:p>
+      <w:r>
+        <w:rPr>
+          <w:b w:val="0"/>
+        </w:rPr>
+        <w:t xml:space="preserve">全局设置中依次点击“保存 HeyGen 设置”和“测试 HeyGen 连接”，连接成功仅表示密钥有效。Key 写入工作区私有 </w:t>
+      </w:r>
+      <w:r>
+        <w:rPr>
+          <w:rFonts w:ascii="Menlo" w:hAnsi="Menlo"/>
+          <w:b w:val="0"/>
+          <w:sz w:val="20"/>
+        </w:rPr>
+        <w:t>presenter-settings.json</w:t>
+      </w:r>
+      <w:r>
+        <w:rPr>
+          <w:b w:val="0"/>
+        </w:rPr>
+        <w:t>，留空保存保留已有密钥，也可单独移除。测试不上传头像、音频或生成视频。</w:t>
+      </w:r>
+    </w:p>
+    <w:p>
+      <w:r>
+        <w:rPr>
+          <w:b w:val="0"/>
+        </w:rPr>
+        <w:t xml:space="preserve">数字人配置和头像当前只保存在本机工作区，项目迁移包暂不包含这部分内容。备份时退出 App 并复制整个 </w:t>
+      </w:r>
+      <w:r>
+        <w:rPr>
+          <w:rFonts w:ascii="Menlo" w:hAnsi="Menlo"/>
+          <w:b w:val="0"/>
+          <w:sz w:val="20"/>
+        </w:rPr>
+        <w:t>workspace</w:t>
+      </w:r>
+      <w:r>
+        <w:rPr>
+          <w:b w:val="0"/>
+        </w:rPr>
+        <w:t xml:space="preserve"> 文件夹；安装或升级只替换 App，不删除此文件夹。配置保存、跨项目隔离、重新打开及错误口播拦截已通过本机测试；真实 HeyGen 视频效果和费用未验证。</w:t>
       </w:r>
     </w:p>
     <w:p>

</xml_diff>

<commit_message>
feat(presenter): generate HeyGen lip sync and restore Mac image copy
Add durable per-page and whole-project video jobs using existing narration audio, explicit generation consent, resumable provider checkpoints, cached clip reuse, and synchronized presenter playback. Restore native image context copy and update validated user guides.
</commit_message>
<xml_diff>
--- a/docs/AutoPPT-安装与使用说明.docx
+++ b/docs/AutoPPT-安装与使用说明.docx
@@ -253,7 +253,7 @@
         <w:rPr>
           <w:b w:val="0"/>
         </w:rPr>
-        <w:t>App 内打开“设置 → 数字人讲解员 · HeyGen”，保存独立 API Key 并测试连接。密钥保存在当前工作区，不回显、不随项目包导出；测试只查询官方账号。浏览器预览与 App 配置不同步，旧 App 需升级后才有此入口。真实视频生成仍在接入中。</w:t>
+        <w:t>App 内打开“设置 → 数字人讲解员 · HeyGen”，保存独立 API Key 并测试连接。密钥保存在当前工作区，不回显、不随项目包导出；测试只查询官方账号。浏览器预览与 App 配置不同步，旧 App 需升级后才有此入口。生成入口在项目的演练中心，确认素材上传和费用后才会生成。</w:t>
       </w:r>
     </w:p>
     <w:p>
@@ -261,7 +261,7 @@
         <w:rPr>
           <w:b w:val="0"/>
         </w:rPr>
-        <w:t>具体项目的头像、口播和位置在“项目 → 演练中心 → 配置数字人讲解员”设置，操作步骤见后文。目前可保存配置和查看静态位置示意，播放器暂不显示数字人。</w:t>
+        <w:t>具体项目的头像、口播和位置在“项目 → 演练中心 → 配置数字人讲解员”设置，操作步骤见后文。保存配置后，使用下方“生成数字人口型”，先试一页或生成整场。</w:t>
       </w:r>
     </w:p>
     <w:p>
@@ -3011,33 +3011,25 @@
       </w:r>
     </w:p>
     <w:p>
-      <w:r>
-        <w:rPr>
-          <w:b w:val="0"/>
-        </w:rPr>
-        <w:t>当前仅能准备和保存配置。真实头像口播视频生成仍在接入中，填好 Key 后也不会自动生成视频，播放器暂不显示数字人。项目内可点击“查看 HeyGen API 设置”检查密钥。</w:t>
+      <w:pPr>
+        <w:ind w:left="288" w:hanging="288"/>
+      </w:pPr>
+      <w:r>
+        <w:rPr>
+          <w:b w:val="0"/>
+        </w:rPr>
+        <w:t>4. 在下方“生成数字人口型”选择“先试哪一页”，点击“生成本页数字人口型”。也可点击“生成整场数字人讲解”。确认窗口显示片段数、音频总时长和 HeyGen 计费提示；点击“确认并开始生成”后才上传头像及所选口播音频。</w:t>
       </w:r>
     </w:p>
     <w:p>
-      <w:r>
-        <w:rPr>
-          <w:b w:val="0"/>
-        </w:rPr>
-        <w:t xml:space="preserve">全局设置中依次点击“保存 HeyGen 设置”和“测试 HeyGen 连接”，连接成功仅表示密钥有效。Key 写入工作区私有 </w:t>
-      </w:r>
-      <w:r>
-        <w:rPr>
-          <w:rFonts w:ascii="Menlo" w:hAnsi="Menlo"/>
-          <w:b w:val="0"/>
-          <w:sz w:val="20"/>
-        </w:rPr>
-        <w:t>presenter-settings.json</w:t>
-      </w:r>
-      <w:r>
-        <w:rPr>
-          <w:b w:val="0"/>
-        </w:rPr>
-        <w:t>，留空保存保留已有密钥，也可单独移除。测试不上传头像、音频或生成视频。</w:t>
+      <w:pPr>
+        <w:ind w:left="288" w:hanging="288"/>
+      </w:pPr>
+      <w:r>
+        <w:rPr>
+          <w:b w:val="0"/>
+        </w:rPr>
+        <w:t>5. 等待进度完成，展开“预览已完成视频”查看口型效果。满意后生成整场；素材相同的已完成片段会复用。点击“打开演讲播放器”，再点击“开始口播”；数字人显示在配置的角落，可用“显示数字人”开关隐藏。口型跟随原口播音频，暂停、快进或切换倍速时同步，片段间停顿保持最后一帧。没有生成视频的页面继续普通口播。</w:t>
       </w:r>
     </w:p>
     <w:p>
@@ -3045,7 +3037,50 @@
         <w:rPr>
           <w:b w:val="0"/>
         </w:rPr>
-        <w:t xml:space="preserve">数字人配置和头像当前只保存在本机工作区，项目迁移包暂不包含这部分内容。备份时退出 App 并复制整个 </w:t>
+        <w:t>填写 Key 和保存项目配置都不会自动调用生成。照片和现成口播音频在你确认生成后才发送到 HeyGen；声音和节奏沿用原口播，无需再输入一份文字。请使用有权使用的照片和声音。HeyGen 按音频时长计费，金额以账号账单为准。</w:t>
+      </w:r>
+    </w:p>
+    <w:p>
+      <w:r>
+        <w:rPr>
+          <w:b w:val="0"/>
+        </w:rPr>
+        <w:t>网络中断、下载失败或重新打开 App 后，点击任务的“继续查询或下载”。App 先查询已提交的视频，保留同一生成请求编号，避免重复创建；尚未提交的片段可能继续产生费用。未知提交超过安全重试时限时会被拦截，应先到 HeyGen 核对任务。HeyGen 明确报告生成失败时，检查账号、照片与音频要求后，重新选择范围并确认新任务。不要直接新建相同片段来绕过未确认的提交。</w:t>
+      </w:r>
+    </w:p>
+    <w:p>
+      <w:r>
+        <w:rPr>
+          <w:b w:val="0"/>
+        </w:rPr>
+        <w:t>“停止后续生成”阻止后续片段上传和提交，但已经被 HeyGen 接受的任务仍可能完成并计费，可以稍后继续查询。App 退出时会提示正在进行的制作任务。更改头像、页面、讲稿或口播后，旧数字人视频保留供预览，当前播放器只使用匹配的素材版本。</w:t>
+      </w:r>
+    </w:p>
+    <w:p>
+      <w:pPr>
+        <w:pStyle w:val="Heading2"/>
+      </w:pPr>
+      <w:r>
+        <w:rPr>
+          <w:b w:val="0"/>
+        </w:rPr>
+        <w:t>在 Mac App 中复制页面图片</w:t>
+      </w:r>
+    </w:p>
+    <w:p>
+      <w:r>
+        <w:rPr>
+          <w:b w:val="0"/>
+        </w:rPr>
+        <w:t>在稿件中打开页面或放大图片，把鼠标放在图片上，右键选择“复制图片”，再到微信、Word、Keynote 等应用粘贴。复制的是图片本身。文字输入框也提供剪切、复制、粘贴菜单；不要在图片之外的空白区域右键。</w:t>
+      </w:r>
+    </w:p>
+    <w:p>
+      <w:r>
+        <w:rPr>
+          <w:b w:val="0"/>
+        </w:rPr>
+        <w:t xml:space="preserve">全局设置中依次点击“保存 HeyGen 设置”和“测试 HeyGen 连接”，连接成功仅表示密钥有效。Key 写入工作区私有 </w:t>
       </w:r>
       <w:r>
         <w:rPr>
@@ -3053,13 +3088,35 @@
           <w:b w:val="0"/>
           <w:sz w:val="20"/>
         </w:rPr>
+        <w:t>presenter-settings.json</w:t>
+      </w:r>
+      <w:r>
+        <w:rPr>
+          <w:b w:val="0"/>
+        </w:rPr>
+        <w:t>，留空保存保留已有密钥，也可单独移除。测试不上传头像、音频或生成视频。</w:t>
+      </w:r>
+    </w:p>
+    <w:p>
+      <w:r>
+        <w:rPr>
+          <w:b w:val="0"/>
+        </w:rPr>
+        <w:t xml:space="preserve">数字人配置、头像及已生成视频保存在本机工作区，项目迁移包、PPTX 与离线 HTML 暂不包含这部分内容。备份时退出 App 并复制整个 </w:t>
+      </w:r>
+      <w:r>
+        <w:rPr>
+          <w:rFonts w:ascii="Menlo" w:hAnsi="Menlo"/>
+          <w:b w:val="0"/>
+          <w:sz w:val="20"/>
+        </w:rPr>
         <w:t>workspace</w:t>
       </w:r>
       <w:r>
         <w:rPr>
           <w:b w:val="0"/>
         </w:rPr>
-        <w:t xml:space="preserve"> 文件夹；安装或升级只替换 App，不删除此文件夹。配置保存、跨项目隔离、重新打开及错误口播拦截已通过本机测试；真实 HeyGen 视频效果和费用未验证。</w:t>
+        <w:t xml:space="preserve"> 文件夹；安装或升级只替换 App，不删除此文件夹。配置保存、跨项目隔离、错误口播拦截、生成接口的离线模拟、失败恢复、视频复用、播放器同步及 Mac 图片剪贴板已通过本机测试；未自动调用真实 HeyGen 付费生成，真实视频效果、耗时和账号费用请先生成一页验证。</w:t>
       </w:r>
     </w:p>
     <w:p>

</xml_diff>

<commit_message>
feat(presenter): centralize avatar studio and generate directly from notes
</commit_message>
<xml_diff>
--- a/docs/AutoPPT-安装与使用说明.docx
+++ b/docs/AutoPPT-安装与使用说明.docx
@@ -253,7 +253,7 @@
         <w:rPr>
           <w:b w:val="0"/>
         </w:rPr>
-        <w:t>App 内打开“设置 → 数字人讲解员 · HeyGen”，保存独立 API Key 并测试连接。密钥保存在当前工作区，不回显、不随项目包导出；测试只查询官方账号。浏览器预览与 App 配置不同步，旧 App 需升级后才有此入口。生成入口在项目的演练中心，确认素材上传和费用后才会生成。</w:t>
+        <w:t>App 内打开“设置 → 数字人工作室”，先连接 HeyGen，再保存头像、风格和中文声音，输入短文字试播。Key 保存在当前工作区，不回显、不随项目包导出；测试连接只查询账号，真实试播才会生成并计费。浏览器预览与 App 配置不同步，旧 App 需升级。</w:t>
       </w:r>
     </w:p>
     <w:p>
@@ -261,7 +261,7 @@
         <w:rPr>
           <w:b w:val="0"/>
         </w:rPr>
-        <w:t>具体项目的头像、口播和位置在“项目 → 演练中心 → 配置数字人讲解员”设置，操作步骤见后文。保存配置后，使用下方“生成数字人口型”，先试一页或生成整场。</w:t>
+        <w:t>项目中进入“演练中心 → 数字人讲解”，直接选择已准备好的数字人，生成本页或整场讲解。默认从逐页讲稿生成声音和嘴型，不需要先制作 AI 口播。操作步骤见后文。</w:t>
       </w:r>
     </w:p>
     <w:p>
@@ -2966,7 +2966,7 @@
         <w:rPr>
           <w:b w:val="0"/>
         </w:rPr>
-        <w:t>配置项目数字人讲解员</w:t>
+        <w:t>在数字人工作室准备形象和试播</w:t>
       </w:r>
     </w:p>
     <w:p>
@@ -2974,7 +2974,7 @@
         <w:rPr>
           <w:b w:val="0"/>
         </w:rPr>
-        <w:t>在 App 中打开一个项目，进入“演练中心”，点击“配置数字人讲解员”。空项目也能先准备头像和位置；完成讲稿、画面和口播后再选择口播版本。</w:t>
+        <w:t>在 App 中打开“设置”，点击“数字人工作室”。头像和声音在这里统一管理，供所有项目使用。</w:t>
       </w:r>
     </w:p>
     <w:p>
@@ -2985,7 +2985,7 @@
         <w:rPr>
           <w:b w:val="0"/>
         </w:rPr>
-        <w:t>1. 展开“添加头像”，填写名称，选择正面清晰的静态 JPEG、PNG 或 WebP 照片，最大 8 MB，再点击“保存头像”。图片会校验、去除元数据并以本机素材保存，不会在这一步发送到 HeyGen。已保存的头像可以在其他项目中再次选择。</w:t>
+        <w:t>1. 展开“连接 HeyGen”，保存独立 API Key，再测试连接。连接成功只表示密钥有效，真实试播仍需要 API 账号余额和可用头像。</w:t>
       </w:r>
     </w:p>
     <w:p>
@@ -2996,7 +2996,7 @@
         <w:rPr>
           <w:b w:val="0"/>
         </w:rPr>
-        <w:t>2. 在“数字人口播版本”中选择与本项目当前画面、讲稿和音频匹配的已完成口播。标为“需更新”的历史版本不可选；可点击“前往制作 AI 口播”先完成或更新口播。</w:t>
+        <w:t>2. 点击“添加数字人”，填写名称并上传正面清晰、嘴部无遮挡的 JPEG、PNG 或 WebP，最大 8 MB。选择原始照片、职业照、卡通或古装分类。上传保存只写入本机，不在这一步发送到 HeyGen。</w:t>
       </w:r>
     </w:p>
     <w:p>
@@ -3007,7 +3007,7 @@
         <w:rPr>
           <w:b w:val="0"/>
         </w:rPr>
-        <w:t>3. 选择四角位置及小、中、大尺寸，查看“位置示意（静态）”，再点击“保存本项目数字人配置”。每个项目分别保存选择，不改动页面、讲稿、项目版本或已有口播；重新打开项目后保留。</w:t>
+        <w:t>3. 选择“中文声音”，点击“保存数字人”或“保存形象与声音”。已有头像仍会显示在列表中，为它补选声音即可使用。可把常用形象设为默认数字人。</w:t>
       </w:r>
     </w:p>
     <w:p>
@@ -3018,7 +3018,7 @@
         <w:rPr>
           <w:b w:val="0"/>
         </w:rPr>
-        <w:t>4. 在下方“生成数字人口型”选择“先试哪一页”，点击“生成本页数字人口型”。也可点击“生成整场数字人讲解”。确认窗口显示片段数、音频总时长和 HeyGen 计费提示；点击“确认并开始生成”后才上传头像及所选口播音频。</w:t>
+        <w:t>4. 在“文字试播”输入 1–300 字，点击“生成试播视频”。确认头像和文字将发送到 HeyGen，并按 API 规则计费后开始。完成的视频直接显示在这里，可播放检查声音、嘴型和形象；输入的试播草稿会在本机保留。</w:t>
       </w:r>
     </w:p>
     <w:p>
@@ -3029,31 +3029,7 @@
         <w:rPr>
           <w:b w:val="0"/>
         </w:rPr>
-        <w:t>5. 等待进度完成，展开“预览已完成视频”查看口型效果。满意后生成整场；素材相同的已完成片段会复用。点击“打开演讲播放器”，再点击“开始口播”；数字人显示在配置的角落，可用“显示数字人”开关隐藏。口型跟随原口播音频，暂停、快进或切换倍速时同步，片段间停顿保持最后一帧。没有生成视频的页面继续普通口播。</w:t>
-      </w:r>
-    </w:p>
-    <w:p>
-      <w:r>
-        <w:rPr>
-          <w:b w:val="0"/>
-        </w:rPr>
-        <w:t>填写 Key 和保存项目配置都不会自动调用生成。照片和现成口播音频在你确认生成后才发送到 HeyGen；声音和节奏沿用原口播，无需再输入一份文字。请使用有权使用的照片和声音。HeyGen 按音频时长计费，金额以账号账单为准。</w:t>
-      </w:r>
-    </w:p>
-    <w:p>
-      <w:r>
-        <w:rPr>
-          <w:b w:val="0"/>
-        </w:rPr>
-        <w:t>网络中断、下载失败或重新打开 App 后，点击任务的“继续查询或下载”。App 先查询已提交的视频，保留同一生成请求编号，避免重复创建；尚未提交的片段可能继续产生费用。未知提交超过安全重试时限时会被拦截，应先到 HeyGen 核对任务。HeyGen 明确报告生成失败时，检查账号、照片与音频要求后，重新选择范围并确认新任务。不要直接新建相同片段来绕过未确认的提交。</w:t>
-      </w:r>
-    </w:p>
-    <w:p>
-      <w:r>
-        <w:rPr>
-          <w:b w:val="0"/>
-        </w:rPr>
-        <w:t>“停止后续生成”阻止后续片段上传和提交，但已经被 HeyGen 接受的任务仍可能完成并计费，可以稍后继续查询。App 退出时会提示正在进行的制作任务。更改头像、页面、讲稿或口播后，旧数字人视频保留供预览，当前播放器只使用匹配的素材版本。</w:t>
+        <w:t>5. 要制作其他风格，展开“创建其他风格形象”，选择职业照、卡通或古装，确认图片服务费用后生成。需要图片服务支持带照片的 Images Edits 接口；完成后另存一个数字人，原头像保留。也可以直接上传已经准备好的风格图片。风格分类本身不会把照片自动变成卡通或古装。</w:t>
       </w:r>
     </w:p>
     <w:p>
@@ -3064,40 +3040,119 @@
         <w:rPr>
           <w:b w:val="0"/>
         </w:rPr>
-        <w:t>在 Mac App 中复制页面图片</w:t>
+        <w:t>在项目中直接生成数字人讲解</w:t>
       </w:r>
     </w:p>
     <w:p>
-      <w:r>
-        <w:rPr>
-          <w:b w:val="0"/>
-        </w:rPr>
-        <w:t>在稿件中打开页面或放大图片，把鼠标放在图片上，右键选择“复制图片”，再到微信、Word、Keynote 等应用粘贴。复制的是图片本身。文字输入框也提供剪切、复制、粘贴菜单；不要在图片之外的空白区域右键。</w:t>
+      <w:pPr>
+        <w:ind w:left="288" w:hanging="288"/>
+      </w:pPr>
+      <w:r>
+        <w:rPr>
+          <w:b w:val="0"/>
+        </w:rPr>
+        <w:t>1. 打开项目的“演练中心”，找到“数字人讲解”，选择工作室里已经保存好头像和声音的数字人。</w:t>
       </w:r>
     </w:p>
     <w:p>
-      <w:r>
-        <w:rPr>
-          <w:b w:val="0"/>
-        </w:rPr>
-        <w:t xml:space="preserve">全局设置中依次点击“保存 HeyGen 设置”和“测试 HeyGen 连接”，连接成功仅表示密钥有效。Key 写入工作区私有 </w:t>
-      </w:r>
-      <w:r>
-        <w:rPr>
-          <w:rFonts w:ascii="Menlo" w:hAnsi="Menlo"/>
-          <w:b w:val="0"/>
-          <w:sz w:val="20"/>
-        </w:rPr>
-        <w:t>presenter-settings.json</w:t>
-      </w:r>
-      <w:r>
-        <w:rPr>
-          <w:b w:val="0"/>
-        </w:rPr>
-        <w:t>，留空保存保留已有密钥，也可单独移除。测试不上传头像、音频或生成视频。</w:t>
+      <w:pPr>
+        <w:ind w:left="288" w:hanging="288"/>
+      </w:pPr>
+      <w:r>
+        <w:rPr>
+          <w:b w:val="0"/>
+        </w:rPr>
+        <w:t>2. 选择一个有逐页讲稿的页面，点击“生成本页讲解”。确认窗口显示形象、声音、讲稿及 API 计费提示；确认后直接从讲稿生成声音和嘴型，不需要先到另一处制作口播。满意后可点击“生成整场讲解”。</w:t>
       </w:r>
     </w:p>
     <w:p>
+      <w:pPr>
+        <w:ind w:left="288" w:hanging="288"/>
+      </w:pPr>
+      <w:r>
+        <w:rPr>
+          <w:b w:val="0"/>
+        </w:rPr>
+        <w:t>3. 在生成记录查看进度。完成后点击“播放讲解”，在项目画面上播放有声数字人视频；可连续播放、切换片段和调整倍速。</w:t>
+      </w:r>
+    </w:p>
+    <w:p>
+      <w:pPr>
+        <w:ind w:left="288" w:hanging="288"/>
+      </w:pPr>
+      <w:r>
+        <w:rPr>
+          <w:b w:val="0"/>
+        </w:rPr>
+        <w:t>4. “显示位置与其他方式”中可选择四角位置、尺寸。需要保留已经制作好的 AI 口播声音时，改选“沿用已有 AI 口播”，选择当前画面、讲稿匹配的已完成版本，再生成。旧方式使用原演讲播放器。</w:t>
+      </w:r>
+    </w:p>
+    <w:p>
+      <w:r>
+        <w:rPr>
+          <w:b w:val="0"/>
+        </w:rPr>
+        <w:t>任务会保留素材和讲稿快照。相同头像、声音和文字的已完成视频会优先复用，试播与项目也可以复用；更改页面或讲稿后旧视频会保留，但不能作为当前版本播放。项目内不提供临时上传头像，修改形象与声音请回到数字人工作室。</w:t>
+      </w:r>
+    </w:p>
+    <w:p>
+      <w:r>
+        <w:rPr>
+          <w:b w:val="0"/>
+        </w:rPr>
+        <w:t>网络中断、下载失败或重新打开 App 后，点击任务的“继续查询或下载”。已提交的视频只查询和下载，尚未提交的片段可能继续计费。未知提交超过安全重试时限时会被拦截，应先到 HeyGen 核对任务。不要另建相同内容绕过未确认提交。</w:t>
+      </w:r>
+    </w:p>
+    <w:p>
+      <w:r>
+        <w:rPr>
+          <w:b w:val="0"/>
+        </w:rPr>
+        <w:t>“停止后续生成”阻止后续上传和提交，但已经被 HeyGen 接受的任务仍可能完成并计费。App 退出时会提示正在进行的任务。</w:t>
+      </w:r>
+    </w:p>
+    <w:p>
+      <w:pPr>
+        <w:pStyle w:val="Heading2"/>
+      </w:pPr>
+      <w:r>
+        <w:rPr>
+          <w:b w:val="0"/>
+        </w:rPr>
+        <w:t>在 Mac App 中复制页面图片</w:t>
+      </w:r>
+    </w:p>
+    <w:p>
+      <w:r>
+        <w:rPr>
+          <w:b w:val="0"/>
+        </w:rPr>
+        <w:t>在稿件中打开页面或放大图片，把鼠标放在图片上，右键选择“复制图片”，再到微信、Word、Keynote 等应用粘贴。复制的是图片本身。文字输入框也提供剪切、复制、粘贴菜单；不要在图片之外的空白区域右键。</w:t>
+      </w:r>
+    </w:p>
+    <w:p>
+      <w:r>
+        <w:rPr>
+          <w:b w:val="0"/>
+        </w:rPr>
+        <w:t xml:space="preserve">在数字人工作室的连接区域依次点击“保存 HeyGen 设置”和“测试 HeyGen 连接”，连接成功仅表示密钥有效。Key 写入工作区私有 </w:t>
+      </w:r>
+      <w:r>
+        <w:rPr>
+          <w:rFonts w:ascii="Menlo" w:hAnsi="Menlo"/>
+          <w:b w:val="0"/>
+          <w:sz w:val="20"/>
+        </w:rPr>
+        <w:t>presenter-settings.json</w:t>
+      </w:r>
+      <w:r>
+        <w:rPr>
+          <w:b w:val="0"/>
+        </w:rPr>
+        <w:t>，留空保存保留已有密钥，也可单独移除。测试不上传头像、音频或生成视频。</w:t>
+      </w:r>
+    </w:p>
+    <w:p>
       <w:r>
         <w:rPr>
           <w:b w:val="0"/>
@@ -3116,7 +3171,7 @@
         <w:rPr>
           <w:b w:val="0"/>
         </w:rPr>
-        <w:t xml:space="preserve"> 文件夹；安装或升级只替换 App，不删除此文件夹。配置保存、跨项目隔离、错误口播拦截、生成接口的离线模拟、失败恢复、视频复用、播放器同步及 Mac 图片剪贴板已通过本机测试；未自动调用真实 HeyGen 付费生成，真实视频效果、耗时和账号费用请先生成一页验证。</w:t>
+        <w:t xml:space="preserve"> 文件夹；安装或升级只替换 App，不删除此文件夹。配置保存、跨项目隔离、错误口播拦截、生成接口的离线模拟、失败恢复、视频复用、播放器同步及 Mac 图片剪贴板已通过本机测试；2026-10-09 已用真实 HeyGen 账号和保存照片成功生成约 2.36 秒中文视频，并验证新后端的查询、下载、音视频校验及本机保存。不同风格的真实口型效果及各图片服务的风格生成未逐项付费验证，请先做短试播。</w:t>
       </w:r>
     </w:p>
     <w:p>

</xml_diff>

<commit_message>
fix(presenter): use saved MiniMax voice for avatar speech
</commit_message>
<xml_diff>
--- a/docs/AutoPPT-安装与使用说明.docx
+++ b/docs/AutoPPT-安装与使用说明.docx
@@ -253,7 +253,7 @@
         <w:rPr>
           <w:b w:val="0"/>
         </w:rPr>
-        <w:t>App 内打开“设置 → 数字人工作室”，先连接 HeyGen，再保存头像、风格和中文声音，输入短文字试播。Key 保存在当前工作区，不回显、不随项目包导出；测试连接只查询账号，真实试播才会生成并计费。浏览器预览与 App 配置不同步，旧 App 需升级。</w:t>
+        <w:t>App 内打开“设置 → 数字人工作室”，连接 HeyGen 和 MiniMax，再保存头像、风格和 MiniMax 声音，输入短文字试播。文字先用所选 MiniMax 声音合成音频，再把头像和音频交给 HeyGen 同步嘴型，不使用 HeyGen 平台配音。Key 保存在当前工作区，不回显、不随项目包导出；测试连接只查询账号，真实试播按两项服务规则计费。浏览器预览与 App 配置不同步，旧 App 需升级。</w:t>
       </w:r>
     </w:p>
     <w:p>
@@ -3007,7 +3007,7 @@
         <w:rPr>
           <w:b w:val="0"/>
         </w:rPr>
-        <w:t>3. 选择“中文声音”，点击“保存数字人”或“保存形象与声音”。已有头像仍会显示在列表中，为它补选声音即可使用。可把常用形象设为默认数字人。</w:t>
+        <w:t>3. 在“语音与声音 · MiniMax”保存语音服务配置；本人声音需先在这里采集。回到工作室选择“MiniMax 声音”，点击“保存数字人”或“保存形象与声音”。列表与 AI 口播共用，包含播音员和已采集声音。已有头像优先沿用最近口播使用的 MiniMax 声音；无法确认声音时需自行选择，不会替换成 HeyGen 平台声音。可把常用形象设为默认数字人。</w:t>
       </w:r>
     </w:p>
     <w:p>
@@ -3018,7 +3018,7 @@
         <w:rPr>
           <w:b w:val="0"/>
         </w:rPr>
-        <w:t>4. 在“文字试播”输入 1–300 字，点击“生成试播视频”。确认头像和文字将发送到 HeyGen，并按 API 规则计费后开始。完成的视频直接显示在这里，可播放检查声音、嘴型和形象；输入的试播草稿会在本机保留。</w:t>
+        <w:t>4. 在“文字试播”输入 1–300 字，点击“生成试播视频”。确认文字交给 MiniMax 使用所选声音合成音频，再把头像和音频交给 HeyGen 同步嘴型，按两项服务规则计费后开始。完成的视频直接显示在这里，可播放检查声音、嘴型和形象；输入的试播草稿会在本机保留。</w:t>
       </w:r>
     </w:p>
     <w:p>
@@ -3062,7 +3062,7 @@
         <w:rPr>
           <w:b w:val="0"/>
         </w:rPr>
-        <w:t>2. 选择一个有逐页讲稿的页面，点击“生成本页讲解”。确认窗口显示形象、声音、讲稿及 API 计费提示；确认后直接从讲稿生成声音和嘴型，不需要先到另一处制作口播。满意后可点击“生成整场讲解”。</w:t>
+        <w:t>2. 选择一个有逐页讲稿的页面，点击“生成本页讲解”。确认窗口显示形象、声音、讲稿及 API 计费提示；确认后自动用所选 MiniMax 声音合成讲稿音频，再同步嘴型，不需要先到另一处制作口播。满意后可点击“生成整场讲解”。</w:t>
       </w:r>
     </w:p>
     <w:p>
@@ -3084,7 +3084,7 @@
         <w:rPr>
           <w:b w:val="0"/>
         </w:rPr>
-        <w:t>4. “显示位置与其他方式”中可选择四角位置、尺寸。需要保留已经制作好的 AI 口播声音时，改选“沿用已有 AI 口播”，选择当前画面、讲稿匹配的已完成版本，再生成。旧方式使用原演讲播放器。</w:t>
+        <w:t>4. “显示位置与其他方式”中可选择四角位置、尺寸。需要保留已经制作好的 AI 口播声音时，改选“沿用已有 AI 口播”，选择当前画面、讲稿匹配的已完成版本，再生成。直接传原口播音频，不重新选择声音或合成；旧方式使用原演讲播放器。</w:t>
       </w:r>
     </w:p>
     <w:p>
@@ -3092,7 +3092,7 @@
         <w:rPr>
           <w:b w:val="0"/>
         </w:rPr>
-        <w:t>任务会保留素材和讲稿快照。相同头像、声音和文字的已完成视频会优先复用，试播与项目也可以复用；更改页面或讲稿后旧视频会保留，但不能作为当前版本播放。项目内不提供临时上传头像，修改形象与声音请回到数字人工作室。</w:t>
+        <w:t>任务会保留素材和讲稿快照。相同头像、MiniMax 账号、模型、声音和文字的已完成素材会优先复用，试播与项目也可以复用；音频在视频提交前保存，下载重试不会重新合成。更改页面或讲稿后旧视频会保留，但不能作为当前版本播放。项目内不提供临时上传头像，修改形象与声音请回到数字人工作室。</w:t>
       </w:r>
     </w:p>
     <w:p>
@@ -3100,7 +3100,7 @@
         <w:rPr>
           <w:b w:val="0"/>
         </w:rPr>
-        <w:t>网络中断、下载失败或重新打开 App 后，点击任务的“继续查询或下载”。已提交的视频只查询和下载，尚未提交的片段可能继续计费。未知提交超过安全重试时限时会被拦截，应先到 HeyGen 核对任务。不要另建相同内容绕过未确认提交。</w:t>
+        <w:t>网络中断、下载失败或重新打开 App 后，点击任务的“继续查询或下载”。已生成音频直接复用，已提交的视频只查询和下载，尚未生成的片段可能使用 MiniMax 或 HeyGen 额度。未知提交超过安全重试时限时会被拦截，应先到 HeyGen 核对任务。不要另建相同内容绕过未确认提交。</w:t>
       </w:r>
     </w:p>
     <w:p>
@@ -3171,7 +3171,7 @@
         <w:rPr>
           <w:b w:val="0"/>
         </w:rPr>
-        <w:t xml:space="preserve"> 文件夹；安装或升级只替换 App，不删除此文件夹。配置保存、跨项目隔离、错误口播拦截、生成接口的离线模拟、失败恢复、视频复用、播放器同步及 Mac 图片剪贴板已通过本机测试；2026-10-09 已用真实 HeyGen 账号和保存照片成功生成约 2.36 秒中文视频，并验证新后端的查询、下载、音视频校验及本机保存。不同风格的真实口型效果及各图片服务的风格生成未逐项付费验证，请先做短试播。</w:t>
+        <w:t xml:space="preserve"> 文件夹；安装或升级只替换 App，不删除此文件夹。配置保存、跨项目隔离、错误口播拦截、生成接口的离线模拟、失败恢复、视频复用、播放器同步及 Mac 图片剪贴板已通过本机测试；2026-10-09 已用保存的本人照片和 MiniMax 复刻声音成功生成约 2.64 秒视频，确认原音频传给 HeyGen、没有平台配音选项，视频音轨沿用 MiniMax 原音频，查询下载和本机保存通过。旧版 HeyGen 平台配音视频保留并标明来源。不同风格的真实口型效果及各图片服务的风格生成未逐项付费验证，请先做短试播。</w:t>
       </w:r>
     </w:p>
     <w:p>

</xml_diff>

<commit_message>
Sync rehearsal instructions in the downloadable guide
</commit_message>
<xml_diff>
--- a/docs/AutoPPT-安装与使用说明.docx
+++ b/docs/AutoPPT-安装与使用说明.docx
@@ -18,7 +18,7 @@
         <w:rPr>
           <w:b w:val="0"/>
         </w:rPr>
-        <w:t>适用版本：2026 年 10 月 9 日的仓库代码。</w:t>
+        <w:t>适用版本：2026 年 10 月 11 日的仓库代码。</w:t>
       </w:r>
     </w:p>
     <w:p>
@@ -253,15 +253,31 @@
         <w:rPr>
           <w:b w:val="0"/>
         </w:rPr>
-        <w:t>App 内打开“设置 → 数字人工作室”，连接 HeyGen 和 MiniMax，再保存头像、风格和 MiniMax 声音，输入短文字试播。文字先用所选 MiniMax 声音合成音频，再把头像和音频交给 HeyGen 同步嘴型，不使用 HeyGen 平台配音。Key 保存在当前工作区，不回显、不随项目包导出；测试连接只查询账号，真实试播按两项服务规则计费。浏览器预览与 App 配置不同步，旧 App 需升级。</w:t>
-      </w:r>
-    </w:p>
-    <w:p>
-      <w:r>
-        <w:rPr>
-          <w:b w:val="0"/>
-        </w:rPr>
-        <w:t>项目中进入“演练中心 → 数字人讲解”，直接选择已准备好的数字人，生成本页或整场讲解。默认从逐页讲稿生成声音和嘴型，不需要先制作 AI 口播。操作步骤见后文。</w:t>
+        <w:t>设置页分为“模型服务”“语音与声音”“实验室”，切换后只显示当前栏目。模型与 MiniMax 已配置时默认收起连接表单，可展开“修改连接配置”或“修改 MiniMax 连接”，修改后点击对应保存按钮。语音栏先选择默认声音，需要本人声音时再展开“采集演讲者的声音”。切换栏目保留未保存输入，并停止录音和试听，不会自动保存或生成素材。数字人移到实验室并标为实验功能；已有头像、声音、视频和项目选择保留。新项目演练默认“自己讲”，需要数字人时主动展开实验入口。</w:t>
+      </w:r>
+    </w:p>
+    <w:p>
+      <w:r>
+        <w:rPr>
+          <w:b w:val="0"/>
+        </w:rPr>
+        <w:t>项目首页的删除入口是卡片右上角的垃圾桶图标，鼠标移到卡片上时才显示；键盘聚焦时也会显示。触屏设备保持显示，点击区域更大。点击后先确认，选择“取消”不会删除项目。</w:t>
+      </w:r>
+    </w:p>
+    <w:p>
+      <w:r>
+        <w:rPr>
+          <w:b w:val="0"/>
+        </w:rPr>
+        <w:t>App 内打开“设置 → 实验室 → 数字人工作室”，连接 HeyGen 和 MiniMax，再保存头像、风格和 MiniMax 声音，输入短文字试播。文字先用所选 MiniMax 声音合成音频，再把头像和音频交给 HeyGen 同步嘴型，不使用 HeyGen 平台配音。Key 保存在当前工作区，不回显、不随项目包导出；测试连接只查询账号，真实试播按两项服务规则计费。浏览器预览与 App 配置不同步，旧 App 需升级。</w:t>
+      </w:r>
+    </w:p>
+    <w:p>
+      <w:r>
+        <w:rPr>
+          <w:b w:val="0"/>
+        </w:rPr>
+        <w:t>项目中进入“演练中心 → 实验室 · 数字人讲解”，直接选择已准备好的数字人，生成本页或整场讲解。默认从逐页讲稿生成声音和嘴型，不需要先制作 AI 口播。操作步骤见后文。</w:t>
       </w:r>
     </w:p>
     <w:p>
@@ -1518,7 +1534,7 @@
         <w:rPr>
           <w:b w:val="0"/>
         </w:rPr>
-        <w:t>点击侧栏“产品介绍”，在右侧阅读新版官网，左侧导航保留。“返回刚才的页面”会回到原编辑位置，未提交的表单保持；独立打开本机介绍页时提供“返回工作台”。页面先展示用途、风格作品和实际工作台，再纵向介绍风格制作、拆稿生成、逐页打磨、口播、动态演示和交付迁移；常见问题另在“使用帮助”中查找。风格展示区可切换 6 套实际封面，支持键盘左右键；全部 13 套风格在产品内选择。截图点击可放大，按 Esc 或关闭按钮退出；手机可展开顶部导航，动效遵循系统“减少动态效果”设置。“开始使用”提供安装说明、源码 ZIP、Word 说明和 Markdown 快速指南。公开下载为源码，Mac 安装包目前为内部构建。浏览无需 API，实际生成需自行配置模型。</w:t>
+        <w:t>在本机浏览器版和 Mac App 中，点击侧栏“产品介绍”，在右侧阅读产品介绍，左侧导航保留。“返回刚才的页面”会回到原编辑位置，未提交的表单保持；独立打开本机介绍页时提供“返回工作台”。页面先展示用途、风格作品和实际工作台，再纵向介绍风格制作、拆稿生成、逐页打磨、口播、动态演示和交付迁移；常见问题另在“使用帮助”中查找。风格展示区可切换 6 套实际封面，支持键盘左右键；全部 13 套风格在产品内选择。截图点击可放大，按 Esc 或关闭按钮退出；手机可展开顶部导航，动效遵循系统“减少动态效果”设置。“开始使用”提供安装说明、源码 ZIP 和 Markdown 快速指南。公开下载为源码，Mac 安装包目前为内部构建。浏览无需 API，实际生成需自行配置模型。</w:t>
       </w:r>
     </w:p>
     <w:p>
@@ -1561,7 +1577,7 @@
         <w:rPr>
           <w:b w:val="0"/>
         </w:rPr>
-        <w:t>能力矩阵包含项目源文件导入导出、PPTX 与逐字稿、标准放映、AI 口播生成、动态演示、本机和管理员模型设置。不可用时会显示原因。未配置语音的本机版仍可手动翻页；hosted 当前未开放播放器与语音，其模型设置由管理员管理。演练中心、交付中心与模型设置页会复用相同的服务原因。</w:t>
+        <w:t>能力矩阵包含项目源文件导入导出、PPTX 与逐字稿、标准放映、AI 口播生成、动态演示、本机和管理员模型设置。不可用时会显示原因。未配置语音的本机版仍可手动翻页；hosted 支持口播播放器和可选 MiniMax 合成，其模型设置由管理员管理。演练中心、交付中心与模型设置页会复用相同的服务原因。</w:t>
       </w:r>
     </w:p>
     <w:p>
@@ -1715,15 +1731,15 @@
         <w:rPr>
           <w:b w:val="0"/>
         </w:rPr>
-        <w:t>也可以选择“上传图片”，或选择“从网址获取”，粘贴公开作品页或图片链接。网址导入会先展示预览，勾选 1–12 张后再提炼；建议先用 3–5 张风格一致、构图不同的作品。</w:t>
-      </w:r>
-    </w:p>
-    <w:p>
-      <w:r>
-        <w:rPr>
-          <w:b w:val="0"/>
-        </w:rPr>
-        <w:t>选择图片后，系统先逐张分析字体、色彩、构图、图像处理、材质、疏密和微观细节，再根据共同特征设计一套完整的新风格。描述方法参考已选定的三套范例：克制儿童摄影杂志风、先锋酸性色彩编辑风、新瑞士主义战略编辑风；只学习展开设计规范的写法，新风格的配色、字体与气质由本次图片决定，不默认使用儿童摄影语境。</w:t>
+        <w:t>也可以选择“上传图片”，或选择“从网址获取”，粘贴公开作品页或图片链接。可上传或继续追加 1–12 张图片，支持含多页缩略图的展示图；网址导入先展示预览，勾选后再分析。名称可留空自动命名。展开“视觉补充要求（可选）”，只填写希望强化或避免的视觉方向。主题、行业、受众与使用场景属于具体项目，在新建项目或项目的“内容倾向与配色”中填写并保存。输出沿用单张 16:9 横版演示页面。</w:t>
+      </w:r>
+    </w:p>
+    <w:p>
+      <w:r>
+        <w:rPr>
+          <w:b w:val="0"/>
+        </w:rPr>
+        <w:t>点击“分析视觉风格”，系统先从十二个维度观察图片，分开内容主题、具体版式、视觉语言与底层设计逻辑，区分直接观察与合理推断。然后判断同一视觉系统、不同页面类型、混合风格、离群图或证据不足。多种风格按 STYLE A、STYLE B 等独立生成，离群图明确标注且不并入主体；不能从参考图题材推定所有新页面必须出现同一个人物、物件或行业。缩略图展示的外框、灰底、阴影、水印和源图文案按模板要求忽略。一张拼图内部若含不同风格，先说明可辨认主体与局限，需要分组时请拆成独立图片上传。</w:t>
       </w:r>
     </w:p>
     <w:p>
@@ -1739,15 +1755,31 @@
         <w:rPr>
           <w:b w:val="0"/>
         </w:rPr>
-        <w:t>新规范包含视觉定位、核心原则、内容表达、字体层级、色彩比例、图像材质、图形强调、细节、构图疏密、跨页变化、偏离方向和自检标准 12 个部分。详情中显示当前步骤，完成后展开“查看参考图分析与创作依据”，可以核对每张图的观察、共同特征、图间差异、不确定项和设计取舍。分析依据记录最近一次提炼；手动调整或恢复历史版本后，出图以当前提示词为准。</w:t>
-      </w:r>
-    </w:p>
-    <w:p>
-      <w:r>
-        <w:rPr>
-          <w:b w:val="0"/>
-        </w:rPr>
-        <w:t>每次提炼顺序调用内容分析模型两次，产生对应服务费用；不会自动生成图片。分析或规范不完整时显示错误，原有规则继续保留，升级也不会自动重写已有风格。提炼成功后再主动试做，核对能否延伸到不同内容。此流程已用模拟模型验证，真实模型的分析深度与新风格成图效果尚未实测。</w:t>
+        <w:t>每组结果可查看中英文名称、定义与风格边界、核心视觉 DNA、完整提示词、锁定语句和风险提醒。完整提示词有 19 个章节，覆盖角色、内容判断、气质、颜色、字体、构图与网格、图像、材质、图形、真实数据、编辑细节、页面变化、行业语境、禁止事项、自检与效果标准。四级规则明确“必须保持、可以变化、偶尔使用、必须禁止”。锁定语句、四级规则与共同设计底线已合并进完整提示词，点击“复制完整提示词”即可带走。预览其他组不更换当前规则，点击“采用这组风格”才保存新版本；试做、封面与正式页面使用当前保存的完整规则。</w:t>
+      </w:r>
+    </w:p>
+    <w:p>
+      <w:r>
+        <w:rPr>
+          <w:b w:val="0"/>
+        </w:rPr>
+        <w:t>风格详情默认显示“已保存到风格库”，可直接用于新项目或试做，无需再次保存。提示词、分析记录、历史版本与动态页码说明统一放在折叠的“高级设置”中，日常使用不需要打开。高级设置中复制和编辑使用当前保存的完整原文，不会误用旧分析；“分析记录”保留最近一次提炼的候选与依据，明确点击“采用这组风格”才保存新版本。</w:t>
+      </w:r>
+    </w:p>
+    <w:p>
+      <w:r>
+        <w:rPr>
+          <w:b w:val="0"/>
+        </w:rPr>
+        <w:t>风格详情的标题、关闭按钮与底部操作保持可见。桌面左侧是参考图和可选视觉调整，右侧是保存状态与高级设置；窄窗口改为单列。已有参考图时展开“调整视觉风格（可选）”，填写调整要求，草稿自动保存在本机，关闭后重新打开仍可继续；点击区内“重新提炼风格”成功后才应用到风格，失败时保留当前规则。无参考图时先补图，不展示无法应用的调整表单。高级提示词编辑仍需明确“保存规则”，保存前不能试做或创建项目。项目的主题、行业和受众不会从这里填写。</w:t>
+      </w:r>
+    </w:p>
+    <w:p>
+      <w:r>
+        <w:rPr>
+          <w:b w:val="0"/>
+        </w:rPr>
+        <w:t>每次分析先调用一次支持图片理解的内容模型，再为每组调用一次内容模型生成提示词，单组共两次，产生相应服务费用；不会自动生成图片。全部组验证通过才保存，任一组失败或取消都保留原有规则；升级不会自动重写已有风格。原图只用于观察，写作使用本组记录，出图使用完整提示词。成功后再主动试做，核对不同内容是否做到同源但不同形。分组、复制、切换、失败保护和版本保留已用模拟模型与浏览器验证；真实模型的分组准确率、分析深度与新风格成图效果尚未实测。</w:t>
       </w:r>
     </w:p>
     <w:p>
@@ -1763,7 +1795,7 @@
         <w:rPr>
           <w:b w:val="0"/>
         </w:rPr>
-        <w:t>在风格详情点击“生成一页 demo / 调试风格”，可用预填示例直接生成一页，也可切换通用表达、儿童摄影、运动与赛事示例并修改文字，不需要先创建项目。已有讲稿仍可手填或从已有页面选择。普通试做不再用作封面。点击“生成统一封面”，固定以“让想法被看见 / 把内容讲清楚，让表达有自己的风格。”两句文案，按已保存风格直接生成一张图并自动设为封面。文案不再提炼，也不带入试做讲稿、反馈或临时倾向与配色；不改提示词、不增加出图参考。失败或风格中途变化时保留旧封面。封面只需图片模型；普通试做还需内容模型，均会调用所选服务。若提示后台版本过旧，请等制作任务完成后重新打开程序，仅刷新网页不会更新后台。</w:t>
+        <w:t>在风格详情点击“试做一页”，桌面左侧集中显示成图、保存风格和试做记录，右侧按“试做内容 / 调整效果”切换操作；右侧内容独立滚动，生成按钮保持可见。窄窗口先编辑内容，再查看成图。默认使用预填示例，“换一段示例”可切换通用表达、儿童摄影、运动与赛事，无需先创建项目。试做草稿自动保存在本机，切换页签保留讲稿、调整意见、提示词和独立配色；讲稿、行业、受众与临时配色不会保存为正式风格。需要精细调整规则时展开“试做内容 → 高级设置”；展开“内容倾向与配色（可选）”才显示这些选项。已有讲稿仍可手填或从已有页面选择。普通试做不再用作封面。展开“风格封面”后点击“生成统一封面”，固定以“让想法被看见 / 把内容讲清楚，让表达有自己的风格。”两句文案，按已保存风格直接生成一张图并自动设为封面。文案不再提炼，也不带入试做讲稿、反馈或临时倾向与配色；不改提示词、不增加出图参考。失败或风格中途变化时保留旧封面。封面只需图片模型；普通试做还需内容模型，均会调用所选服务。若提示后台版本过旧，请等制作任务完成后重新打开程序，仅刷新网页不会更新后台。</w:t>
       </w:r>
     </w:p>
     <w:p>
@@ -1779,7 +1811,7 @@
         <w:rPr>
           <w:b w:val="0"/>
         </w:rPr>
-        <w:t>提炼后可先“风格试做”。设计提示词将原文用于出图，不会自动改写。需要修改时直接编辑“设计提示词原文”，试做满意后点击“保存这版为正式风格”；只有主动“重新提炼风格”才会根据参考图改写规则。</w:t>
+        <w:t>提炼后可先“风格试做”。设计提示词将原文用于出图，不会自动改写。需要修改时在“试做内容 → 高级设置”中编辑原文，试做满意后点击“保存这版为正式风格”；只有主动“重新提炼风格”才会根据参考图改写规则。</w:t>
       </w:r>
     </w:p>
     <w:p>
@@ -1798,15 +1830,15 @@
         <w:rPr>
           <w:b w:val="0"/>
         </w:rPr>
-        <w:t>在“查看风格”或“风格试做”展开“提示词版本”，选择历史记录，查看版本号、保存时间、来源及完整提示词；展开“与当前版本比较”，可查看增加、移除的文字和构思方式变化。</w:t>
-      </w:r>
-    </w:p>
-    <w:p>
-      <w:r>
-        <w:rPr>
-          <w:b w:val="0"/>
-        </w:rPr>
-        <w:t>手动保存、重新提炼、试做转正式时，提示词或构思方式有变化便留存版本；相同内容不重复保存。点击“恢复此版本”会创建一个新版本，恢复前的内容仍保留。恢复不改变参考图和已有图片，下次主动制作时使用恢复后的规则。编辑中的内容需要先保存或取消；试做中的草稿可先转为正式风格，或“从正式风格重新开始”。其他窗口更新过规则时，会提示冲突并保留你的输入，先比较最新版本再保存。</w:t>
+        <w:t>在“查看风格 → 高级设置”进入“历史版本”，或在试做区的“试做内容 → 高级设置”中展开“提示词版本”，选择历史记录，查看版本号、保存时间、来源及完整提示词；展开“与当前版本比较”，可查看增加、移除的文字和旧版构思方式的历史记录。</w:t>
+      </w:r>
+    </w:p>
+    <w:p>
+      <w:r>
+        <w:rPr>
+          <w:b w:val="0"/>
+        </w:rPr>
+        <w:t>手动保存、重新提炼、试做转正式时，提示词有变化便留存版本；相同内容不重复保存。点击“恢复此版本”会创建一个新版本，恢复前的内容仍保留。恢复不改变参考图和已有图片，下次主动制作时使用恢复后的规则。编辑中的内容需要先保存或取消；试做中的草稿可先转为正式风格，或“从正式风格重新开始”。其他窗口更新过规则时，会提示冲突并保留你的输入，先比较最新版本再保存。</w:t>
       </w:r>
     </w:p>
     <w:p>
@@ -1828,7 +1860,7 @@
         <w:rPr>
           <w:b w:val="0"/>
         </w:rPr>
-        <w:t xml:space="preserve"> 时一并保留。旧提炼和试做转正式记录按实际保存内容展示；未记录构思方式的旧版，恢复时沿用当前方式。过去没有留存的手动修改无法补回。</w:t>
+        <w:t xml:space="preserve"> 时一并保留。旧提炼和试做转正式记录按实际保存内容展示；旧版构思方式仅作为历史元数据保留，恢复版本也不会重新启用额外构图。过去没有留存的手动修改无法补回。</w:t>
       </w:r>
     </w:p>
     <w:p>
@@ -1976,15 +2008,15 @@
         <w:rPr>
           <w:b w:val="0"/>
         </w:rPr>
-        <w:t>风格详情可开启“按内容构思（仅当前风格）”。每页增加一次内容模型调用：文案冻结后，依据风格原文比较三种表达，按排版、留白、视觉层次、色彩搭配、原创性检查构思，再出图。不会改写风格或上屏文案，其他风格不受影响；关闭后恢复直接出图。</w:t>
-      </w:r>
-    </w:p>
-    <w:p>
-      <w:r>
-        <w:rPr>
-          <w:b w:val="0"/>
-        </w:rPr>
-        <w:t>开启时可展开“本页构图与五维构思自检”，查看最终方案、选择理由和候选方向。批量制作会参考附近同风格页面已保存的构图描述，减少重复；旧页面没有描述时不猜测。这是出图前的构思自检，不是对实际图片的自动判重或视觉验收。图片失败后重试复用已保存方案，实际成图仍需核对。</w:t>
+        <w:t>“按内容构思”功能已取消。试做、单页重新设计与整场制作统一按风格原文和已复核文案直接出图，不额外调用内容模型制定构图，旧的开启配置也不再生效。已有图片与风格版本保留，升级不会自动重新生成。</w:t>
+      </w:r>
+    </w:p>
+    <w:p>
+      <w:r>
+        <w:rPr>
+          <w:b w:val="0"/>
+        </w:rPr>
+        <w:t>旧版保存的构图说明可在生成依据中查看，标为“历史构图记录（功能已停用）”。再次生成或重试不会把它追加给图片模型；有效上屏文案继续复用，附件、独立配色和你主动填写的画面调整仍按原流程使用。</w:t>
       </w:r>
     </w:p>
     <w:p>
@@ -2089,97 +2121,47 @@
         <w:rPr>
           <w:b w:val="0"/>
         </w:rPr>
-        <w:t>追加讲稿并调整页面</w:t>
-      </w:r>
-    </w:p>
-    <w:p>
-      <w:r>
-        <w:rPr>
-          <w:b w:val="0"/>
-        </w:rPr>
-        <w:t>项目分为“概览 → 制作台 → 演练中心 → 交付中心”，对应“写 → 做 → 练 → 交”。概览按当前状态给出一个下一步动作，来源版本不同的演示会单独提示。已有讲稿时，制作台顶部显示“继续添加讲稿”，内容视图为“页面 / 演说稿”，范围为“最近制作 / 全部页面 / 历史段落”。演练中心打开播放器和动态演示，交付中心集中报告与下载。</w:t>
-      </w:r>
-    </w:p>
-    <w:p>
-      <w:r>
-        <w:rPr>
-          <w:b w:val="0"/>
-        </w:rPr>
-        <w:t>“最近制作”跟随实际制作任务：制作中显示当前及排队任务涉及的页面，没有进行中的任务时显示最近一次制作的页面，完成后仍保留在视图中。标签数字表示页数，卡片按整份演讲的当前顺序编号，插页后会随之更新。查看旧讲稿使用段落下拉框，“全部页面”查看完整演讲；尚无制作记录时回退到最近添加的段落。</w:t>
-      </w:r>
-    </w:p>
-    <w:p>
-      <w:r>
-        <w:rPr>
-          <w:b w:val="0"/>
-        </w:rPr>
-        <w:t xml:space="preserve">流程为“完整逐字稿 → 按讲述逻辑拆页 → 每页提炼并复核上屏文案 → 按需构思 → 搭配原始风格提示词出图”。风格不参与拆页和文案提炼。段落是拆页依据，不机械地一段一页。选好风格后，一段一段追加逐字稿，确认本段效果后再继续。系统保留提交原文，并在拆页和保存逐字稿时去掉 Markdown 标题，包括 </w:t>
-      </w:r>
-      <w:r>
-        <w:rPr>
-          <w:rFonts w:ascii="Menlo" w:hAnsi="Menlo"/>
-          <w:b w:val="0"/>
-          <w:sz w:val="20"/>
-        </w:rPr>
-        <w:t>#</w:t>
-      </w:r>
-      <w:r>
-        <w:rPr>
-          <w:b w:val="0"/>
-        </w:rPr>
-        <w:t xml:space="preserve"> 到 </w:t>
-      </w:r>
-      <w:r>
-        <w:rPr>
-          <w:rFonts w:ascii="Menlo" w:hAnsi="Menlo"/>
-          <w:b w:val="0"/>
-          <w:sz w:val="20"/>
-        </w:rPr>
-        <w:t>######</w:t>
-      </w:r>
-      <w:r>
-        <w:rPr>
-          <w:b w:val="0"/>
-        </w:rPr>
-        <w:t xml:space="preserve"> 的标题，以及下划线式标题。正文、普通短句、加粗强调和段落继续保留。</w:t>
-      </w:r>
-    </w:p>
-    <w:p>
-      <w:r>
-        <w:rPr>
-          <w:b/>
-        </w:rPr>
-        <w:t>需要被去掉的大标题，请在原稿中明确标成 Markdown 标题。</w:t>
-      </w:r>
-      <w:r>
-        <w:rPr>
-          <w:b w:val="0"/>
-        </w:rPr>
-        <w:t xml:space="preserve"> 没有标题标记的普通短句会作为正文保留。</w:t>
-      </w:r>
-    </w:p>
-    <w:p>
-      <w:r>
-        <w:rPr>
-          <w:b w:val="0"/>
-        </w:rPr>
-        <w:t>在页面卡片或演说稿的页间点击“插入”，填写新页完整讲稿，再点“插入并生成”。固定新增一页，沿用当前风格、内容倾向和配色，后续页码顺延；不等待其他页制作完成。也可仅插入、稍后生成，或在第一页前及末尾插入。失败后新页和讲稿保留，可以改稿或重试；网络异常后重试同一次提交不会重复插页。</w:t>
-      </w:r>
-    </w:p>
-    <w:p>
-      <w:r>
-        <w:rPr>
-          <w:b w:val="0"/>
-        </w:rPr>
-        <w:t>手动拆分可对照原图插入分界，立即拆成多页；默认后台生成，也可关闭生成先改稿。原文及内容附件保留，新页重新提炼文案和出图。拆分页空闲时可撤销，不影响其他页刚完成的图片。合并相邻页仍先预览、确认后出图。修改正文后，画面标记为待核对。在概览点击“核对 N 页画面”，可查看每页原因及前后讲稿；换行、空格或加粗的变化会单独说明。需要调整时进入页面编辑；画面仍适用时点击“确认保留第 N 页”，关闭该页提醒。“稍后处理”暂不作决定。确认保留不调用模型，原图、讲稿和历史保留；以后再次改稿会重新提醒。</w:t>
-      </w:r>
-    </w:p>
-    <w:p>
-      <w:r>
-        <w:rPr>
-          <w:b w:val="0"/>
-        </w:rPr>
-        <w:t>逐页修改后可提交后台任务，再编辑其他页，最多同时执行 4 项，超出自动排队。手动拆分立即保存新页，每张新图独立排队；制作只锁定对应页。合并方案只锁定来源页，追加讲稿只锁定未完成页，同一项目的追加段落按顺序制作。其他空闲页可改稿、重绘、拆分，也可提交下一段。正在制作的本页可先写草稿，完成后再提交；离开时提示未提交内容。已有拆分或合并方案在来源页空闲时即可确认，其他页任务不影响。确认时显示提交状态，失败提示仅属于本次窗口，重新打开会清除旧提示。切换风格和 PPT 导出仍需项目空闲，单独下载已保存逐字稿无需等待出图。旧图保留，失败可重试；实际提速取决于服务商额度。弹窗外部点击或拖动不会关闭弹窗；请用关闭、取消按钮或 Esc 键。</w:t>
+        <w:t>演练中心从试播到整场</w:t>
+      </w:r>
+    </w:p>
+    <w:p>
+      <w:r>
+        <w:rPr>
+          <w:b w:val="0"/>
+        </w:rPr>
+        <w:t>演练中心按“准备本场演讲 → 先试效果 → 生成整场”组织。先选择“自己讲 / AI 口播”和“原画面 / 动态演示”；需要数字人时，按需展开“实验室 · 数字人讲解”，在同一处选择本场声音、表达、语速、头像、布局与页面范围，编辑当前页口播正文。布局预览不调用模型；口播正文单独保存，原逐字稿、图片和旧生成版本保留。</w:t>
+      </w:r>
+    </w:p>
+    <w:p>
+      <w:r>
+        <w:rPr>
+          <w:b w:val="0"/>
+        </w:rPr>
+        <w:t>一次准备的服务连接、密钥、声音采集、默认声音放在全局设置；头像与数字人声音在实验室管理，风格在风格库管理；本场只保存素材编号与演讲选择。缺少声音或头像时，点击“管理声音 / 服务”或“管理 / 创建头像”，打开独立设置窗口，完成后直接返回原项目。改变全局默认声音不会替换已有项目保存的声音。数字人按本场所选 MiniMax 声音生成音频，再把同一音频交给 HeyGen 同步嘴型；也可沿用本项目已有完整口播，不重新配音。</w:t>
+      </w:r>
+    </w:p>
+    <w:p>
+      <w:r>
+        <w:rPr>
+          <w:b w:val="0"/>
+        </w:rPr>
+        <w:t>“先试当前页”支持开头最多 100 字或完整一页，确认范围和费用后才开始。短片段明确标记，不当作完整页结果；完整页试播与整场文字、声音、语速、情绪、头像一致时复用音频和嘴型视频。动态演示先转换当前页，整场只生成尚无匹配结果的页面。未填口播或缺少画面的页面会提示，用户可调整范围后生成。</w:t>
+      </w:r>
+    </w:p>
+    <w:p>
+      <w:r>
+        <w:rPr>
+          <w:b w:val="0"/>
+        </w:rPr>
+        <w:t>生成期间显示声音、嘴型与动态页进度，可先听完成的声音或看完成的页面；关闭窗口后任务和结果仍保留。整场完整音频另存为口播版本，可在高级播放器与交付中继续使用。HeyGen 明确失败时不再显示“继续查询或下载”，已生成的 MiniMax 音频保留；处理失败原因后，重新确认生成可复用音频。尚在处理或下载失败的提交继续使用原任务，避免重复提交。继续未生成的声音或失败的动态页需再次确认费用。</w:t>
+      </w:r>
+    </w:p>
+    <w:p>
+      <w:r>
+        <w:rPr>
+          <w:b w:val="0"/>
+        </w:rPr>
+        <w:t>“已有版本与高级调整”保留原口播播放器、AI 演绎、数字人历史和动态图层校准。密钥已保存仅代表完成配置，不代表服务可用或额度充足。自动化测试使用模拟服务验证数据保留、个人声音、完整页复用、短片段范围和失败保护；真实 App 的验收进度与服务限制见[本次发布验证记录](演练中心发布验证-2026-10-10.md)。</w:t>
       </w:r>
     </w:p>
     <w:p>
@@ -2190,23 +2172,97 @@
         <w:rPr>
           <w:b w:val="0"/>
         </w:rPr>
-        <w:t>看懂本次制作进度</w:t>
-      </w:r>
-    </w:p>
-    <w:p>
-      <w:r>
-        <w:rPr>
-          <w:b w:val="0"/>
-        </w:rPr>
-        <w:t>顶部按本次实际需要制作的页面显示“已生成、失败、待处理”，另列已保存并跳过的页数。例如 133 页中还有 24 页未完成，继续后分母为 24，另外 109 页明确显示已保存、本次跳过；当前页仍标注原项目页码。“已处理”包括成功和失败，不代表全部成图；内容分析保存进度也不代表图片已经生成。</w:t>
-      </w:r>
-    </w:p>
-    <w:p>
-      <w:r>
-        <w:rPr>
-          <w:b w:val="0"/>
-        </w:rPr>
-        <w:t>可恢复的服务拥堵、暂无可用通道或限流拒绝会先自动等待并重试，显示原因、等待时间与次数，无需再次点击，恢复期间不标为失败。恢复成功后继续制作；重试耗尽或需人工处理时，才显示失败数量。展开“查看原因与处理方式”可查看原页码、原因分类、建议操作和具体错误。失败页先跳过，其他页继续，已完成内容立即保存。任务结束后点击“继续未完成任务”，仅补做未完成部分。</w:t>
+        <w:t>追加讲稿并调整页面</w:t>
+      </w:r>
+    </w:p>
+    <w:p>
+      <w:r>
+        <w:rPr>
+          <w:b w:val="0"/>
+        </w:rPr>
+        <w:t>项目分为“概览 → 制作台 → 演练中心 → 交付中心”，对应“写 → 做 → 练 → 交”。概览按当前状态给出一个下一步动作，来源版本不同的演示会单独提示。已有讲稿时，制作台顶部显示“继续添加讲稿”，内容视图为“页面 / 演说稿”，范围为“最近制作 / 全部页面 / 历史段落”。演练中心打开播放器和动态演示，交付中心集中报告与下载。</w:t>
+      </w:r>
+    </w:p>
+    <w:p>
+      <w:r>
+        <w:rPr>
+          <w:b w:val="0"/>
+        </w:rPr>
+        <w:t>“最近制作”跟随实际制作任务：制作中显示当前及排队任务涉及的页面，没有进行中的任务时显示最近一次制作的页面，完成后仍保留在视图中。标签数字表示页数，卡片按整份演讲的当前顺序编号，插页后会随之更新。查看旧讲稿使用段落下拉框，“全部页面”查看完整演讲；尚无制作记录时回退到最近添加的段落。</w:t>
+      </w:r>
+    </w:p>
+    <w:p>
+      <w:r>
+        <w:rPr>
+          <w:b w:val="0"/>
+        </w:rPr>
+        <w:t xml:space="preserve">流程为“完整逐字稿 → 按讲述逻辑拆页 → 每页提炼并复核上屏文案 → 搭配原始风格提示词出图”。风格不参与拆页和文案提炼。段落是拆页依据，不机械地一段一页。选好风格后，一段一段追加逐字稿，确认本段效果后再继续。系统保留提交原文，并在拆页和保存逐字稿时去掉 Markdown 标题，包括 </w:t>
+      </w:r>
+      <w:r>
+        <w:rPr>
+          <w:rFonts w:ascii="Menlo" w:hAnsi="Menlo"/>
+          <w:b w:val="0"/>
+          <w:sz w:val="20"/>
+        </w:rPr>
+        <w:t>#</w:t>
+      </w:r>
+      <w:r>
+        <w:rPr>
+          <w:b w:val="0"/>
+        </w:rPr>
+        <w:t xml:space="preserve"> 到 </w:t>
+      </w:r>
+      <w:r>
+        <w:rPr>
+          <w:rFonts w:ascii="Menlo" w:hAnsi="Menlo"/>
+          <w:b w:val="0"/>
+          <w:sz w:val="20"/>
+        </w:rPr>
+        <w:t>######</w:t>
+      </w:r>
+      <w:r>
+        <w:rPr>
+          <w:b w:val="0"/>
+        </w:rPr>
+        <w:t xml:space="preserve"> 的标题，以及下划线式标题。正文、普通短句、加粗强调和段落继续保留。</w:t>
+      </w:r>
+    </w:p>
+    <w:p>
+      <w:r>
+        <w:rPr>
+          <w:b/>
+        </w:rPr>
+        <w:t>需要被去掉的大标题，请在原稿中明确标成 Markdown 标题。</w:t>
+      </w:r>
+      <w:r>
+        <w:rPr>
+          <w:b w:val="0"/>
+        </w:rPr>
+        <w:t xml:space="preserve"> 没有标题标记的普通短句会作为正文保留。</w:t>
+      </w:r>
+    </w:p>
+    <w:p>
+      <w:r>
+        <w:rPr>
+          <w:b w:val="0"/>
+        </w:rPr>
+        <w:t>在页面卡片或演说稿的页间点击“插入”，填写新页完整讲稿，再点“插入并生成”。固定新增一页，沿用当前风格、内容倾向和配色，后续页码顺延；不等待其他页制作完成。也可仅插入、稍后生成，或在第一页前及末尾插入。失败后新页和讲稿保留，可以改稿或重试；网络异常后重试同一次提交不会重复插页。</w:t>
+      </w:r>
+    </w:p>
+    <w:p>
+      <w:r>
+        <w:rPr>
+          <w:b w:val="0"/>
+        </w:rPr>
+        <w:t>手动拆分可对照原图插入分界，立即拆成多页；默认后台生成，也可关闭生成先改稿。原文及内容附件保留，新页重新提炼文案和出图。拆分页空闲时可撤销，不影响其他页刚完成的图片。合并相邻页仍先预览、确认后出图。修改正文后，画面标记为待核对。在概览点击“核对 N 页画面”，可查看每页原因及前后讲稿；换行、空格或加粗的变化会单独说明。需要调整时进入页面编辑；画面仍适用时点击“确认保留第 N 页”，关闭该页提醒。“稍后处理”暂不作决定。确认保留不调用模型，原图、讲稿和历史保留；以后再次改稿会重新提醒。</w:t>
+      </w:r>
+    </w:p>
+    <w:p>
+      <w:r>
+        <w:rPr>
+          <w:b w:val="0"/>
+        </w:rPr>
+        <w:t>逐页修改后可提交后台任务，再编辑其他页，最多同时执行 4 项，超出自动排队。手动拆分立即保存新页，每张新图独立排队；制作只锁定对应页。合并方案只锁定来源页，追加讲稿只锁定未完成页，同一项目的追加段落按顺序制作。其他空闲页可改稿、重绘、拆分，也可提交下一段。正在制作的本页可先写草稿，完成后再提交；离开时提示未提交内容。已有拆分或合并方案在来源页空闲时即可确认，其他页任务不影响。确认时显示提交状态，失败提示仅属于本次窗口，重新打开会清除旧提示。切换风格和 PPT 导出仍需项目空闲，单独下载已保存逐字稿无需等待出图。旧图保留，失败可重试；实际提速取决于服务商额度。弹窗外部点击或拖动不会关闭弹窗；请用关闭、取消按钮或 Esc 键。</w:t>
       </w:r>
     </w:p>
     <w:p>
@@ -2217,23 +2273,23 @@
         <w:rPr>
           <w:b w:val="0"/>
         </w:rPr>
-        <w:t>全部或选择几页重新设计</w:t>
-      </w:r>
-    </w:p>
-    <w:p>
-      <w:r>
-        <w:rPr>
-          <w:b w:val="0"/>
-        </w:rPr>
-        <w:t>在制作台点击“重新设计”（手机端先展开“更多操作”，也可用键盘聚焦后按 Enter 展开）。手机首屏保留“补齐未生成页面”；首部插页和撤销也在“更多操作”中。选择“全部页面重新设计”会包含整个项目，不受当前查看段落影响；选择“选择几页重新设计”后，直接勾选缩略图，也可“全选可重做页面”或“清空选择”。页面卡片左上角的多选框始终显示，勾选后也能从底栏“重新设计所选 N 页”进入，原有勾选会带入窗口。</w:t>
-      </w:r>
-    </w:p>
-    <w:p>
-      <w:r>
-        <w:rPr>
-          <w:b w:val="0"/>
-        </w:rPr>
-        <w:t>核对窗口里的当前风格、页码和数量，再点击“开始重新设计 N 页”。这时才会调用模型并产生费用；取消不会生成。使用已保存的讲稿、内容附件、风格和配色重新出图，成功后旧图存入历史，失败保留旧图。正在制作的页不能重复提交，可以选择其他空闲页。此操作重做 PPT 图片；动态 HTML 仍从独立入口转换。</w:t>
+        <w:t>看懂本次制作进度</w:t>
+      </w:r>
+    </w:p>
+    <w:p>
+      <w:r>
+        <w:rPr>
+          <w:b w:val="0"/>
+        </w:rPr>
+        <w:t>顶部按本次实际需要制作的页面显示“已生成、失败、待处理”，另列已保存并跳过的页数。例如 133 页中还有 24 页未完成，继续后分母为 24，另外 109 页明确显示已保存、本次跳过；当前页仍标注原项目页码。“已处理”包括成功和失败，不代表全部成图；内容分析保存进度也不代表图片已经生成。</w:t>
+      </w:r>
+    </w:p>
+    <w:p>
+      <w:r>
+        <w:rPr>
+          <w:b w:val="0"/>
+        </w:rPr>
+        <w:t>可恢复的服务拥堵、暂无可用通道或限流拒绝会先自动等待并重试，显示原因、等待时间与次数，无需再次点击，恢复期间不标为失败。恢复成功后继续制作；重试耗尽或需人工处理时，才显示失败数量。展开“查看原因与处理方式”可查看原页码、原因分类、建议操作和具体错误。失败页先跳过，其他页继续，已完成内容立即保存。任务结束后点击“继续未完成任务”，仅补做未完成部分。</w:t>
       </w:r>
     </w:p>
     <w:p>
@@ -2244,87 +2300,23 @@
         <w:rPr>
           <w:b w:val="0"/>
         </w:rPr>
-        <w:t>控制画面文字密度</w:t>
-      </w:r>
-    </w:p>
-    <w:p>
-      <w:r>
-        <w:rPr>
-          <w:b w:val="0"/>
-        </w:rPr>
-        <w:t>新页面会先提炼上屏文案，再单独复核，最后把文案和原始风格提示词一起交给图片模型。系统把内容分为核心表达、必要支撑和口播展开，提炼观众需要看见的重点，不逐句缩写原稿；开场、重复解释、口语衔接和长段展开优先留给口播，同时保留关键条件、数字、单位和范围。逐字稿与导出备注保持完整。</w:t>
-      </w:r>
-    </w:p>
-    <w:p>
-      <w:r>
-        <w:rPr>
-          <w:b w:val="0"/>
-        </w:rPr>
-        <w:t>原稿引用校验允许空行、换行、中文间距和 Markdown 加粗、斜体差异；例如两句之间少一个空行，不再报“缺少原文依据”。原稿和引用记录保持原样，英文单词与数字之间有意义的分隔仍保留。实质文字、数字、标点、否定或条件变化，以及跳过正文拼接引用，仍会被拦截。完整语义由文案复核继续检查，已选主张的必保条件也继续保留。</w:t>
-      </w:r>
-    </w:p>
-    <w:p>
-      <w:r>
-        <w:rPr>
-          <w:b w:val="0"/>
-        </w:rPr>
-        <w:t>在“上屏文案与风格 → 文字取舍与密度”查看讲稿字数、上屏字数、文字组数及取舍依据。字数含标点、不计空白；附件内部文字不计入，但模型会看图判断阅读负担。改稿后的旧方案提示重新设计，缺失记录不显示。可展开风格原文和实际出图提示词核对输入。</w:t>
-      </w:r>
-    </w:p>
-    <w:p>
-      <w:r>
-        <w:rPr>
-          <w:b w:val="0"/>
-        </w:rPr>
-        <w:t>风格试做显示“本次提炼的上屏内容”。对照时复制完整出图提示词，或分别复制风格和“内容部分（含辅助信息）”，可展开辅助依据。开启“按内容构思”、内容倾向或独立配色时，请复制完整提示词以包含全部要求。只复制主文案会漏掉语义边界，已有 ChatGPT 对话也可能带入上下文。复制取自当前记录，改稿后会提示；不调用模型，受限时可手动复制。</w:t>
-      </w:r>
-    </w:p>
-    <w:p>
-      <w:r>
-        <w:rPr>
-          <w:b w:val="0"/>
-        </w:rPr>
-        <w:t>页面按任务设置密度提醒，超出时说明保留理由，不截断原稿或自动增加页数。字多时可填写“上屏文字调整”后重做；只调整画面或换风格时复用文案。确需拆页时，在逐字稿中手动选择分界。</w:t>
-      </w:r>
-    </w:p>
-    <w:p>
-      <w:r>
-        <w:rPr>
-          <w:b w:val="0"/>
-        </w:rPr>
-        <w:t>校验保护已选上屏主张的必要条件，允许“五个/5个”等明确等值的整数数量写法。整条移至口播的非核心支撑信息不必强制上屏；仍在表达的结果不能只删限定词。来源或必保信息错误最多自动修正一次；字面匹配仍失败时，自动恢复有来源依据的对应原句再校验，不增加模型请求；来源、原意或其他校验仍不通过才停止出图、保留旧图并显示具体原因。恢复记录可在文字取舍中查看。</w:t>
-      </w:r>
-    </w:p>
-    <w:p>
-      <w:r>
-        <w:rPr>
-          <w:b w:val="0"/>
-        </w:rPr>
-        <w:t>正常提炼与复核共两次内容请求，自动修正最多增加一次请求及相应等待和费用。换风格、重新构图及仅更新出图格式时复用有效文案；图片失败后重试复用有效方案。语义判断仍可能出错，密度复核不代表成图面积或阅读时间，成图仍需检查。</w:t>
-      </w:r>
-    </w:p>
-    <w:p>
-      <w:r>
-        <w:rPr>
-          <w:b w:val="0"/>
-        </w:rPr>
-        <w:t>内容部分会保留各组文案的核心、支撑、限定或出处、标签角色，供图片模型建立阅读主次，角色说明本身不上屏。字号、位置和构图仍依照风格决定。旧图片保持原样，下次主动重新设计或续做时采用新格式；格式更新不代表排版质量已验收。</w:t>
-      </w:r>
-    </w:p>
-    <w:p>
-      <w:r>
-        <w:rPr>
-          <w:b w:val="0"/>
-        </w:rPr>
-        <w:t>出图默认使用风格原文、上屏文案和简短的辅助表达边界。以已提炼的上屏文案为主，保持原意和表达程度。为丰富页面可增加少量、轻微、中性的辅助联想或解释，不能有指向性或引导性，不能让观众读出原文没有表达的意思、判断、倾向或结论，也不能补造事实。文字、图像和图形关系都遵守这一边界；有来源的摘录仅作次要辅助。成图仍需核对。</w:t>
-      </w:r>
-    </w:p>
-    <w:p>
-      <w:r>
-        <w:rPr>
-          <w:b w:val="0"/>
-        </w:rPr>
-        <w:t>“实际发送的出图提示词”同时显示服务、请求模型和规格、实际尺寸及服务返回的信息。缺失信息不补造；若服务返回改写提示词也会显示。同文输入不保证构图一致，第三方接口的模型名称也不能证明后端与 ChatGPT 相同。</w:t>
+        <w:t>全部或选择几页重新设计</w:t>
+      </w:r>
+    </w:p>
+    <w:p>
+      <w:r>
+        <w:rPr>
+          <w:b w:val="0"/>
+        </w:rPr>
+        <w:t>在制作台点击“重新设计”（手机端先展开“更多操作”，也可用键盘聚焦后按 Enter 展开）。手机首屏保留“补齐未生成页面”；首部插页和撤销也在“更多操作”中。选择“全部页面重新设计”会包含整个项目，不受当前查看段落影响；选择“选择几页重新设计”后，直接勾选缩略图，也可“全选可重做页面”或“清空选择”。页面卡片左上角的多选框始终显示，勾选后也能从底栏“重新设计所选 N 页”进入，原有勾选会带入窗口。</w:t>
+      </w:r>
+    </w:p>
+    <w:p>
+      <w:r>
+        <w:rPr>
+          <w:b w:val="0"/>
+        </w:rPr>
+        <w:t>核对窗口里的当前风格、页码和数量，再点击“开始重新设计 N 页”。这时才会调用模型并产生费用；取消不会生成。使用已保存的讲稿、内容附件、风格和配色重新出图，成功后旧图存入历史，失败保留旧图。正在制作的页不能重复提交，可以选择其他空闲页。此操作重做 PPT 图片；动态 HTML 仍从独立入口转换。</w:t>
       </w:r>
     </w:p>
     <w:p>
@@ -2335,39 +2327,87 @@
         <w:rPr>
           <w:b w:val="0"/>
         </w:rPr>
-        <w:t>重做时加入图表或产品截图</w:t>
-      </w:r>
-    </w:p>
-    <w:p>
-      <w:r>
-        <w:rPr>
-          <w:b w:val="0"/>
-        </w:rPr>
-        <w:t>打开要调整的页面，在“换一个思路，再设计一次”下面点击“添加图片”。可添加 1–4 张 PNG、JPG 或 WebP，每张最多 12 MB。缩略图可打开查看，也可移除后换图。</w:t>
-      </w:r>
-    </w:p>
-    <w:p>
-      <w:r>
-        <w:rPr>
-          <w:b w:val="0"/>
-        </w:rPr>
-        <w:t>这些图片是内容材料，不是风格参考。可写明用途，如“第一张是操作界面，第二张是测试结果”，再点击“重新设计这页”。附件会交给文案提炼、复核和图片模型，结合风格原文参与整页构图，不默认贴缩略图、套卡片或固定放在一侧。照片可裁切无关外围、自然衔接背景；图表与界面用周围排版融合。保留主体身份、数据、文字和必要上下文，避免扭曲、遮挡或缩得过小。</w:t>
-      </w:r>
-    </w:p>
-    <w:p>
-      <w:r>
-        <w:rPr>
-          <w:b w:val="0"/>
-        </w:rPr>
-        <w:t>成功后，附件随这一版页面保存；恢复历史版本也会恢复对应附件。生成失败时保留旧页面、本次方案和附件，可以继续重试。添加后尚未点击重做就离开，会提示附件选择尚未提交。</w:t>
-      </w:r>
-    </w:p>
-    <w:p>
-      <w:r>
-        <w:rPr>
-          <w:b w:val="0"/>
-        </w:rPr>
-        <w:t>带附件出图要求配置的图片服务支持 Images Edits 多图输入；不支持时会明确报错，不会自动忽略附件改为纯文字出图。模型生成的图表数值、小字与产品细节仍应检查；接口传递的测试不代表真实模型能逐像素保留材料。</w:t>
+        <w:t>控制画面文字密度</w:t>
+      </w:r>
+    </w:p>
+    <w:p>
+      <w:r>
+        <w:rPr>
+          <w:b w:val="0"/>
+        </w:rPr>
+        <w:t>新页面会先提炼上屏文案，再单独复核，最后把文案和原始风格提示词一起交给图片模型。系统把内容分为核心表达、必要支撑和口播展开，提炼观众需要看见的重点，不逐句缩写原稿；开场、重复解释、口语衔接和长段展开优先留给口播，同时保留关键条件、数字、单位和范围。逐字稿与导出备注保持完整。</w:t>
+      </w:r>
+    </w:p>
+    <w:p>
+      <w:r>
+        <w:rPr>
+          <w:b w:val="0"/>
+        </w:rPr>
+        <w:t>原稿引用校验允许空行、换行、中文间距和 Markdown 加粗、斜体差异；例如两句之间少一个空行，不再报“缺少原文依据”。原稿和引用记录保持原样，英文单词与数字之间有意义的分隔仍保留。实质文字、数字、标点、否定或条件变化，以及跳过正文拼接引用，仍会被拦截。完整语义由文案复核继续检查，已选主张的必保条件也继续保留。</w:t>
+      </w:r>
+    </w:p>
+    <w:p>
+      <w:r>
+        <w:rPr>
+          <w:b w:val="0"/>
+        </w:rPr>
+        <w:t>在“上屏文案与风格 → 文字取舍与密度”查看讲稿字数、上屏字数、文字组数及取舍依据。字数含标点、不计空白；附件内部文字不计入，但模型会看图判断阅读负担。改稿后的旧方案提示重新设计，缺失记录不显示。可展开风格原文和实际出图提示词核对输入。</w:t>
+      </w:r>
+    </w:p>
+    <w:p>
+      <w:r>
+        <w:rPr>
+          <w:b w:val="0"/>
+        </w:rPr>
+        <w:t>试做生成后展开左侧“查看上屏文案与生成依据”，可查看“本次提炼的上屏内容”；更详细的生成依据另行展开。对照时复制完整出图提示词，或分别复制风格和“内容部分（含辅助信息）”，可展开辅助依据。使用内容倾向或独立配色时，请复制完整提示词以包含全部要求。只复制主文案会漏掉语义边界，已有 ChatGPT 对话也可能带入上下文。复制取自当前记录，改稿后会提示；不调用模型，受限时可手动复制。</w:t>
+      </w:r>
+    </w:p>
+    <w:p>
+      <w:r>
+        <w:rPr>
+          <w:b w:val="0"/>
+        </w:rPr>
+        <w:t>页面按任务设置密度提醒，超出时说明保留理由，不截断原稿或自动增加页数。字多时可填写“上屏文字调整”后重做；只调整画面或换风格时复用文案。确需拆页时，在逐字稿中手动选择分界。</w:t>
+      </w:r>
+    </w:p>
+    <w:p>
+      <w:r>
+        <w:rPr>
+          <w:b w:val="0"/>
+        </w:rPr>
+        <w:t>校验保护已选上屏主张的必要条件，允许“五个/5个”等明确等值的整数数量写法。整条移至口播的非核心支撑信息不必强制上屏；仍在表达的结果不能只删限定词。来源或必保信息错误最多自动修正一次；字面匹配仍失败时，自动恢复有来源依据的对应原句再校验，不增加模型请求；来源、原意或其他校验仍不通过才停止出图、保留旧图并显示具体原因。恢复记录可在文字取舍中查看。</w:t>
+      </w:r>
+    </w:p>
+    <w:p>
+      <w:r>
+        <w:rPr>
+          <w:b w:val="0"/>
+        </w:rPr>
+        <w:t>正常提炼与复核共两次内容请求，自动修正最多增加一次请求及相应等待和费用。换风格、重新构图及仅更新出图格式时复用有效文案；图片失败后重试复用有效方案。语义判断仍可能出错，密度复核不代表成图面积或阅读时间，成图仍需检查。</w:t>
+      </w:r>
+    </w:p>
+    <w:p>
+      <w:r>
+        <w:rPr>
+          <w:b w:val="0"/>
+        </w:rPr>
+        <w:t>内容部分会保留各组文案的核心、支撑、限定或出处、标签角色，供图片模型建立阅读主次，角色说明本身不上屏。字号、位置和构图仍依照风格决定。旧图片保持原样，下次主动重新设计或续做时采用新格式；格式更新不代表排版质量已验收。</w:t>
+      </w:r>
+    </w:p>
+    <w:p>
+      <w:r>
+        <w:rPr>
+          <w:b w:val="0"/>
+        </w:rPr>
+        <w:t>出图默认使用风格原文、上屏文案和简短的辅助表达边界。以已提炼的上屏文案为主，保持原意和表达程度。为丰富页面可增加少量、轻微、中性的辅助联想或解释，不能有指向性或引导性，不能让观众读出原文没有表达的意思、判断、倾向或结论，也不能补造事实。文字、图像和图形关系都遵守这一边界；有来源的摘录仅作次要辅助。成图仍需核对。</w:t>
+      </w:r>
+    </w:p>
+    <w:p>
+      <w:r>
+        <w:rPr>
+          <w:b w:val="0"/>
+        </w:rPr>
+        <w:t>“实际发送的出图提示词”同时显示服务、请求模型和规格、实际尺寸及服务返回的信息。缺失信息不补造；若服务返回改写提示词也会显示。同文输入不保证构图一致，第三方接口的模型名称也不能证明后端与 ChatGPT 相同。</w:t>
       </w:r>
     </w:p>
     <w:p>
@@ -2378,55 +2418,39 @@
         <w:rPr>
           <w:b w:val="0"/>
         </w:rPr>
-        <w:t>用报告核对内容完整性</w:t>
-      </w:r>
-    </w:p>
-    <w:p>
-      <w:r>
-        <w:rPr>
-          <w:b w:val="0"/>
-        </w:rPr>
-        <w:t>在交付中心点击“查看制作报告”。报告显示四项：已提交原文字数、页面总数、页面备注字数、演说稿字数，并显示已有画面与待生成的页数。</w:t>
-      </w:r>
-    </w:p>
-    <w:p>
-      <w:r>
-        <w:rPr>
-          <w:b w:val="0"/>
-        </w:rPr>
-        <w:t>统一按非空白字符计数：不计空格和换行，汉字、标点、数字及每个英文字母各算一个字符。原文包含提交时的 Markdown 标题，所以另列去标题后的正文，用正文与备注比较，避免把正常去标题误判为遗漏。</w:t>
-      </w:r>
-    </w:p>
-    <w:p>
-      <w:r>
-        <w:rPr>
-          <w:b w:val="0"/>
-        </w:rPr>
-        <w:t>报告不仅比较字数，还逐字检查正文与当前已保存备注的顺序和内容。发现差异时显示第一处差异的上下文，能定位时可直接打开对应页面。改过备注也可能产生差异，需要结合原稿判断；报告不会自动改稿。</w:t>
-      </w:r>
-    </w:p>
-    <w:p>
-      <w:r>
-        <w:rPr>
-          <w:b w:val="0"/>
-        </w:rPr>
-        <w:t>演说稿就是页面备注按顺序拼合，因此两者字数相同；完整性要以备注与原稿正文的核对结果为准。未拆页的已提交段落计入原文并提示，未提交草稿单独显示、不纳入基准。可展开逐页字数，或下载文字报告。报告不调用模型。</w:t>
-      </w:r>
-    </w:p>
-    <w:p>
-      <w:r>
-        <w:rPr>
-          <w:b w:val="0"/>
-        </w:rPr>
-        <w:t>新图、试做和附件重绘统一请求 2560 × 1440（16:9）、high 质量。保存时使用高质量 JPG，质量参数 92，保留完整色彩采样以照顾小字和线条。图片等比限制在 2560×1440 内，不裁切，较小图片不放大；实际像素可在生成依据中核对。JPG 属于有损压缩，适用于屏幕演示，不等于无损原图。</w:t>
-      </w:r>
-    </w:p>
-    <w:p>
-      <w:r>
-        <w:rPr>
-          <w:b w:val="0"/>
-        </w:rPr>
-        <w:t>新页面、试做和封面采用同一规则。风格参考图沿用 1600×1600 上限，内容附件保留实际尺寸；透明图片、抠图和蒙版仍保存为 PNG。已有本机原图与历史不批量改写，旧项目在导出 PPT、HTML 或保存单图时自动转换。已符合要求的 JPG 不重复压缩。</w:t>
+        <w:t>重做时加入图表或产品截图</w:t>
+      </w:r>
+    </w:p>
+    <w:p>
+      <w:r>
+        <w:rPr>
+          <w:b w:val="0"/>
+        </w:rPr>
+        <w:t>打开要调整的页面，在“换一个思路，再设计一次”下面点击“添加图片”。可添加 1–4 张 PNG、JPG 或 WebP，每张最多 12 MB。缩略图可打开查看，也可移除后换图。</w:t>
+      </w:r>
+    </w:p>
+    <w:p>
+      <w:r>
+        <w:rPr>
+          <w:b w:val="0"/>
+        </w:rPr>
+        <w:t>这些图片是内容材料，不是风格参考。可写明用途，如“第一张是操作界面，第二张是测试结果”，再点击“重新设计这页”。附件会交给文案提炼、复核和图片模型，结合风格原文参与整页构图，不默认贴缩略图、套卡片或固定放在一侧。照片可裁切无关外围、自然衔接背景；图表与界面用周围排版融合。保留主体身份、数据、文字和必要上下文，避免扭曲、遮挡或缩得过小。</w:t>
+      </w:r>
+    </w:p>
+    <w:p>
+      <w:r>
+        <w:rPr>
+          <w:b w:val="0"/>
+        </w:rPr>
+        <w:t>成功后，附件随这一版页面保存；恢复历史版本也会恢复对应附件。生成失败时保留旧页面、本次方案和附件，可以继续重试。添加后尚未点击重做就离开，会提示附件选择尚未提交。</w:t>
+      </w:r>
+    </w:p>
+    <w:p>
+      <w:r>
+        <w:rPr>
+          <w:b w:val="0"/>
+        </w:rPr>
+        <w:t>带附件出图要求配置的图片服务支持 Images Edits 多图输入；不支持时会明确报错，不会自动忽略附件改为纯文字出图。模型生成的图表数值、小字与产品细节仍应检查；接口传递的测试不代表真实模型能逐像素保留材料。</w:t>
       </w:r>
     </w:p>
     <w:p>
@@ -2437,6 +2461,65 @@
         <w:rPr>
           <w:b w:val="0"/>
         </w:rPr>
+        <w:t>用报告核对内容完整性</w:t>
+      </w:r>
+    </w:p>
+    <w:p>
+      <w:r>
+        <w:rPr>
+          <w:b w:val="0"/>
+        </w:rPr>
+        <w:t>在交付中心点击“查看制作报告”。报告显示四项：已提交原文字数、页面总数、页面备注字数、演说稿字数，并显示已有画面与待生成的页数。</w:t>
+      </w:r>
+    </w:p>
+    <w:p>
+      <w:r>
+        <w:rPr>
+          <w:b w:val="0"/>
+        </w:rPr>
+        <w:t>统一按非空白字符计数：不计空格和换行，汉字、标点、数字及每个英文字母各算一个字符。原文包含提交时的 Markdown 标题，所以另列去标题后的正文，用正文与备注比较，避免把正常去标题误判为遗漏。</w:t>
+      </w:r>
+    </w:p>
+    <w:p>
+      <w:r>
+        <w:rPr>
+          <w:b w:val="0"/>
+        </w:rPr>
+        <w:t>报告不仅比较字数，还逐字检查正文与当前已保存备注的顺序和内容。发现差异时显示第一处差异的上下文，能定位时可直接打开对应页面。改过备注也可能产生差异，需要结合原稿判断；报告不会自动改稿。</w:t>
+      </w:r>
+    </w:p>
+    <w:p>
+      <w:r>
+        <w:rPr>
+          <w:b w:val="0"/>
+        </w:rPr>
+        <w:t>演说稿就是页面备注按顺序拼合，因此两者字数相同；完整性要以备注与原稿正文的核对结果为准。未拆页的已提交段落计入原文并提示，未提交草稿单独显示、不纳入基准。可展开逐页字数，或下载文字报告。报告不调用模型。</w:t>
+      </w:r>
+    </w:p>
+    <w:p>
+      <w:r>
+        <w:rPr>
+          <w:b w:val="0"/>
+        </w:rPr>
+        <w:t>新图、试做和附件重绘统一请求 2560 × 1440（16:9）、high 质量。保存时使用高质量 JPG，质量参数 92，保留完整色彩采样以照顾小字和线条。图片等比限制在 2560×1440 内，不裁切，较小图片不放大；实际像素可在生成依据中核对。JPG 属于有损压缩，适用于屏幕演示，不等于无损原图。</w:t>
+      </w:r>
+    </w:p>
+    <w:p>
+      <w:r>
+        <w:rPr>
+          <w:b w:val="0"/>
+        </w:rPr>
+        <w:t>新页面、试做和封面采用同一规则。风格参考图沿用 1600×1600 上限，内容附件保留实际尺寸；透明图片、抠图和蒙版仍保存为 PNG。已有本机原图与历史不批量改写，旧项目在导出 PPT、HTML 或保存单图时自动转换。已符合要求的 JPG 不重复压缩。</w:t>
+      </w:r>
+    </w:p>
+    <w:p>
+      <w:pPr>
+        <w:pStyle w:val="Heading2"/>
+      </w:pPr>
+      <w:r>
+        <w:rPr>
+          <w:b w:val="0"/>
+        </w:rPr>
         <w:t>导出图片加备注的 PPT</w:t>
       </w:r>
     </w:p>
@@ -2573,7 +2656,7 @@
         <w:rPr>
           <w:b w:val="0"/>
         </w:rPr>
-        <w:t>在演练中心点击“打开动态演示”。选择“整个项目”，或先关闭窗口、在工作台勾选多页，再选择“选中的页面”。一次支持 1–500 页，按原项目页序转换；所选范围如有未生成图片的页，会提示先补齐。已有演示可在窗口上方切换，也可新建另一份转换。</w:t>
+        <w:t>在演练中心选择“动态演示”，或在“已有版本与高级调整”点击“动态版本 / 图层校准”。选择“整个项目”，或先关闭窗口、在工作台勾选多页，再选择“选中的页面”。一次支持 1–500 页，按原项目页序转换；所选范围如有未生成图片的页，会提示先补齐。已有演示可在窗口上方切换，也可新建另一份转换。</w:t>
       </w:r>
     </w:p>
     <w:p>
@@ -2675,7 +2758,7 @@
         <w:rPr>
           <w:b w:val="0"/>
         </w:rPr>
-        <w:t>本机版打开演讲项目，在演练中心点击“打开演讲播放器”。可以直接选择“仅放映 PPT”，使用前后翻页按钮或方向键播放已有页面，点击“全屏”进入正式放映，按 Esc 返回设置。播放器可以查看逐页讲稿，不需要再次生成图片。</w:t>
+        <w:t>本机版打开演讲项目，在演练中心点击“普通放映”。可以直接选择“仅放映 PPT”，使用前后翻页按钮或方向键播放已有页面，点击“全屏”进入正式放映，按 Esc 返回设置。播放器可以查看逐页讲稿，不需要再次生成图片。</w:t>
       </w:r>
     </w:p>
     <w:p>
@@ -2974,7 +3057,7 @@
         <w:rPr>
           <w:b w:val="0"/>
         </w:rPr>
-        <w:t>在 App 中打开“设置”，点击“数字人工作室”。头像和声音在这里统一管理，供所有项目使用。</w:t>
+        <w:t>在 App 中打开“设置 → 实验室”，进入“数字人工作室”。数字人目前作为实验功能保留，生成效果与等待时间仍需优化，建议先做短试播。已有头像、声音和视频记录保留，供项目按需使用。</w:t>
       </w:r>
     </w:p>
     <w:p>
@@ -3051,7 +3134,7 @@
         <w:rPr>
           <w:b w:val="0"/>
         </w:rPr>
-        <w:t>1. 打开项目的“演练中心”，找到“数字人讲解”，选择工作室里已经保存好头像和声音的数字人。</w:t>
+        <w:t>1. 打开项目的“演练中心”，展开“实验室 · 数字人讲解”，选择“数字人讲解”，选择工作室里已经保存好头像和声音的数字人。</w:t>
       </w:r>
     </w:p>
     <w:p>
@@ -4091,7 +4174,7 @@
         <w:rPr>
           <w:b w:val="0"/>
         </w:rPr>
-        <w:t>如果管理员给你的是正式网站地址和邀请码，无需进行前面的本机安装，也无需填写模型 Key。打开网站，选择“有邀请码？创建账号”，填写账号、至少 12 个字符的密码和邀请码。邀请码有效期 7 天且只能使用一次；已注册后直接用账号密码登录。</w:t>
+        <w:t>如果管理员给你的是正式网站地址和邀请码，无需进行前面的本机安装，也无需填写模型 Key。打开网站先查看产品介绍，点击“邀请注册”，填写邀请码、账号、至少 12 个字符的密码并确认。管理员发来的注册链接会自动填入邀请码。邀请码有效期 7 天且只能使用一次；已注册后直接用账号密码登录。</w:t>
       </w:r>
     </w:p>
     <w:p>
@@ -4114,6 +4197,60 @@
           <w:b w:val="0"/>
         </w:rPr>
         <w:t xml:space="preserve"> 当作同一份数据。</w:t>
+      </w:r>
+    </w:p>
+    <w:p>
+      <w:r>
+        <w:rPr>
+          <w:b w:val="0"/>
+        </w:rPr>
+        <w:t>提交讲稿时默认“先试一页”：整份讲稿会完整保存并拆页，本次只生成第一页。点击“查看试做页”检查效果，满意后选择“生成其余页面”；确认窗口显示实际页数与额度，已有试做图保留。需要直接制作整段时，在提交前选择“制作全部页面”。不生成剩余页也不会丢稿，重新打开网站可继续。重复提交尚未确认的同一稿件与制作方式会复用请求标识；切换制作方式是另一次请求。</w:t>
+      </w:r>
+    </w:p>
+    <w:p>
+      <w:r>
+        <w:rPr>
+          <w:b w:val="0"/>
+        </w:rPr>
+        <w:t>长项目可在制作台搜索标题、讲稿、上屏文字或原页码；搜索作用于当前范围，可切换“全部页面”。每组显示 24 页，跨组选择保留，提示“另有 N 页已选”。分组和搜索不改变项目内容，交付中心仍导出完整项目。</w:t>
+      </w:r>
+    </w:p>
+    <w:p>
+      <w:r>
+        <w:rPr>
+          <w:b w:val="0"/>
+        </w:rPr>
+        <w:t>继续制作或补齐缺图时，确认窗口会检查可用额度。额度只够一部分时，可以选择“先生成前 N 页”，其余未生成页保留，补充后再继续。零额度时仍可保存草稿、编辑、查看和导出。打开窗口和提交前都会刷新额度；其他任务可能继续占用，最终以服务器实际预留为准。</w:t>
+      </w:r>
+    </w:p>
+    <w:p>
+      <w:r>
+        <w:rPr>
+          <w:b w:val="0"/>
+        </w:rPr>
+        <w:t>网页版支持图片演讲制作、普通放映和 MiniMax 语音合成。在项目“演练中心”选择“AI 口播”，声音、语速和当前页正文集中显示；上方常驻操作栏提供“先试当前页”和“生成整场”，不必滚动到页尾找按钮。“更多选项”可调整表达、试播长度、沿用已有口播，也可手动保存本场选择。小屏幕优先显示口播表单，再查看画面预览。语音记录可播放，整场完成后可导出含口播的离线静态 HTML；原逐字稿、图片和旧音频保留。“普通放映”仍可直接使用。语音 Key 与默认声音由管理员部署配置，本场选项在演练中心保存。数字人、声音复刻、AI 演绎编排和动态演示制作暂不开放。语音不扣图片张数，但使用管理员 MiniMax 预算，并受每日字符及请求上限限制；播放、保存正文和缓存复用不重新合成。详见[网页版语音演练](网页版语音演练.md)。</w:t>
+      </w:r>
+    </w:p>
+    <w:p>
+      <w:r>
+        <w:rPr>
+          <w:b w:val="0"/>
+        </w:rPr>
+        <w:t xml:space="preserve">本机已有项目不会自动上传或删除。需要迁移时，在 App 导出 </w:t>
+      </w:r>
+      <w:r>
+        <w:rPr>
+          <w:rFonts w:ascii="Menlo" w:hAnsi="Menlo"/>
+          <w:b w:val="0"/>
+          <w:sz w:val="20"/>
+        </w:rPr>
+        <w:t>.autoppt.zip</w:t>
+      </w:r>
+      <w:r>
+        <w:rPr>
+          <w:b w:val="0"/>
+        </w:rPr>
+        <w:t xml:space="preserve"> 项目源文件，再从网页项目首页导入，每次创建独立副本。包内已有口播与动态素材会保留并随源文件再次导出；完整数字人视频和配置暂不包含在项目迁移包中。</w:t>
       </w:r>
     </w:p>
     <w:p>
@@ -4132,15 +4269,23 @@
         <w:rPr>
           <w:b w:val="0"/>
         </w:rPr>
-        <w:t>新账号一次性赠送 100 张图片额度，不按月重置。成功生成一张图片使用 1 张，风格试做和重新生成同样计入；编辑文字、导出 PPT 与逐字稿、恢复旧版本不扣图片额度。侧栏显示可用和预留张数，点击账号可查看使用记录和已完成的图片。</w:t>
-      </w:r>
-    </w:p>
-    <w:p>
-      <w:r>
-        <w:rPr>
-          <w:b w:val="0"/>
-        </w:rPr>
-        <w:t>生成开始前先预留额度，明确失败会释放。网络中断且结果不明确时，记录显示待核对，由管理员确认后处理，不会自动重复扣费。额度不足请联系管理员补充；当前采用手动增加张数，尚未开通微信、支付宝或自动充值。</w:t>
+        <w:t>新账号默认一次性赠送 20 张图片额度（以登录页显示和管理员配置为准），不按月重置。成功生成一张图片使用 1 张，风格试做和重新生成同样计入；编辑文字、导出 PPT 与逐字稿、恢复旧版本不扣图片额度。侧栏显示可用和预留张数，点击账号可查看使用记录和已完成的图片。</w:t>
+      </w:r>
+    </w:p>
+    <w:p>
+      <w:r>
+        <w:rPr>
+          <w:b w:val="0"/>
+        </w:rPr>
+        <w:t>任务区显示当前阶段、已保存页数与本次已等待时间；排队会自动开始，可以先处理其他内容，重新打开网站仍可查看进度。停止仅停止后续制作，服务商已经接受的请求仍可能完成。</w:t>
+      </w:r>
+    </w:p>
+    <w:p>
+      <w:r>
+        <w:rPr>
+          <w:b w:val="0"/>
+        </w:rPr>
+        <w:t>生成开始前先预留额度，明确失败会释放。网络中断且结果不明确时，记录显示待核对，由管理员确认后处理，不会自动重复扣费。结果不明时，继续按钮显示“核对后继续”，请先联系管理员核对生成和用量记录；确认愿意重新提交未完成部分后才继续，可能再次计费。已完成页不会因此重做。额度不足请联系管理员补充；当前采用手动增加张数，尚未开通微信、支付宝或自动充值。</w:t>
       </w:r>
     </w:p>
     <w:p>
@@ -4151,6 +4296,139 @@
         <w:rPr>
           <w:b w:val="0"/>
         </w:rPr>
+        <w:t>官网与工作区导航</w:t>
+      </w:r>
+    </w:p>
+    <w:p>
+      <w:r>
+        <w:rPr>
+          <w:b w:val="0"/>
+        </w:rPr>
+        <w:t xml:space="preserve">官网介绍可在未登录时查看，不包含他人的私人项目。网站提供 </w:t>
+      </w:r>
+      <w:r>
+        <w:rPr>
+          <w:rFonts w:ascii="Menlo" w:hAnsi="Menlo"/>
+          <w:b w:val="0"/>
+          <w:sz w:val="20"/>
+        </w:rPr>
+        <w:t>/website</w:t>
+      </w:r>
+      <w:r>
+        <w:rPr>
+          <w:b w:val="0"/>
+        </w:rPr>
+        <w:t xml:space="preserve"> 产品介绍、</w:t>
+      </w:r>
+      <w:r>
+        <w:rPr>
+          <w:rFonts w:ascii="Menlo" w:hAnsi="Menlo"/>
+          <w:b w:val="0"/>
+          <w:sz w:val="20"/>
+        </w:rPr>
+        <w:t>/register</w:t>
+      </w:r>
+      <w:r>
+        <w:rPr>
+          <w:b w:val="0"/>
+        </w:rPr>
+        <w:t xml:space="preserve"> 邀请注册、</w:t>
+      </w:r>
+      <w:r>
+        <w:rPr>
+          <w:rFonts w:ascii="Menlo" w:hAnsi="Menlo"/>
+          <w:b w:val="0"/>
+          <w:sz w:val="20"/>
+        </w:rPr>
+        <w:t>/login</w:t>
+      </w:r>
+      <w:r>
+        <w:rPr>
+          <w:b w:val="0"/>
+        </w:rPr>
+        <w:t xml:space="preserve"> 登录、</w:t>
+      </w:r>
+      <w:r>
+        <w:rPr>
+          <w:rFonts w:ascii="Menlo" w:hAnsi="Menlo"/>
+          <w:b w:val="0"/>
+          <w:sz w:val="20"/>
+        </w:rPr>
+        <w:t>/support</w:t>
+      </w:r>
+      <w:r>
+        <w:rPr>
+          <w:b w:val="0"/>
+        </w:rPr>
+        <w:t xml:space="preserve"> 使用帮助、</w:t>
+      </w:r>
+      <w:r>
+        <w:rPr>
+          <w:rFonts w:ascii="Menlo" w:hAnsi="Menlo"/>
+          <w:b w:val="0"/>
+          <w:sz w:val="20"/>
+        </w:rPr>
+        <w:t>/privacy</w:t>
+      </w:r>
+      <w:r>
+        <w:rPr>
+          <w:b w:val="0"/>
+        </w:rPr>
+        <w:t xml:space="preserve"> 数据与隐私和 </w:t>
+      </w:r>
+      <w:r>
+        <w:rPr>
+          <w:rFonts w:ascii="Menlo" w:hAnsi="Menlo"/>
+          <w:b w:val="0"/>
+          <w:sz w:val="20"/>
+        </w:rPr>
+        <w:t>/terms</w:t>
+      </w:r>
+      <w:r>
+        <w:rPr>
+          <w:b w:val="0"/>
+        </w:rPr>
+        <w:t xml:space="preserve"> 使用说明。工作区沿用 </w:t>
+      </w:r>
+      <w:r>
+        <w:rPr>
+          <w:rFonts w:ascii="Menlo" w:hAnsi="Menlo"/>
+          <w:b w:val="0"/>
+          <w:sz w:val="20"/>
+        </w:rPr>
+        <w:t>/#project/项目编号/studio</w:t>
+      </w:r>
+      <w:r>
+        <w:rPr>
+          <w:b w:val="0"/>
+        </w:rPr>
+        <w:t xml:space="preserve"> 等链接，未登录时先登录，再回到目标页面。</w:t>
+      </w:r>
+    </w:p>
+    <w:p>
+      <w:r>
+        <w:rPr>
+          <w:b w:val="0"/>
+        </w:rPr>
+        <w:t>左侧上方是“我的项目”和“风格库”，中间显示最近六个项目，可收起；下方是帮助、官网与账号，管理员另有网站管理入口。平板显示带名称提示的图标，手机通过顶部菜单展开完整导航，可用关闭按钮或 Esc 返回。查看官网再进入工作区时保留当前会话的工作页面与草稿；刷新页面仍以已保存内容和浏览器草稿为准。</w:t>
+      </w:r>
+    </w:p>
+    <w:p>
+      <w:r>
+        <w:rPr>
+          <w:b w:val="0"/>
+        </w:rPr>
+        <w:t>忘记密码请在登录页打开“忘记密码或无法登录”，按说明联系邀请你的管理员。当前没有邮件验证码和自助找回；邮箱只是可选的账号名。技术同事可配置支持邮箱或 HTTPS 支持地址，供使用帮助和数据说明显示。</w:t>
+      </w:r>
+    </w:p>
+    <w:p>
+      <w:pPr>
+        <w:pStyle w:val="Heading2"/>
+      </w:pPr>
+      <w:r>
+        <w:rPr>
+          <w:b w:val="0"/>
+        </w:rPr>
         <w:t>管理员操作</w:t>
       </w:r>
     </w:p>
@@ -4159,25 +4437,40 @@
         <w:rPr>
           <w:b w:val="0"/>
         </w:rPr>
-        <w:t>使用管理员账号进入“账号与额度”，可创建和撤销邀请码、为指定用户补充额度、停用账号、重置密码，以及核对异常生成。密码重置会撤销该用户之前的登录；忘记密码的用户需联系管理员。</w:t>
-      </w:r>
-    </w:p>
-    <w:p>
-      <w:r>
-        <w:rPr>
-          <w:b w:val="0"/>
-        </w:rPr>
-        <w:t>两套模型 Key 只在服务器配置，普通用户无法查看或修改。全站默认同时处理 4 个模型请求，其余排队；另外设置每人和全站每天模型调用上限，用于控制包括内容提炼在内的成本。额度是产品使用配额，不等于供应商的实际账单。</w:t>
-      </w:r>
-    </w:p>
-    <w:p>
-      <w:r>
-        <w:rPr>
-          <w:b w:val="0"/>
-        </w:rPr>
-        <w:t xml:space="preserve">维护者请按仓库中的 </w:t>
+        <w:t>使用管理员账号进入侧栏“网站管理”，可创建和撤销邀请码、为指定用户补充额度、停用账号、重置密码，以及核对异常生成。密码重置会撤销该用户之前的登录；忘记密码的用户需联系管理员。</w:t>
+      </w:r>
+    </w:p>
+    <w:p>
+      <w:r>
+        <w:rPr>
+          <w:b w:val="0"/>
+        </w:rPr>
+        <w:t>两套模型 Key 只在服务器配置，普通用户无法查看或修改。全站默认同时处理 2 个模型请求，其余排队；另外设置每人和全站每天模型调用上限，用于控制包括内容提炼在内的成本。额度是产品使用配额，不等于供应商的实际账单。</w:t>
+      </w:r>
+    </w:p>
+    <w:p>
+      <w:r>
+        <w:rPr>
+          <w:b w:val="0"/>
+        </w:rPr>
+        <w:t xml:space="preserve">技术部署、版本校验、备份与回滚请先阅读 </w:t>
       </w:r>
       <w:hyperlink r:id="rId14">
+        <w:r>
+          <w:rPr>
+            <w:color w:val="245C85"/>
+            <w:u w:val="single"/>
+          </w:rPr>
+          <w:t>网页版部署交付</w:t>
+        </w:r>
+      </w:hyperlink>
+      <w:r>
+        <w:rPr>
+          <w:b w:val="0"/>
+        </w:rPr>
+        <w:t xml:space="preserve">。维护者请按仓库中的 </w:t>
+      </w:r>
+      <w:hyperlink r:id="rId15">
         <w:r>
           <w:rPr>
             <w:color w:val="245C85"/>

</xml_diff>

<commit_message>
Curate four default styles for the invited web edition
</commit_message>
<xml_diff>
--- a/docs/AutoPPT-安装与使用说明.docx
+++ b/docs/AutoPPT-安装与使用说明.docx
@@ -4167,6 +4167,14 @@
           <w:b w:val="0"/>
         </w:rPr>
         <w:t>7 邀请制线上使用</w:t>
+      </w:r>
+    </w:p>
+    <w:p>
+      <w:r>
+        <w:rPr>
+          <w:b w:val="0"/>
+        </w:rPr>
+        <w:t>网页版默认提供四款精品风格：克制儿童摄影杂志风、先锋酸性色彩编辑风、日系现代建筑提案风、当代 Neo-Swiss。风格库默认打开“精品风格”；自己创建或导入的风格在“我的风格”。其他旧内置风格暂不提供给新项目选择，已有项目仍可继续沿用原风格，不改写提示词、图片或历史。Mac App 的原风格保留。</w:t>
       </w:r>
     </w:p>
     <w:p>

</xml_diff>

<commit_message>
Guide web users from manuscript to first picture and finished PPT
</commit_message>
<xml_diff>
--- a/docs/AutoPPT-安装与使用说明.docx
+++ b/docs/AutoPPT-安装与使用说明.docx
@@ -4190,7 +4190,7 @@
         <w:rPr>
           <w:b w:val="0"/>
         </w:rPr>
-        <w:t xml:space="preserve">每个人有独立的演讲项目、风格版本、附件与图片，默认风格已经内置。制作流程仍是选择风格、提交逐字稿、提炼上屏文案、生成图片、逐页修改和导出。内容保存在服务器的个人工作区，不能把它与本机 </w:t>
+        <w:t xml:space="preserve">每个人有独立的演讲项目、风格版本、附件与图片，默认风格已经内置。从讲稿开始，先看一页效果，满意后再制作其余页面。内容保存在服务器的个人工作区，不能把它与本机 </w:t>
       </w:r>
       <w:r>
         <w:rPr>
@@ -4212,15 +4212,31 @@
         <w:rPr>
           <w:b w:val="0"/>
         </w:rPr>
-        <w:t>提交讲稿时默认“先试一页”：整份讲稿会完整保存并拆页，本次只生成第一页。点击“查看试做页”检查效果，满意后选择“生成其余页面”；确认窗口显示实际页数与额度，已有试做图保留。需要直接制作整段时，在提交前选择“制作全部页面”。不生成剩余页也不会丢稿，重新打开网站可继续。重复提交尚未确认的同一稿件与制作方式会复用请求标识；切换制作方式是另一次请求。</w:t>
-      </w:r>
-    </w:p>
-    <w:p>
-      <w:r>
-        <w:rPr>
-          <w:b w:val="0"/>
-        </w:rPr>
-        <w:t>长项目可在制作台搜索标题、讲稿、上屏文字或原页码；搜索作用于当前范围，可切换“全部页面”。每组显示 24 页，跨组选择保留，提示“另有 N 页已选”。分组和搜索不改变项目内容，交付中心仍导出完整项目。</w:t>
+        <w:t>首页点击“用我的讲稿开始”，在同一页粘贴讲稿、选择精品风格，再点“生成第一张画面”。不用先建空项目；演讲名称自动填写，可展开修改。没有讲稿可“用示例体验”，示例文字可直接替换。输入中显示“暂存于此浏览器”，点击“只保存讲稿”才保存到服务器且不调用模型；退出账号会清理浏览器临时缓存。</w:t>
+      </w:r>
+    </w:p>
+    <w:p>
+      <w:r>
+        <w:rPr>
+          <w:b w:val="0"/>
+        </w:rPr>
+        <w:t>生成时先完整保存并拆分讲稿，只制作第一页，成功使用 1 张图片额度。结果会放大展示；点“画面文字少一点”“重点更突出”或“换一种构图”可预填要求，确认后才重新生成，旧版本保留，讲稿与风格原文不改。满意后点“生成其余页面”，核对张数与额度后继续，已有试做图保留。刷新和重复提交不会自动重复创建演讲或调用模型。</w:t>
+      </w:r>
+    </w:p>
+    <w:p>
+      <w:r>
+        <w:rPr>
+          <w:b w:val="0"/>
+        </w:rPr>
+        <w:t>重新打开演讲直接进入“画面与讲稿”；首页卡片显示可继续的实际状态。全部完成后可直接下载 PPT 或放映；需要声音时再进入“放映与配音”。“下载与导出”集中其他交付方式，“进度概览”保留进度汇总。继续添加讲稿时仍可选择直接制作整段。</w:t>
+      </w:r>
+    </w:p>
+    <w:p>
+      <w:r>
+        <w:rPr>
+          <w:b w:val="0"/>
+        </w:rPr>
+        <w:t>长项目可在“画面与讲稿”搜索标题、讲稿、上屏文字或原页码；搜索作用于当前范围，可切换“全部页面”。每组显示 24 页，跨组选择保留，提示“另有 N 页已选”。分组和搜索不改变项目内容，“下载与导出”仍导出完整项目。</w:t>
       </w:r>
     </w:p>
     <w:p>
@@ -4236,7 +4252,7 @@
         <w:rPr>
           <w:b w:val="0"/>
         </w:rPr>
-        <w:t>网页版支持图片演讲制作、普通放映和 MiniMax 语音合成。在项目“演练中心”选择“AI 口播”，声音、语速和当前页正文集中显示；上方常驻操作栏提供“先试当前页”和“生成整场”，不必滚动到页尾找按钮。“更多选项”可调整表达、试播长度、沿用已有口播，也可手动保存本场选择。小屏幕优先显示口播表单，再查看画面预览。语音记录可播放，整场完成后可导出含口播的离线静态 HTML；原逐字稿、图片和旧音频保留。“普通放映”仍可直接使用。语音 Key 与默认声音由管理员部署配置，本场选项在演练中心保存。数字人、声音复刻、AI 演绎编排和动态演示制作暂不开放。语音不扣图片张数，但使用管理员 MiniMax 预算，并受每日字符及请求上限限制；播放、保存正文和缓存复用不重新合成。详见[网页版语音演练](网页版语音演练.md)。</w:t>
+        <w:t>网页版支持图片演讲制作、普通放映和 MiniMax 语音合成。在项目“放映与配音”选择“AI 口播”，声音、语速和当前页正文集中显示；上方常驻操作栏提供“先试当前页”和“生成整场”，不必滚动到页尾找按钮。“更多选项”可调整表达、试播长度、沿用已有口播，也可手动保存本场选择。小屏幕优先显示口播表单，再查看画面预览。语音记录可播放，整场完成后可导出含口播的离线静态 HTML；原逐字稿、图片和旧音频保留。“普通放映”仍可直接使用。语音 Key 与默认声音由管理员部署配置，本场选项在“放映与配音”保存。数字人、声音复刻、AI 演绎编排和动态演示制作暂不开放。语音不扣图片张数，但使用管理员 MiniMax 预算，并受每日字符及请求上限限制；播放、保存正文和缓存复用不重新合成。详见[网页版语音演练](网页版语音演练.md)。</w:t>
       </w:r>
     </w:p>
     <w:p>
@@ -4418,7 +4434,7 @@
         <w:rPr>
           <w:b w:val="0"/>
         </w:rPr>
-        <w:t>左侧上方是“我的项目”和“风格库”，中间显示最近六个项目，可收起；下方是帮助、官网与账号，管理员另有网站管理入口。平板显示带名称提示的图标，手机通过顶部菜单展开完整导航，可用关闭按钮或 Esc 返回。查看官网再进入工作区时保留当前会话的工作页面与草稿；刷新页面仍以已保存内容和浏览器草稿为准。</w:t>
+        <w:t>左侧上方是“我的演讲”和“风格库”，中间显示最近六场演讲，可收起；下方是帮助、官网与账号，管理员另有网站管理入口。平板显示带名称提示的图标，手机通过顶部菜单展开完整导航，可用关闭按钮或 Esc 返回。查看官网再进入工作区时保留当前会话的工作页面与草稿；刷新页面仍以已保存内容和浏览器草稿为准。</w:t>
       </w:r>
     </w:p>
     <w:p>

</xml_diff>

<commit_message>
Emphasize visual aesthetics and simplify invitations to six digits
</commit_message>
<xml_diff>
--- a/docs/AutoPPT-安装与使用说明.docx
+++ b/docs/AutoPPT-安装与使用说明.docx
@@ -4190,6 +4190,14 @@
         <w:rPr>
           <w:b w:val="0"/>
         </w:rPr>
+        <w:t>新邀请码为 6 位数字，开头的 0 也需要填写；旧的长邀请码在原有效期内仍可粘贴使用。管理员在“网站管理”点击“创建 6 位邀请码”，复制数字或邀请链接交给同事。每个 IP 每 15 分钟最多尝试注册 5 次，全站每小时最多 30 次；提示操作频繁时请稍后重试。注册后可在“用户与额度”给对应账号增加图片张数。</w:t>
+      </w:r>
+    </w:p>
+    <w:p>
+      <w:r>
+        <w:rPr>
+          <w:b w:val="0"/>
+        </w:rPr>
         <w:t xml:space="preserve">每个人有独立的演讲项目、风格版本、附件与图片，默认风格已经内置。从讲稿开始，先看一页效果，满意后再制作其余页面。内容保存在服务器的个人工作区，不能把它与本机 </w:t>
       </w:r>
       <w:r>
@@ -4427,6 +4435,14 @@
           <w:b w:val="0"/>
         </w:rPr>
         <w:t xml:space="preserve"> 等链接，未登录时先登录，再回到目标页面。</w:t>
+      </w:r>
+    </w:p>
+    <w:p>
+      <w:r>
+        <w:rPr>
+          <w:b w:val="0"/>
+        </w:rPr>
+        <w:t>官网以“让观点有好看的表达”为主线，展示四款精品风格的真实内置封面，可点击缩略图切换。页面介绍字体、配色与留白组成的视觉风格，以及参考图建风格、先试一页、调整后生成整场的制作路径。示例不代表每次生成都能得到完全相同的效果。</w:t>
       </w:r>
     </w:p>
     <w:p>

</xml_diff>

<commit_message>
Open automatic narration direction and add a voiced product demo
</commit_message>
<xml_diff>
--- a/docs/AutoPPT-安装与使用说明.docx
+++ b/docs/AutoPPT-安装与使用说明.docx
@@ -4260,7 +4260,7 @@
         <w:rPr>
           <w:b w:val="0"/>
         </w:rPr>
-        <w:t>网页版支持图片演讲制作、普通放映和 MiniMax 语音合成。在项目“放映与配音”选择“AI 口播”，声音、语速和当前页正文集中显示；上方常驻操作栏集中显示试播进度、停止与失败续做。声音生成好后，原按钮变为“播放试播”，点击即可开始；整场完成后同处显示“播放整场”，不必滚动找结果。播放器固定显示音频和翻页操作，正文按需展开；暂停、继续和重播不再合成。缺画面或正文的页会提前提示，历史录音默认收起。“更多选项”可调整表达、试播长度、沿用已有口播，也可手动保存本场选择。小屏幕优先显示口播表单，再查看画面预览。语音记录可播放，整场完成后可导出含口播的离线静态 HTML；原逐字稿、图片和旧音频保留。“普通放映”仍可直接使用。语音 Key 与默认声音由管理员部署配置，本场选项在“放映与配音”保存。数字人、声音复刻、AI 演绎编排和动态演示制作暂不开放。语音不扣图片张数，但使用管理员 MiniMax 预算，并受每日字符及请求上限限制；播放、保存正文和缓存复用不重新合成。详见[网页版语音演练](网页版语音演练.md)。</w:t>
+        <w:t>网页版支持图片演讲制作、普通放映和 MiniMax 语音合成。在项目“放映与配音”选择“AI 口播”，声音、语速和当前页正文集中显示；上方常驻操作栏集中显示试播进度、停止与失败续做。声音生成好后，原按钮变为“播放试播”，点击即可开始；整场完成后同处显示“播放整场”，不必滚动找结果。播放器固定显示音频和翻页操作，正文按需展开；暂停、继续和重播不再合成。缺画面或正文的页会提前提示，历史录音默认收起。“更多选项”可调整表达、试播长度、沿用已有口播，也可手动保存本场选择。小屏幕优先显示口播表单，再查看画面预览。语音记录可播放，整场完成后可导出含口播的离线静态 HTML；原逐字稿、图片和旧音频保留。“普通放映”仍可直接使用。语音 Key 与默认声音由管理员部署配置，本场选项在“放映与配音”保存。自动情感编排已开放；数字人、声音复刻和动态演示制作暂不开放。语音不扣图片张数，但使用管理员 MiniMax 预算，并受每日字符及请求上限限制；播放、保存正文和缓存复用不重新合成。详见[网页版语音演练](网页版语音演练.md)。</w:t>
       </w:r>
     </w:p>
     <w:p>
@@ -4442,7 +4442,7 @@
         <w:rPr>
           <w:b w:val="0"/>
         </w:rPr>
-        <w:t>官网以“好看、简单、更多表达”为主线：首屏可切换实际作品，作品区展示 6 张既有生成页面并可查看大图，包含自建风格；四款内置风格另行介绍。三步说明提取观点与划分演讲单元、分开上屏内容与完整逐字稿、智能配图生成页面。口播和管理员接入的专属声音已支持；自动叙事情感编排与数字人标为扩展方向，网页版尚未开放。公开样张是用户指定展示的独立副本，不连接私人项目；示例不代表每次都能得到相同效果。</w:t>
+        <w:t>官网以“好看、简单、更多表达”为主线：首屏点击播放产品实际制作的有声介绍视频，支持暂停、拖动、字幕和全屏，并提供对应 PPT 与完整介绍稿，作品区展示 6 张既有生成页面并可查看大图，包含自建风格；四款内置风格另行介绍。三步说明提取观点与划分演讲单元、分开上屏内容与完整逐字稿、智能配图生成页面。口播、管理员接入的专属声音与自动情感编排已支持；数字人仍在实验室阶段，网页版尚未开放。公开样张是用户指定展示的独立副本，不连接私人项目；示例不代表每次都能得到相同效果。</w:t>
       </w:r>
     </w:p>
     <w:p>
@@ -4532,6 +4532,33 @@
           <w:b w:val="0"/>
         </w:rPr>
         <w:t>账号、数据隔离、模拟出图与额度、浏览器注册登录已验证。正式服务器和域名、真实模型账单与并发承载尚未完成上线验收；管理员应先用少量账号进行实际试用，再扩大邀请范围。</w:t>
+      </w:r>
+    </w:p>
+    <w:p>
+      <w:pPr>
+        <w:pStyle w:val="Heading2"/>
+      </w:pPr>
+      <w:r>
+        <w:rPr>
+          <w:b w:val="0"/>
+        </w:rPr>
+        <w:t>网页版自动情感编排与官网演示</w:t>
+      </w:r>
+    </w:p>
+    <w:p>
+      <w:r>
+        <w:rPr>
+          <w:b w:val="0"/>
+        </w:rPr>
+        <w:t>在“放映与配音”选择 AI 口播后，声音、语速、表达方式和正文集中呈现。选择“自动情感编排”，生成时先由内容模型通读讲稿，再安排情绪、语速和停顿，使用本场所选 MiniMax 音色合成。原逐字稿、服务连接和已生成版本保留；编排失败可从已保存进度继续，不自动替换成普通口播。新网页版项目默认自动编排，已有选择沿用。详情见 [网页版语音演练](网页版语音演练.md)。</w:t>
+      </w:r>
+    </w:p>
+    <w:p>
+      <w:r>
+        <w:rPr>
+          <w:b w:val="0"/>
+        </w:rPr>
+        <w:t>官网首屏播放六页产品介绍视频，画面通过本产品实际生成，配音使用 MiniMax 播报男声及自动情感编排，不模仿具体人物。视频仅在用户点击后加载和播放，支持原地暂停、拖动、字幕与全屏；首屏另提供整页图片加讲稿备注的 PPT 与完整介绍稿。演示在独立工作区制作，公开目录只包含审阅后的发布文件，不包含模型 Key 或私人项目。</w:t>
       </w:r>
     </w:p>
     <w:sectPr>

</xml_diff>

<commit_message>
Add optional piano background music with looping and fades
</commit_message>
<xml_diff>
--- a/docs/AutoPPT-安装与使用说明.docx
+++ b/docs/AutoPPT-安装与使用说明.docx
@@ -4559,6 +4559,48 @@
           <w:b w:val="0"/>
         </w:rPr>
         <w:t>官网首屏播放六页产品介绍视频，画面通过本产品实际生成，配音使用 MiniMax 播报男声及自动情感编排，不模仿具体人物。视频仅在用户点击后加载和播放，支持原地暂停、拖动、字幕与全屏；首屏另提供整页图片加讲稿备注的 PPT 与完整介绍稿。演示在独立工作区制作，公开目录只包含审阅后的发布文件，不包含模型 Key 或私人项目。</w:t>
+      </w:r>
+    </w:p>
+    <w:p>
+      <w:pPr>
+        <w:pStyle w:val="Heading2"/>
+      </w:pPr>
+      <w:r>
+        <w:rPr>
+          <w:b w:val="0"/>
+        </w:rPr>
+        <w:t>钢琴背景音乐</w:t>
+      </w:r>
+    </w:p>
+    <w:p>
+      <w:r>
+        <w:rPr>
+          <w:b w:val="0"/>
+        </w:rPr>
+        <w:t>点击官网视频下方或口播播放器里的“背景音乐”，即可开启并选择曲目。初始音量为 12%，可独立调整至 0%–40%；本浏览器记住曲目和音量，每次重新打开播放器仍默认关闭。音乐在播放时淡入、暂停或结束时淡出；换页不中断，换曲柔和交接，整场持续循环。关闭播放器后音乐淡出停止，不会影响已有配音。“普通放映”适合自己讲，开启背景音乐后持续播放，关闭开关或退出放映时淡出。</w:t>
+      </w:r>
+    </w:p>
+    <w:p>
+      <w:r>
+        <w:rPr>
+          <w:b w:val="0"/>
+        </w:rPr>
+        <w:t>四首提供的钢琴曲已导入本地网页版。音乐与项目、模型连接和 MiniMax 声音配置分开保存，原音乐文件保留。背景音乐当前用于在线播放，PPTX、离线 HTML 和项目源文件暂不包含音乐；Mac 已安装 App 尚未替换。技术同事上线时需单独导入有权公开播放的 MP3，详见</w:t>
+      </w:r>
+      <w:hyperlink r:id="rId16">
+        <w:r>
+          <w:rPr>
+            <w:color w:val="245C85"/>
+            <w:u w:val="single"/>
+          </w:rPr>
+          <w:t>网页版语音演练</w:t>
+        </w:r>
+      </w:hyperlink>
+      <w:r>
+        <w:rPr>
+          <w:b w:val="0"/>
+        </w:rPr>
+        <w:t>。</w:t>
       </w:r>
     </w:p>
     <w:sectPr>

</xml_diff>

<commit_message>
Sync usage guide with server delivery and music defaults
</commit_message>
<xml_diff>
--- a/docs/AutoPPT-安装与使用说明.docx
+++ b/docs/AutoPPT-安装与使用说明.docx
@@ -10,23 +10,45 @@
         <w:rPr>
           <w:b w:val="0"/>
         </w:rPr>
-        <w:t>AutoPPT 安装与使用说明</w:t>
-      </w:r>
-    </w:p>
-    <w:p>
-      <w:r>
-        <w:rPr>
-          <w:b w:val="0"/>
-        </w:rPr>
-        <w:t>适用版本：2026 年 10 月 11 日的仓库代码。</w:t>
-      </w:r>
-    </w:p>
-    <w:p>
-      <w:r>
-        <w:rPr>
-          <w:b w:val="0"/>
-        </w:rPr>
-        <w:t>AutoPPT 把演讲逐字稿拆成页面，按选定风格生成图片，并导出包含逐页备注的 PPTX。按照本说明完成安装、模型配置和一次小规模测试，就可以开始制作自己的演讲。</w:t>
+        <w:t>讲好安装与使用说明</w:t>
+      </w:r>
+    </w:p>
+    <w:p>
+      <w:r>
+        <w:rPr>
+          <w:b w:val="0"/>
+        </w:rPr>
+        <w:t>适用版本：2026 年 10 月 12 日的仓库代码。产品原名 AutoPPT；程序文件名与数据路径继续沿用原标识。</w:t>
+      </w:r>
+    </w:p>
+    <w:p>
+      <w:r>
+        <w:rPr>
+          <w:b w:val="0"/>
+        </w:rPr>
+        <w:t>讲好把演讲逐字稿拆成页面，按选定风格生成图片，并导出包含逐页备注的 PPTX。按照本说明完成安装、模型配置和一次小规模测试，就可以开始制作自己的演讲。</w:t>
+      </w:r>
+    </w:p>
+    <w:p>
+      <w:r>
+        <w:rPr>
+          <w:b w:val="0"/>
+        </w:rPr>
+        <w:t xml:space="preserve">本轮源码将产品显示名、工作台页头、菜单和官网统一为「讲好」，使用同一品牌标志。本次未安装或替换 </w:t>
+      </w:r>
+      <w:r>
+        <w:rPr>
+          <w:rFonts w:ascii="Menlo" w:hAnsi="Menlo"/>
+          <w:b w:val="0"/>
+          <w:sz w:val="20"/>
+        </w:rPr>
+        <w:t>/Applications/AutoPPT.app</w:t>
+      </w:r>
+      <w:r>
+        <w:rPr>
+          <w:b w:val="0"/>
+        </w:rPr>
+        <w:t>，正在运行的旧 App 不会自动更新；新界面需在新构建版本下一次启动后使用。已有项目、模型连接和草稿保持，数据无需迁移。</w:t>
       </w:r>
     </w:p>
     <w:p>
@@ -217,7 +239,7 @@
         <w:rPr>
           <w:b w:val="0"/>
         </w:rPr>
-        <w:t xml:space="preserve">在菜单“AutoPPT → 打开数据文件夹”查看本机项目。数据位于 </w:t>
+        <w:t xml:space="preserve">在新构建版本的菜单“讲好 → 打开数据文件夹”查看本机项目，已安装旧版菜单可能仍显示 AutoPPT。数据位于 </w:t>
       </w:r>
       <w:r>
         <w:rPr>
@@ -285,7 +307,7 @@
         <w:rPr>
           <w:b w:val="0"/>
         </w:rPr>
-        <w:t xml:space="preserve">点击窗口关闭按钮会隐藏窗口，任务继续运行；从 Dock 可重新打开。选择菜单“退出 AutoPPT”或按 Command Q 才会退出，有未完成任务时会先提醒。退出再打开，已保存内容和试做草稿仍会保留。备份时先退出 App，再复制整个 </w:t>
+        <w:t xml:space="preserve">点击窗口关闭按钮会隐藏窗口，任务继续运行；从 Dock 可重新打开。选择菜单“退出讲好”（已安装旧版为“退出 AutoPPT”）或按 Command Q 才会退出，有未完成任务时会先提醒。退出再打开，已保存内容和试做草稿仍会保留。备份时先退出 App，再复制整个 </w:t>
       </w:r>
       <w:r>
         <w:rPr>
@@ -2739,7 +2761,7 @@
         <w:rPr>
           <w:b w:val="0"/>
         </w:rPr>
-        <w:t>Mac App 菜单“帮助”可打开两者；“AutoPPT → 设置…”或 ⌘, 打开设置。声音采集归在设置，不占用演播主界面。</w:t>
+        <w:t>Mac App 菜单“帮助”可打开两者；新构建版本的“讲好 → 设置…”或 ⌘, 打开设置，已安装旧版菜单可能仍显示 AutoPPT。声音采集归在设置，不占用演播主界面。</w:t>
       </w:r>
     </w:p>
     <w:p>
@@ -4442,7 +4464,7 @@
         <w:rPr>
           <w:b w:val="0"/>
         </w:rPr>
-        <w:t>官网以“好看、简单、更多表达”为主线：首屏点击播放产品实际制作的有声介绍视频，支持暂停、拖动、字幕和全屏，并提供对应 PPT 与完整介绍稿。“好看”把作品与风格介绍合成四组：克制儿童摄影杂志、先锋、日系现代、当代 NEO，每组展示三张不同表达的实际生成页面；点击任一画面可查看大图，不再单独重复展示风格封面。电脑以两列展示主题，每组一张主图和两张配图，小屏幕按主题纵向阅读。三步说明提取观点与划分演讲单元、分开上屏内容与完整逐字稿、智能配图生成页面。口播、管理员接入的专属声音与自动情感编排已支持；数字人仍在实验室阶段，网页版尚未开放。样张使用未改动的内置风格在独立演示工作区制作，经选图与单页调整后发布，不连接私人项目；示例不代表每次都能得到相同效果。</w:t>
+        <w:t>官网采用「讲好」品牌，以“从一份讲稿，到一次从容的表达”为主线，并以写、做、练、交四个动作连接制作流程：首屏点击播放产品实际制作的有声介绍视频，支持暂停、拖动、字幕和全屏，并提供对应 PPT 与完整介绍稿。“好看”把作品与风格介绍合成四组：克制儿童摄影杂志、先锋、日系现代、当代 NEO，每组展示三张不同表达的实际生成页面，直接呈现完整画面，不再显示“放大查看”提示，也不单独重复展示风格封面。电脑以两列展示主题，每组一张主图和两张配图，小屏幕按主题纵向阅读。三步说明提取观点与划分演讲单元、分开上屏内容与完整逐字稿、智能配图生成页面。口播、管理员接入的专属声音与自动情感编排已支持；数字人仍在实验室阶段，网页版尚未开放。样张使用未改动的内置风格在独立演示工作区制作，经选图与单页调整后发布，不连接私人项目；示例不代表每次都能得到相同效果。</w:t>
       </w:r>
     </w:p>
     <w:p>
@@ -4558,7 +4580,51 @@
         <w:rPr>
           <w:b w:val="0"/>
         </w:rPr>
-        <w:t>官网首屏播放六页产品介绍视频，画面通过本产品实际生成，配音使用 MiniMax 播报男声及自动情感编排，不模仿具体人物。视频仅在用户点击后加载和播放，支持原地暂停、拖动、字幕与全屏；首屏另提供整页图片加讲稿备注的 PPT 与完整介绍稿。演示在独立工作区制作，公开目录只包含审阅后的发布文件，不包含模型 Key 或私人项目。</w:t>
+        <w:t xml:space="preserve">官网首屏播放六页产品介绍视频，画面通过本产品实际生成，配音使用 MiniMax 播报男声及自动情感编排，不模仿具体人物。视频仅在用户点击后加载和播放，支持原地暂停、拖动、字幕与全屏；首屏另提供整页图片加讲稿备注的 PPT 与完整介绍稿。公开视频为 </w:t>
+      </w:r>
+      <w:r>
+        <w:rPr>
+          <w:rFonts w:ascii="Menlo" w:hAnsi="Menlo"/>
+          <w:b w:val="0"/>
+          <w:sz w:val="20"/>
+        </w:rPr>
+        <w:t>public/product-demo/jianghao-introduction.mp4</w:t>
+      </w:r>
+      <w:r>
+        <w:rPr>
+          <w:b w:val="0"/>
+        </w:rPr>
+        <w:t xml:space="preserve">，PPT 为 </w:t>
+      </w:r>
+      <w:r>
+        <w:rPr>
+          <w:rFonts w:ascii="Menlo" w:hAnsi="Menlo"/>
+          <w:b w:val="0"/>
+          <w:sz w:val="20"/>
+        </w:rPr>
+        <w:t>public/product-demo/讲好-产品介绍.pptx</w:t>
+      </w:r>
+      <w:r>
+        <w:rPr>
+          <w:b w:val="0"/>
+        </w:rPr>
+        <w:t>，画面、备注与字幕统一为讲好。为同步名称，仅重录含旧产品名的 3 段口播，其余 19 段沿用原音频。演示公开文件与用户工作区分开，不包含模型 Key。</w:t>
+      </w:r>
+    </w:p>
+    <w:p>
+      <w:r>
+        <w:rPr>
+          <w:b w:val="0"/>
+        </w:rPr>
+        <w:t>“更多表达”加入《朝花夕拾》第 4 页“先讲故事”的 AI 原录音案例，声音为 Amanda，原音频时长 36.816625 秒（约 36.82 秒）。页面使用小女孩插画头像；随滚动滑入，点击可展开案例，声音只在点击播放后开始。该案例从已有页面与录音只读复制，不重新合成声音，不更改原项目、逐字稿或录音。</w:t>
+      </w:r>
+    </w:p>
+    <w:p>
+      <w:r>
+        <w:rPr>
+          <w:b w:val="0"/>
+        </w:rPr>
+        <w:t>本次公开产品演示已检查六页 PPT 结构、画布尺寸、文件回读，并逐页渲染核对讲好名称与原始 SVG 标志。新版视频约 128.09 秒，字幕与实际解码音频和停顿对应。尚未宣称由真人在 PowerPoint 打开验收。八张工作台截图已用当前隔离构建与公开虚拟资料重拍，不调用收费模型，也不包含真实用户数据。</w:t>
       </w:r>
     </w:p>
     <w:p>
@@ -4577,15 +4643,15 @@
         <w:rPr>
           <w:b w:val="0"/>
         </w:rPr>
-        <w:t>点击官网视频下方或口播播放器里的“背景音乐”，即可开启并选择曲目。初始音量为 12%，可独立调整至 0%–40%；本浏览器记住曲目和音量，每次重新打开播放器仍默认关闭。音乐在播放时淡入、暂停或结束时淡出；换页不中断，换曲柔和交接，整场持续循环。关闭播放器后音乐淡出停止，不会影响已有配音。“普通放映”适合自己讲，开启背景音乐后持续播放，关闭开关或退出放映时淡出。</w:t>
-      </w:r>
-    </w:p>
-    <w:p>
-      <w:r>
-        <w:rPr>
-          <w:b w:val="0"/>
-        </w:rPr>
-        <w:t>四首提供的钢琴曲已导入本地网页版。音乐与项目、模型连接和 MiniMax 声音配置分开保存，原音乐文件保留。背景音乐当前用于在线播放，PPTX、离线 HTML 和项目源文件暂不包含音乐；Mac 已安装 App 尚未替换。技术同事上线时需单独导入有权公开播放的 MP3，详见</w:t>
+        <w:t>官网视频下方和口播播放器里的“背景音乐”默认开启，首次音量为 40%，点播放时音乐一起淡入。仍可关闭、选曲或独立调整至 0%–40%；本浏览器记住此后的曲目和音量，旧版 12% 偏好不会作为新版初始音量。音乐在暂停或结束时淡出；换页不中断，换曲柔和交接，整场持续循环。关闭播放器后音乐淡出停止，不会影响已有配音。“普通放映”适合自己讲，开启背景音乐后持续播放，关闭开关或退出放映时淡出。</w:t>
+      </w:r>
+    </w:p>
+    <w:p>
+      <w:r>
+        <w:rPr>
+          <w:b w:val="0"/>
+        </w:rPr>
+        <w:t>四首提供的钢琴曲已导入本地网页版。音乐与项目、模型连接和 MiniMax 声音配置分开保存，原音乐文件保留。背景音乐当前用于在线播放，PPTX、离线 HTML 和项目源文件暂不包含音乐；Mac 已安装 App 尚未替换。默认源码 ZIP 上线时需单独导入有权公开播放的 MP3，带音乐的完整发行包已包含四首，详见</w:t>
       </w:r>
       <w:hyperlink r:id="rId16">
         <w:r>
@@ -4601,6 +4667,224 @@
           <w:b w:val="0"/>
         </w:rPr>
         <w:t>。</w:t>
+      </w:r>
+    </w:p>
+    <w:p>
+      <w:pPr>
+        <w:pStyle w:val="Heading2"/>
+      </w:pPr>
+      <w:r>
+        <w:rPr>
+          <w:b w:val="0"/>
+        </w:rPr>
+        <w:t>讲好品牌与入口</w:t>
+      </w:r>
+    </w:p>
+    <w:p>
+      <w:r>
+        <w:rPr>
+          <w:b w:val="0"/>
+        </w:rPr>
+        <w:t xml:space="preserve">产品名称现为「讲好」，定位为「AI 演讲工作台」，标语为「从一份讲稿，到一次从容的表达。」。源码中的产品显示名、工作台页头、菜单、官网、注册、登录及帮助使用同一 </w:t>
+      </w:r>
+      <w:r>
+        <w:rPr>
+          <w:rFonts w:ascii="Menlo" w:hAnsi="Menlo"/>
+          <w:b w:val="0"/>
+          <w:sz w:val="20"/>
+        </w:rPr>
+        <w:t>public/brand/</w:t>
+      </w:r>
+      <w:r>
+        <w:rPr>
+          <w:b w:val="0"/>
+        </w:rPr>
+        <w:t xml:space="preserve"> 标志，本机产品介绍页同步更新。官网字体由宋体调整为本地 Noto Sans SC Variable（</w:t>
+      </w:r>
+      <w:r>
+        <w:rPr>
+          <w:rFonts w:ascii="Menlo" w:hAnsi="Menlo"/>
+          <w:b w:val="0"/>
+          <w:sz w:val="20"/>
+        </w:rPr>
+        <w:t>Jianghao Sans</w:t>
+      </w:r>
+      <w:r>
+        <w:rPr>
+          <w:b w:val="0"/>
+        </w:rPr>
+        <w:t>）现代黑体。官网依次说明写、做、练、交，保留四组十二张实际作品、六页有声产品演示与 PPT 下载，并加入 Amanda 的真实原录音案例。</w:t>
+      </w:r>
+    </w:p>
+    <w:p>
+      <w:r>
+        <w:rPr>
+          <w:b w:val="0"/>
+        </w:rPr>
+        <w:t xml:space="preserve">Mac 程序文件继续使用 </w:t>
+      </w:r>
+      <w:r>
+        <w:rPr>
+          <w:rFonts w:ascii="Menlo" w:hAnsi="Menlo"/>
+          <w:b w:val="0"/>
+          <w:sz w:val="20"/>
+        </w:rPr>
+        <w:t>/Applications/AutoPPT.app</w:t>
+      </w:r>
+      <w:r>
+        <w:rPr>
+          <w:b w:val="0"/>
+        </w:rPr>
+        <w:t>，账号、项目、</w:t>
+      </w:r>
+      <w:r>
+        <w:rPr>
+          <w:rFonts w:ascii="Menlo" w:hAnsi="Menlo"/>
+          <w:b w:val="0"/>
+          <w:sz w:val="20"/>
+        </w:rPr>
+        <w:t>~/Library/Application Support/AutoPPT/</w:t>
+      </w:r>
+      <w:r>
+        <w:rPr>
+          <w:b w:val="0"/>
+        </w:rPr>
+        <w:t xml:space="preserve">、仓库 </w:t>
+      </w:r>
+      <w:r>
+        <w:rPr>
+          <w:rFonts w:ascii="Menlo" w:hAnsi="Menlo"/>
+          <w:b w:val="0"/>
+          <w:sz w:val="20"/>
+        </w:rPr>
+        <w:t>.local/</w:t>
+      </w:r>
+      <w:r>
+        <w:rPr>
+          <w:b w:val="0"/>
+        </w:rPr>
+        <w:t xml:space="preserve">、环境变量与 </w:t>
+      </w:r>
+      <w:r>
+        <w:rPr>
+          <w:rFonts w:ascii="Menlo" w:hAnsi="Menlo"/>
+          <w:b w:val="0"/>
+          <w:sz w:val="20"/>
+        </w:rPr>
+        <w:t>.autoppt.zip</w:t>
+      </w:r>
+      <w:r>
+        <w:rPr>
+          <w:b w:val="0"/>
+        </w:rPr>
+        <w:t xml:space="preserve"> 项目包均沿用原标识，已有项目、模型配置与草稿保留。本次未安装、替换或重启已安装 App，源码变化需在新构建版本下一次启动后生效。品牌资产和字体在本机提供；当前预览为 </w:t>
+      </w:r>
+      <w:hyperlink r:id="rId17">
+        <w:r>
+          <w:rPr>
+            <w:color w:val="245C85"/>
+            <w:u w:val="single"/>
+          </w:rPr>
+          <w:t>讲好官网</w:t>
+        </w:r>
+      </w:hyperlink>
+      <w:r>
+        <w:rPr>
+          <w:b w:val="0"/>
+        </w:rPr>
+        <w:t>，公网官网尚未发布。完整规则见 [讲好品牌规范](讲好-品牌规范.md)。</w:t>
+      </w:r>
+    </w:p>
+    <w:p>
+      <w:r>
+        <w:rPr>
+          <w:b w:val="0"/>
+        </w:rPr>
+        <w:t xml:space="preserve">本轮网站、桌面入口、版本、用量和部署的 21 项检查通过，1 项公网部署浏览器测试跳过；静态介绍页的 3 项检查（含浏览器）通过。官网在 1440/820/390/320px 的播放、暂停、键盘进度和音视频互相暂停均通过；实际视频时长 128.092 秒，无横向溢出或控制台错误。全量仍为 243 通过、4 失败、13 跳过，四项与干净 </w:t>
+      </w:r>
+      <w:r>
+        <w:rPr>
+          <w:rFonts w:ascii="Menlo" w:hAnsi="Menlo"/>
+          <w:b w:val="0"/>
+          <w:sz w:val="20"/>
+        </w:rPr>
+        <w:t>c12c770</w:t>
+      </w:r>
+      <w:r>
+        <w:rPr>
+          <w:b w:val="0"/>
+        </w:rPr>
+        <w:t xml:space="preserve"> 上复现的数字人、项目导航和新手引导选择器问题相同；全量运行使用旧根 </w:t>
+      </w:r>
+      <w:r>
+        <w:rPr>
+          <w:rFonts w:ascii="Menlo" w:hAnsi="Menlo"/>
+          <w:b w:val="0"/>
+          <w:sz w:val="20"/>
+        </w:rPr>
+        <w:t>dist</w:t>
+      </w:r>
+      <w:r>
+        <w:rPr>
+          <w:b w:val="0"/>
+        </w:rPr>
+        <w:t>，不能认证新版全部工作台。独立设计复核仅接受 320px 标题断行与文档事实两项修正，不是整体产品、已安装旧 App 或声音质量认证；正式公网和安装验收尚未完成。</w:t>
+      </w:r>
+    </w:p>
+    <w:p>
+      <w:r>
+        <w:rPr>
+          <w:b w:val="0"/>
+        </w:rPr>
+        <w:t>来源保护已按选定范围只读核对：《朝花夕拾》仍有 133 页，第 4 页和 Amanda 原口播记录完全一致，原页面文件与 5 段原音频的 SHA-256 一致。另一份隔离产品演示源的 27 项数据库、配置与录音输入前后校验一致。该复核只覆盖所选来源与隔离演示源，不代表对所有活跃用户数据库逐字节核验。</w:t>
+      </w:r>
+    </w:p>
+    <w:p>
+      <w:pPr>
+        <w:pStyle w:val="Heading2"/>
+      </w:pPr>
+      <w:r>
+        <w:rPr>
+          <w:b w:val="0"/>
+        </w:rPr>
+        <w:t>服务端发行包部署</w:t>
+      </w:r>
+    </w:p>
+    <w:p>
+      <w:r>
+        <w:rPr>
+          <w:b w:val="0"/>
+        </w:rPr>
+        <w:t>带音乐的服务端发行包已将四首曲目、完整网页服务源码、HTTPS、MiniMax 配置与部署手册合在一起，解压后按</w:t>
+      </w:r>
+      <w:hyperlink r:id="rId18">
+        <w:r>
+          <w:rPr>
+            <w:color w:val="245C85"/>
+            <w:u w:val="single"/>
+          </w:rPr>
+          <w:t>服务器部署操作手册</w:t>
+        </w:r>
+      </w:hyperlink>
+      <w:r>
+        <w:rPr>
+          <w:b w:val="0"/>
+        </w:rPr>
+        <w:t xml:space="preserve">操作。技术同事需填写域名、模型地址和名称、三套模型 Key、管理员密码及本人声音编号；包内不含密钥或私人项目。使用统一 </w:t>
+      </w:r>
+      <w:r>
+        <w:rPr>
+          <w:rFonts w:ascii="Menlo" w:hAnsi="Menlo"/>
+          <w:b w:val="0"/>
+          <w:sz w:val="20"/>
+        </w:rPr>
+        <w:t>deploy/compose.sh</w:t>
+      </w:r>
+      <w:r>
+        <w:rPr>
+          <w:b w:val="0"/>
+        </w:rPr>
+        <w:t xml:space="preserve"> 入口，账号与用户素材留在原持久卷，升级不清理数据。</w:t>
       </w:r>
     </w:p>
     <w:sectPr>

</xml_diff>

<commit_message>
Keep generated dates grounded in source content and runtime context
</commit_message>
<xml_diff>
--- a/docs/AutoPPT-安装与使用说明.docx
+++ b/docs/AutoPPT-安装与使用说明.docx
@@ -1445,6 +1445,14 @@
           <w:b w:val="0"/>
         </w:rPr>
         <w:t>；转发说明文档和代码时，无需附带此文件。</w:t>
+      </w:r>
+    </w:p>
+    <w:p>
+      <w:r>
+        <w:rPr>
+          <w:b w:val="0"/>
+        </w:rPr>
+        <w:t>年份按内容依据处理：原稿、图表和截图中的真实历史日期保留，不统一改成今年。内容分析与出图请求会携带上海时区的实时日期，只在明确要求“今天/当前年份”时帮助理解，不自动加入口播或画面。风格示例、文件名和素材边缘的装饰年份不应被沿用为新页年份。已有图片、原稿、风格规则与历史不批量改写；PPTX、HTML 和图片下载使用已保存的画面，所以旧图片里的日期仍会保留。模型可能仍未遵循日期要求，请查看实际成品。具体检查范围与验证结果见仓库中的《提示词年份检查》。</w:t>
       </w:r>
     </w:p>
     <w:p>

</xml_diff>